<commit_message>
Add form submission with secure PHP handling
</commit_message>
<xml_diff>
--- a/PHP.docx
+++ b/PHP.docx
@@ -18,7 +18,7 @@
       </w:pPr>
       <w:r>
         <w:drawing>
-          <wp:inline wp14:editId="27C631B0" wp14:anchorId="1E4C7E10">
+          <wp:inline wp14:editId="026C7B39" wp14:anchorId="1E4C7E10">
             <wp:extent cx="5724525" cy="3238500"/>
             <wp:effectExtent l="0" t="0" r="0" b="0"/>
             <wp:docPr id="397895639" name="drawing"/>
@@ -66,7 +66,7 @@
       </w:pPr>
       <w:r>
         <w:drawing>
-          <wp:inline wp14:editId="0A652CA8" wp14:anchorId="18E95775">
+          <wp:inline wp14:editId="3490D25E" wp14:anchorId="18E95775">
             <wp:extent cx="5724525" cy="3200400"/>
             <wp:effectExtent l="0" t="0" r="0" b="0"/>
             <wp:docPr id="1431471561" name="drawing"/>
@@ -238,7 +238,7 @@
       </w:pPr>
       <w:r>
         <w:drawing>
-          <wp:inline wp14:editId="410F7B9B" wp14:anchorId="4559CA8C">
+          <wp:inline wp14:editId="1DC81509" wp14:anchorId="4559CA8C">
             <wp:extent cx="5220828" cy="2936173"/>
             <wp:effectExtent l="0" t="0" r="0" b="0"/>
             <wp:docPr id="1143620684" name="drawing"/>
@@ -286,7 +286,7 @@
       </w:pPr>
       <w:r>
         <w:drawing>
-          <wp:inline wp14:editId="1B828C07" wp14:anchorId="4289C205">
+          <wp:inline wp14:editId="1E1BD60D" wp14:anchorId="4289C205">
             <wp:extent cx="5470478" cy="3076575"/>
             <wp:effectExtent l="0" t="0" r="0" b="0"/>
             <wp:docPr id="628167729" name="drawing"/>
@@ -334,7 +334,7 @@
       </w:pPr>
       <w:r>
         <w:drawing>
-          <wp:inline wp14:editId="65689AFA" wp14:anchorId="24431F18">
+          <wp:inline wp14:editId="1529F6D9" wp14:anchorId="24431F18">
             <wp:extent cx="5724525" cy="3219450"/>
             <wp:effectExtent l="0" t="0" r="0" b="0"/>
             <wp:docPr id="1975926718" name="drawing"/>
@@ -971,18 +971,3648 @@
         <w:pStyle w:val="Normal"/>
         <w:spacing w:before="240" w:beforeAutospacing="off" w:after="240" w:afterAutospacing="off"/>
         <w:ind w:left="0"/>
+      </w:pPr>
+      <w:r>
         <w:rPr>
           <w:rFonts w:ascii="Calibri" w:hAnsi="Calibri" w:eastAsia="Calibri" w:cs="Calibri"/>
-          <w:noProof w:val="0"/>
-          <w:sz w:val="24"/>
-          <w:szCs w:val="24"/>
-          <w:lang w:val="en-GB"/>
-        </w:rPr>
-      </w:pPr>
+          <w:b w:val="1"/>
+          <w:bCs w:val="1"/>
+          <w:noProof w:val="0"/>
+          <w:color w:val="FF0000"/>
+          <w:sz w:val="32"/>
+          <w:szCs w:val="32"/>
+          <w:lang w:val="en-GB"/>
+        </w:rPr>
+        <w:t xml:space="preserve">How PHP can read the data from the submitted form from the HTML page </w:t>
+      </w:r>
+      <w:r>
+        <w:rPr>
+          <w:rFonts w:ascii="Calibri" w:hAnsi="Calibri" w:eastAsia="Calibri" w:cs="Calibri"/>
+          <w:b w:val="1"/>
+          <w:bCs w:val="1"/>
+          <w:noProof w:val="0"/>
+          <w:color w:val="FF0000"/>
+          <w:sz w:val="32"/>
+          <w:szCs w:val="32"/>
+          <w:lang w:val="en-GB"/>
+        </w:rPr>
+        <w:t>throough</w:t>
+      </w:r>
+      <w:r>
+        <w:rPr>
+          <w:rFonts w:ascii="Calibri" w:hAnsi="Calibri" w:eastAsia="Calibri" w:cs="Calibri"/>
+          <w:b w:val="1"/>
+          <w:bCs w:val="1"/>
+          <w:noProof w:val="0"/>
+          <w:color w:val="FF0000"/>
+          <w:sz w:val="32"/>
+          <w:szCs w:val="32"/>
+          <w:lang w:val="en-GB"/>
+        </w:rPr>
+        <w:t xml:space="preserve"> $_GET and $_POST</w:t>
+      </w:r>
     </w:p>
     <w:p>
       <w:pPr>
         <w:pStyle w:val="Normal"/>
+        <w:spacing w:before="240" w:beforeAutospacing="off" w:after="240" w:afterAutospacing="off"/>
+        <w:ind w:left="0"/>
+        <w:rPr>
+          <w:rFonts w:ascii="Calibri" w:hAnsi="Calibri" w:eastAsia="Calibri" w:cs="Calibri"/>
+          <w:b w:val="1"/>
+          <w:bCs w:val="1"/>
+          <w:noProof w:val="0"/>
+          <w:color w:val="FF0000"/>
+          <w:sz w:val="32"/>
+          <w:szCs w:val="32"/>
+          <w:lang w:val="en-GB"/>
+        </w:rPr>
+      </w:pPr>
+    </w:p>
+    <w:p>
+      <w:pPr>
+        <w:spacing w:before="360" w:beforeAutospacing="off" w:after="180" w:afterAutospacing="off"/>
+      </w:pPr>
+      <w:r>
+        <w:rPr>
+          <w:rFonts w:ascii="Arial" w:hAnsi="Arial" w:eastAsia="Arial" w:cs="Arial"/>
+          <w:b w:val="1"/>
+          <w:bCs w:val="1"/>
+          <w:strike w:val="0"/>
+          <w:dstrike w:val="0"/>
+          <w:noProof w:val="0"/>
+          <w:sz w:val="30"/>
+          <w:szCs w:val="30"/>
+          <w:u w:val="none"/>
+          <w:lang w:val="en-GB"/>
+        </w:rPr>
+        <w:t>Step 1: Create the HTML Form</w:t>
+      </w:r>
+    </w:p>
+    <w:p>
+      <w:pPr>
+        <w:spacing w:before="180" w:beforeAutospacing="off" w:after="240" w:afterAutospacing="off"/>
+        <w:rPr>
+          <w:b w:val="0"/>
+          <w:bCs w:val="0"/>
+          <w:strike w:val="0"/>
+          <w:dstrike w:val="0"/>
+          <w:noProof w:val="0"/>
+          <w:u w:val="none"/>
+          <w:lang w:val="en-GB"/>
+        </w:rPr>
+      </w:pPr>
+      <w:r>
+        <w:rPr>
+          <w:rFonts w:ascii="Arial" w:hAnsi="Arial" w:eastAsia="Arial" w:cs="Arial"/>
+          <w:b w:val="0"/>
+          <w:bCs w:val="0"/>
+          <w:strike w:val="0"/>
+          <w:dstrike w:val="0"/>
+          <w:noProof w:val="0"/>
+          <w:sz w:val="24"/>
+          <w:szCs w:val="24"/>
+          <w:u w:val="none"/>
+          <w:lang w:val="en-GB"/>
+        </w:rPr>
+        <w:t>The HTML form must have two critical attributes for PHP to successfully read the data:</w:t>
+      </w:r>
+    </w:p>
+    <w:p>
+      <w:pPr>
+        <w:pStyle w:val="ListParagraph"/>
+        <w:numPr>
+          <w:ilvl w:val="0"/>
+          <w:numId w:val="5"/>
+        </w:numPr>
+        <w:spacing w:before="0" w:beforeAutospacing="off" w:after="180" w:afterAutospacing="off"/>
+        <w:rPr>
+          <w:rFonts w:ascii="Arial" w:hAnsi="Arial" w:eastAsia="Arial" w:cs="Arial"/>
+          <w:b w:val="0"/>
+          <w:bCs w:val="0"/>
+          <w:strike w:val="0"/>
+          <w:dstrike w:val="0"/>
+          <w:noProof w:val="0"/>
+          <w:sz w:val="24"/>
+          <w:szCs w:val="24"/>
+          <w:u w:val="none"/>
+          <w:lang w:val="en-GB"/>
+        </w:rPr>
+      </w:pPr>
+      <w:r>
+        <w:rPr>
+          <w:rFonts w:ascii="Consolas" w:hAnsi="Consolas" w:eastAsia="Consolas" w:cs="Consolas"/>
+          <w:b w:val="1"/>
+          <w:bCs w:val="1"/>
+          <w:strike w:val="0"/>
+          <w:dstrike w:val="0"/>
+          <w:noProof w:val="0"/>
+          <w:sz w:val="21"/>
+          <w:szCs w:val="21"/>
+          <w:u w:val="none"/>
+          <w:lang w:val="en-GB"/>
+        </w:rPr>
+        <w:t>method</w:t>
+      </w:r>
+      <w:r>
+        <w:rPr>
+          <w:rFonts w:ascii="Arial" w:hAnsi="Arial" w:eastAsia="Arial" w:cs="Arial"/>
+          <w:b w:val="0"/>
+          <w:bCs w:val="0"/>
+          <w:strike w:val="0"/>
+          <w:dstrike w:val="0"/>
+          <w:noProof w:val="0"/>
+          <w:sz w:val="24"/>
+          <w:szCs w:val="24"/>
+          <w:u w:val="none"/>
+          <w:lang w:val="en-GB"/>
+        </w:rPr>
+        <w:t xml:space="preserve">: Defines how data is sent (typically </w:t>
+      </w:r>
+      <w:r>
+        <w:rPr>
+          <w:rFonts w:ascii="Consolas" w:hAnsi="Consolas" w:eastAsia="Consolas" w:cs="Consolas"/>
+          <w:b w:val="0"/>
+          <w:bCs w:val="0"/>
+          <w:strike w:val="0"/>
+          <w:dstrike w:val="0"/>
+          <w:noProof w:val="0"/>
+          <w:sz w:val="21"/>
+          <w:szCs w:val="21"/>
+          <w:u w:val="none"/>
+          <w:lang w:val="en-GB"/>
+        </w:rPr>
+        <w:t>POST</w:t>
+      </w:r>
+      <w:r>
+        <w:rPr>
+          <w:rFonts w:ascii="Arial" w:hAnsi="Arial" w:eastAsia="Arial" w:cs="Arial"/>
+          <w:b w:val="0"/>
+          <w:bCs w:val="0"/>
+          <w:strike w:val="0"/>
+          <w:dstrike w:val="0"/>
+          <w:noProof w:val="0"/>
+          <w:sz w:val="24"/>
+          <w:szCs w:val="24"/>
+          <w:u w:val="none"/>
+          <w:lang w:val="en-GB"/>
+        </w:rPr>
+        <w:t xml:space="preserve"> for security and larger payloads, or </w:t>
+      </w:r>
+      <w:r>
+        <w:rPr>
+          <w:rFonts w:ascii="Consolas" w:hAnsi="Consolas" w:eastAsia="Consolas" w:cs="Consolas"/>
+          <w:b w:val="0"/>
+          <w:bCs w:val="0"/>
+          <w:strike w:val="0"/>
+          <w:dstrike w:val="0"/>
+          <w:noProof w:val="0"/>
+          <w:sz w:val="21"/>
+          <w:szCs w:val="21"/>
+          <w:u w:val="none"/>
+          <w:lang w:val="en-GB"/>
+        </w:rPr>
+        <w:t>GET</w:t>
+      </w:r>
+      <w:r>
+        <w:rPr>
+          <w:rFonts w:ascii="Arial" w:hAnsi="Arial" w:eastAsia="Arial" w:cs="Arial"/>
+          <w:b w:val="0"/>
+          <w:bCs w:val="0"/>
+          <w:strike w:val="0"/>
+          <w:dstrike w:val="0"/>
+          <w:noProof w:val="0"/>
+          <w:sz w:val="24"/>
+          <w:szCs w:val="24"/>
+          <w:u w:val="none"/>
+          <w:lang w:val="en-GB"/>
+        </w:rPr>
+        <w:t xml:space="preserve"> for URL-based parameters).</w:t>
+      </w:r>
+    </w:p>
+    <w:p>
+      <w:pPr>
+        <w:pStyle w:val="ListParagraph"/>
+        <w:numPr>
+          <w:ilvl w:val="0"/>
+          <w:numId w:val="5"/>
+        </w:numPr>
+        <w:spacing w:before="0" w:beforeAutospacing="off" w:after="180" w:afterAutospacing="off"/>
+        <w:rPr>
+          <w:rFonts w:ascii="Arial" w:hAnsi="Arial" w:eastAsia="Arial" w:cs="Arial"/>
+          <w:b w:val="0"/>
+          <w:bCs w:val="0"/>
+          <w:strike w:val="0"/>
+          <w:dstrike w:val="0"/>
+          <w:noProof w:val="0"/>
+          <w:sz w:val="24"/>
+          <w:szCs w:val="24"/>
+          <w:u w:val="none"/>
+          <w:lang w:val="en-GB"/>
+        </w:rPr>
+      </w:pPr>
+      <w:r>
+        <w:rPr>
+          <w:rFonts w:ascii="Consolas" w:hAnsi="Consolas" w:eastAsia="Consolas" w:cs="Consolas"/>
+          <w:b w:val="1"/>
+          <w:bCs w:val="1"/>
+          <w:strike w:val="0"/>
+          <w:dstrike w:val="0"/>
+          <w:noProof w:val="0"/>
+          <w:sz w:val="21"/>
+          <w:szCs w:val="21"/>
+          <w:u w:val="none"/>
+          <w:lang w:val="en-GB"/>
+        </w:rPr>
+        <w:t>name</w:t>
+      </w:r>
+      <w:r>
+        <w:rPr>
+          <w:rFonts w:ascii="Arial" w:hAnsi="Arial" w:eastAsia="Arial" w:cs="Arial"/>
+          <w:b w:val="1"/>
+          <w:bCs w:val="1"/>
+          <w:strike w:val="0"/>
+          <w:dstrike w:val="0"/>
+          <w:noProof w:val="0"/>
+          <w:sz w:val="24"/>
+          <w:szCs w:val="24"/>
+          <w:u w:val="none"/>
+          <w:lang w:val="en-GB"/>
+        </w:rPr>
+        <w:t xml:space="preserve"> attribute</w:t>
+      </w:r>
+      <w:r>
+        <w:rPr>
+          <w:rFonts w:ascii="Arial" w:hAnsi="Arial" w:eastAsia="Arial" w:cs="Arial"/>
+          <w:b w:val="0"/>
+          <w:bCs w:val="0"/>
+          <w:strike w:val="0"/>
+          <w:dstrike w:val="0"/>
+          <w:noProof w:val="0"/>
+          <w:sz w:val="24"/>
+          <w:szCs w:val="24"/>
+          <w:u w:val="none"/>
+          <w:lang w:val="en-GB"/>
+        </w:rPr>
+        <w:t xml:space="preserve">: Every input element </w:t>
+      </w:r>
+      <w:r>
+        <w:rPr>
+          <w:rFonts w:ascii="Arial" w:hAnsi="Arial" w:eastAsia="Arial" w:cs="Arial"/>
+          <w:b w:val="1"/>
+          <w:bCs w:val="1"/>
+          <w:strike w:val="0"/>
+          <w:dstrike w:val="0"/>
+          <w:noProof w:val="0"/>
+          <w:sz w:val="24"/>
+          <w:szCs w:val="24"/>
+          <w:u w:val="none"/>
+          <w:lang w:val="en-GB"/>
+        </w:rPr>
+        <w:t>must</w:t>
+      </w:r>
+      <w:r>
+        <w:rPr>
+          <w:rFonts w:ascii="Arial" w:hAnsi="Arial" w:eastAsia="Arial" w:cs="Arial"/>
+          <w:b w:val="0"/>
+          <w:bCs w:val="0"/>
+          <w:strike w:val="0"/>
+          <w:dstrike w:val="0"/>
+          <w:noProof w:val="0"/>
+          <w:sz w:val="24"/>
+          <w:szCs w:val="24"/>
+          <w:u w:val="none"/>
+          <w:lang w:val="en-GB"/>
+        </w:rPr>
+        <w:t xml:space="preserve"> have a unique </w:t>
+      </w:r>
+      <w:r>
+        <w:rPr>
+          <w:rFonts w:ascii="Consolas" w:hAnsi="Consolas" w:eastAsia="Consolas" w:cs="Consolas"/>
+          <w:b w:val="0"/>
+          <w:bCs w:val="0"/>
+          <w:strike w:val="0"/>
+          <w:dstrike w:val="0"/>
+          <w:noProof w:val="0"/>
+          <w:sz w:val="21"/>
+          <w:szCs w:val="21"/>
+          <w:u w:val="none"/>
+          <w:lang w:val="en-GB"/>
+        </w:rPr>
+        <w:t>name</w:t>
+      </w:r>
+      <w:r>
+        <w:rPr>
+          <w:rFonts w:ascii="Arial" w:hAnsi="Arial" w:eastAsia="Arial" w:cs="Arial"/>
+          <w:b w:val="0"/>
+          <w:bCs w:val="0"/>
+          <w:strike w:val="0"/>
+          <w:dstrike w:val="0"/>
+          <w:noProof w:val="0"/>
+          <w:sz w:val="24"/>
+          <w:szCs w:val="24"/>
+          <w:u w:val="none"/>
+          <w:lang w:val="en-GB"/>
+        </w:rPr>
+        <w:t xml:space="preserve"> attribute. PHP uses this attribute value as a lookup key to find the submitted text.</w:t>
+      </w:r>
+    </w:p>
+    <w:p>
+      <w:pPr>
+        <w:pStyle w:val="Normal"/>
+        <w:spacing w:before="0" w:beforeAutospacing="off" w:after="180" w:afterAutospacing="off"/>
+        <w:ind w:left="0"/>
+        <w:rPr>
+          <w:rFonts w:ascii="Arial" w:hAnsi="Arial" w:eastAsia="Arial" w:cs="Arial"/>
+          <w:b w:val="0"/>
+          <w:bCs w:val="0"/>
+          <w:strike w:val="0"/>
+          <w:dstrike w:val="0"/>
+          <w:noProof w:val="0"/>
+          <w:sz w:val="24"/>
+          <w:szCs w:val="24"/>
+          <w:u w:val="none"/>
+          <w:lang w:val="en-GB"/>
+        </w:rPr>
+      </w:pPr>
+    </w:p>
+    <w:p>
+      <w:pPr>
+        <w:pStyle w:val="Normal"/>
+        <w:spacing w:before="0" w:beforeAutospacing="off" w:after="180" w:afterAutospacing="off"/>
+        <w:ind w:left="0"/>
+        <w:rPr>
+          <w:rFonts w:ascii="Arial" w:hAnsi="Arial" w:eastAsia="Arial" w:cs="Arial"/>
+          <w:b w:val="1"/>
+          <w:bCs w:val="1"/>
+          <w:strike w:val="0"/>
+          <w:dstrike w:val="0"/>
+          <w:noProof w:val="0"/>
+          <w:color w:val="4C94D8" w:themeColor="text2" w:themeTint="80" w:themeShade="FF"/>
+          <w:sz w:val="24"/>
+          <w:szCs w:val="24"/>
+          <w:u w:val="none"/>
+          <w:lang w:val="en-GB"/>
+        </w:rPr>
+      </w:pPr>
+      <w:r>
+        <w:rPr>
+          <w:rFonts w:ascii="Arial" w:hAnsi="Arial" w:eastAsia="Arial" w:cs="Arial"/>
+          <w:b w:val="1"/>
+          <w:bCs w:val="1"/>
+          <w:strike w:val="0"/>
+          <w:dstrike w:val="0"/>
+          <w:noProof w:val="0"/>
+          <w:color w:val="4C94D8" w:themeColor="text2" w:themeTint="80" w:themeShade="FF"/>
+          <w:sz w:val="24"/>
+          <w:szCs w:val="24"/>
+          <w:u w:val="none"/>
+          <w:lang w:val="en-GB"/>
+        </w:rPr>
+        <w:t>&lt;!-- index.html --&gt;</w:t>
+      </w:r>
+    </w:p>
+    <w:p>
+      <w:pPr>
+        <w:pStyle w:val="Normal"/>
+        <w:spacing w:before="0" w:beforeAutospacing="off" w:after="180" w:afterAutospacing="off"/>
+        <w:ind w:left="0"/>
+        <w:rPr>
+          <w:rFonts w:ascii="Arial" w:hAnsi="Arial" w:eastAsia="Arial" w:cs="Arial"/>
+          <w:b w:val="1"/>
+          <w:bCs w:val="1"/>
+          <w:strike w:val="0"/>
+          <w:dstrike w:val="0"/>
+          <w:noProof w:val="0"/>
+          <w:color w:val="4C94D8" w:themeColor="text2" w:themeTint="80" w:themeShade="FF"/>
+          <w:sz w:val="24"/>
+          <w:szCs w:val="24"/>
+          <w:u w:val="none"/>
+          <w:lang w:val="en-GB"/>
+        </w:rPr>
+      </w:pPr>
+      <w:r>
+        <w:rPr>
+          <w:rFonts w:ascii="Arial" w:hAnsi="Arial" w:eastAsia="Arial" w:cs="Arial"/>
+          <w:b w:val="1"/>
+          <w:bCs w:val="1"/>
+          <w:strike w:val="0"/>
+          <w:dstrike w:val="0"/>
+          <w:noProof w:val="0"/>
+          <w:color w:val="4C94D8" w:themeColor="text2" w:themeTint="80" w:themeShade="FF"/>
+          <w:sz w:val="24"/>
+          <w:szCs w:val="24"/>
+          <w:u w:val="none"/>
+          <w:lang w:val="en-GB"/>
+        </w:rPr>
+        <w:t>&lt;form action="process.php" method="POST"&gt;</w:t>
+      </w:r>
+    </w:p>
+    <w:p>
+      <w:pPr>
+        <w:pStyle w:val="Normal"/>
+        <w:spacing w:before="0" w:beforeAutospacing="off" w:after="180" w:afterAutospacing="off"/>
+        <w:ind w:left="0"/>
+        <w:rPr>
+          <w:rFonts w:ascii="Arial" w:hAnsi="Arial" w:eastAsia="Arial" w:cs="Arial"/>
+          <w:b w:val="1"/>
+          <w:bCs w:val="1"/>
+          <w:strike w:val="0"/>
+          <w:dstrike w:val="0"/>
+          <w:noProof w:val="0"/>
+          <w:color w:val="4C94D8" w:themeColor="text2" w:themeTint="80" w:themeShade="FF"/>
+          <w:sz w:val="24"/>
+          <w:szCs w:val="24"/>
+          <w:u w:val="none"/>
+          <w:lang w:val="en-GB"/>
+        </w:rPr>
+      </w:pPr>
+      <w:r>
+        <w:rPr>
+          <w:rFonts w:ascii="Arial" w:hAnsi="Arial" w:eastAsia="Arial" w:cs="Arial"/>
+          <w:b w:val="1"/>
+          <w:bCs w:val="1"/>
+          <w:strike w:val="0"/>
+          <w:dstrike w:val="0"/>
+          <w:noProof w:val="0"/>
+          <w:color w:val="4C94D8" w:themeColor="text2" w:themeTint="80" w:themeShade="FF"/>
+          <w:sz w:val="24"/>
+          <w:szCs w:val="24"/>
+          <w:u w:val="none"/>
+          <w:lang w:val="en-GB"/>
+        </w:rPr>
+        <w:t xml:space="preserve">    &lt;label for="username"&gt;Username:&lt;/label&gt;</w:t>
+      </w:r>
+    </w:p>
+    <w:p>
+      <w:pPr>
+        <w:pStyle w:val="Normal"/>
+        <w:spacing w:before="0" w:beforeAutospacing="off" w:after="180" w:afterAutospacing="off"/>
+        <w:ind w:left="0"/>
+        <w:rPr>
+          <w:rFonts w:ascii="Arial" w:hAnsi="Arial" w:eastAsia="Arial" w:cs="Arial"/>
+          <w:b w:val="1"/>
+          <w:bCs w:val="1"/>
+          <w:strike w:val="0"/>
+          <w:dstrike w:val="0"/>
+          <w:noProof w:val="0"/>
+          <w:color w:val="4C94D8" w:themeColor="text2" w:themeTint="80" w:themeShade="FF"/>
+          <w:sz w:val="24"/>
+          <w:szCs w:val="24"/>
+          <w:u w:val="none"/>
+          <w:lang w:val="en-GB"/>
+        </w:rPr>
+      </w:pPr>
+      <w:r>
+        <w:rPr>
+          <w:rFonts w:ascii="Arial" w:hAnsi="Arial" w:eastAsia="Arial" w:cs="Arial"/>
+          <w:b w:val="1"/>
+          <w:bCs w:val="1"/>
+          <w:strike w:val="0"/>
+          <w:dstrike w:val="0"/>
+          <w:noProof w:val="0"/>
+          <w:color w:val="4C94D8" w:themeColor="text2" w:themeTint="80" w:themeShade="FF"/>
+          <w:sz w:val="24"/>
+          <w:szCs w:val="24"/>
+          <w:u w:val="none"/>
+          <w:lang w:val="en-GB"/>
+        </w:rPr>
+        <w:t xml:space="preserve">    &lt;input type="text" id="username" name="user_name"&gt;</w:t>
+      </w:r>
+    </w:p>
+    <w:p>
+      <w:pPr>
+        <w:pStyle w:val="Normal"/>
+        <w:spacing w:before="0" w:beforeAutospacing="off" w:after="180" w:afterAutospacing="off"/>
+        <w:ind w:left="0"/>
+        <w:rPr>
+          <w:rFonts w:ascii="Arial" w:hAnsi="Arial" w:eastAsia="Arial" w:cs="Arial"/>
+          <w:b w:val="1"/>
+          <w:bCs w:val="1"/>
+          <w:strike w:val="0"/>
+          <w:dstrike w:val="0"/>
+          <w:noProof w:val="0"/>
+          <w:color w:val="4C94D8" w:themeColor="text2" w:themeTint="80" w:themeShade="FF"/>
+          <w:sz w:val="24"/>
+          <w:szCs w:val="24"/>
+          <w:u w:val="none"/>
+          <w:lang w:val="en-GB"/>
+        </w:rPr>
+      </w:pPr>
+      <w:r>
+        <w:rPr>
+          <w:rFonts w:ascii="Arial" w:hAnsi="Arial" w:eastAsia="Arial" w:cs="Arial"/>
+          <w:b w:val="1"/>
+          <w:bCs w:val="1"/>
+          <w:strike w:val="0"/>
+          <w:dstrike w:val="0"/>
+          <w:noProof w:val="0"/>
+          <w:color w:val="4C94D8" w:themeColor="text2" w:themeTint="80" w:themeShade="FF"/>
+          <w:sz w:val="24"/>
+          <w:szCs w:val="24"/>
+          <w:u w:val="none"/>
+          <w:lang w:val="en-GB"/>
+        </w:rPr>
+        <w:t xml:space="preserve">    </w:t>
+      </w:r>
+    </w:p>
+    <w:p>
+      <w:pPr>
+        <w:pStyle w:val="Normal"/>
+        <w:spacing w:before="0" w:beforeAutospacing="off" w:after="180" w:afterAutospacing="off"/>
+        <w:ind w:left="0"/>
+        <w:rPr>
+          <w:rFonts w:ascii="Arial" w:hAnsi="Arial" w:eastAsia="Arial" w:cs="Arial"/>
+          <w:b w:val="1"/>
+          <w:bCs w:val="1"/>
+          <w:strike w:val="0"/>
+          <w:dstrike w:val="0"/>
+          <w:noProof w:val="0"/>
+          <w:color w:val="4C94D8" w:themeColor="text2" w:themeTint="80" w:themeShade="FF"/>
+          <w:sz w:val="24"/>
+          <w:szCs w:val="24"/>
+          <w:u w:val="none"/>
+          <w:lang w:val="en-GB"/>
+        </w:rPr>
+      </w:pPr>
+      <w:r>
+        <w:rPr>
+          <w:rFonts w:ascii="Arial" w:hAnsi="Arial" w:eastAsia="Arial" w:cs="Arial"/>
+          <w:b w:val="1"/>
+          <w:bCs w:val="1"/>
+          <w:strike w:val="0"/>
+          <w:dstrike w:val="0"/>
+          <w:noProof w:val="0"/>
+          <w:color w:val="4C94D8" w:themeColor="text2" w:themeTint="80" w:themeShade="FF"/>
+          <w:sz w:val="24"/>
+          <w:szCs w:val="24"/>
+          <w:u w:val="none"/>
+          <w:lang w:val="en-GB"/>
+        </w:rPr>
+        <w:t xml:space="preserve">    &lt;label for="email"&gt;Email:&lt;/label&gt;</w:t>
+      </w:r>
+    </w:p>
+    <w:p>
+      <w:pPr>
+        <w:pStyle w:val="Normal"/>
+        <w:spacing w:before="0" w:beforeAutospacing="off" w:after="180" w:afterAutospacing="off"/>
+        <w:ind w:left="0"/>
+        <w:rPr>
+          <w:rFonts w:ascii="Arial" w:hAnsi="Arial" w:eastAsia="Arial" w:cs="Arial"/>
+          <w:b w:val="1"/>
+          <w:bCs w:val="1"/>
+          <w:strike w:val="0"/>
+          <w:dstrike w:val="0"/>
+          <w:noProof w:val="0"/>
+          <w:color w:val="4C94D8" w:themeColor="text2" w:themeTint="80" w:themeShade="FF"/>
+          <w:sz w:val="24"/>
+          <w:szCs w:val="24"/>
+          <w:u w:val="none"/>
+          <w:lang w:val="en-GB"/>
+        </w:rPr>
+      </w:pPr>
+      <w:r>
+        <w:rPr>
+          <w:rFonts w:ascii="Arial" w:hAnsi="Arial" w:eastAsia="Arial" w:cs="Arial"/>
+          <w:b w:val="1"/>
+          <w:bCs w:val="1"/>
+          <w:strike w:val="0"/>
+          <w:dstrike w:val="0"/>
+          <w:noProof w:val="0"/>
+          <w:color w:val="4C94D8" w:themeColor="text2" w:themeTint="80" w:themeShade="FF"/>
+          <w:sz w:val="24"/>
+          <w:szCs w:val="24"/>
+          <w:u w:val="none"/>
+          <w:lang w:val="en-GB"/>
+        </w:rPr>
+        <w:t xml:space="preserve">    &lt;input type="email" id="email" name="user_email"&gt;</w:t>
+      </w:r>
+    </w:p>
+    <w:p>
+      <w:pPr>
+        <w:pStyle w:val="Normal"/>
+        <w:spacing w:before="0" w:beforeAutospacing="off" w:after="180" w:afterAutospacing="off"/>
+        <w:ind w:left="0"/>
+        <w:rPr>
+          <w:rFonts w:ascii="Arial" w:hAnsi="Arial" w:eastAsia="Arial" w:cs="Arial"/>
+          <w:b w:val="1"/>
+          <w:bCs w:val="1"/>
+          <w:strike w:val="0"/>
+          <w:dstrike w:val="0"/>
+          <w:noProof w:val="0"/>
+          <w:color w:val="4C94D8" w:themeColor="text2" w:themeTint="80" w:themeShade="FF"/>
+          <w:sz w:val="24"/>
+          <w:szCs w:val="24"/>
+          <w:u w:val="none"/>
+          <w:lang w:val="en-GB"/>
+        </w:rPr>
+      </w:pPr>
+      <w:r>
+        <w:rPr>
+          <w:rFonts w:ascii="Arial" w:hAnsi="Arial" w:eastAsia="Arial" w:cs="Arial"/>
+          <w:b w:val="1"/>
+          <w:bCs w:val="1"/>
+          <w:strike w:val="0"/>
+          <w:dstrike w:val="0"/>
+          <w:noProof w:val="0"/>
+          <w:color w:val="4C94D8" w:themeColor="text2" w:themeTint="80" w:themeShade="FF"/>
+          <w:sz w:val="24"/>
+          <w:szCs w:val="24"/>
+          <w:u w:val="none"/>
+          <w:lang w:val="en-GB"/>
+        </w:rPr>
+        <w:t xml:space="preserve">    </w:t>
+      </w:r>
+    </w:p>
+    <w:p>
+      <w:pPr>
+        <w:pStyle w:val="Normal"/>
+        <w:spacing w:before="0" w:beforeAutospacing="off" w:after="180" w:afterAutospacing="off"/>
+        <w:ind w:left="0"/>
+        <w:rPr>
+          <w:rFonts w:ascii="Arial" w:hAnsi="Arial" w:eastAsia="Arial" w:cs="Arial"/>
+          <w:b w:val="1"/>
+          <w:bCs w:val="1"/>
+          <w:strike w:val="0"/>
+          <w:dstrike w:val="0"/>
+          <w:noProof w:val="0"/>
+          <w:color w:val="4C94D8" w:themeColor="text2" w:themeTint="80" w:themeShade="FF"/>
+          <w:sz w:val="24"/>
+          <w:szCs w:val="24"/>
+          <w:u w:val="none"/>
+          <w:lang w:val="en-GB"/>
+        </w:rPr>
+      </w:pPr>
+      <w:r>
+        <w:rPr>
+          <w:rFonts w:ascii="Arial" w:hAnsi="Arial" w:eastAsia="Arial" w:cs="Arial"/>
+          <w:b w:val="1"/>
+          <w:bCs w:val="1"/>
+          <w:strike w:val="0"/>
+          <w:dstrike w:val="0"/>
+          <w:noProof w:val="0"/>
+          <w:color w:val="4C94D8" w:themeColor="text2" w:themeTint="80" w:themeShade="FF"/>
+          <w:sz w:val="24"/>
+          <w:szCs w:val="24"/>
+          <w:u w:val="none"/>
+          <w:lang w:val="en-GB"/>
+        </w:rPr>
+        <w:t xml:space="preserve">    &lt;button type="submit"&gt;Submit Data&lt;/button&gt;</w:t>
+      </w:r>
+    </w:p>
+    <w:p>
+      <w:pPr>
+        <w:pStyle w:val="Normal"/>
+        <w:spacing w:before="0" w:beforeAutospacing="off" w:after="180" w:afterAutospacing="off"/>
+        <w:ind w:left="0"/>
+      </w:pPr>
+      <w:r>
+        <w:rPr>
+          <w:rFonts w:ascii="Arial" w:hAnsi="Arial" w:eastAsia="Arial" w:cs="Arial"/>
+          <w:b w:val="1"/>
+          <w:bCs w:val="1"/>
+          <w:strike w:val="0"/>
+          <w:dstrike w:val="0"/>
+          <w:noProof w:val="0"/>
+          <w:color w:val="4C94D8" w:themeColor="text2" w:themeTint="80" w:themeShade="FF"/>
+          <w:sz w:val="24"/>
+          <w:szCs w:val="24"/>
+          <w:u w:val="none"/>
+          <w:lang w:val="en-GB"/>
+        </w:rPr>
+        <w:t>&lt;/form&gt;</w:t>
+      </w:r>
+    </w:p>
+    <w:p>
+      <w:pPr>
+        <w:pStyle w:val="Normal"/>
+        <w:spacing w:before="0" w:beforeAutospacing="off" w:after="180" w:afterAutospacing="off"/>
+        <w:ind w:left="0"/>
+        <w:rPr>
+          <w:rFonts w:ascii="Arial" w:hAnsi="Arial" w:eastAsia="Arial" w:cs="Arial"/>
+          <w:b w:val="1"/>
+          <w:bCs w:val="1"/>
+          <w:strike w:val="0"/>
+          <w:dstrike w:val="0"/>
+          <w:noProof w:val="0"/>
+          <w:color w:val="4C94D8" w:themeColor="text2" w:themeTint="80" w:themeShade="FF"/>
+          <w:sz w:val="24"/>
+          <w:szCs w:val="24"/>
+          <w:u w:val="none"/>
+          <w:lang w:val="en-GB"/>
+        </w:rPr>
+      </w:pPr>
+    </w:p>
+    <w:p>
+      <w:pPr>
+        <w:spacing w:before="360" w:beforeAutospacing="off" w:after="180" w:afterAutospacing="off"/>
+      </w:pPr>
+      <w:r>
+        <w:rPr>
+          <w:rFonts w:ascii="Arial" w:hAnsi="Arial" w:eastAsia="Arial" w:cs="Arial"/>
+          <w:b w:val="1"/>
+          <w:bCs w:val="1"/>
+          <w:strike w:val="0"/>
+          <w:dstrike w:val="0"/>
+          <w:noProof w:val="0"/>
+          <w:sz w:val="30"/>
+          <w:szCs w:val="30"/>
+          <w:u w:val="none"/>
+          <w:lang w:val="en-GB"/>
+        </w:rPr>
+        <w:t>Step 2: Write the PHP Processing Script</w:t>
+      </w:r>
+    </w:p>
+    <w:p>
+      <w:pPr>
+        <w:spacing w:before="180" w:beforeAutospacing="off" w:after="240" w:afterAutospacing="off"/>
+      </w:pPr>
+      <w:r>
+        <w:rPr>
+          <w:rFonts w:ascii="Arial" w:hAnsi="Arial" w:eastAsia="Arial" w:cs="Arial"/>
+          <w:b w:val="0"/>
+          <w:bCs w:val="0"/>
+          <w:strike w:val="0"/>
+          <w:dstrike w:val="0"/>
+          <w:noProof w:val="0"/>
+          <w:sz w:val="24"/>
+          <w:szCs w:val="24"/>
+          <w:u w:val="none"/>
+          <w:lang w:val="en-GB"/>
+        </w:rPr>
+        <w:t xml:space="preserve">In your processing file </w:t>
+      </w:r>
+      <w:r>
+        <w:rPr>
+          <w:rFonts w:ascii="Arial" w:hAnsi="Arial" w:eastAsia="Arial" w:cs="Arial"/>
+          <w:b w:val="1"/>
+          <w:bCs w:val="1"/>
+          <w:strike w:val="0"/>
+          <w:dstrike w:val="0"/>
+          <w:noProof w:val="0"/>
+          <w:sz w:val="24"/>
+          <w:szCs w:val="24"/>
+          <w:u w:val="none"/>
+          <w:lang w:val="en-GB"/>
+        </w:rPr>
+        <w:t>script.php</w:t>
+      </w:r>
+      <w:r>
+        <w:rPr>
+          <w:rFonts w:ascii="Arial" w:hAnsi="Arial" w:eastAsia="Arial" w:cs="Arial"/>
+          <w:b w:val="0"/>
+          <w:bCs w:val="0"/>
+          <w:strike w:val="0"/>
+          <w:dstrike w:val="0"/>
+          <w:noProof w:val="0"/>
+          <w:sz w:val="24"/>
+          <w:szCs w:val="24"/>
+          <w:u w:val="none"/>
+          <w:lang w:val="en-GB"/>
+        </w:rPr>
+        <w:t xml:space="preserve">, you access the values by calling the </w:t>
+      </w:r>
+      <w:r>
+        <w:rPr>
+          <w:rFonts w:ascii="Arial" w:hAnsi="Arial" w:eastAsia="Arial" w:cs="Arial"/>
+          <w:b w:val="0"/>
+          <w:bCs w:val="0"/>
+          <w:strike w:val="0"/>
+          <w:dstrike w:val="0"/>
+          <w:noProof w:val="0"/>
+          <w:sz w:val="24"/>
+          <w:szCs w:val="24"/>
+          <w:u w:val="none"/>
+          <w:lang w:val="en-GB"/>
+        </w:rPr>
+        <w:t>superglobal</w:t>
+      </w:r>
+      <w:r>
+        <w:rPr>
+          <w:rFonts w:ascii="Arial" w:hAnsi="Arial" w:eastAsia="Arial" w:cs="Arial"/>
+          <w:b w:val="0"/>
+          <w:bCs w:val="0"/>
+          <w:strike w:val="0"/>
+          <w:dstrike w:val="0"/>
+          <w:noProof w:val="0"/>
+          <w:sz w:val="24"/>
+          <w:szCs w:val="24"/>
+          <w:u w:val="none"/>
+          <w:lang w:val="en-GB"/>
+        </w:rPr>
+        <w:t xml:space="preserve"> array matching your form's method. Pass the input's </w:t>
+      </w:r>
+      <w:r>
+        <w:rPr>
+          <w:rFonts w:ascii="Consolas" w:hAnsi="Consolas" w:eastAsia="Consolas" w:cs="Consolas"/>
+          <w:b w:val="0"/>
+          <w:bCs w:val="0"/>
+          <w:strike w:val="0"/>
+          <w:dstrike w:val="0"/>
+          <w:noProof w:val="0"/>
+          <w:sz w:val="21"/>
+          <w:szCs w:val="21"/>
+          <w:u w:val="none"/>
+          <w:lang w:val="en-GB"/>
+        </w:rPr>
+        <w:t>name</w:t>
+      </w:r>
+      <w:r>
+        <w:rPr>
+          <w:rFonts w:ascii="Arial" w:hAnsi="Arial" w:eastAsia="Arial" w:cs="Arial"/>
+          <w:b w:val="0"/>
+          <w:bCs w:val="0"/>
+          <w:strike w:val="0"/>
+          <w:dstrike w:val="0"/>
+          <w:noProof w:val="0"/>
+          <w:sz w:val="24"/>
+          <w:szCs w:val="24"/>
+          <w:u w:val="none"/>
+          <w:lang w:val="en-GB"/>
+        </w:rPr>
+        <w:t xml:space="preserve"> attribute inside brackets as a string</w:t>
+      </w:r>
+    </w:p>
+    <w:p>
+      <w:pPr>
+        <w:spacing w:before="180" w:beforeAutospacing="off" w:after="240" w:afterAutospacing="off"/>
+        <w:rPr>
+          <w:rFonts w:ascii="Arial" w:hAnsi="Arial" w:eastAsia="Arial" w:cs="Arial"/>
+          <w:b w:val="0"/>
+          <w:bCs w:val="0"/>
+          <w:strike w:val="0"/>
+          <w:dstrike w:val="0"/>
+          <w:noProof w:val="0"/>
+          <w:sz w:val="24"/>
+          <w:szCs w:val="24"/>
+          <w:u w:val="none"/>
+          <w:lang w:val="en-GB"/>
+        </w:rPr>
+      </w:pPr>
+    </w:p>
+    <w:p>
+      <w:pPr>
+        <w:spacing w:before="180" w:beforeAutospacing="off" w:after="240" w:afterAutospacing="off"/>
+        <w:rPr>
+          <w:rFonts w:ascii="Arial" w:hAnsi="Arial" w:eastAsia="Arial" w:cs="Arial"/>
+          <w:b w:val="0"/>
+          <w:bCs w:val="0"/>
+          <w:strike w:val="0"/>
+          <w:dstrike w:val="0"/>
+          <w:noProof w:val="0"/>
+          <w:sz w:val="24"/>
+          <w:szCs w:val="24"/>
+          <w:u w:val="none"/>
+          <w:lang w:val="en-GB"/>
+        </w:rPr>
+      </w:pPr>
+    </w:p>
+    <w:p>
+      <w:pPr>
+        <w:pStyle w:val="Normal"/>
+        <w:spacing w:before="180" w:beforeAutospacing="off" w:after="240" w:afterAutospacing="off"/>
+      </w:pPr>
+      <w:r>
+        <w:rPr>
+          <w:rFonts w:ascii="Arial" w:hAnsi="Arial" w:eastAsia="Arial" w:cs="Arial"/>
+          <w:b w:val="1"/>
+          <w:bCs w:val="1"/>
+          <w:strike w:val="0"/>
+          <w:dstrike w:val="0"/>
+          <w:noProof w:val="0"/>
+          <w:color w:val="4C94D8" w:themeColor="text2" w:themeTint="80" w:themeShade="FF"/>
+          <w:sz w:val="24"/>
+          <w:szCs w:val="24"/>
+          <w:u w:val="none"/>
+          <w:lang w:val="en-GB"/>
+        </w:rPr>
+        <w:t>&lt;?php</w:t>
+      </w:r>
+    </w:p>
+    <w:p>
+      <w:pPr>
+        <w:pStyle w:val="Normal"/>
+        <w:spacing w:before="180" w:beforeAutospacing="off" w:after="240" w:afterAutospacing="off"/>
+        <w:rPr>
+          <w:rFonts w:ascii="Arial" w:hAnsi="Arial" w:eastAsia="Arial" w:cs="Arial"/>
+          <w:b w:val="1"/>
+          <w:bCs w:val="1"/>
+          <w:strike w:val="0"/>
+          <w:dstrike w:val="0"/>
+          <w:noProof w:val="0"/>
+          <w:color w:val="4C94D8" w:themeColor="text2" w:themeTint="80" w:themeShade="FF"/>
+          <w:sz w:val="24"/>
+          <w:szCs w:val="24"/>
+          <w:u w:val="none"/>
+          <w:lang w:val="en-GB"/>
+        </w:rPr>
+      </w:pPr>
+      <w:r>
+        <w:rPr>
+          <w:rFonts w:ascii="Arial" w:hAnsi="Arial" w:eastAsia="Arial" w:cs="Arial"/>
+          <w:b w:val="1"/>
+          <w:bCs w:val="1"/>
+          <w:strike w:val="0"/>
+          <w:dstrike w:val="0"/>
+          <w:noProof w:val="0"/>
+          <w:color w:val="4C94D8" w:themeColor="text2" w:themeTint="80" w:themeShade="FF"/>
+          <w:sz w:val="24"/>
+          <w:szCs w:val="24"/>
+          <w:u w:val="none"/>
+          <w:lang w:val="en-GB"/>
+        </w:rPr>
+        <w:t>// process.php</w:t>
+      </w:r>
+    </w:p>
+    <w:p>
+      <w:pPr>
+        <w:pStyle w:val="Normal"/>
+        <w:spacing w:before="180" w:beforeAutospacing="off" w:after="240" w:afterAutospacing="off"/>
+        <w:rPr>
+          <w:rFonts w:ascii="Arial" w:hAnsi="Arial" w:eastAsia="Arial" w:cs="Arial"/>
+          <w:b w:val="1"/>
+          <w:bCs w:val="1"/>
+          <w:strike w:val="0"/>
+          <w:dstrike w:val="0"/>
+          <w:noProof w:val="0"/>
+          <w:color w:val="4C94D8" w:themeColor="text2" w:themeTint="80" w:themeShade="FF"/>
+          <w:sz w:val="24"/>
+          <w:szCs w:val="24"/>
+          <w:u w:val="none"/>
+          <w:lang w:val="en-GB"/>
+        </w:rPr>
+      </w:pPr>
+      <w:r>
+        <w:rPr>
+          <w:rFonts w:ascii="Arial" w:hAnsi="Arial" w:eastAsia="Arial" w:cs="Arial"/>
+          <w:b w:val="1"/>
+          <w:bCs w:val="1"/>
+          <w:strike w:val="0"/>
+          <w:dstrike w:val="0"/>
+          <w:noProof w:val="0"/>
+          <w:color w:val="4C94D8" w:themeColor="text2" w:themeTint="80" w:themeShade="FF"/>
+          <w:sz w:val="24"/>
+          <w:szCs w:val="24"/>
+          <w:u w:val="none"/>
+          <w:lang w:val="en-GB"/>
+        </w:rPr>
+        <w:t xml:space="preserve"> </w:t>
+      </w:r>
+    </w:p>
+    <w:p>
+      <w:pPr>
+        <w:pStyle w:val="Normal"/>
+        <w:spacing w:before="180" w:beforeAutospacing="off" w:after="240" w:afterAutospacing="off"/>
+        <w:rPr>
+          <w:rFonts w:ascii="Arial" w:hAnsi="Arial" w:eastAsia="Arial" w:cs="Arial"/>
+          <w:b w:val="1"/>
+          <w:bCs w:val="1"/>
+          <w:strike w:val="0"/>
+          <w:dstrike w:val="0"/>
+          <w:noProof w:val="0"/>
+          <w:color w:val="4C94D8" w:themeColor="text2" w:themeTint="80" w:themeShade="FF"/>
+          <w:sz w:val="24"/>
+          <w:szCs w:val="24"/>
+          <w:u w:val="none"/>
+          <w:lang w:val="en-GB"/>
+        </w:rPr>
+      </w:pPr>
+      <w:r>
+        <w:rPr>
+          <w:rFonts w:ascii="Arial" w:hAnsi="Arial" w:eastAsia="Arial" w:cs="Arial"/>
+          <w:b w:val="1"/>
+          <w:bCs w:val="1"/>
+          <w:strike w:val="0"/>
+          <w:dstrike w:val="0"/>
+          <w:noProof w:val="0"/>
+          <w:color w:val="4C94D8" w:themeColor="text2" w:themeTint="80" w:themeShade="FF"/>
+          <w:sz w:val="24"/>
+          <w:szCs w:val="24"/>
+          <w:u w:val="none"/>
+          <w:lang w:val="en-GB"/>
+        </w:rPr>
+        <w:t>// 1. Verify if the form was actually submitted via POST</w:t>
+      </w:r>
+    </w:p>
+    <w:p>
+      <w:pPr>
+        <w:pStyle w:val="Normal"/>
+        <w:spacing w:before="180" w:beforeAutospacing="off" w:after="240" w:afterAutospacing="off"/>
+        <w:rPr>
+          <w:rFonts w:ascii="Arial" w:hAnsi="Arial" w:eastAsia="Arial" w:cs="Arial"/>
+          <w:b w:val="1"/>
+          <w:bCs w:val="1"/>
+          <w:strike w:val="0"/>
+          <w:dstrike w:val="0"/>
+          <w:noProof w:val="0"/>
+          <w:color w:val="4C94D8" w:themeColor="text2" w:themeTint="80" w:themeShade="FF"/>
+          <w:sz w:val="24"/>
+          <w:szCs w:val="24"/>
+          <w:u w:val="none"/>
+          <w:lang w:val="en-GB"/>
+        </w:rPr>
+      </w:pPr>
+      <w:r>
+        <w:rPr>
+          <w:rFonts w:ascii="Arial" w:hAnsi="Arial" w:eastAsia="Arial" w:cs="Arial"/>
+          <w:b w:val="1"/>
+          <w:bCs w:val="1"/>
+          <w:strike w:val="0"/>
+          <w:dstrike w:val="0"/>
+          <w:noProof w:val="0"/>
+          <w:color w:val="4C94D8" w:themeColor="text2" w:themeTint="80" w:themeShade="FF"/>
+          <w:sz w:val="24"/>
+          <w:szCs w:val="24"/>
+          <w:u w:val="none"/>
+          <w:lang w:val="en-GB"/>
+        </w:rPr>
+        <w:t>if ($_SERVER["REQUEST_METHOD"] == "POST") {</w:t>
+      </w:r>
+    </w:p>
+    <w:p>
+      <w:pPr>
+        <w:pStyle w:val="Normal"/>
+        <w:spacing w:before="180" w:beforeAutospacing="off" w:after="240" w:afterAutospacing="off"/>
+        <w:rPr>
+          <w:rFonts w:ascii="Arial" w:hAnsi="Arial" w:eastAsia="Arial" w:cs="Arial"/>
+          <w:i w:val="1"/>
+          <w:iCs w:val="1"/>
+          <w:noProof w:val="0"/>
+          <w:color w:val="auto"/>
+          <w:sz w:val="22"/>
+          <w:szCs w:val="22"/>
+          <w:lang w:val="en-GB"/>
+        </w:rPr>
+      </w:pPr>
+      <w:r>
+        <w:rPr>
+          <w:rFonts w:ascii="Arial" w:hAnsi="Arial" w:eastAsia="Arial" w:cs="Arial"/>
+          <w:b w:val="1"/>
+          <w:bCs w:val="1"/>
+          <w:strike w:val="0"/>
+          <w:dstrike w:val="0"/>
+          <w:noProof w:val="0"/>
+          <w:color w:val="4C94D8" w:themeColor="text2" w:themeTint="80" w:themeShade="FF"/>
+          <w:sz w:val="24"/>
+          <w:szCs w:val="24"/>
+          <w:u w:val="none"/>
+          <w:lang w:val="en-GB"/>
+        </w:rPr>
+        <w:t xml:space="preserve">   </w:t>
+      </w:r>
+      <w:r>
+        <w:rPr>
+          <w:rFonts w:ascii="Arial" w:hAnsi="Arial" w:eastAsia="Arial" w:cs="Arial"/>
+          <w:b w:val="1"/>
+          <w:bCs w:val="1"/>
+          <w:strike w:val="0"/>
+          <w:dstrike w:val="0"/>
+          <w:noProof w:val="0"/>
+          <w:color w:val="auto"/>
+          <w:sz w:val="24"/>
+          <w:szCs w:val="24"/>
+          <w:u w:val="none"/>
+          <w:lang w:val="en-GB"/>
+        </w:rPr>
+        <w:t xml:space="preserve"> </w:t>
+      </w:r>
+      <w:r>
+        <w:rPr>
+          <w:rFonts w:ascii="Arial" w:hAnsi="Arial" w:eastAsia="Arial" w:cs="Arial"/>
+          <w:i w:val="1"/>
+          <w:iCs w:val="1"/>
+          <w:noProof w:val="0"/>
+          <w:color w:val="auto"/>
+          <w:sz w:val="24"/>
+          <w:szCs w:val="24"/>
+          <w:lang w:val="en-GB"/>
+        </w:rPr>
+        <w:t>I</w:t>
+      </w:r>
+      <w:r>
+        <w:rPr>
+          <w:rFonts w:ascii="Arial" w:hAnsi="Arial" w:eastAsia="Arial" w:cs="Arial"/>
+          <w:i w:val="1"/>
+          <w:iCs w:val="1"/>
+          <w:noProof w:val="0"/>
+          <w:color w:val="auto"/>
+          <w:sz w:val="22"/>
+          <w:szCs w:val="22"/>
+          <w:lang w:val="en-GB"/>
+        </w:rPr>
+        <w:t xml:space="preserve">t must be written exactly as </w:t>
+      </w:r>
+      <w:r>
+        <w:rPr>
+          <w:rFonts w:ascii="Consolas" w:hAnsi="Consolas" w:eastAsia="Consolas" w:cs="Consolas"/>
+          <w:b w:val="1"/>
+          <w:bCs w:val="1"/>
+          <w:i w:val="1"/>
+          <w:iCs w:val="1"/>
+          <w:strike w:val="0"/>
+          <w:dstrike w:val="0"/>
+          <w:noProof w:val="0"/>
+          <w:color w:val="auto"/>
+          <w:sz w:val="22"/>
+          <w:szCs w:val="22"/>
+          <w:u w:val="none"/>
+          <w:lang w:val="en-GB"/>
+        </w:rPr>
+        <w:t>REQUEST_METHOD</w:t>
+      </w:r>
+      <w:r>
+        <w:rPr>
+          <w:rFonts w:ascii="Arial" w:hAnsi="Arial" w:eastAsia="Arial" w:cs="Arial"/>
+          <w:i w:val="1"/>
+          <w:iCs w:val="1"/>
+          <w:noProof w:val="0"/>
+          <w:color w:val="auto"/>
+          <w:sz w:val="22"/>
+          <w:szCs w:val="22"/>
+          <w:lang w:val="en-GB"/>
+        </w:rPr>
+        <w:t xml:space="preserve"> (in all capital letters) every single time</w:t>
+      </w:r>
+    </w:p>
+    <w:p>
+      <w:pPr>
+        <w:pStyle w:val="Normal"/>
+        <w:spacing w:before="180" w:beforeAutospacing="off" w:after="240" w:afterAutospacing="off"/>
+        <w:rPr>
+          <w:rFonts w:ascii="Arial" w:hAnsi="Arial" w:eastAsia="Arial" w:cs="Arial"/>
+          <w:i w:val="1"/>
+          <w:iCs w:val="1"/>
+          <w:noProof w:val="0"/>
+          <w:color w:val="auto"/>
+          <w:sz w:val="22"/>
+          <w:szCs w:val="22"/>
+          <w:lang w:val="en-GB"/>
+        </w:rPr>
+      </w:pPr>
+      <w:r>
+        <w:rPr>
+          <w:rFonts w:ascii="Consolas" w:hAnsi="Consolas" w:eastAsia="Consolas" w:cs="Consolas"/>
+          <w:b w:val="1"/>
+          <w:bCs w:val="1"/>
+          <w:i w:val="1"/>
+          <w:iCs w:val="1"/>
+          <w:strike w:val="0"/>
+          <w:dstrike w:val="0"/>
+          <w:noProof w:val="0"/>
+          <w:color w:val="auto"/>
+          <w:sz w:val="22"/>
+          <w:szCs w:val="22"/>
+          <w:u w:val="none"/>
+          <w:lang w:val="en-GB"/>
+        </w:rPr>
+        <w:t>"REQUEST_METHOD"</w:t>
+      </w:r>
+      <w:r>
+        <w:rPr>
+          <w:rFonts w:ascii="Arial" w:hAnsi="Arial" w:eastAsia="Arial" w:cs="Arial"/>
+          <w:i w:val="1"/>
+          <w:iCs w:val="1"/>
+          <w:noProof w:val="0"/>
+          <w:color w:val="auto"/>
+          <w:sz w:val="22"/>
+          <w:szCs w:val="22"/>
+          <w:lang w:val="en-GB"/>
+        </w:rPr>
+        <w:t xml:space="preserve"> is hardcoded directly into the PHP engine. Think it like a </w:t>
+      </w:r>
+      <w:r>
+        <w:rPr>
+          <w:rFonts w:ascii="Arial" w:hAnsi="Arial" w:eastAsia="Arial" w:cs="Arial"/>
+          <w:i w:val="1"/>
+          <w:iCs w:val="1"/>
+          <w:noProof w:val="0"/>
+          <w:color w:val="auto"/>
+          <w:sz w:val="22"/>
+          <w:szCs w:val="22"/>
+          <w:lang w:val="en-GB"/>
+        </w:rPr>
+        <w:t>sysntax</w:t>
+      </w:r>
+    </w:p>
+    <w:p>
+      <w:pPr>
+        <w:pStyle w:val="Normal"/>
+        <w:spacing w:before="180" w:beforeAutospacing="off" w:after="240" w:afterAutospacing="off"/>
+        <w:rPr>
+          <w:rFonts w:ascii="Arial" w:hAnsi="Arial" w:eastAsia="Arial" w:cs="Arial"/>
+          <w:i w:val="1"/>
+          <w:iCs w:val="1"/>
+          <w:noProof w:val="0"/>
+          <w:color w:val="auto"/>
+          <w:sz w:val="22"/>
+          <w:szCs w:val="22"/>
+          <w:lang w:val="en-GB"/>
+        </w:rPr>
+      </w:pPr>
+    </w:p>
+    <w:p>
+      <w:pPr>
+        <w:pStyle w:val="ListParagraph"/>
+        <w:numPr>
+          <w:ilvl w:val="0"/>
+          <w:numId w:val="1"/>
+        </w:numPr>
+        <w:spacing w:before="0" w:beforeAutospacing="off" w:after="180" w:afterAutospacing="off"/>
+        <w:rPr>
+          <w:rFonts w:ascii="Arial" w:hAnsi="Arial" w:eastAsia="Arial" w:cs="Arial"/>
+          <w:b w:val="0"/>
+          <w:bCs w:val="0"/>
+          <w:i w:val="1"/>
+          <w:iCs w:val="1"/>
+          <w:strike w:val="0"/>
+          <w:dstrike w:val="0"/>
+          <w:noProof w:val="0"/>
+          <w:sz w:val="22"/>
+          <w:szCs w:val="22"/>
+          <w:u w:val="none"/>
+          <w:lang w:val="en-GB"/>
+        </w:rPr>
+      </w:pPr>
+      <w:r>
+        <w:rPr>
+          <w:rFonts w:ascii="Arial" w:hAnsi="Arial" w:eastAsia="Arial" w:cs="Arial"/>
+          <w:b w:val="0"/>
+          <w:bCs w:val="0"/>
+          <w:i w:val="1"/>
+          <w:iCs w:val="1"/>
+          <w:strike w:val="0"/>
+          <w:dstrike w:val="0"/>
+          <w:noProof w:val="0"/>
+          <w:sz w:val="22"/>
+          <w:szCs w:val="22"/>
+          <w:u w:val="none"/>
+          <w:lang w:val="en-GB"/>
+        </w:rPr>
+        <w:t xml:space="preserve">f using </w:t>
+      </w:r>
+      <w:r>
+        <w:rPr>
+          <w:rFonts w:ascii="Consolas" w:hAnsi="Consolas" w:eastAsia="Consolas" w:cs="Consolas"/>
+          <w:b w:val="0"/>
+          <w:bCs w:val="0"/>
+          <w:i w:val="1"/>
+          <w:iCs w:val="1"/>
+          <w:strike w:val="0"/>
+          <w:dstrike w:val="0"/>
+          <w:noProof w:val="0"/>
+          <w:sz w:val="22"/>
+          <w:szCs w:val="22"/>
+          <w:u w:val="none"/>
+          <w:lang w:val="en-GB"/>
+        </w:rPr>
+        <w:t>POST</w:t>
+      </w:r>
+      <w:r>
+        <w:rPr>
+          <w:rFonts w:ascii="Arial" w:hAnsi="Arial" w:eastAsia="Arial" w:cs="Arial"/>
+          <w:b w:val="0"/>
+          <w:bCs w:val="0"/>
+          <w:i w:val="1"/>
+          <w:iCs w:val="1"/>
+          <w:strike w:val="0"/>
+          <w:dstrike w:val="0"/>
+          <w:noProof w:val="0"/>
+          <w:sz w:val="22"/>
+          <w:szCs w:val="22"/>
+          <w:u w:val="none"/>
+          <w:lang w:val="en-GB"/>
+        </w:rPr>
+        <w:t xml:space="preserve">: The data payload is hidden inside the </w:t>
+      </w:r>
+      <w:r>
+        <w:rPr>
+          <w:rFonts w:ascii="Arial" w:hAnsi="Arial" w:eastAsia="Arial" w:cs="Arial"/>
+          <w:b w:val="1"/>
+          <w:bCs w:val="1"/>
+          <w:i w:val="1"/>
+          <w:iCs w:val="1"/>
+          <w:strike w:val="0"/>
+          <w:dstrike w:val="0"/>
+          <w:noProof w:val="0"/>
+          <w:sz w:val="22"/>
+          <w:szCs w:val="22"/>
+          <w:u w:val="none"/>
+          <w:lang w:val="en-GB"/>
+        </w:rPr>
+        <w:t>HTTP Request Body</w:t>
+      </w:r>
+      <w:r>
+        <w:rPr>
+          <w:rFonts w:ascii="Arial" w:hAnsi="Arial" w:eastAsia="Arial" w:cs="Arial"/>
+          <w:b w:val="0"/>
+          <w:bCs w:val="0"/>
+          <w:i w:val="1"/>
+          <w:iCs w:val="1"/>
+          <w:strike w:val="0"/>
+          <w:dstrike w:val="0"/>
+          <w:noProof w:val="0"/>
+          <w:sz w:val="22"/>
+          <w:szCs w:val="22"/>
+          <w:u w:val="none"/>
+          <w:lang w:val="en-GB"/>
+        </w:rPr>
+        <w:t>.</w:t>
+      </w:r>
+    </w:p>
+    <w:p>
+      <w:pPr>
+        <w:pStyle w:val="ListParagraph"/>
+        <w:numPr>
+          <w:ilvl w:val="0"/>
+          <w:numId w:val="1"/>
+        </w:numPr>
+        <w:spacing w:before="0" w:beforeAutospacing="off" w:after="180" w:afterAutospacing="off"/>
+        <w:rPr>
+          <w:rFonts w:ascii="Arial" w:hAnsi="Arial" w:eastAsia="Arial" w:cs="Arial"/>
+          <w:b w:val="0"/>
+          <w:bCs w:val="0"/>
+          <w:i w:val="1"/>
+          <w:iCs w:val="1"/>
+          <w:strike w:val="0"/>
+          <w:dstrike w:val="0"/>
+          <w:noProof w:val="0"/>
+          <w:sz w:val="22"/>
+          <w:szCs w:val="22"/>
+          <w:u w:val="none"/>
+          <w:lang w:val="en-GB"/>
+        </w:rPr>
+      </w:pPr>
+      <w:r>
+        <w:rPr>
+          <w:rFonts w:ascii="Arial" w:hAnsi="Arial" w:eastAsia="Arial" w:cs="Arial"/>
+          <w:b w:val="0"/>
+          <w:bCs w:val="0"/>
+          <w:i w:val="1"/>
+          <w:iCs w:val="1"/>
+          <w:strike w:val="0"/>
+          <w:dstrike w:val="0"/>
+          <w:noProof w:val="0"/>
+          <w:sz w:val="22"/>
+          <w:szCs w:val="22"/>
+          <w:u w:val="none"/>
+          <w:lang w:val="en-GB"/>
+        </w:rPr>
+        <w:t xml:space="preserve">If using </w:t>
+      </w:r>
+      <w:r>
+        <w:rPr>
+          <w:rFonts w:ascii="Consolas" w:hAnsi="Consolas" w:eastAsia="Consolas" w:cs="Consolas"/>
+          <w:b w:val="0"/>
+          <w:bCs w:val="0"/>
+          <w:i w:val="1"/>
+          <w:iCs w:val="1"/>
+          <w:strike w:val="0"/>
+          <w:dstrike w:val="0"/>
+          <w:noProof w:val="0"/>
+          <w:sz w:val="22"/>
+          <w:szCs w:val="22"/>
+          <w:u w:val="none"/>
+          <w:lang w:val="en-GB"/>
+        </w:rPr>
+        <w:t>GET</w:t>
+      </w:r>
+      <w:r>
+        <w:rPr>
+          <w:rFonts w:ascii="Arial" w:hAnsi="Arial" w:eastAsia="Arial" w:cs="Arial"/>
+          <w:b w:val="0"/>
+          <w:bCs w:val="0"/>
+          <w:i w:val="1"/>
+          <w:iCs w:val="1"/>
+          <w:strike w:val="0"/>
+          <w:dstrike w:val="0"/>
+          <w:noProof w:val="0"/>
+          <w:sz w:val="22"/>
+          <w:szCs w:val="22"/>
+          <w:u w:val="none"/>
+          <w:lang w:val="en-GB"/>
+        </w:rPr>
+        <w:t xml:space="preserve">: The data payload is appended directly to the </w:t>
+      </w:r>
+      <w:r>
+        <w:rPr>
+          <w:rFonts w:ascii="Arial" w:hAnsi="Arial" w:eastAsia="Arial" w:cs="Arial"/>
+          <w:b w:val="1"/>
+          <w:bCs w:val="1"/>
+          <w:i w:val="1"/>
+          <w:iCs w:val="1"/>
+          <w:strike w:val="0"/>
+          <w:dstrike w:val="0"/>
+          <w:noProof w:val="0"/>
+          <w:sz w:val="22"/>
+          <w:szCs w:val="22"/>
+          <w:u w:val="none"/>
+          <w:lang w:val="en-GB"/>
+        </w:rPr>
+        <w:t>URL string</w:t>
+      </w:r>
+      <w:r>
+        <w:rPr>
+          <w:rFonts w:ascii="Arial" w:hAnsi="Arial" w:eastAsia="Arial" w:cs="Arial"/>
+          <w:b w:val="0"/>
+          <w:bCs w:val="0"/>
+          <w:i w:val="1"/>
+          <w:iCs w:val="1"/>
+          <w:strike w:val="0"/>
+          <w:dstrike w:val="0"/>
+          <w:noProof w:val="0"/>
+          <w:sz w:val="22"/>
+          <w:szCs w:val="22"/>
+          <w:u w:val="none"/>
+          <w:lang w:val="en-GB"/>
+        </w:rPr>
+        <w:t xml:space="preserve"> after </w:t>
+      </w:r>
+      <w:r>
+        <w:rPr>
+          <w:rFonts w:ascii="Arial" w:hAnsi="Arial" w:eastAsia="Arial" w:cs="Arial"/>
+          <w:b w:val="0"/>
+          <w:bCs w:val="0"/>
+          <w:i w:val="1"/>
+          <w:iCs w:val="1"/>
+          <w:strike w:val="0"/>
+          <w:dstrike w:val="0"/>
+          <w:noProof w:val="0"/>
+          <w:sz w:val="22"/>
+          <w:szCs w:val="22"/>
+          <w:u w:val="none"/>
+          <w:lang w:val="en-GB"/>
+        </w:rPr>
+        <w:t xml:space="preserve">a </w:t>
+      </w:r>
+      <w:r>
+        <w:rPr>
+          <w:rFonts w:ascii="Consolas" w:hAnsi="Consolas" w:eastAsia="Consolas" w:cs="Consolas"/>
+          <w:b w:val="0"/>
+          <w:bCs w:val="0"/>
+          <w:i w:val="1"/>
+          <w:iCs w:val="1"/>
+          <w:strike w:val="0"/>
+          <w:dstrike w:val="0"/>
+          <w:noProof w:val="0"/>
+          <w:sz w:val="22"/>
+          <w:szCs w:val="22"/>
+          <w:u w:val="none"/>
+          <w:lang w:val="en-GB"/>
+        </w:rPr>
+        <w:t>?</w:t>
+      </w:r>
+      <w:r>
+        <w:rPr>
+          <w:rFonts w:ascii="Arial" w:hAnsi="Arial" w:eastAsia="Arial" w:cs="Arial"/>
+          <w:b w:val="0"/>
+          <w:bCs w:val="0"/>
+          <w:i w:val="1"/>
+          <w:iCs w:val="1"/>
+          <w:strike w:val="0"/>
+          <w:dstrike w:val="0"/>
+          <w:noProof w:val="0"/>
+          <w:sz w:val="22"/>
+          <w:szCs w:val="22"/>
+          <w:u w:val="none"/>
+          <w:lang w:val="en-GB"/>
+        </w:rPr>
+        <w:t>. means POST is more secure than GET</w:t>
+      </w:r>
+    </w:p>
+    <w:p>
+      <w:pPr>
+        <w:pStyle w:val="Normal"/>
+        <w:spacing w:before="0" w:beforeAutospacing="off" w:after="180" w:afterAutospacing="off"/>
+        <w:ind w:left="0"/>
+        <w:rPr>
+          <w:rFonts w:ascii="Arial" w:hAnsi="Arial" w:eastAsia="Arial" w:cs="Arial"/>
+          <w:b w:val="1"/>
+          <w:bCs w:val="1"/>
+          <w:i w:val="1"/>
+          <w:iCs w:val="1"/>
+          <w:strike w:val="0"/>
+          <w:dstrike w:val="0"/>
+          <w:noProof w:val="0"/>
+          <w:sz w:val="22"/>
+          <w:szCs w:val="22"/>
+          <w:u w:val="none"/>
+          <w:lang w:val="en-GB"/>
+        </w:rPr>
+      </w:pPr>
+      <w:r>
+        <w:rPr>
+          <w:rFonts w:ascii="Consolas" w:hAnsi="Consolas" w:eastAsia="Consolas" w:cs="Consolas"/>
+          <w:b w:val="0"/>
+          <w:bCs w:val="0"/>
+          <w:i w:val="1"/>
+          <w:iCs w:val="1"/>
+          <w:strike w:val="0"/>
+          <w:dstrike w:val="0"/>
+          <w:noProof w:val="0"/>
+          <w:sz w:val="22"/>
+          <w:szCs w:val="22"/>
+          <w:u w:val="none"/>
+          <w:lang w:val="en-GB"/>
+        </w:rPr>
+        <w:t>POST</w:t>
+      </w:r>
+      <w:r>
+        <w:rPr>
+          <w:rFonts w:ascii="Arial" w:hAnsi="Arial" w:eastAsia="Arial" w:cs="Arial"/>
+          <w:i w:val="1"/>
+          <w:iCs w:val="1"/>
+          <w:noProof w:val="0"/>
+          <w:sz w:val="22"/>
+          <w:szCs w:val="22"/>
+          <w:lang w:val="en-GB"/>
+        </w:rPr>
+        <w:t xml:space="preserve"> is used instead of </w:t>
+      </w:r>
+      <w:r>
+        <w:rPr>
+          <w:rFonts w:ascii="Consolas" w:hAnsi="Consolas" w:eastAsia="Consolas" w:cs="Consolas"/>
+          <w:b w:val="0"/>
+          <w:bCs w:val="0"/>
+          <w:i w:val="1"/>
+          <w:iCs w:val="1"/>
+          <w:strike w:val="0"/>
+          <w:dstrike w:val="0"/>
+          <w:noProof w:val="0"/>
+          <w:sz w:val="22"/>
+          <w:szCs w:val="22"/>
+          <w:u w:val="none"/>
+          <w:lang w:val="en-GB"/>
+        </w:rPr>
+        <w:t>GET</w:t>
+      </w:r>
+      <w:r>
+        <w:rPr>
+          <w:rFonts w:ascii="Arial" w:hAnsi="Arial" w:eastAsia="Arial" w:cs="Arial"/>
+          <w:i w:val="1"/>
+          <w:iCs w:val="1"/>
+          <w:noProof w:val="0"/>
+          <w:sz w:val="22"/>
+          <w:szCs w:val="22"/>
+          <w:lang w:val="en-GB"/>
+        </w:rPr>
+        <w:t xml:space="preserve"> for processing this form due to three critical technical reasons: </w:t>
+      </w:r>
+      <w:r>
+        <w:rPr>
+          <w:rFonts w:ascii="Arial" w:hAnsi="Arial" w:eastAsia="Arial" w:cs="Arial"/>
+          <w:b w:val="1"/>
+          <w:bCs w:val="1"/>
+          <w:i w:val="1"/>
+          <w:iCs w:val="1"/>
+          <w:strike w:val="0"/>
+          <w:dstrike w:val="0"/>
+          <w:noProof w:val="0"/>
+          <w:sz w:val="22"/>
+          <w:szCs w:val="22"/>
+          <w:u w:val="none"/>
+          <w:lang w:val="en-GB"/>
+        </w:rPr>
+        <w:t>security, data privacy, and server limitations.</w:t>
+      </w:r>
+    </w:p>
+    <w:p>
+      <w:pPr>
+        <w:pStyle w:val="Normal"/>
+        <w:spacing w:before="0" w:beforeAutospacing="off" w:after="180" w:afterAutospacing="off"/>
+        <w:ind w:left="0"/>
+      </w:pPr>
+      <w:r>
+        <w:rPr>
+          <w:rFonts w:ascii="Arial" w:hAnsi="Arial" w:eastAsia="Arial" w:cs="Arial"/>
+          <w:b w:val="1"/>
+          <w:bCs w:val="1"/>
+          <w:i w:val="1"/>
+          <w:iCs w:val="1"/>
+          <w:strike w:val="0"/>
+          <w:dstrike w:val="0"/>
+          <w:noProof w:val="0"/>
+          <w:color w:val="A5C9EB" w:themeColor="text2" w:themeTint="40" w:themeShade="FF"/>
+          <w:sz w:val="24"/>
+          <w:szCs w:val="24"/>
+          <w:u w:val="none"/>
+          <w:lang w:val="en-GB"/>
+        </w:rPr>
+        <w:t>if ($_SERVER["REQUEST_METHOD"] == "POST")</w:t>
+      </w:r>
+      <w:r>
+        <w:rPr>
+          <w:rFonts w:ascii="Arial" w:hAnsi="Arial" w:eastAsia="Arial" w:cs="Arial"/>
+          <w:b w:val="1"/>
+          <w:bCs w:val="1"/>
+          <w:i w:val="1"/>
+          <w:iCs w:val="1"/>
+          <w:strike w:val="0"/>
+          <w:dstrike w:val="0"/>
+          <w:noProof w:val="0"/>
+          <w:color w:val="4C94D8" w:themeColor="text2" w:themeTint="80" w:themeShade="FF"/>
+          <w:sz w:val="24"/>
+          <w:szCs w:val="24"/>
+          <w:u w:val="none"/>
+          <w:lang w:val="en-GB"/>
+        </w:rPr>
+        <w:t xml:space="preserve"> </w:t>
+      </w:r>
+    </w:p>
+    <w:p>
+      <w:pPr>
+        <w:pStyle w:val="ListParagraph"/>
+        <w:numPr>
+          <w:ilvl w:val="0"/>
+          <w:numId w:val="1"/>
+        </w:numPr>
+        <w:spacing w:before="0" w:beforeAutospacing="off" w:after="180" w:afterAutospacing="off"/>
+        <w:rPr>
+          <w:rFonts w:ascii="Arial" w:hAnsi="Arial" w:eastAsia="Arial" w:cs="Arial"/>
+          <w:b w:val="0"/>
+          <w:bCs w:val="0"/>
+          <w:i w:val="1"/>
+          <w:iCs w:val="1"/>
+          <w:strike w:val="0"/>
+          <w:dstrike w:val="0"/>
+          <w:noProof w:val="0"/>
+          <w:sz w:val="22"/>
+          <w:szCs w:val="22"/>
+          <w:u w:val="none"/>
+          <w:lang w:val="en-GB"/>
+        </w:rPr>
+      </w:pPr>
+      <w:r>
+        <w:rPr>
+          <w:rFonts w:ascii="Arial" w:hAnsi="Arial" w:eastAsia="Arial" w:cs="Arial"/>
+          <w:b w:val="1"/>
+          <w:bCs w:val="1"/>
+          <w:i w:val="1"/>
+          <w:iCs w:val="1"/>
+          <w:strike w:val="0"/>
+          <w:dstrike w:val="0"/>
+          <w:noProof w:val="0"/>
+          <w:sz w:val="22"/>
+          <w:szCs w:val="22"/>
+          <w:u w:val="none"/>
+          <w:lang w:val="en-GB"/>
+        </w:rPr>
+        <w:t>What it does</w:t>
+      </w:r>
+      <w:r>
+        <w:rPr>
+          <w:rFonts w:ascii="Arial" w:hAnsi="Arial" w:eastAsia="Arial" w:cs="Arial"/>
+          <w:b w:val="0"/>
+          <w:bCs w:val="0"/>
+          <w:i w:val="1"/>
+          <w:iCs w:val="1"/>
+          <w:strike w:val="0"/>
+          <w:dstrike w:val="0"/>
+          <w:noProof w:val="0"/>
+          <w:sz w:val="22"/>
+          <w:szCs w:val="22"/>
+          <w:u w:val="none"/>
+          <w:lang w:val="en-GB"/>
+        </w:rPr>
+        <w:t>: Checks if the page was accessed via a form submission.</w:t>
+      </w:r>
+    </w:p>
+    <w:p>
+      <w:pPr>
+        <w:pStyle w:val="ListParagraph"/>
+        <w:numPr>
+          <w:ilvl w:val="0"/>
+          <w:numId w:val="1"/>
+        </w:numPr>
+        <w:spacing w:before="0" w:beforeAutospacing="off" w:after="180" w:afterAutospacing="off"/>
+        <w:rPr>
+          <w:rFonts w:ascii="Arial" w:hAnsi="Arial" w:eastAsia="Arial" w:cs="Arial"/>
+          <w:b w:val="0"/>
+          <w:bCs w:val="0"/>
+          <w:i w:val="1"/>
+          <w:iCs w:val="1"/>
+          <w:strike w:val="0"/>
+          <w:dstrike w:val="0"/>
+          <w:noProof w:val="0"/>
+          <w:sz w:val="22"/>
+          <w:szCs w:val="22"/>
+          <w:u w:val="none"/>
+          <w:lang w:val="en-GB"/>
+        </w:rPr>
+      </w:pPr>
+      <w:r>
+        <w:rPr>
+          <w:rFonts w:ascii="Arial" w:hAnsi="Arial" w:eastAsia="Arial" w:cs="Arial"/>
+          <w:b w:val="1"/>
+          <w:bCs w:val="1"/>
+          <w:i w:val="1"/>
+          <w:iCs w:val="1"/>
+          <w:strike w:val="0"/>
+          <w:dstrike w:val="0"/>
+          <w:noProof w:val="0"/>
+          <w:sz w:val="22"/>
+          <w:szCs w:val="22"/>
+          <w:u w:val="none"/>
+          <w:lang w:val="en-GB"/>
+        </w:rPr>
+        <w:t>Why it matters</w:t>
+      </w:r>
+      <w:r>
+        <w:rPr>
+          <w:rFonts w:ascii="Arial" w:hAnsi="Arial" w:eastAsia="Arial" w:cs="Arial"/>
+          <w:b w:val="0"/>
+          <w:bCs w:val="0"/>
+          <w:i w:val="1"/>
+          <w:iCs w:val="1"/>
+          <w:strike w:val="0"/>
+          <w:dstrike w:val="0"/>
+          <w:noProof w:val="0"/>
+          <w:sz w:val="22"/>
+          <w:szCs w:val="22"/>
+          <w:u w:val="none"/>
+          <w:lang w:val="en-GB"/>
+        </w:rPr>
+        <w:t xml:space="preserve">: Prevents the script from running if someone just types </w:t>
+      </w:r>
+      <w:r>
+        <w:rPr>
+          <w:rFonts w:ascii="Consolas" w:hAnsi="Consolas" w:eastAsia="Consolas" w:cs="Consolas"/>
+          <w:b w:val="0"/>
+          <w:bCs w:val="0"/>
+          <w:i w:val="1"/>
+          <w:iCs w:val="1"/>
+          <w:strike w:val="0"/>
+          <w:dstrike w:val="0"/>
+          <w:noProof w:val="0"/>
+          <w:sz w:val="22"/>
+          <w:szCs w:val="22"/>
+          <w:u w:val="none"/>
+          <w:lang w:val="en-GB"/>
+        </w:rPr>
+        <w:t>process.php</w:t>
+      </w:r>
+      <w:r>
+        <w:rPr>
+          <w:rFonts w:ascii="Arial" w:hAnsi="Arial" w:eastAsia="Arial" w:cs="Arial"/>
+          <w:b w:val="0"/>
+          <w:bCs w:val="0"/>
+          <w:i w:val="1"/>
+          <w:iCs w:val="1"/>
+          <w:strike w:val="0"/>
+          <w:dstrike w:val="0"/>
+          <w:noProof w:val="0"/>
+          <w:sz w:val="22"/>
+          <w:szCs w:val="22"/>
+          <w:u w:val="none"/>
+          <w:lang w:val="en-GB"/>
+        </w:rPr>
+        <w:t xml:space="preserve"> directly into their browser bar (which triggers a </w:t>
+      </w:r>
+      <w:r>
+        <w:rPr>
+          <w:rFonts w:ascii="Consolas" w:hAnsi="Consolas" w:eastAsia="Consolas" w:cs="Consolas"/>
+          <w:b w:val="0"/>
+          <w:bCs w:val="0"/>
+          <w:i w:val="1"/>
+          <w:iCs w:val="1"/>
+          <w:strike w:val="0"/>
+          <w:dstrike w:val="0"/>
+          <w:noProof w:val="0"/>
+          <w:sz w:val="22"/>
+          <w:szCs w:val="22"/>
+          <w:u w:val="none"/>
+          <w:lang w:val="en-GB"/>
+        </w:rPr>
+        <w:t>GET</w:t>
+      </w:r>
+      <w:r>
+        <w:rPr>
+          <w:rFonts w:ascii="Arial" w:hAnsi="Arial" w:eastAsia="Arial" w:cs="Arial"/>
+          <w:b w:val="0"/>
+          <w:bCs w:val="0"/>
+          <w:i w:val="1"/>
+          <w:iCs w:val="1"/>
+          <w:strike w:val="0"/>
+          <w:dstrike w:val="0"/>
+          <w:noProof w:val="0"/>
+          <w:sz w:val="22"/>
+          <w:szCs w:val="22"/>
+          <w:u w:val="none"/>
+          <w:lang w:val="en-GB"/>
+        </w:rPr>
+        <w:t xml:space="preserve"> request).</w:t>
+      </w:r>
+    </w:p>
+    <w:p>
+      <w:pPr>
+        <w:pStyle w:val="ListParagraph"/>
+        <w:numPr>
+          <w:ilvl w:val="0"/>
+          <w:numId w:val="1"/>
+        </w:numPr>
+        <w:spacing w:before="0" w:beforeAutospacing="off" w:after="180" w:afterAutospacing="off"/>
+        <w:rPr>
+          <w:rFonts w:ascii="Arial" w:hAnsi="Arial" w:eastAsia="Arial" w:cs="Arial"/>
+          <w:b w:val="0"/>
+          <w:bCs w:val="0"/>
+          <w:strike w:val="0"/>
+          <w:dstrike w:val="0"/>
+          <w:noProof w:val="0"/>
+          <w:sz w:val="24"/>
+          <w:szCs w:val="24"/>
+          <w:u w:val="none"/>
+          <w:lang w:val="en-GB"/>
+        </w:rPr>
+      </w:pPr>
+      <w:r>
+        <w:rPr>
+          <w:rFonts w:ascii="Arial" w:hAnsi="Arial" w:eastAsia="Arial" w:cs="Arial"/>
+          <w:b w:val="1"/>
+          <w:bCs w:val="1"/>
+          <w:i w:val="1"/>
+          <w:iCs w:val="1"/>
+          <w:strike w:val="0"/>
+          <w:dstrike w:val="0"/>
+          <w:noProof w:val="0"/>
+          <w:sz w:val="22"/>
+          <w:szCs w:val="22"/>
+          <w:u w:val="none"/>
+          <w:lang w:val="en-GB"/>
+        </w:rPr>
+        <w:t>Security benefit</w:t>
+      </w:r>
+      <w:r>
+        <w:rPr>
+          <w:rFonts w:ascii="Arial" w:hAnsi="Arial" w:eastAsia="Arial" w:cs="Arial"/>
+          <w:b w:val="0"/>
+          <w:bCs w:val="0"/>
+          <w:i w:val="1"/>
+          <w:iCs w:val="1"/>
+          <w:strike w:val="0"/>
+          <w:dstrike w:val="0"/>
+          <w:noProof w:val="0"/>
+          <w:sz w:val="22"/>
+          <w:szCs w:val="22"/>
+          <w:u w:val="none"/>
+          <w:lang w:val="en-GB"/>
+        </w:rPr>
+        <w:t>: Ensures data only processes when a user actively clicks your form's submit button</w:t>
+      </w:r>
+      <w:r>
+        <w:rPr>
+          <w:rFonts w:ascii="Arial" w:hAnsi="Arial" w:eastAsia="Arial" w:cs="Arial"/>
+          <w:b w:val="0"/>
+          <w:bCs w:val="0"/>
+          <w:strike w:val="0"/>
+          <w:dstrike w:val="0"/>
+          <w:noProof w:val="0"/>
+          <w:sz w:val="24"/>
+          <w:szCs w:val="24"/>
+          <w:u w:val="none"/>
+          <w:lang w:val="en-GB"/>
+        </w:rPr>
+        <w:t>.</w:t>
+      </w:r>
+    </w:p>
+    <w:p>
+      <w:pPr>
+        <w:pStyle w:val="Normal"/>
+        <w:spacing w:before="0" w:beforeAutospacing="off" w:after="180" w:afterAutospacing="off"/>
+        <w:ind w:left="0"/>
+        <w:rPr>
+          <w:rFonts w:ascii="Arial" w:hAnsi="Arial" w:eastAsia="Arial" w:cs="Arial"/>
+          <w:b w:val="1"/>
+          <w:bCs w:val="1"/>
+          <w:i w:val="1"/>
+          <w:iCs w:val="1"/>
+          <w:strike w:val="0"/>
+          <w:dstrike w:val="0"/>
+          <w:noProof w:val="0"/>
+          <w:color w:val="4C94D8" w:themeColor="text2" w:themeTint="80" w:themeShade="FF"/>
+          <w:sz w:val="24"/>
+          <w:szCs w:val="24"/>
+          <w:u w:val="none"/>
+          <w:lang w:val="en-GB"/>
+        </w:rPr>
+      </w:pPr>
+    </w:p>
+    <w:p>
+      <w:pPr>
+        <w:pStyle w:val="Normal"/>
+        <w:spacing w:before="0" w:beforeAutospacing="off" w:after="180" w:afterAutospacing="off"/>
+        <w:ind w:left="0"/>
+        <w:rPr>
+          <w:rFonts w:ascii="Arial" w:hAnsi="Arial" w:eastAsia="Arial" w:cs="Arial"/>
+          <w:b w:val="1"/>
+          <w:bCs w:val="1"/>
+          <w:i w:val="1"/>
+          <w:iCs w:val="1"/>
+          <w:strike w:val="0"/>
+          <w:dstrike w:val="0"/>
+          <w:noProof w:val="0"/>
+          <w:color w:val="4C94D8" w:themeColor="text2" w:themeTint="80" w:themeShade="FF"/>
+          <w:sz w:val="24"/>
+          <w:szCs w:val="24"/>
+          <w:u w:val="none"/>
+          <w:lang w:val="en-GB"/>
+        </w:rPr>
+      </w:pPr>
+    </w:p>
+    <w:p>
+      <w:pPr>
+        <w:pStyle w:val="Normal"/>
+        <w:spacing w:before="0" w:beforeAutospacing="off" w:after="180" w:afterAutospacing="off"/>
+        <w:ind w:left="0"/>
+        <w:rPr>
+          <w:rFonts w:ascii="Arial" w:hAnsi="Arial" w:eastAsia="Arial" w:cs="Arial"/>
+          <w:b w:val="1"/>
+          <w:bCs w:val="1"/>
+          <w:strike w:val="0"/>
+          <w:dstrike w:val="0"/>
+          <w:noProof w:val="0"/>
+          <w:sz w:val="24"/>
+          <w:szCs w:val="24"/>
+          <w:u w:val="none"/>
+          <w:lang w:val="en-GB"/>
+        </w:rPr>
+      </w:pPr>
+    </w:p>
+    <w:p>
+      <w:pPr>
+        <w:pStyle w:val="Normal"/>
+        <w:spacing w:before="180" w:beforeAutospacing="off" w:after="240" w:afterAutospacing="off"/>
+        <w:rPr>
+          <w:rFonts w:ascii="Arial" w:hAnsi="Arial" w:eastAsia="Arial" w:cs="Arial"/>
+          <w:i w:val="1"/>
+          <w:iCs w:val="1"/>
+          <w:noProof w:val="0"/>
+          <w:color w:val="auto"/>
+          <w:sz w:val="24"/>
+          <w:szCs w:val="24"/>
+          <w:lang w:val="en-GB"/>
+        </w:rPr>
+      </w:pPr>
+    </w:p>
+    <w:p>
+      <w:pPr>
+        <w:pStyle w:val="Normal"/>
+        <w:spacing w:before="180" w:beforeAutospacing="off" w:after="240" w:afterAutospacing="off"/>
+        <w:rPr>
+          <w:rFonts w:ascii="Arial" w:hAnsi="Arial" w:eastAsia="Arial" w:cs="Arial"/>
+          <w:b w:val="1"/>
+          <w:bCs w:val="1"/>
+          <w:strike w:val="0"/>
+          <w:dstrike w:val="0"/>
+          <w:noProof w:val="0"/>
+          <w:color w:val="4C94D8" w:themeColor="text2" w:themeTint="80" w:themeShade="FF"/>
+          <w:sz w:val="24"/>
+          <w:szCs w:val="24"/>
+          <w:u w:val="none"/>
+          <w:lang w:val="en-GB"/>
+        </w:rPr>
+      </w:pPr>
+      <w:r>
+        <w:rPr>
+          <w:rFonts w:ascii="Arial" w:hAnsi="Arial" w:eastAsia="Arial" w:cs="Arial"/>
+          <w:b w:val="1"/>
+          <w:bCs w:val="1"/>
+          <w:strike w:val="0"/>
+          <w:dstrike w:val="0"/>
+          <w:noProof w:val="0"/>
+          <w:color w:val="4C94D8" w:themeColor="text2" w:themeTint="80" w:themeShade="FF"/>
+          <w:sz w:val="24"/>
+          <w:szCs w:val="24"/>
+          <w:u w:val="none"/>
+          <w:lang w:val="en-GB"/>
+        </w:rPr>
+        <w:t xml:space="preserve">    // 2. Read and clean the data to protect against Cross-Site Scripting (XSS)</w:t>
+      </w:r>
+    </w:p>
+    <w:p>
+      <w:pPr>
+        <w:pStyle w:val="Normal"/>
+        <w:spacing w:before="180" w:beforeAutospacing="off" w:after="240" w:afterAutospacing="off"/>
+      </w:pPr>
+      <w:r>
+        <w:rPr>
+          <w:rFonts w:ascii="Arial" w:hAnsi="Arial" w:eastAsia="Arial" w:cs="Arial"/>
+          <w:b w:val="1"/>
+          <w:bCs w:val="1"/>
+          <w:strike w:val="0"/>
+          <w:dstrike w:val="0"/>
+          <w:noProof w:val="0"/>
+          <w:color w:val="4C94D8" w:themeColor="text2" w:themeTint="80" w:themeShade="FF"/>
+          <w:sz w:val="24"/>
+          <w:szCs w:val="24"/>
+          <w:u w:val="none"/>
+          <w:lang w:val="en-GB"/>
+        </w:rPr>
+        <w:t xml:space="preserve">    $username = </w:t>
+      </w:r>
+      <w:r>
+        <w:rPr>
+          <w:rFonts w:ascii="Arial" w:hAnsi="Arial" w:eastAsia="Arial" w:cs="Arial"/>
+          <w:b w:val="1"/>
+          <w:bCs w:val="1"/>
+          <w:strike w:val="0"/>
+          <w:dstrike w:val="0"/>
+          <w:noProof w:val="0"/>
+          <w:color w:val="4C94D8" w:themeColor="text2" w:themeTint="80" w:themeShade="FF"/>
+          <w:sz w:val="24"/>
+          <w:szCs w:val="24"/>
+          <w:u w:val="none"/>
+          <w:lang w:val="en-GB"/>
+        </w:rPr>
+        <w:t>htmlspecialchars</w:t>
+      </w:r>
+      <w:r>
+        <w:rPr>
+          <w:rFonts w:ascii="Arial" w:hAnsi="Arial" w:eastAsia="Arial" w:cs="Arial"/>
+          <w:b w:val="1"/>
+          <w:bCs w:val="1"/>
+          <w:strike w:val="0"/>
+          <w:dstrike w:val="0"/>
+          <w:noProof w:val="0"/>
+          <w:color w:val="4C94D8" w:themeColor="text2" w:themeTint="80" w:themeShade="FF"/>
+          <w:sz w:val="24"/>
+          <w:szCs w:val="24"/>
+          <w:u w:val="none"/>
+          <w:lang w:val="en-GB"/>
+        </w:rPr>
+        <w:t>($_POST['</w:t>
+      </w:r>
+      <w:r>
+        <w:rPr>
+          <w:rFonts w:ascii="Arial" w:hAnsi="Arial" w:eastAsia="Arial" w:cs="Arial"/>
+          <w:b w:val="1"/>
+          <w:bCs w:val="1"/>
+          <w:strike w:val="0"/>
+          <w:dstrike w:val="0"/>
+          <w:noProof w:val="0"/>
+          <w:color w:val="4C94D8" w:themeColor="text2" w:themeTint="80" w:themeShade="FF"/>
+          <w:sz w:val="24"/>
+          <w:szCs w:val="24"/>
+          <w:u w:val="none"/>
+          <w:lang w:val="en-GB"/>
+        </w:rPr>
+        <w:t>user_name</w:t>
+      </w:r>
+      <w:r>
+        <w:rPr>
+          <w:rFonts w:ascii="Arial" w:hAnsi="Arial" w:eastAsia="Arial" w:cs="Arial"/>
+          <w:b w:val="1"/>
+          <w:bCs w:val="1"/>
+          <w:strike w:val="0"/>
+          <w:dstrike w:val="0"/>
+          <w:noProof w:val="0"/>
+          <w:color w:val="4C94D8" w:themeColor="text2" w:themeTint="80" w:themeShade="FF"/>
+          <w:sz w:val="24"/>
+          <w:szCs w:val="24"/>
+          <w:u w:val="none"/>
+          <w:lang w:val="en-GB"/>
+        </w:rPr>
+        <w:t>']);</w:t>
+      </w:r>
+      <w:r>
+        <w:rPr>
+          <w:rFonts w:ascii="Arial" w:hAnsi="Arial" w:eastAsia="Arial" w:cs="Arial"/>
+          <w:b w:val="1"/>
+          <w:bCs w:val="1"/>
+          <w:strike w:val="0"/>
+          <w:dstrike w:val="0"/>
+          <w:noProof w:val="0"/>
+          <w:color w:val="4C94D8" w:themeColor="text2" w:themeTint="80" w:themeShade="FF"/>
+          <w:sz w:val="24"/>
+          <w:szCs w:val="24"/>
+          <w:u w:val="none"/>
+          <w:lang w:val="en-GB"/>
+        </w:rPr>
+        <w:t xml:space="preserve"> </w:t>
+      </w:r>
+    </w:p>
+    <w:p>
+      <w:pPr>
+        <w:pStyle w:val="Normal"/>
+        <w:spacing w:before="180" w:beforeAutospacing="off" w:after="240" w:afterAutospacing="off"/>
+        <w:rPr>
+          <w:rFonts w:ascii="Arial" w:hAnsi="Arial" w:eastAsia="Arial" w:cs="Arial"/>
+          <w:b w:val="1"/>
+          <w:bCs w:val="1"/>
+          <w:i w:val="1"/>
+          <w:iCs w:val="1"/>
+          <w:strike w:val="0"/>
+          <w:dstrike w:val="0"/>
+          <w:noProof w:val="0"/>
+          <w:color w:val="auto"/>
+          <w:sz w:val="22"/>
+          <w:szCs w:val="22"/>
+          <w:u w:val="none"/>
+          <w:lang w:val="en-GB"/>
+        </w:rPr>
+      </w:pPr>
+      <w:r>
+        <w:rPr>
+          <w:rFonts w:ascii="Arial" w:hAnsi="Arial" w:eastAsia="Arial" w:cs="Arial"/>
+          <w:b w:val="1"/>
+          <w:bCs w:val="1"/>
+          <w:i w:val="1"/>
+          <w:iCs w:val="1"/>
+          <w:strike w:val="0"/>
+          <w:dstrike w:val="0"/>
+          <w:noProof w:val="0"/>
+          <w:color w:val="auto"/>
+          <w:sz w:val="22"/>
+          <w:szCs w:val="22"/>
+          <w:u w:val="none"/>
+          <w:lang w:val="en-GB"/>
+        </w:rPr>
+        <w:t xml:space="preserve">We gave this </w:t>
+      </w:r>
+      <w:r>
+        <w:rPr>
+          <w:rFonts w:ascii="Arial" w:hAnsi="Arial" w:eastAsia="Arial" w:cs="Arial"/>
+          <w:b w:val="1"/>
+          <w:bCs w:val="1"/>
+          <w:i w:val="1"/>
+          <w:iCs w:val="1"/>
+          <w:strike w:val="0"/>
+          <w:dstrike w:val="0"/>
+          <w:noProof w:val="0"/>
+          <w:color w:val="auto"/>
+          <w:sz w:val="22"/>
+          <w:szCs w:val="22"/>
+          <w:u w:val="none"/>
+          <w:lang w:val="en-GB"/>
+        </w:rPr>
+        <w:t>user_name</w:t>
+      </w:r>
+      <w:r>
+        <w:rPr>
+          <w:rFonts w:ascii="Arial" w:hAnsi="Arial" w:eastAsia="Arial" w:cs="Arial"/>
+          <w:b w:val="1"/>
+          <w:bCs w:val="1"/>
+          <w:i w:val="1"/>
+          <w:iCs w:val="1"/>
+          <w:strike w:val="0"/>
+          <w:dstrike w:val="0"/>
+          <w:noProof w:val="0"/>
+          <w:color w:val="auto"/>
+          <w:sz w:val="22"/>
+          <w:szCs w:val="22"/>
+          <w:u w:val="none"/>
+          <w:lang w:val="en-GB"/>
+        </w:rPr>
+        <w:t xml:space="preserve"> as a name </w:t>
+      </w:r>
+      <w:r>
+        <w:rPr>
+          <w:rFonts w:ascii="Arial" w:hAnsi="Arial" w:eastAsia="Arial" w:cs="Arial"/>
+          <w:b w:val="1"/>
+          <w:bCs w:val="1"/>
+          <w:i w:val="1"/>
+          <w:iCs w:val="1"/>
+          <w:strike w:val="0"/>
+          <w:dstrike w:val="0"/>
+          <w:noProof w:val="0"/>
+          <w:color w:val="auto"/>
+          <w:sz w:val="22"/>
+          <w:szCs w:val="22"/>
+          <w:u w:val="none"/>
+          <w:lang w:val="en-GB"/>
+        </w:rPr>
+        <w:t>attritubte</w:t>
+      </w:r>
+      <w:r>
+        <w:rPr>
+          <w:rFonts w:ascii="Arial" w:hAnsi="Arial" w:eastAsia="Arial" w:cs="Arial"/>
+          <w:b w:val="1"/>
+          <w:bCs w:val="1"/>
+          <w:i w:val="1"/>
+          <w:iCs w:val="1"/>
+          <w:strike w:val="0"/>
+          <w:dstrike w:val="0"/>
+          <w:noProof w:val="0"/>
+          <w:color w:val="auto"/>
+          <w:sz w:val="22"/>
+          <w:szCs w:val="22"/>
+          <w:u w:val="none"/>
+          <w:lang w:val="en-GB"/>
+        </w:rPr>
+        <w:t xml:space="preserve"> in the index html so that </w:t>
+      </w:r>
+      <w:r>
+        <w:rPr>
+          <w:rFonts w:ascii="Arial" w:hAnsi="Arial" w:eastAsia="Arial" w:cs="Arial"/>
+          <w:b w:val="1"/>
+          <w:bCs w:val="1"/>
+          <w:i w:val="1"/>
+          <w:iCs w:val="1"/>
+          <w:strike w:val="0"/>
+          <w:dstrike w:val="0"/>
+          <w:noProof w:val="0"/>
+          <w:color w:val="auto"/>
+          <w:sz w:val="22"/>
+          <w:szCs w:val="22"/>
+          <w:u w:val="none"/>
+          <w:lang w:val="en-GB"/>
+        </w:rPr>
+        <w:t>php</w:t>
+      </w:r>
+      <w:r>
+        <w:rPr>
+          <w:rFonts w:ascii="Arial" w:hAnsi="Arial" w:eastAsia="Arial" w:cs="Arial"/>
+          <w:b w:val="1"/>
+          <w:bCs w:val="1"/>
+          <w:i w:val="1"/>
+          <w:iCs w:val="1"/>
+          <w:strike w:val="0"/>
+          <w:dstrike w:val="0"/>
+          <w:noProof w:val="0"/>
+          <w:color w:val="auto"/>
+          <w:sz w:val="22"/>
+          <w:szCs w:val="22"/>
+          <w:u w:val="none"/>
+          <w:lang w:val="en-GB"/>
+        </w:rPr>
+        <w:t xml:space="preserve"> can understand</w:t>
+      </w:r>
+    </w:p>
+    <w:p>
+      <w:pPr>
+        <w:pStyle w:val="Normal"/>
+        <w:spacing w:before="180" w:beforeAutospacing="off" w:after="240" w:afterAutospacing="off"/>
+        <w:rPr>
+          <w:rFonts w:ascii="Arial" w:hAnsi="Arial" w:eastAsia="Arial" w:cs="Arial"/>
+          <w:b w:val="1"/>
+          <w:bCs w:val="1"/>
+          <w:strike w:val="0"/>
+          <w:dstrike w:val="0"/>
+          <w:noProof w:val="0"/>
+          <w:color w:val="4C94D8" w:themeColor="text2" w:themeTint="80" w:themeShade="FF"/>
+          <w:sz w:val="24"/>
+          <w:szCs w:val="24"/>
+          <w:u w:val="none"/>
+          <w:lang w:val="en-GB"/>
+        </w:rPr>
+      </w:pPr>
+      <w:r>
+        <w:rPr>
+          <w:rFonts w:ascii="Arial" w:hAnsi="Arial" w:eastAsia="Arial" w:cs="Arial"/>
+          <w:b w:val="1"/>
+          <w:bCs w:val="1"/>
+          <w:strike w:val="0"/>
+          <w:dstrike w:val="0"/>
+          <w:noProof w:val="0"/>
+          <w:color w:val="4C94D8" w:themeColor="text2" w:themeTint="80" w:themeShade="FF"/>
+          <w:sz w:val="24"/>
+          <w:szCs w:val="24"/>
+          <w:u w:val="none"/>
+          <w:lang w:val="en-GB"/>
+        </w:rPr>
+        <w:t xml:space="preserve">    $email = htmlspecialchars($_POST['user_email']);</w:t>
+      </w:r>
+    </w:p>
+    <w:p>
+      <w:pPr>
+        <w:pStyle w:val="Normal"/>
+        <w:spacing w:before="180" w:beforeAutospacing="off" w:after="240" w:afterAutospacing="off"/>
+        <w:rPr>
+          <w:rFonts w:ascii="Arial" w:hAnsi="Arial" w:eastAsia="Arial" w:cs="Arial"/>
+          <w:b w:val="1"/>
+          <w:bCs w:val="1"/>
+          <w:strike w:val="0"/>
+          <w:dstrike w:val="0"/>
+          <w:noProof w:val="0"/>
+          <w:color w:val="4C94D8" w:themeColor="text2" w:themeTint="80" w:themeShade="FF"/>
+          <w:sz w:val="24"/>
+          <w:szCs w:val="24"/>
+          <w:u w:val="none"/>
+          <w:lang w:val="en-GB"/>
+        </w:rPr>
+      </w:pPr>
+      <w:r>
+        <w:rPr>
+          <w:rFonts w:ascii="Arial" w:hAnsi="Arial" w:eastAsia="Arial" w:cs="Arial"/>
+          <w:b w:val="1"/>
+          <w:bCs w:val="1"/>
+          <w:strike w:val="0"/>
+          <w:dstrike w:val="0"/>
+          <w:noProof w:val="0"/>
+          <w:color w:val="4C94D8" w:themeColor="text2" w:themeTint="80" w:themeShade="FF"/>
+          <w:sz w:val="24"/>
+          <w:szCs w:val="24"/>
+          <w:u w:val="none"/>
+          <w:lang w:val="en-GB"/>
+        </w:rPr>
+        <w:t xml:space="preserve">   </w:t>
+      </w:r>
+    </w:p>
+    <w:p>
+      <w:pPr>
+        <w:pStyle w:val="Normal"/>
+        <w:spacing w:before="180" w:beforeAutospacing="off" w:after="240" w:afterAutospacing="off"/>
+        <w:rPr>
+          <w:rFonts w:ascii="Arial" w:hAnsi="Arial" w:eastAsia="Arial" w:cs="Arial"/>
+          <w:b w:val="1"/>
+          <w:bCs w:val="1"/>
+          <w:strike w:val="0"/>
+          <w:dstrike w:val="0"/>
+          <w:noProof w:val="0"/>
+          <w:color w:val="4C94D8" w:themeColor="text2" w:themeTint="80" w:themeShade="FF"/>
+          <w:sz w:val="24"/>
+          <w:szCs w:val="24"/>
+          <w:u w:val="none"/>
+          <w:lang w:val="en-GB"/>
+        </w:rPr>
+      </w:pPr>
+      <w:r>
+        <w:rPr>
+          <w:rFonts w:ascii="Arial" w:hAnsi="Arial" w:eastAsia="Arial" w:cs="Arial"/>
+          <w:b w:val="1"/>
+          <w:bCs w:val="1"/>
+          <w:strike w:val="0"/>
+          <w:dstrike w:val="0"/>
+          <w:noProof w:val="0"/>
+          <w:color w:val="4C94D8" w:themeColor="text2" w:themeTint="80" w:themeShade="FF"/>
+          <w:sz w:val="24"/>
+          <w:szCs w:val="24"/>
+          <w:u w:val="none"/>
+          <w:lang w:val="en-GB"/>
+        </w:rPr>
+        <w:t xml:space="preserve"> // 3. Use</w:t>
+      </w:r>
+      <w:r>
+        <w:rPr>
+          <w:rFonts w:ascii="Arial" w:hAnsi="Arial" w:eastAsia="Arial" w:cs="Arial"/>
+          <w:b w:val="1"/>
+          <w:bCs w:val="1"/>
+          <w:strike w:val="0"/>
+          <w:dstrike w:val="0"/>
+          <w:noProof w:val="0"/>
+          <w:color w:val="4C94D8" w:themeColor="text2" w:themeTint="80" w:themeShade="FF"/>
+          <w:sz w:val="24"/>
+          <w:szCs w:val="24"/>
+          <w:u w:val="none"/>
+          <w:lang w:val="en-GB"/>
+        </w:rPr>
+        <w:t xml:space="preserve"> the data (e.g., echo it, save to database, or email it)</w:t>
+      </w:r>
+    </w:p>
+    <w:p>
+      <w:pPr>
+        <w:pStyle w:val="Normal"/>
+        <w:spacing w:before="180" w:beforeAutospacing="off" w:after="240" w:afterAutospacing="off"/>
+        <w:rPr>
+          <w:rFonts w:ascii="Arial" w:hAnsi="Arial" w:eastAsia="Arial" w:cs="Arial"/>
+          <w:b w:val="1"/>
+          <w:bCs w:val="1"/>
+          <w:strike w:val="0"/>
+          <w:dstrike w:val="0"/>
+          <w:noProof w:val="0"/>
+          <w:color w:val="4C94D8" w:themeColor="text2" w:themeTint="80" w:themeShade="FF"/>
+          <w:sz w:val="24"/>
+          <w:szCs w:val="24"/>
+          <w:u w:val="none"/>
+          <w:lang w:val="en-GB"/>
+        </w:rPr>
+      </w:pPr>
+      <w:r>
+        <w:rPr>
+          <w:rFonts w:ascii="Arial" w:hAnsi="Arial" w:eastAsia="Arial" w:cs="Arial"/>
+          <w:b w:val="1"/>
+          <w:bCs w:val="1"/>
+          <w:strike w:val="0"/>
+          <w:dstrike w:val="0"/>
+          <w:noProof w:val="0"/>
+          <w:color w:val="4C94D8" w:themeColor="text2" w:themeTint="80" w:themeShade="FF"/>
+          <w:sz w:val="24"/>
+          <w:szCs w:val="24"/>
+          <w:u w:val="none"/>
+          <w:lang w:val="en-GB"/>
+        </w:rPr>
+        <w:t xml:space="preserve">    echo "Hello, " . $username . "!&lt;br&gt;";</w:t>
+      </w:r>
+    </w:p>
+    <w:p>
+      <w:pPr>
+        <w:pStyle w:val="Normal"/>
+        <w:spacing w:before="180" w:beforeAutospacing="off" w:after="240" w:afterAutospacing="off"/>
+        <w:rPr>
+          <w:rFonts w:ascii="Arial" w:hAnsi="Arial" w:eastAsia="Arial" w:cs="Arial"/>
+          <w:b w:val="1"/>
+          <w:bCs w:val="1"/>
+          <w:strike w:val="0"/>
+          <w:dstrike w:val="0"/>
+          <w:noProof w:val="0"/>
+          <w:color w:val="4C94D8" w:themeColor="text2" w:themeTint="80" w:themeShade="FF"/>
+          <w:sz w:val="24"/>
+          <w:szCs w:val="24"/>
+          <w:u w:val="none"/>
+          <w:lang w:val="en-GB"/>
+        </w:rPr>
+      </w:pPr>
+      <w:r>
+        <w:rPr>
+          <w:rFonts w:ascii="Arial" w:hAnsi="Arial" w:eastAsia="Arial" w:cs="Arial"/>
+          <w:b w:val="1"/>
+          <w:bCs w:val="1"/>
+          <w:strike w:val="0"/>
+          <w:dstrike w:val="0"/>
+          <w:noProof w:val="0"/>
+          <w:color w:val="4C94D8" w:themeColor="text2" w:themeTint="80" w:themeShade="FF"/>
+          <w:sz w:val="24"/>
+          <w:szCs w:val="24"/>
+          <w:u w:val="none"/>
+          <w:lang w:val="en-GB"/>
+        </w:rPr>
+        <w:t xml:space="preserve">    echo "Your registered email is: " . $email;</w:t>
+      </w:r>
+    </w:p>
+    <w:p>
+      <w:pPr>
+        <w:pStyle w:val="Normal"/>
+        <w:spacing w:before="180" w:beforeAutospacing="off" w:after="240" w:afterAutospacing="off"/>
+        <w:rPr>
+          <w:rFonts w:ascii="Arial" w:hAnsi="Arial" w:eastAsia="Arial" w:cs="Arial"/>
+          <w:b w:val="1"/>
+          <w:bCs w:val="1"/>
+          <w:strike w:val="0"/>
+          <w:dstrike w:val="0"/>
+          <w:noProof w:val="0"/>
+          <w:color w:val="4C94D8" w:themeColor="text2" w:themeTint="80" w:themeShade="FF"/>
+          <w:sz w:val="24"/>
+          <w:szCs w:val="24"/>
+          <w:u w:val="none"/>
+          <w:lang w:val="en-GB"/>
+        </w:rPr>
+      </w:pPr>
+      <w:r>
+        <w:rPr>
+          <w:rFonts w:ascii="Arial" w:hAnsi="Arial" w:eastAsia="Arial" w:cs="Arial"/>
+          <w:b w:val="1"/>
+          <w:bCs w:val="1"/>
+          <w:strike w:val="0"/>
+          <w:dstrike w:val="0"/>
+          <w:noProof w:val="0"/>
+          <w:color w:val="4C94D8" w:themeColor="text2" w:themeTint="80" w:themeShade="FF"/>
+          <w:sz w:val="24"/>
+          <w:szCs w:val="24"/>
+          <w:u w:val="none"/>
+          <w:lang w:val="en-GB"/>
+        </w:rPr>
+        <w:t>}</w:t>
+      </w:r>
+    </w:p>
+    <w:p>
+      <w:pPr>
+        <w:pStyle w:val="Normal"/>
+        <w:spacing w:before="180" w:beforeAutospacing="off" w:after="240" w:afterAutospacing="off"/>
+      </w:pPr>
+      <w:r>
+        <w:rPr>
+          <w:rFonts w:ascii="Arial" w:hAnsi="Arial" w:eastAsia="Arial" w:cs="Arial"/>
+          <w:b w:val="1"/>
+          <w:bCs w:val="1"/>
+          <w:strike w:val="0"/>
+          <w:dstrike w:val="0"/>
+          <w:noProof w:val="0"/>
+          <w:color w:val="4C94D8" w:themeColor="text2" w:themeTint="80" w:themeShade="FF"/>
+          <w:sz w:val="24"/>
+          <w:szCs w:val="24"/>
+          <w:u w:val="none"/>
+          <w:lang w:val="en-GB"/>
+        </w:rPr>
+        <w:t>?&gt;</w:t>
+      </w:r>
+    </w:p>
+    <w:p>
+      <w:pPr>
+        <w:pStyle w:val="Normal"/>
+        <w:spacing w:before="180" w:beforeAutospacing="off" w:after="240" w:afterAutospacing="off"/>
+        <w:rPr>
+          <w:rFonts w:ascii="Arial" w:hAnsi="Arial" w:eastAsia="Arial" w:cs="Arial"/>
+          <w:b w:val="1"/>
+          <w:bCs w:val="1"/>
+          <w:strike w:val="0"/>
+          <w:dstrike w:val="0"/>
+          <w:noProof w:val="0"/>
+          <w:color w:val="4C94D8" w:themeColor="text2" w:themeTint="80" w:themeShade="FF"/>
+          <w:sz w:val="24"/>
+          <w:szCs w:val="24"/>
+          <w:u w:val="none"/>
+          <w:lang w:val="en-GB"/>
+        </w:rPr>
+      </w:pPr>
+    </w:p>
+    <w:p>
+      <w:pPr>
+        <w:pStyle w:val="Normal"/>
+        <w:spacing w:before="180" w:beforeAutospacing="off" w:after="240" w:afterAutospacing="off"/>
+      </w:pPr>
+      <w:r>
+        <w:drawing>
+          <wp:inline wp14:editId="6C6FA4C6" wp14:anchorId="4ED59397">
+            <wp:extent cx="5724525" cy="3219450"/>
+            <wp:effectExtent l="0" t="0" r="0" b="0"/>
+            <wp:docPr id="1298346087" name="drawing"/>
+            <wp:cNvGraphicFramePr>
+              <a:graphicFrameLocks noChangeAspect="1"/>
+            </wp:cNvGraphicFramePr>
+            <a:graphic>
+              <a:graphicData xmlns:a="http://schemas.openxmlformats.org/drawingml/2006/main" uri="http://schemas.openxmlformats.org/drawingml/2006/picture">
+                <pic:pic xmlns:pic="http://schemas.openxmlformats.org/drawingml/2006/picture">
+                  <pic:nvPicPr>
+                    <pic:cNvPr id="1298346087" name="Picture 1298346087"/>
+                    <pic:cNvPicPr/>
+                  </pic:nvPicPr>
+                  <pic:blipFill>
+                    <a:blip xmlns:r="http://schemas.openxmlformats.org/officeDocument/2006/relationships" r:embed="rId2122407751">
+                      <a:extLst>
+                        <a:ext uri="{28A0092B-C50C-407E-A947-70E740481C1C}">
+                          <a14:useLocalDpi xmlns:a14="http://schemas.microsoft.com/office/drawing/2010/main"/>
+                        </a:ext>
+                      </a:extLst>
+                    </a:blip>
+                    <a:stretch>
+                      <a:fillRect/>
+                    </a:stretch>
+                  </pic:blipFill>
+                  <pic:spPr>
+                    <a:xfrm>
+                      <a:off x="0" y="0"/>
+                      <a:ext cx="5724525" cy="3219450"/>
+                    </a:xfrm>
+                    <a:prstGeom prst="rect">
+                      <a:avLst/>
+                    </a:prstGeom>
+                  </pic:spPr>
+                </pic:pic>
+              </a:graphicData>
+            </a:graphic>
+          </wp:inline>
+        </w:drawing>
+      </w:r>
+    </w:p>
+    <w:tbl>
+      <w:tblPr>
+        <w:tblStyle w:val="TableNormal"/>
+        <w:bidiVisual w:val="0"/>
+        <w:tblW w:w="0" w:type="auto"/>
+        <w:tblLook w:val="06A0" w:firstRow="1" w:lastRow="0" w:firstColumn="1" w:lastColumn="0" w:noHBand="1" w:noVBand="1"/>
+      </w:tblPr>
+      <w:tblGrid>
+        <w:gridCol w:w="1786"/>
+        <w:gridCol w:w="4155"/>
+        <w:gridCol w:w="4180"/>
+      </w:tblGrid>
+      <w:tr>
+        <w:trPr>
+          <w:trHeight w:val="300"/>
+        </w:trPr>
+        <w:tc>
+          <w:tcPr>
+            <w:tcW w:w="1786" w:type="dxa"/>
+            <w:tcBorders>
+              <w:bottom w:val="single" w:color="DCDFE5" w:sz="4"/>
+            </w:tcBorders>
+            <w:tcMar/>
+            <w:vAlign w:val="center"/>
+          </w:tcPr>
+          <w:p>
+            <w:pPr>
+              <w:spacing w:before="0" w:beforeAutospacing="off" w:after="0" w:afterAutospacing="off"/>
+              <w:jc w:val="center"/>
+            </w:pPr>
+            <w:r>
+              <w:rPr>
+                <w:rFonts w:ascii="Arial" w:hAnsi="Arial" w:eastAsia="Arial" w:cs="Arial"/>
+                <w:b w:val="1"/>
+                <w:bCs w:val="1"/>
+                <w:strike w:val="0"/>
+                <w:dstrike w:val="0"/>
+                <w:sz w:val="21"/>
+                <w:szCs w:val="21"/>
+                <w:u w:val="none"/>
+              </w:rPr>
+              <w:t>Escape Sequence</w:t>
+            </w:r>
+          </w:p>
+        </w:tc>
+        <w:tc>
+          <w:tcPr>
+            <w:tcW w:w="4155" w:type="dxa"/>
+            <w:tcBorders>
+              <w:bottom w:val="single" w:color="DCDFE5" w:sz="4"/>
+            </w:tcBorders>
+            <w:tcMar/>
+            <w:vAlign w:val="center"/>
+          </w:tcPr>
+          <w:p>
+            <w:pPr>
+              <w:spacing w:before="0" w:beforeAutospacing="off" w:after="0" w:afterAutospacing="off"/>
+              <w:jc w:val="center"/>
+            </w:pPr>
+            <w:r>
+              <w:rPr>
+                <w:rFonts w:ascii="Arial" w:hAnsi="Arial" w:eastAsia="Arial" w:cs="Arial"/>
+                <w:b w:val="1"/>
+                <w:bCs w:val="1"/>
+                <w:strike w:val="0"/>
+                <w:dstrike w:val="0"/>
+                <w:sz w:val="21"/>
+                <w:szCs w:val="21"/>
+                <w:u w:val="none"/>
+              </w:rPr>
+              <w:t>Result / Meaning</w:t>
+            </w:r>
+          </w:p>
+        </w:tc>
+        <w:tc>
+          <w:tcPr>
+            <w:tcW w:w="4180" w:type="dxa"/>
+            <w:tcBorders>
+              <w:bottom w:val="single" w:color="DCDFE5" w:sz="4"/>
+            </w:tcBorders>
+            <w:tcMar/>
+            <w:vAlign w:val="center"/>
+          </w:tcPr>
+          <w:p>
+            <w:pPr>
+              <w:spacing w:before="0" w:beforeAutospacing="off" w:after="0" w:afterAutospacing="off"/>
+              <w:jc w:val="center"/>
+            </w:pPr>
+            <w:r>
+              <w:rPr>
+                <w:rFonts w:ascii="Arial" w:hAnsi="Arial" w:eastAsia="Arial" w:cs="Arial"/>
+                <w:b w:val="1"/>
+                <w:bCs w:val="1"/>
+                <w:strike w:val="0"/>
+                <w:dstrike w:val="0"/>
+                <w:sz w:val="21"/>
+                <w:szCs w:val="21"/>
+                <w:u w:val="none"/>
+              </w:rPr>
+              <w:t>Example Code</w:t>
+            </w:r>
+          </w:p>
+        </w:tc>
+      </w:tr>
+      <w:tr>
+        <w:trPr>
+          <w:trHeight w:val="300"/>
+        </w:trPr>
+        <w:tc>
+          <w:tcPr>
+            <w:tcW w:w="1786" w:type="dxa"/>
+            <w:tcBorders>
+              <w:bottom w:val="single" w:color="DCDFE5" w:sz="4"/>
+            </w:tcBorders>
+            <w:tcMar/>
+            <w:vAlign w:val="center"/>
+          </w:tcPr>
+          <w:p>
+            <w:pPr>
+              <w:spacing w:before="0" w:beforeAutospacing="off" w:after="0" w:afterAutospacing="off"/>
+            </w:pPr>
+            <w:r>
+              <w:rPr>
+                <w:rFonts w:ascii="Consolas" w:hAnsi="Consolas" w:eastAsia="Consolas" w:cs="Consolas"/>
+                <w:b w:val="1"/>
+                <w:bCs w:val="1"/>
+                <w:strike w:val="0"/>
+                <w:dstrike w:val="0"/>
+                <w:sz w:val="21"/>
+                <w:szCs w:val="21"/>
+                <w:u w:val="none"/>
+              </w:rPr>
+              <w:t>\"</w:t>
+            </w:r>
+          </w:p>
+        </w:tc>
+        <w:tc>
+          <w:tcPr>
+            <w:tcW w:w="4155" w:type="dxa"/>
+            <w:tcBorders>
+              <w:bottom w:val="single" w:color="DCDFE5" w:sz="4"/>
+            </w:tcBorders>
+            <w:tcMar/>
+            <w:vAlign w:val="center"/>
+          </w:tcPr>
+          <w:p>
+            <w:pPr>
+              <w:spacing w:before="0" w:beforeAutospacing="off" w:after="0" w:afterAutospacing="off"/>
+            </w:pPr>
+            <w:r>
+              <w:rPr>
+                <w:rFonts w:ascii="Arial" w:hAnsi="Arial" w:eastAsia="Arial" w:cs="Arial"/>
+                <w:b w:val="0"/>
+                <w:bCs w:val="0"/>
+                <w:strike w:val="0"/>
+                <w:dstrike w:val="0"/>
+                <w:sz w:val="21"/>
+                <w:szCs w:val="21"/>
+                <w:u w:val="none"/>
+              </w:rPr>
+              <w:t>Double Quote</w:t>
+            </w:r>
+          </w:p>
+        </w:tc>
+        <w:tc>
+          <w:tcPr>
+            <w:tcW w:w="4180" w:type="dxa"/>
+            <w:tcBorders>
+              <w:bottom w:val="single" w:color="DCDFE5" w:sz="4"/>
+            </w:tcBorders>
+            <w:tcMar/>
+            <w:vAlign w:val="center"/>
+          </w:tcPr>
+          <w:p>
+            <w:pPr>
+              <w:spacing w:before="0" w:beforeAutospacing="off" w:after="0" w:afterAutospacing="off"/>
+            </w:pPr>
+            <w:r>
+              <w:rPr>
+                <w:rFonts w:ascii="Consolas" w:hAnsi="Consolas" w:eastAsia="Consolas" w:cs="Consolas"/>
+                <w:b w:val="0"/>
+                <w:bCs w:val="0"/>
+                <w:strike w:val="0"/>
+                <w:dstrike w:val="0"/>
+                <w:sz w:val="21"/>
+                <w:szCs w:val="21"/>
+                <w:u w:val="none"/>
+              </w:rPr>
+              <w:t>echo "He said, \"Hello\".";</w:t>
+            </w:r>
+          </w:p>
+        </w:tc>
+      </w:tr>
+      <w:tr>
+        <w:trPr>
+          <w:trHeight w:val="300"/>
+        </w:trPr>
+        <w:tc>
+          <w:tcPr>
+            <w:tcW w:w="1786" w:type="dxa"/>
+            <w:tcBorders>
+              <w:bottom w:val="single" w:color="DCDFE5" w:sz="4"/>
+            </w:tcBorders>
+            <w:tcMar/>
+            <w:vAlign w:val="center"/>
+          </w:tcPr>
+          <w:p>
+            <w:pPr>
+              <w:spacing w:before="0" w:beforeAutospacing="off" w:after="0" w:afterAutospacing="off"/>
+            </w:pPr>
+            <w:r>
+              <w:rPr>
+                <w:rFonts w:ascii="Consolas" w:hAnsi="Consolas" w:eastAsia="Consolas" w:cs="Consolas"/>
+                <w:b w:val="1"/>
+                <w:bCs w:val="1"/>
+                <w:strike w:val="0"/>
+                <w:dstrike w:val="0"/>
+                <w:sz w:val="21"/>
+                <w:szCs w:val="21"/>
+                <w:u w:val="none"/>
+              </w:rPr>
+              <w:t>\'</w:t>
+            </w:r>
+          </w:p>
+        </w:tc>
+        <w:tc>
+          <w:tcPr>
+            <w:tcW w:w="4155" w:type="dxa"/>
+            <w:tcBorders>
+              <w:bottom w:val="single" w:color="DCDFE5" w:sz="4"/>
+            </w:tcBorders>
+            <w:tcMar/>
+            <w:vAlign w:val="center"/>
+          </w:tcPr>
+          <w:p>
+            <w:pPr>
+              <w:spacing w:before="0" w:beforeAutospacing="off" w:after="0" w:afterAutospacing="off"/>
+            </w:pPr>
+            <w:r>
+              <w:rPr>
+                <w:rFonts w:ascii="Arial" w:hAnsi="Arial" w:eastAsia="Arial" w:cs="Arial"/>
+                <w:b w:val="0"/>
+                <w:bCs w:val="0"/>
+                <w:strike w:val="0"/>
+                <w:dstrike w:val="0"/>
+                <w:sz w:val="21"/>
+                <w:szCs w:val="21"/>
+                <w:u w:val="none"/>
+              </w:rPr>
+              <w:t>Single Quote</w:t>
+            </w:r>
+          </w:p>
+        </w:tc>
+        <w:tc>
+          <w:tcPr>
+            <w:tcW w:w="4180" w:type="dxa"/>
+            <w:tcBorders>
+              <w:bottom w:val="single" w:color="DCDFE5" w:sz="4"/>
+            </w:tcBorders>
+            <w:tcMar/>
+            <w:vAlign w:val="center"/>
+          </w:tcPr>
+          <w:p>
+            <w:pPr>
+              <w:spacing w:before="0" w:beforeAutospacing="off" w:after="0" w:afterAutospacing="off"/>
+            </w:pPr>
+            <w:r>
+              <w:rPr>
+                <w:rFonts w:ascii="Consolas" w:hAnsi="Consolas" w:eastAsia="Consolas" w:cs="Consolas"/>
+                <w:b w:val="0"/>
+                <w:bCs w:val="0"/>
+                <w:strike w:val="0"/>
+                <w:dstrike w:val="0"/>
+                <w:sz w:val="21"/>
+                <w:szCs w:val="21"/>
+                <w:u w:val="none"/>
+              </w:rPr>
+              <w:t>echo 'It\'s a nice day.';</w:t>
+            </w:r>
+          </w:p>
+        </w:tc>
+      </w:tr>
+      <w:tr>
+        <w:trPr>
+          <w:trHeight w:val="300"/>
+        </w:trPr>
+        <w:tc>
+          <w:tcPr>
+            <w:tcW w:w="1786" w:type="dxa"/>
+            <w:tcBorders>
+              <w:bottom w:val="single" w:color="DCDFE5" w:sz="4"/>
+            </w:tcBorders>
+            <w:tcMar/>
+            <w:vAlign w:val="center"/>
+          </w:tcPr>
+          <w:p>
+            <w:pPr>
+              <w:spacing w:before="0" w:beforeAutospacing="off" w:after="0" w:afterAutospacing="off"/>
+            </w:pPr>
+            <w:hyperlink r:id="R0004b737cb284b17">
+              <w:r>
+                <w:rPr>
+                  <w:rStyle w:val="Hyperlink"/>
+                  <w:b w:val="1"/>
+                  <w:bCs w:val="1"/>
+                  <w:strike w:val="0"/>
+                  <w:dstrike w:val="0"/>
+                </w:rPr>
+                <w:t>\\</w:t>
+              </w:r>
+            </w:hyperlink>
+          </w:p>
+        </w:tc>
+        <w:tc>
+          <w:tcPr>
+            <w:tcW w:w="4155" w:type="dxa"/>
+            <w:tcBorders>
+              <w:bottom w:val="single" w:color="DCDFE5" w:sz="4"/>
+            </w:tcBorders>
+            <w:tcMar/>
+            <w:vAlign w:val="center"/>
+          </w:tcPr>
+          <w:p>
+            <w:pPr>
+              <w:spacing w:before="0" w:beforeAutospacing="off" w:after="0" w:afterAutospacing="off"/>
+            </w:pPr>
+            <w:r>
+              <w:rPr>
+                <w:rFonts w:ascii="Arial" w:hAnsi="Arial" w:eastAsia="Arial" w:cs="Arial"/>
+                <w:b w:val="0"/>
+                <w:bCs w:val="0"/>
+                <w:strike w:val="0"/>
+                <w:dstrike w:val="0"/>
+                <w:sz w:val="21"/>
+                <w:szCs w:val="21"/>
+                <w:u w:val="none"/>
+              </w:rPr>
+              <w:t>Literal Backslash</w:t>
+            </w:r>
+          </w:p>
+        </w:tc>
+        <w:tc>
+          <w:tcPr>
+            <w:tcW w:w="4180" w:type="dxa"/>
+            <w:tcBorders>
+              <w:bottom w:val="single" w:color="DCDFE5" w:sz="4"/>
+            </w:tcBorders>
+            <w:tcMar/>
+            <w:vAlign w:val="center"/>
+          </w:tcPr>
+          <w:p>
+            <w:pPr>
+              <w:spacing w:before="0" w:beforeAutospacing="off" w:after="0" w:afterAutospacing="off"/>
+            </w:pPr>
+            <w:r>
+              <w:rPr>
+                <w:rFonts w:ascii="Consolas" w:hAnsi="Consolas" w:eastAsia="Consolas" w:cs="Consolas"/>
+                <w:b w:val="0"/>
+                <w:bCs w:val="0"/>
+                <w:strike w:val="0"/>
+                <w:dstrike w:val="0"/>
+                <w:sz w:val="21"/>
+                <w:szCs w:val="21"/>
+                <w:u w:val="none"/>
+              </w:rPr>
+              <w:t>echo "Path: C:\\xampp\\htdocs";</w:t>
+            </w:r>
+          </w:p>
+        </w:tc>
+      </w:tr>
+      <w:tr>
+        <w:trPr>
+          <w:trHeight w:val="300"/>
+        </w:trPr>
+        <w:tc>
+          <w:tcPr>
+            <w:tcW w:w="1786" w:type="dxa"/>
+            <w:tcBorders>
+              <w:bottom w:val="single" w:color="DCDFE5" w:sz="4"/>
+            </w:tcBorders>
+            <w:tcMar/>
+            <w:vAlign w:val="center"/>
+          </w:tcPr>
+          <w:p>
+            <w:pPr>
+              <w:spacing w:before="0" w:beforeAutospacing="off" w:after="0" w:afterAutospacing="off"/>
+            </w:pPr>
+            <w:r>
+              <w:rPr>
+                <w:rFonts w:ascii="Consolas" w:hAnsi="Consolas" w:eastAsia="Consolas" w:cs="Consolas"/>
+                <w:b w:val="1"/>
+                <w:bCs w:val="1"/>
+                <w:strike w:val="0"/>
+                <w:dstrike w:val="0"/>
+                <w:sz w:val="21"/>
+                <w:szCs w:val="21"/>
+                <w:u w:val="none"/>
+              </w:rPr>
+              <w:t>\$</w:t>
+            </w:r>
+          </w:p>
+        </w:tc>
+        <w:tc>
+          <w:tcPr>
+            <w:tcW w:w="4155" w:type="dxa"/>
+            <w:tcBorders>
+              <w:bottom w:val="single" w:color="DCDFE5" w:sz="4"/>
+            </w:tcBorders>
+            <w:tcMar/>
+            <w:vAlign w:val="center"/>
+          </w:tcPr>
+          <w:p>
+            <w:pPr>
+              <w:spacing w:before="0" w:beforeAutospacing="off" w:after="0" w:afterAutospacing="off"/>
+            </w:pPr>
+            <w:r>
+              <w:rPr>
+                <w:rFonts w:ascii="Arial" w:hAnsi="Arial" w:eastAsia="Arial" w:cs="Arial"/>
+                <w:b w:val="0"/>
+                <w:bCs w:val="0"/>
+                <w:strike w:val="0"/>
+                <w:dstrike w:val="0"/>
+                <w:sz w:val="21"/>
+                <w:szCs w:val="21"/>
+                <w:u w:val="none"/>
+              </w:rPr>
+              <w:t>Literal Dollar Sign (Prevents variable lookup)</w:t>
+            </w:r>
+          </w:p>
+        </w:tc>
+        <w:tc>
+          <w:tcPr>
+            <w:tcW w:w="4180" w:type="dxa"/>
+            <w:tcBorders>
+              <w:bottom w:val="single" w:color="DCDFE5" w:sz="4"/>
+            </w:tcBorders>
+            <w:tcMar/>
+            <w:vAlign w:val="center"/>
+          </w:tcPr>
+          <w:p>
+            <w:pPr>
+              <w:spacing w:before="0" w:beforeAutospacing="off" w:after="0" w:afterAutospacing="off"/>
+            </w:pPr>
+            <w:r>
+              <w:rPr>
+                <w:rFonts w:ascii="Consolas" w:hAnsi="Consolas" w:eastAsia="Consolas" w:cs="Consolas"/>
+                <w:b w:val="0"/>
+                <w:bCs w:val="0"/>
+                <w:strike w:val="0"/>
+                <w:dstrike w:val="0"/>
+                <w:sz w:val="21"/>
+                <w:szCs w:val="21"/>
+                <w:u w:val="none"/>
+              </w:rPr>
+              <w:t>echo "Total cost: \$100";</w:t>
+            </w:r>
+          </w:p>
+        </w:tc>
+      </w:tr>
+      <w:tr>
+        <w:trPr>
+          <w:trHeight w:val="300"/>
+        </w:trPr>
+        <w:tc>
+          <w:tcPr>
+            <w:tcW w:w="1786" w:type="dxa"/>
+            <w:tcBorders>
+              <w:bottom w:val="single" w:color="DCDFE5" w:sz="4"/>
+            </w:tcBorders>
+            <w:tcMar/>
+            <w:vAlign w:val="center"/>
+          </w:tcPr>
+          <w:p>
+            <w:pPr>
+              <w:spacing w:before="0" w:beforeAutospacing="off" w:after="0" w:afterAutospacing="off"/>
+            </w:pPr>
+            <w:r>
+              <w:rPr>
+                <w:rFonts w:ascii="Consolas" w:hAnsi="Consolas" w:eastAsia="Consolas" w:cs="Consolas"/>
+                <w:b w:val="1"/>
+                <w:bCs w:val="1"/>
+                <w:strike w:val="0"/>
+                <w:dstrike w:val="0"/>
+                <w:sz w:val="21"/>
+                <w:szCs w:val="21"/>
+                <w:u w:val="none"/>
+              </w:rPr>
+              <w:t>\n</w:t>
+            </w:r>
+          </w:p>
+        </w:tc>
+        <w:tc>
+          <w:tcPr>
+            <w:tcW w:w="4155" w:type="dxa"/>
+            <w:tcBorders>
+              <w:bottom w:val="single" w:color="DCDFE5" w:sz="4"/>
+            </w:tcBorders>
+            <w:tcMar/>
+            <w:vAlign w:val="center"/>
+          </w:tcPr>
+          <w:p>
+            <w:pPr>
+              <w:spacing w:before="0" w:beforeAutospacing="off" w:after="0" w:afterAutospacing="off"/>
+            </w:pPr>
+            <w:r>
+              <w:rPr>
+                <w:rFonts w:ascii="Arial" w:hAnsi="Arial" w:eastAsia="Arial" w:cs="Arial"/>
+                <w:b w:val="0"/>
+                <w:bCs w:val="0"/>
+                <w:strike w:val="0"/>
+                <w:dstrike w:val="0"/>
+                <w:sz w:val="21"/>
+                <w:szCs w:val="21"/>
+                <w:u w:val="none"/>
+              </w:rPr>
+              <w:t>Line Feed / Newline</w:t>
+            </w:r>
+          </w:p>
+        </w:tc>
+        <w:tc>
+          <w:tcPr>
+            <w:tcW w:w="4180" w:type="dxa"/>
+            <w:tcBorders>
+              <w:bottom w:val="single" w:color="DCDFE5" w:sz="4"/>
+            </w:tcBorders>
+            <w:tcMar/>
+            <w:vAlign w:val="center"/>
+          </w:tcPr>
+          <w:p>
+            <w:pPr>
+              <w:spacing w:before="0" w:beforeAutospacing="off" w:after="0" w:afterAutospacing="off"/>
+            </w:pPr>
+            <w:r>
+              <w:rPr>
+                <w:rFonts w:ascii="Consolas" w:hAnsi="Consolas" w:eastAsia="Consolas" w:cs="Consolas"/>
+                <w:b w:val="0"/>
+                <w:bCs w:val="0"/>
+                <w:strike w:val="0"/>
+                <w:dstrike w:val="0"/>
+                <w:sz w:val="21"/>
+                <w:szCs w:val="21"/>
+                <w:u w:val="none"/>
+              </w:rPr>
+              <w:t>echo "Line 1\nLine 2";</w:t>
+            </w:r>
+          </w:p>
+        </w:tc>
+      </w:tr>
+      <w:tr>
+        <w:trPr>
+          <w:trHeight w:val="300"/>
+        </w:trPr>
+        <w:tc>
+          <w:tcPr>
+            <w:tcW w:w="1786" w:type="dxa"/>
+            <w:tcBorders>
+              <w:bottom w:val="single" w:color="DCDFE5" w:sz="4"/>
+            </w:tcBorders>
+            <w:tcMar/>
+            <w:vAlign w:val="center"/>
+          </w:tcPr>
+          <w:p>
+            <w:pPr>
+              <w:spacing w:before="0" w:beforeAutospacing="off" w:after="0" w:afterAutospacing="off"/>
+            </w:pPr>
+            <w:r>
+              <w:rPr>
+                <w:rFonts w:ascii="Consolas" w:hAnsi="Consolas" w:eastAsia="Consolas" w:cs="Consolas"/>
+                <w:b w:val="1"/>
+                <w:bCs w:val="1"/>
+                <w:strike w:val="0"/>
+                <w:dstrike w:val="0"/>
+                <w:sz w:val="21"/>
+                <w:szCs w:val="21"/>
+                <w:u w:val="none"/>
+              </w:rPr>
+              <w:t>\r</w:t>
+            </w:r>
+          </w:p>
+        </w:tc>
+        <w:tc>
+          <w:tcPr>
+            <w:tcW w:w="4155" w:type="dxa"/>
+            <w:tcBorders>
+              <w:bottom w:val="single" w:color="DCDFE5" w:sz="4"/>
+            </w:tcBorders>
+            <w:tcMar/>
+            <w:vAlign w:val="center"/>
+          </w:tcPr>
+          <w:p>
+            <w:pPr>
+              <w:spacing w:before="0" w:beforeAutospacing="off" w:after="0" w:afterAutospacing="off"/>
+            </w:pPr>
+            <w:r>
+              <w:rPr>
+                <w:rFonts w:ascii="Arial" w:hAnsi="Arial" w:eastAsia="Arial" w:cs="Arial"/>
+                <w:b w:val="0"/>
+                <w:bCs w:val="0"/>
+                <w:strike w:val="0"/>
+                <w:dstrike w:val="0"/>
+                <w:sz w:val="21"/>
+                <w:szCs w:val="21"/>
+                <w:u w:val="none"/>
+              </w:rPr>
+              <w:t>Carriage Return</w:t>
+            </w:r>
+          </w:p>
+        </w:tc>
+        <w:tc>
+          <w:tcPr>
+            <w:tcW w:w="4180" w:type="dxa"/>
+            <w:tcBorders>
+              <w:bottom w:val="single" w:color="DCDFE5" w:sz="4"/>
+            </w:tcBorders>
+            <w:tcMar/>
+            <w:vAlign w:val="center"/>
+          </w:tcPr>
+          <w:p>
+            <w:pPr>
+              <w:spacing w:before="0" w:beforeAutospacing="off" w:after="0" w:afterAutospacing="off"/>
+            </w:pPr>
+            <w:r>
+              <w:rPr>
+                <w:rFonts w:ascii="Consolas" w:hAnsi="Consolas" w:eastAsia="Consolas" w:cs="Consolas"/>
+                <w:b w:val="0"/>
+                <w:bCs w:val="0"/>
+                <w:strike w:val="0"/>
+                <w:dstrike w:val="0"/>
+                <w:sz w:val="21"/>
+                <w:szCs w:val="21"/>
+                <w:u w:val="none"/>
+              </w:rPr>
+              <w:t>echo "Text\rMore Text";</w:t>
+            </w:r>
+          </w:p>
+        </w:tc>
+      </w:tr>
+      <w:tr>
+        <w:trPr>
+          <w:trHeight w:val="300"/>
+        </w:trPr>
+        <w:tc>
+          <w:tcPr>
+            <w:tcW w:w="1786" w:type="dxa"/>
+            <w:tcBorders>
+              <w:bottom w:val="single" w:color="DCDFE5" w:sz="4"/>
+            </w:tcBorders>
+            <w:tcMar/>
+            <w:vAlign w:val="center"/>
+          </w:tcPr>
+          <w:p>
+            <w:pPr>
+              <w:spacing w:before="0" w:beforeAutospacing="off" w:after="0" w:afterAutospacing="off"/>
+            </w:pPr>
+            <w:r>
+              <w:rPr>
+                <w:rFonts w:ascii="Consolas" w:hAnsi="Consolas" w:eastAsia="Consolas" w:cs="Consolas"/>
+                <w:b w:val="1"/>
+                <w:bCs w:val="1"/>
+                <w:strike w:val="0"/>
+                <w:dstrike w:val="0"/>
+                <w:sz w:val="21"/>
+                <w:szCs w:val="21"/>
+                <w:u w:val="none"/>
+              </w:rPr>
+              <w:t>\t</w:t>
+            </w:r>
+          </w:p>
+        </w:tc>
+        <w:tc>
+          <w:tcPr>
+            <w:tcW w:w="4155" w:type="dxa"/>
+            <w:tcBorders>
+              <w:bottom w:val="single" w:color="DCDFE5" w:sz="4"/>
+            </w:tcBorders>
+            <w:tcMar/>
+            <w:vAlign w:val="center"/>
+          </w:tcPr>
+          <w:p>
+            <w:pPr>
+              <w:spacing w:before="0" w:beforeAutospacing="off" w:after="0" w:afterAutospacing="off"/>
+            </w:pPr>
+            <w:r>
+              <w:rPr>
+                <w:rFonts w:ascii="Arial" w:hAnsi="Arial" w:eastAsia="Arial" w:cs="Arial"/>
+                <w:b w:val="0"/>
+                <w:bCs w:val="0"/>
+                <w:strike w:val="0"/>
+                <w:dstrike w:val="0"/>
+                <w:sz w:val="21"/>
+                <w:szCs w:val="21"/>
+                <w:u w:val="none"/>
+              </w:rPr>
+              <w:t>Horizontal Tab</w:t>
+            </w:r>
+          </w:p>
+        </w:tc>
+        <w:tc>
+          <w:tcPr>
+            <w:tcW w:w="4180" w:type="dxa"/>
+            <w:tcBorders>
+              <w:bottom w:val="single" w:color="DCDFE5" w:sz="4"/>
+            </w:tcBorders>
+            <w:tcMar/>
+            <w:vAlign w:val="center"/>
+          </w:tcPr>
+          <w:p>
+            <w:pPr>
+              <w:spacing w:before="0" w:beforeAutospacing="off" w:after="0" w:afterAutospacing="off"/>
+            </w:pPr>
+            <w:r>
+              <w:rPr>
+                <w:rFonts w:ascii="Consolas" w:hAnsi="Consolas" w:eastAsia="Consolas" w:cs="Consolas"/>
+                <w:b w:val="0"/>
+                <w:bCs w:val="0"/>
+                <w:strike w:val="0"/>
+                <w:dstrike w:val="0"/>
+                <w:sz w:val="21"/>
+                <w:szCs w:val="21"/>
+                <w:u w:val="none"/>
+              </w:rPr>
+              <w:t>echo "Name:\tJohn";</w:t>
+            </w:r>
+          </w:p>
+        </w:tc>
+      </w:tr>
+      <w:tr>
+        <w:trPr>
+          <w:trHeight w:val="300"/>
+        </w:trPr>
+        <w:tc>
+          <w:tcPr>
+            <w:tcW w:w="1786" w:type="dxa"/>
+            <w:tcBorders>
+              <w:bottom w:val="single" w:color="DCDFE5" w:sz="4"/>
+            </w:tcBorders>
+            <w:tcMar/>
+            <w:vAlign w:val="center"/>
+          </w:tcPr>
+          <w:p>
+            <w:pPr>
+              <w:spacing w:before="0" w:beforeAutospacing="off" w:after="0" w:afterAutospacing="off"/>
+            </w:pPr>
+            <w:r>
+              <w:rPr>
+                <w:rFonts w:ascii="Consolas" w:hAnsi="Consolas" w:eastAsia="Consolas" w:cs="Consolas"/>
+                <w:b w:val="1"/>
+                <w:bCs w:val="1"/>
+                <w:strike w:val="0"/>
+                <w:dstrike w:val="0"/>
+                <w:sz w:val="21"/>
+                <w:szCs w:val="21"/>
+                <w:u w:val="none"/>
+              </w:rPr>
+              <w:t>\u{xxxx}</w:t>
+            </w:r>
+          </w:p>
+        </w:tc>
+        <w:tc>
+          <w:tcPr>
+            <w:tcW w:w="4155" w:type="dxa"/>
+            <w:tcBorders>
+              <w:bottom w:val="single" w:color="DCDFE5" w:sz="4"/>
+            </w:tcBorders>
+            <w:tcMar/>
+            <w:vAlign w:val="center"/>
+          </w:tcPr>
+          <w:p>
+            <w:pPr>
+              <w:spacing w:before="0" w:beforeAutospacing="off" w:after="0" w:afterAutospacing="off"/>
+            </w:pPr>
+            <w:r>
+              <w:rPr>
+                <w:rFonts w:ascii="Arial" w:hAnsi="Arial" w:eastAsia="Arial" w:cs="Arial"/>
+                <w:b w:val="0"/>
+                <w:bCs w:val="0"/>
+                <w:strike w:val="0"/>
+                <w:dstrike w:val="0"/>
+                <w:sz w:val="21"/>
+                <w:szCs w:val="21"/>
+                <w:u w:val="none"/>
+              </w:rPr>
+              <w:t>Unicode Character (PHP 7+)</w:t>
+            </w:r>
+          </w:p>
+        </w:tc>
+        <w:tc>
+          <w:tcPr>
+            <w:tcW w:w="4180" w:type="dxa"/>
+            <w:tcBorders>
+              <w:bottom w:val="single" w:color="DCDFE5" w:sz="4"/>
+            </w:tcBorders>
+            <w:tcMar/>
+            <w:vAlign w:val="center"/>
+          </w:tcPr>
+          <w:p>
+            <w:pPr>
+              <w:spacing w:before="0" w:beforeAutospacing="off" w:after="0" w:afterAutospacing="off"/>
+            </w:pPr>
+            <w:r>
+              <w:rPr>
+                <w:rFonts w:ascii="Consolas" w:hAnsi="Consolas" w:eastAsia="Consolas" w:cs="Consolas"/>
+                <w:b w:val="0"/>
+                <w:bCs w:val="0"/>
+                <w:strike w:val="0"/>
+                <w:dstrike w:val="0"/>
+                <w:sz w:val="21"/>
+                <w:szCs w:val="21"/>
+                <w:u w:val="none"/>
+              </w:rPr>
+              <w:t>echo "\u{1F600}";</w:t>
+            </w:r>
+            <w:r>
+              <w:rPr>
+                <w:rFonts w:ascii="Arial" w:hAnsi="Arial" w:eastAsia="Arial" w:cs="Arial"/>
+                <w:b w:val="0"/>
+                <w:bCs w:val="0"/>
+                <w:strike w:val="0"/>
+                <w:dstrike w:val="0"/>
+                <w:sz w:val="21"/>
+                <w:szCs w:val="21"/>
+                <w:u w:val="none"/>
+              </w:rPr>
+              <w:t xml:space="preserve"> </w:t>
+            </w:r>
+            <w:r>
+              <w:rPr>
+                <w:rFonts w:ascii="Arial" w:hAnsi="Arial" w:eastAsia="Arial" w:cs="Arial"/>
+                <w:b w:val="0"/>
+                <w:bCs w:val="0"/>
+                <w:i w:val="1"/>
+                <w:iCs w:val="1"/>
+                <w:strike w:val="0"/>
+                <w:dstrike w:val="0"/>
+                <w:sz w:val="21"/>
+                <w:szCs w:val="21"/>
+                <w:u w:val="none"/>
+              </w:rPr>
+              <w:t>(Outputs a smiley face)</w:t>
+            </w:r>
+          </w:p>
+        </w:tc>
+      </w:tr>
+      <w:tr>
+        <w:trPr>
+          <w:trHeight w:val="300"/>
+        </w:trPr>
+        <w:tc>
+          <w:tcPr>
+            <w:tcW w:w="1786" w:type="dxa"/>
+            <w:tcBorders>
+              <w:bottom w:val="nil"/>
+            </w:tcBorders>
+            <w:tcMar/>
+            <w:vAlign w:val="center"/>
+          </w:tcPr>
+          <w:p>
+            <w:pPr>
+              <w:spacing w:before="0" w:beforeAutospacing="off" w:after="0" w:afterAutospacing="off"/>
+            </w:pPr>
+            <w:r>
+              <w:rPr>
+                <w:rFonts w:ascii="Consolas" w:hAnsi="Consolas" w:eastAsia="Consolas" w:cs="Consolas"/>
+                <w:b w:val="1"/>
+                <w:bCs w:val="1"/>
+                <w:strike w:val="0"/>
+                <w:dstrike w:val="0"/>
+                <w:sz w:val="21"/>
+                <w:szCs w:val="21"/>
+                <w:u w:val="none"/>
+              </w:rPr>
+              <w:t>\xhh</w:t>
+            </w:r>
+          </w:p>
+        </w:tc>
+        <w:tc>
+          <w:tcPr>
+            <w:tcW w:w="4155" w:type="dxa"/>
+            <w:tcBorders>
+              <w:bottom w:val="nil"/>
+            </w:tcBorders>
+            <w:tcMar/>
+            <w:vAlign w:val="center"/>
+          </w:tcPr>
+          <w:p>
+            <w:pPr>
+              <w:spacing w:before="0" w:beforeAutospacing="off" w:after="0" w:afterAutospacing="off"/>
+            </w:pPr>
+            <w:r>
+              <w:rPr>
+                <w:rFonts w:ascii="Arial" w:hAnsi="Arial" w:eastAsia="Arial" w:cs="Arial"/>
+                <w:b w:val="0"/>
+                <w:bCs w:val="0"/>
+                <w:strike w:val="0"/>
+                <w:dstrike w:val="0"/>
+                <w:sz w:val="21"/>
+                <w:szCs w:val="21"/>
+                <w:u w:val="none"/>
+              </w:rPr>
+              <w:t>Hexadecimal Character</w:t>
+            </w:r>
+          </w:p>
+        </w:tc>
+        <w:tc>
+          <w:tcPr>
+            <w:tcW w:w="4180" w:type="dxa"/>
+            <w:tcBorders>
+              <w:bottom w:val="nil"/>
+            </w:tcBorders>
+            <w:tcMar/>
+            <w:vAlign w:val="center"/>
+          </w:tcPr>
+          <w:p>
+            <w:pPr>
+              <w:spacing w:before="0" w:beforeAutospacing="off" w:after="0" w:afterAutospacing="off"/>
+            </w:pPr>
+            <w:r>
+              <w:rPr>
+                <w:rFonts w:ascii="Consolas" w:hAnsi="Consolas" w:eastAsia="Consolas" w:cs="Consolas"/>
+                <w:b w:val="0"/>
+                <w:bCs w:val="0"/>
+                <w:strike w:val="0"/>
+                <w:dstrike w:val="0"/>
+                <w:sz w:val="21"/>
+                <w:szCs w:val="21"/>
+                <w:u w:val="none"/>
+              </w:rPr>
+              <w:t>echo "\x41";</w:t>
+            </w:r>
+            <w:r>
+              <w:rPr>
+                <w:rFonts w:ascii="Arial" w:hAnsi="Arial" w:eastAsia="Arial" w:cs="Arial"/>
+                <w:b w:val="0"/>
+                <w:bCs w:val="0"/>
+                <w:strike w:val="0"/>
+                <w:dstrike w:val="0"/>
+                <w:sz w:val="21"/>
+                <w:szCs w:val="21"/>
+                <w:u w:val="none"/>
+              </w:rPr>
+              <w:t xml:space="preserve"> </w:t>
+            </w:r>
+            <w:r>
+              <w:rPr>
+                <w:rFonts w:ascii="Arial" w:hAnsi="Arial" w:eastAsia="Arial" w:cs="Arial"/>
+                <w:b w:val="0"/>
+                <w:bCs w:val="0"/>
+                <w:i w:val="1"/>
+                <w:iCs w:val="1"/>
+                <w:strike w:val="0"/>
+                <w:dstrike w:val="0"/>
+                <w:sz w:val="21"/>
+                <w:szCs w:val="21"/>
+                <w:u w:val="none"/>
+              </w:rPr>
+              <w:t>(Outputs 'A')</w:t>
+            </w:r>
+          </w:p>
+        </w:tc>
+      </w:tr>
+    </w:tbl>
+    <w:p>
+      <w:pPr>
+        <w:spacing w:before="180" w:beforeAutospacing="off" w:after="240" w:afterAutospacing="off"/>
+        <w:rPr>
+          <w:rFonts w:ascii="Arial" w:hAnsi="Arial" w:eastAsia="Arial" w:cs="Arial"/>
+          <w:b w:val="1"/>
+          <w:bCs w:val="1"/>
+          <w:strike w:val="0"/>
+          <w:dstrike w:val="0"/>
+          <w:noProof w:val="0"/>
+          <w:color w:val="4C94D8" w:themeColor="text2" w:themeTint="80" w:themeShade="FF"/>
+          <w:sz w:val="24"/>
+          <w:szCs w:val="24"/>
+          <w:u w:val="none"/>
+          <w:lang w:val="en-GB"/>
+        </w:rPr>
+      </w:pPr>
+    </w:p>
+    <w:p>
+      <w:pPr>
+        <w:pStyle w:val="Normal"/>
+        <w:spacing w:before="0" w:beforeAutospacing="off" w:after="180" w:afterAutospacing="off"/>
+        <w:ind w:left="0"/>
+        <w:rPr>
+          <w:rFonts w:ascii="Arial" w:hAnsi="Arial" w:eastAsia="Arial" w:cs="Arial"/>
+          <w:b w:val="1"/>
+          <w:bCs w:val="1"/>
+          <w:strike w:val="0"/>
+          <w:dstrike w:val="0"/>
+          <w:noProof w:val="0"/>
+          <w:color w:val="4C94D8" w:themeColor="text2" w:themeTint="80" w:themeShade="FF"/>
+          <w:sz w:val="24"/>
+          <w:szCs w:val="24"/>
+          <w:u w:val="none"/>
+          <w:lang w:val="en-GB"/>
+        </w:rPr>
+      </w:pPr>
+    </w:p>
+    <w:p>
+      <w:pPr>
+        <w:pStyle w:val="Normal"/>
+        <w:spacing w:before="0" w:beforeAutospacing="off" w:after="180" w:afterAutospacing="off"/>
+        <w:ind w:left="0"/>
+        <w:rPr>
+          <w:rFonts w:ascii="Arial" w:hAnsi="Arial" w:eastAsia="Arial" w:cs="Arial"/>
+          <w:b w:val="1"/>
+          <w:bCs w:val="1"/>
+          <w:strike w:val="0"/>
+          <w:dstrike w:val="0"/>
+          <w:noProof w:val="0"/>
+          <w:color w:val="4C94D8" w:themeColor="text2" w:themeTint="80" w:themeShade="FF"/>
+          <w:sz w:val="24"/>
+          <w:szCs w:val="24"/>
+          <w:u w:val="none"/>
+          <w:lang w:val="en-GB"/>
+        </w:rPr>
+      </w:pPr>
+    </w:p>
+    <w:p>
+      <w:pPr>
+        <w:pStyle w:val="Normal"/>
+        <w:spacing w:before="240" w:beforeAutospacing="off" w:after="240" w:afterAutospacing="off"/>
+        <w:ind w:left="0"/>
+        <w:rPr>
+          <w:rFonts w:ascii="Calibri" w:hAnsi="Calibri" w:eastAsia="Calibri" w:cs="Calibri"/>
+          <w:b w:val="1"/>
+          <w:bCs w:val="1"/>
+          <w:noProof w:val="0"/>
+          <w:color w:val="4C94D8" w:themeColor="text2" w:themeTint="80" w:themeShade="FF"/>
+          <w:sz w:val="32"/>
+          <w:szCs w:val="32"/>
+          <w:lang w:val="en-GB"/>
+        </w:rPr>
+      </w:pPr>
+    </w:p>
+    <w:p>
+      <w:pPr>
+        <w:pStyle w:val="Normal"/>
+        <w:spacing w:before="240" w:beforeAutospacing="off" w:after="240" w:afterAutospacing="off"/>
+        <w:ind w:left="0"/>
+        <w:rPr>
+          <w:rFonts w:ascii="Calibri" w:hAnsi="Calibri" w:eastAsia="Calibri" w:cs="Calibri"/>
+          <w:b w:val="1"/>
+          <w:bCs w:val="1"/>
+          <w:noProof w:val="0"/>
+          <w:color w:val="4C94D8" w:themeColor="text2" w:themeTint="80" w:themeShade="FF"/>
+          <w:sz w:val="24"/>
+          <w:szCs w:val="24"/>
+          <w:lang w:val="en-GB"/>
+        </w:rPr>
+      </w:pPr>
+    </w:p>
+    <w:p>
+      <w:pPr>
+        <w:pStyle w:val="Normal"/>
+        <w:rPr>
+          <w:b w:val="1"/>
+          <w:bCs w:val="1"/>
+          <w:color w:val="4C94D8" w:themeColor="text2" w:themeTint="80" w:themeShade="FF"/>
+        </w:rPr>
       </w:pPr>
     </w:p>
     <w:p>
@@ -1002,6 +4632,230 @@
 
 <file path=word/numbering.xml><?xml version="1.0" encoding="utf-8"?>
 <w:numbering xmlns:w="http://schemas.openxmlformats.org/wordprocessingml/2006/main">
+  <w:abstractNum xmlns:w="http://schemas.openxmlformats.org/wordprocessingml/2006/main" w:abstractNumId="5">
+    <w:nsid w:val="5ca6f78e"/>
+    <w:multiLevelType xmlns:w="http://schemas.openxmlformats.org/wordprocessingml/2006/main" w:val="hybridMultilevel"/>
+    <w:lvl xmlns:w="http://schemas.openxmlformats.org/wordprocessingml/2006/main" w:ilvl="0">
+      <w:start w:val="1"/>
+      <w:numFmt w:val="bullet"/>
+      <w:lvlText w:val=""/>
+      <w:lvlJc w:val="left"/>
+      <w:pPr>
+        <w:ind w:left="720" w:hanging="360"/>
+      </w:pPr>
+      <w:rPr>
+        <w:rFonts w:hint="default" w:ascii="Symbol" w:hAnsi="Symbol"/>
+      </w:rPr>
+    </w:lvl>
+    <w:lvl xmlns:w="http://schemas.openxmlformats.org/wordprocessingml/2006/main" w:ilvl="1">
+      <w:start w:val="1"/>
+      <w:numFmt w:val="bullet"/>
+      <w:lvlText w:val="o"/>
+      <w:lvlJc w:val="left"/>
+      <w:pPr>
+        <w:ind w:left="1440" w:hanging="360"/>
+      </w:pPr>
+      <w:rPr>
+        <w:rFonts w:hint="default" w:ascii="Courier New" w:hAnsi="Courier New"/>
+      </w:rPr>
+    </w:lvl>
+    <w:lvl xmlns:w="http://schemas.openxmlformats.org/wordprocessingml/2006/main" w:ilvl="2">
+      <w:start w:val="1"/>
+      <w:numFmt w:val="bullet"/>
+      <w:lvlText w:val=""/>
+      <w:lvlJc w:val="left"/>
+      <w:pPr>
+        <w:ind w:left="2160" w:hanging="360"/>
+      </w:pPr>
+      <w:rPr>
+        <w:rFonts w:hint="default" w:ascii="Wingdings" w:hAnsi="Wingdings"/>
+      </w:rPr>
+    </w:lvl>
+    <w:lvl xmlns:w="http://schemas.openxmlformats.org/wordprocessingml/2006/main" w:ilvl="3">
+      <w:start w:val="1"/>
+      <w:numFmt w:val="bullet"/>
+      <w:lvlText w:val=""/>
+      <w:lvlJc w:val="left"/>
+      <w:pPr>
+        <w:ind w:left="2880" w:hanging="360"/>
+      </w:pPr>
+      <w:rPr>
+        <w:rFonts w:hint="default" w:ascii="Symbol" w:hAnsi="Symbol"/>
+      </w:rPr>
+    </w:lvl>
+    <w:lvl xmlns:w="http://schemas.openxmlformats.org/wordprocessingml/2006/main" w:ilvl="4">
+      <w:start w:val="1"/>
+      <w:numFmt w:val="bullet"/>
+      <w:lvlText w:val="o"/>
+      <w:lvlJc w:val="left"/>
+      <w:pPr>
+        <w:ind w:left="3600" w:hanging="360"/>
+      </w:pPr>
+      <w:rPr>
+        <w:rFonts w:hint="default" w:ascii="Courier New" w:hAnsi="Courier New"/>
+      </w:rPr>
+    </w:lvl>
+    <w:lvl xmlns:w="http://schemas.openxmlformats.org/wordprocessingml/2006/main" w:ilvl="5">
+      <w:start w:val="1"/>
+      <w:numFmt w:val="bullet"/>
+      <w:lvlText w:val=""/>
+      <w:lvlJc w:val="left"/>
+      <w:pPr>
+        <w:ind w:left="4320" w:hanging="360"/>
+      </w:pPr>
+      <w:rPr>
+        <w:rFonts w:hint="default" w:ascii="Wingdings" w:hAnsi="Wingdings"/>
+      </w:rPr>
+    </w:lvl>
+    <w:lvl xmlns:w="http://schemas.openxmlformats.org/wordprocessingml/2006/main" w:ilvl="6">
+      <w:start w:val="1"/>
+      <w:numFmt w:val="bullet"/>
+      <w:lvlText w:val=""/>
+      <w:lvlJc w:val="left"/>
+      <w:pPr>
+        <w:ind w:left="5040" w:hanging="360"/>
+      </w:pPr>
+      <w:rPr>
+        <w:rFonts w:hint="default" w:ascii="Symbol" w:hAnsi="Symbol"/>
+      </w:rPr>
+    </w:lvl>
+    <w:lvl xmlns:w="http://schemas.openxmlformats.org/wordprocessingml/2006/main" w:ilvl="7">
+      <w:start w:val="1"/>
+      <w:numFmt w:val="bullet"/>
+      <w:lvlText w:val="o"/>
+      <w:lvlJc w:val="left"/>
+      <w:pPr>
+        <w:ind w:left="5760" w:hanging="360"/>
+      </w:pPr>
+      <w:rPr>
+        <w:rFonts w:hint="default" w:ascii="Courier New" w:hAnsi="Courier New"/>
+      </w:rPr>
+    </w:lvl>
+    <w:lvl xmlns:w="http://schemas.openxmlformats.org/wordprocessingml/2006/main" w:ilvl="8">
+      <w:start w:val="1"/>
+      <w:numFmt w:val="bullet"/>
+      <w:lvlText w:val=""/>
+      <w:lvlJc w:val="left"/>
+      <w:pPr>
+        <w:ind w:left="6480" w:hanging="360"/>
+      </w:pPr>
+      <w:rPr>
+        <w:rFonts w:hint="default" w:ascii="Wingdings" w:hAnsi="Wingdings"/>
+      </w:rPr>
+    </w:lvl>
+  </w:abstractNum>
+  <w:abstractNum xmlns:w="http://schemas.openxmlformats.org/wordprocessingml/2006/main" w:abstractNumId="4">
+    <w:nsid w:val="6cf51323"/>
+    <w:multiLevelType xmlns:w="http://schemas.openxmlformats.org/wordprocessingml/2006/main" w:val="hybridMultilevel"/>
+    <w:lvl xmlns:w="http://schemas.openxmlformats.org/wordprocessingml/2006/main" w:ilvl="0">
+      <w:start w:val="1"/>
+      <w:numFmt w:val="bullet"/>
+      <w:lvlText w:val=""/>
+      <w:lvlJc w:val="left"/>
+      <w:pPr>
+        <w:ind w:left="720" w:hanging="360"/>
+      </w:pPr>
+      <w:rPr>
+        <w:rFonts w:hint="default" w:ascii="Symbol" w:hAnsi="Symbol"/>
+      </w:rPr>
+    </w:lvl>
+    <w:lvl xmlns:w="http://schemas.openxmlformats.org/wordprocessingml/2006/main" w:ilvl="1">
+      <w:start w:val="1"/>
+      <w:numFmt w:val="bullet"/>
+      <w:lvlText w:val="o"/>
+      <w:lvlJc w:val="left"/>
+      <w:pPr>
+        <w:ind w:left="1440" w:hanging="360"/>
+      </w:pPr>
+      <w:rPr>
+        <w:rFonts w:hint="default" w:ascii="Courier New" w:hAnsi="Courier New"/>
+      </w:rPr>
+    </w:lvl>
+    <w:lvl xmlns:w="http://schemas.openxmlformats.org/wordprocessingml/2006/main" w:ilvl="2">
+      <w:start w:val="1"/>
+      <w:numFmt w:val="bullet"/>
+      <w:lvlText w:val=""/>
+      <w:lvlJc w:val="left"/>
+      <w:pPr>
+        <w:ind w:left="2160" w:hanging="360"/>
+      </w:pPr>
+      <w:rPr>
+        <w:rFonts w:hint="default" w:ascii="Wingdings" w:hAnsi="Wingdings"/>
+      </w:rPr>
+    </w:lvl>
+    <w:lvl xmlns:w="http://schemas.openxmlformats.org/wordprocessingml/2006/main" w:ilvl="3">
+      <w:start w:val="1"/>
+      <w:numFmt w:val="bullet"/>
+      <w:lvlText w:val=""/>
+      <w:lvlJc w:val="left"/>
+      <w:pPr>
+        <w:ind w:left="2880" w:hanging="360"/>
+      </w:pPr>
+      <w:rPr>
+        <w:rFonts w:hint="default" w:ascii="Symbol" w:hAnsi="Symbol"/>
+      </w:rPr>
+    </w:lvl>
+    <w:lvl xmlns:w="http://schemas.openxmlformats.org/wordprocessingml/2006/main" w:ilvl="4">
+      <w:start w:val="1"/>
+      <w:numFmt w:val="bullet"/>
+      <w:lvlText w:val="o"/>
+      <w:lvlJc w:val="left"/>
+      <w:pPr>
+        <w:ind w:left="3600" w:hanging="360"/>
+      </w:pPr>
+      <w:rPr>
+        <w:rFonts w:hint="default" w:ascii="Courier New" w:hAnsi="Courier New"/>
+      </w:rPr>
+    </w:lvl>
+    <w:lvl xmlns:w="http://schemas.openxmlformats.org/wordprocessingml/2006/main" w:ilvl="5">
+      <w:start w:val="1"/>
+      <w:numFmt w:val="bullet"/>
+      <w:lvlText w:val=""/>
+      <w:lvlJc w:val="left"/>
+      <w:pPr>
+        <w:ind w:left="4320" w:hanging="360"/>
+      </w:pPr>
+      <w:rPr>
+        <w:rFonts w:hint="default" w:ascii="Wingdings" w:hAnsi="Wingdings"/>
+      </w:rPr>
+    </w:lvl>
+    <w:lvl xmlns:w="http://schemas.openxmlformats.org/wordprocessingml/2006/main" w:ilvl="6">
+      <w:start w:val="1"/>
+      <w:numFmt w:val="bullet"/>
+      <w:lvlText w:val=""/>
+      <w:lvlJc w:val="left"/>
+      <w:pPr>
+        <w:ind w:left="5040" w:hanging="360"/>
+      </w:pPr>
+      <w:rPr>
+        <w:rFonts w:hint="default" w:ascii="Symbol" w:hAnsi="Symbol"/>
+      </w:rPr>
+    </w:lvl>
+    <w:lvl xmlns:w="http://schemas.openxmlformats.org/wordprocessingml/2006/main" w:ilvl="7">
+      <w:start w:val="1"/>
+      <w:numFmt w:val="bullet"/>
+      <w:lvlText w:val="o"/>
+      <w:lvlJc w:val="left"/>
+      <w:pPr>
+        <w:ind w:left="5760" w:hanging="360"/>
+      </w:pPr>
+      <w:rPr>
+        <w:rFonts w:hint="default" w:ascii="Courier New" w:hAnsi="Courier New"/>
+      </w:rPr>
+    </w:lvl>
+    <w:lvl xmlns:w="http://schemas.openxmlformats.org/wordprocessingml/2006/main" w:ilvl="8">
+      <w:start w:val="1"/>
+      <w:numFmt w:val="bullet"/>
+      <w:lvlText w:val=""/>
+      <w:lvlJc w:val="left"/>
+      <w:pPr>
+        <w:ind w:left="6480" w:hanging="360"/>
+      </w:pPr>
+      <w:rPr>
+        <w:rFonts w:hint="default" w:ascii="Wingdings" w:hAnsi="Wingdings"/>
+      </w:rPr>
+    </w:lvl>
+  </w:abstractNum>
   <w:abstractNum xmlns:w="http://schemas.openxmlformats.org/wordprocessingml/2006/main" w:abstractNumId="3">
     <w:nsid w:val="39d3b130"/>
     <w:multiLevelType xmlns:w="http://schemas.openxmlformats.org/wordprocessingml/2006/main" w:val="hybridMultilevel"/>
@@ -1338,6 +5192,12 @@
       </w:rPr>
     </w:lvl>
   </w:abstractNum>
+  <w:num w:numId="5">
+    <w:abstractNumId w:val="5"/>
+  </w:num>
+  <w:num w:numId="4">
+    <w:abstractNumId w:val="4"/>
+  </w:num>
   <w:num w:numId="3">
     <w:abstractNumId w:val="3"/>
   </w:num>
@@ -1776,7 +5636,7 @@
     <w:name w:val="List Paragraph"/>
     <w:basedOn w:val="Normal"/>
     <w:qFormat/>
-    <w:rsid w:val="427004BD"/>
+    <w:rsid w:val="309A4FE5"/>
     <w:pPr>
       <w:spacing/>
       <w:ind w:left="720"/>
@@ -1790,7 +5650,7 @@
     <w:next w:val="Normal"/>
     <w:unhideWhenUsed/>
     <w:qFormat/>
-    <w:rsid w:val="427004BD"/>
+    <w:rsid w:val="309A4FE5"/>
     <w:rPr>
       <w:rFonts w:eastAsia="" w:cs="" w:eastAsiaTheme="majorEastAsia" w:cstheme="majorBidi"/>
       <w:color w:val="0F4761" w:themeColor="accent1" w:themeTint="FF" w:themeShade="BF"/>
@@ -1809,11 +5669,37 @@
     <w:name w:val="Hyperlink"/>
     <w:basedOn w:val="DefaultParagraphFont"/>
     <w:unhideWhenUsed/>
-    <w:rsid w:val="427004BD"/>
+    <w:rsid w:val="309A4FE5"/>
     <w:rPr>
       <w:color w:val="467886"/>
       <w:u w:val="single"/>
     </w:rPr>
+  </w:style>
+  <w:style xmlns:w="http://schemas.openxmlformats.org/wordprocessingml/2006/main" w:type="table" w:styleId="TableGrid">
+    <w:name xmlns:w="http://schemas.openxmlformats.org/wordprocessingml/2006/main" w:val="Table Grid"/>
+    <w:basedOn xmlns:w="http://schemas.openxmlformats.org/wordprocessingml/2006/main" w:val="TableNormal"/>
+    <w:uiPriority xmlns:w="http://schemas.openxmlformats.org/wordprocessingml/2006/main" w:val="59"/>
+    <w:rsid xmlns:w="http://schemas.openxmlformats.org/wordprocessingml/2006/main" w:val="00FB4123"/>
+    <w:pPr xmlns:w="http://schemas.openxmlformats.org/wordprocessingml/2006/main">
+      <w:spacing w:after="0" w:line="240" w:lineRule="auto"/>
+    </w:pPr>
+    <w:tblPr xmlns:w="http://schemas.openxmlformats.org/wordprocessingml/2006/main">
+      <w:tblInd w:w="0" w:type="dxa"/>
+      <w:tblBorders>
+        <w:top w:val="single" w:color="000000" w:themeColor="text1" w:sz="4" w:space="0"/>
+        <w:left w:val="single" w:color="000000" w:themeColor="text1" w:sz="4" w:space="0"/>
+        <w:bottom w:val="single" w:color="000000" w:themeColor="text1" w:sz="4" w:space="0"/>
+        <w:right w:val="single" w:color="000000" w:themeColor="text1" w:sz="4" w:space="0"/>
+        <w:insideH w:val="single" w:color="000000" w:themeColor="text1" w:sz="4" w:space="0"/>
+        <w:insideV w:val="single" w:color="000000" w:themeColor="text1" w:sz="4" w:space="0"/>
+      </w:tblBorders>
+      <w:tblCellMar>
+        <w:top w:w="0" w:type="dxa"/>
+        <w:left w:w="108" w:type="dxa"/>
+        <w:bottom w:w="0" w:type="dxa"/>
+        <w:right w:w="108" w:type="dxa"/>
+      </w:tblCellMar>
+    </w:tblPr>
   </w:style>
 </w:styles>
 </file>

</xml_diff>

<commit_message>
Add practice scripts for PHP variables, superglobals and scope
</commit_message>
<xml_diff>
--- a/PHP.docx
+++ b/PHP.docx
@@ -5422,7 +5422,10 @@
           <w:numId w:val="6"/>
         </w:numPr>
         <w:spacing w:before="0" w:beforeAutospacing="off" w:after="180" w:afterAutospacing="off"/>
-        <w:rPr/>
+        <w:rPr>
+          <w:noProof w:val="0"/>
+          <w:lang w:val="en-GB"/>
+        </w:rPr>
       </w:pPr>
       <w:r>
         <w:rPr>
@@ -5468,6 +5471,947 @@
         </w:rPr>
         <w:t xml:space="preserve"> or implicit type conversion</w:t>
       </w:r>
+    </w:p>
+    <w:p>
+      <w:pPr>
+        <w:pStyle w:val="Normal"/>
+        <w:spacing w:before="0" w:beforeAutospacing="off" w:after="180" w:afterAutospacing="off"/>
+        <w:rPr>
+          <w:noProof w:val="0"/>
+          <w:lang w:val="en-GB"/>
+        </w:rPr>
+      </w:pPr>
+    </w:p>
+    <w:p>
+      <w:pPr>
+        <w:pStyle w:val="Normal"/>
+        <w:spacing w:before="0" w:beforeAutospacing="off" w:after="180" w:afterAutospacing="off"/>
+      </w:pPr>
+      <w:r>
+        <w:rPr>
+          <w:b w:val="1"/>
+          <w:bCs w:val="1"/>
+          <w:noProof w:val="0"/>
+          <w:color w:val="FF0000"/>
+          <w:sz w:val="32"/>
+          <w:szCs w:val="32"/>
+          <w:lang w:val="en-GB"/>
+        </w:rPr>
+        <w:t>SUPER GLOBALS:</w:t>
+      </w:r>
+    </w:p>
+    <w:p>
+      <w:pPr>
+        <w:pStyle w:val="Normal"/>
+        <w:spacing w:before="0" w:beforeAutospacing="off" w:after="180" w:afterAutospacing="off"/>
+        <w:rPr>
+          <w:rFonts w:ascii="Calibri" w:hAnsi="Calibri" w:eastAsia="Calibri" w:cs="Calibri" w:asciiTheme="minorAscii" w:hAnsiTheme="minorAscii" w:eastAsiaTheme="minorAscii" w:cstheme="minorAscii"/>
+          <w:b w:val="0"/>
+          <w:bCs w:val="0"/>
+          <w:noProof w:val="0"/>
+          <w:color w:val="auto"/>
+          <w:sz w:val="22"/>
+          <w:szCs w:val="22"/>
+          <w:lang w:val="en-GB"/>
+        </w:rPr>
+      </w:pPr>
+      <w:r>
+        <w:rPr>
+          <w:rFonts w:ascii="Calibri" w:hAnsi="Calibri" w:eastAsia="Calibri" w:cs="Calibri" w:asciiTheme="minorAscii" w:hAnsiTheme="minorAscii" w:eastAsiaTheme="minorAscii" w:cstheme="minorAscii"/>
+          <w:b w:val="0"/>
+          <w:bCs w:val="0"/>
+          <w:noProof w:val="0"/>
+          <w:color w:val="auto"/>
+          <w:sz w:val="22"/>
+          <w:szCs w:val="22"/>
+          <w:lang w:val="en-GB"/>
+        </w:rPr>
+        <w:t>A superglobal in PHP is a built-in, predefined variable that is always accessible regardless of scope. This means you can access them inside any function, class, or file without needing to declare them with the global keyword</w:t>
+      </w:r>
+    </w:p>
+    <w:p>
+      <w:pPr>
+        <w:spacing w:before="360" w:beforeAutospacing="off" w:after="180" w:afterAutospacing="off"/>
+        <w:rPr>
+          <w:rFonts w:ascii="Calibri" w:hAnsi="Calibri" w:eastAsia="Calibri" w:cs="Calibri" w:asciiTheme="minorAscii" w:hAnsiTheme="minorAscii" w:eastAsiaTheme="minorAscii" w:cstheme="minorAscii"/>
+          <w:b w:val="1"/>
+          <w:bCs w:val="1"/>
+          <w:strike w:val="0"/>
+          <w:dstrike w:val="0"/>
+          <w:noProof w:val="0"/>
+          <w:sz w:val="22"/>
+          <w:szCs w:val="22"/>
+          <w:u w:val="none"/>
+          <w:lang w:val="en-GB"/>
+        </w:rPr>
+      </w:pPr>
+      <w:r>
+        <w:rPr>
+          <w:rFonts w:ascii="Calibri" w:hAnsi="Calibri" w:eastAsia="Calibri" w:cs="Calibri" w:asciiTheme="minorAscii" w:hAnsiTheme="minorAscii" w:eastAsiaTheme="minorAscii" w:cstheme="minorAscii"/>
+          <w:b w:val="1"/>
+          <w:bCs w:val="1"/>
+          <w:strike w:val="0"/>
+          <w:dstrike w:val="0"/>
+          <w:noProof w:val="0"/>
+          <w:sz w:val="22"/>
+          <w:szCs w:val="22"/>
+          <w:u w:val="none"/>
+          <w:lang w:val="en-GB"/>
+        </w:rPr>
+        <w:t>Characteristics</w:t>
+      </w:r>
+    </w:p>
+    <w:p>
+      <w:pPr>
+        <w:pStyle w:val="ListParagraph"/>
+        <w:numPr>
+          <w:ilvl w:val="0"/>
+          <w:numId w:val="7"/>
+        </w:numPr>
+        <w:spacing w:before="0" w:beforeAutospacing="off" w:after="180" w:afterAutospacing="off"/>
+        <w:rPr>
+          <w:rFonts w:ascii="Calibri" w:hAnsi="Calibri" w:eastAsia="Calibri" w:cs="Calibri" w:asciiTheme="minorAscii" w:hAnsiTheme="minorAscii" w:eastAsiaTheme="minorAscii" w:cstheme="minorAscii"/>
+          <w:b w:val="0"/>
+          <w:bCs w:val="0"/>
+          <w:strike w:val="0"/>
+          <w:dstrike w:val="0"/>
+          <w:noProof w:val="0"/>
+          <w:sz w:val="22"/>
+          <w:szCs w:val="22"/>
+          <w:u w:val="none"/>
+          <w:lang w:val="en-GB"/>
+        </w:rPr>
+      </w:pPr>
+      <w:r>
+        <w:rPr>
+          <w:rFonts w:ascii="Calibri" w:hAnsi="Calibri" w:eastAsia="Calibri" w:cs="Calibri" w:asciiTheme="minorAscii" w:hAnsiTheme="minorAscii" w:eastAsiaTheme="minorAscii" w:cstheme="minorAscii"/>
+          <w:b w:val="1"/>
+          <w:bCs w:val="1"/>
+          <w:strike w:val="0"/>
+          <w:dstrike w:val="0"/>
+          <w:noProof w:val="0"/>
+          <w:sz w:val="22"/>
+          <w:szCs w:val="22"/>
+          <w:u w:val="none"/>
+          <w:lang w:val="en-GB"/>
+        </w:rPr>
+        <w:t>Automatic Scope:</w:t>
+      </w:r>
+      <w:r>
+        <w:rPr>
+          <w:rFonts w:ascii="Calibri" w:hAnsi="Calibri" w:eastAsia="Calibri" w:cs="Calibri" w:asciiTheme="minorAscii" w:hAnsiTheme="minorAscii" w:eastAsiaTheme="minorAscii" w:cstheme="minorAscii"/>
+          <w:b w:val="0"/>
+          <w:bCs w:val="0"/>
+          <w:strike w:val="0"/>
+          <w:dstrike w:val="0"/>
+          <w:noProof w:val="0"/>
+          <w:sz w:val="22"/>
+          <w:szCs w:val="22"/>
+          <w:u w:val="none"/>
+          <w:lang w:val="en-GB"/>
+        </w:rPr>
+        <w:t xml:space="preserve"> Available globally throughout your entire PHP script.</w:t>
+      </w:r>
+    </w:p>
+    <w:p>
+      <w:pPr>
+        <w:pStyle w:val="ListParagraph"/>
+        <w:numPr>
+          <w:ilvl w:val="0"/>
+          <w:numId w:val="7"/>
+        </w:numPr>
+        <w:spacing w:before="0" w:beforeAutospacing="off" w:after="180" w:afterAutospacing="off"/>
+        <w:rPr>
+          <w:rFonts w:ascii="Calibri" w:hAnsi="Calibri" w:eastAsia="Calibri" w:cs="Calibri" w:asciiTheme="minorAscii" w:hAnsiTheme="minorAscii" w:eastAsiaTheme="minorAscii" w:cstheme="minorAscii"/>
+          <w:b w:val="0"/>
+          <w:bCs w:val="0"/>
+          <w:strike w:val="0"/>
+          <w:dstrike w:val="0"/>
+          <w:noProof w:val="0"/>
+          <w:sz w:val="22"/>
+          <w:szCs w:val="22"/>
+          <w:u w:val="none"/>
+          <w:lang w:val="en-GB"/>
+        </w:rPr>
+      </w:pPr>
+      <w:r>
+        <w:rPr>
+          <w:rFonts w:ascii="Calibri" w:hAnsi="Calibri" w:eastAsia="Calibri" w:cs="Calibri" w:asciiTheme="minorAscii" w:hAnsiTheme="minorAscii" w:eastAsiaTheme="minorAscii" w:cstheme="minorAscii"/>
+          <w:b w:val="1"/>
+          <w:bCs w:val="1"/>
+          <w:strike w:val="0"/>
+          <w:dstrike w:val="0"/>
+          <w:noProof w:val="0"/>
+          <w:sz w:val="22"/>
+          <w:szCs w:val="22"/>
+          <w:u w:val="none"/>
+          <w:lang w:val="en-GB"/>
+        </w:rPr>
+        <w:t>Pre-populated:</w:t>
+      </w:r>
+      <w:r>
+        <w:rPr>
+          <w:rFonts w:ascii="Calibri" w:hAnsi="Calibri" w:eastAsia="Calibri" w:cs="Calibri" w:asciiTheme="minorAscii" w:hAnsiTheme="minorAscii" w:eastAsiaTheme="minorAscii" w:cstheme="minorAscii"/>
+          <w:b w:val="0"/>
+          <w:bCs w:val="0"/>
+          <w:strike w:val="0"/>
+          <w:dstrike w:val="0"/>
+          <w:noProof w:val="0"/>
+          <w:sz w:val="22"/>
+          <w:szCs w:val="22"/>
+          <w:u w:val="none"/>
+          <w:lang w:val="en-GB"/>
+        </w:rPr>
+        <w:t xml:space="preserve"> Automatically filled by PHP before your code even starts executing.</w:t>
+      </w:r>
+    </w:p>
+    <w:p>
+      <w:pPr>
+        <w:pStyle w:val="ListParagraph"/>
+        <w:numPr>
+          <w:ilvl w:val="0"/>
+          <w:numId w:val="7"/>
+        </w:numPr>
+        <w:spacing w:before="0" w:beforeAutospacing="off" w:after="180" w:afterAutospacing="off"/>
+        <w:rPr>
+          <w:rFonts w:ascii="Calibri" w:hAnsi="Calibri" w:eastAsia="Calibri" w:cs="Calibri" w:asciiTheme="minorAscii" w:hAnsiTheme="minorAscii" w:eastAsiaTheme="minorAscii" w:cstheme="minorAscii"/>
+          <w:b w:val="0"/>
+          <w:bCs w:val="0"/>
+          <w:strike w:val="0"/>
+          <w:dstrike w:val="0"/>
+          <w:noProof w:val="0"/>
+          <w:sz w:val="22"/>
+          <w:szCs w:val="22"/>
+          <w:u w:val="none"/>
+          <w:lang w:val="en-GB"/>
+        </w:rPr>
+      </w:pPr>
+      <w:r>
+        <w:rPr>
+          <w:rFonts w:ascii="Calibri" w:hAnsi="Calibri" w:eastAsia="Calibri" w:cs="Calibri" w:asciiTheme="minorAscii" w:hAnsiTheme="minorAscii" w:eastAsiaTheme="minorAscii" w:cstheme="minorAscii"/>
+          <w:b w:val="1"/>
+          <w:bCs w:val="1"/>
+          <w:strike w:val="0"/>
+          <w:dstrike w:val="0"/>
+          <w:noProof w:val="0"/>
+          <w:sz w:val="22"/>
+          <w:szCs w:val="22"/>
+          <w:u w:val="none"/>
+          <w:lang w:val="en-GB"/>
+        </w:rPr>
+        <w:t>Array Structure:</w:t>
+      </w:r>
+      <w:r>
+        <w:rPr>
+          <w:rFonts w:ascii="Calibri" w:hAnsi="Calibri" w:eastAsia="Calibri" w:cs="Calibri" w:asciiTheme="minorAscii" w:hAnsiTheme="minorAscii" w:eastAsiaTheme="minorAscii" w:cstheme="minorAscii"/>
+          <w:b w:val="0"/>
+          <w:bCs w:val="0"/>
+          <w:strike w:val="0"/>
+          <w:dstrike w:val="0"/>
+          <w:noProof w:val="0"/>
+          <w:sz w:val="22"/>
+          <w:szCs w:val="22"/>
+          <w:u w:val="none"/>
+          <w:lang w:val="en-GB"/>
+        </w:rPr>
+        <w:t xml:space="preserve"> Every superglobal is an associative array containing key-value pairs.</w:t>
+      </w:r>
+    </w:p>
+    <w:p>
+      <w:pPr>
+        <w:pStyle w:val="Normal"/>
+        <w:spacing w:before="0" w:beforeAutospacing="off" w:after="180" w:afterAutospacing="off"/>
+        <w:rPr>
+          <w:rFonts w:ascii="Calibri" w:hAnsi="Calibri" w:eastAsia="Calibri" w:cs="Calibri" w:asciiTheme="minorAscii" w:hAnsiTheme="minorAscii" w:eastAsiaTheme="minorAscii" w:cstheme="minorAscii"/>
+          <w:b w:val="0"/>
+          <w:bCs w:val="0"/>
+          <w:noProof w:val="0"/>
+          <w:color w:val="auto"/>
+          <w:sz w:val="22"/>
+          <w:szCs w:val="22"/>
+          <w:lang w:val="en-GB"/>
+        </w:rPr>
+      </w:pPr>
+    </w:p>
+    <w:p>
+      <w:pPr>
+        <w:pStyle w:val="Normal"/>
+        <w:spacing w:before="0" w:beforeAutospacing="off" w:after="180" w:afterAutospacing="off"/>
+        <w:rPr>
+          <w:rFonts w:ascii="Calibri" w:hAnsi="Calibri" w:eastAsia="Calibri" w:cs="Calibri" w:asciiTheme="minorAscii" w:hAnsiTheme="minorAscii" w:eastAsiaTheme="minorAscii" w:cstheme="minorAscii"/>
+          <w:b w:val="1"/>
+          <w:bCs w:val="1"/>
+          <w:noProof w:val="0"/>
+          <w:sz w:val="22"/>
+          <w:szCs w:val="22"/>
+          <w:lang w:val="en-GB"/>
+        </w:rPr>
+      </w:pPr>
+      <w:r>
+        <w:rPr>
+          <w:rFonts w:ascii="Calibri" w:hAnsi="Calibri" w:eastAsia="Calibri" w:cs="Calibri" w:asciiTheme="minorAscii" w:hAnsiTheme="minorAscii" w:eastAsiaTheme="minorAscii" w:cstheme="minorAscii"/>
+          <w:b w:val="1"/>
+          <w:bCs w:val="1"/>
+          <w:noProof w:val="0"/>
+          <w:sz w:val="22"/>
+          <w:szCs w:val="22"/>
+          <w:lang w:val="en-GB"/>
+        </w:rPr>
+        <w:t>The 9 Superglobals in PHP</w:t>
+      </w:r>
+    </w:p>
+    <w:p>
+      <w:pPr>
+        <w:pStyle w:val="ListParagraph"/>
+        <w:numPr>
+          <w:ilvl w:val="0"/>
+          <w:numId w:val="1"/>
+        </w:numPr>
+        <w:spacing w:before="0" w:beforeAutospacing="off" w:after="180" w:afterAutospacing="off"/>
+        <w:rPr>
+          <w:rFonts w:ascii="Calibri" w:hAnsi="Calibri" w:eastAsia="Calibri" w:cs="Calibri" w:asciiTheme="minorAscii" w:hAnsiTheme="minorAscii" w:eastAsiaTheme="minorAscii" w:cstheme="minorAscii"/>
+          <w:b w:val="0"/>
+          <w:bCs w:val="0"/>
+          <w:strike w:val="0"/>
+          <w:dstrike w:val="0"/>
+          <w:noProof w:val="0"/>
+          <w:sz w:val="22"/>
+          <w:szCs w:val="22"/>
+          <w:u w:val="none"/>
+          <w:lang w:val="en-GB"/>
+        </w:rPr>
+      </w:pPr>
+      <w:r>
+        <w:rPr>
+          <w:rFonts w:ascii="Calibri" w:hAnsi="Calibri" w:eastAsia="Calibri" w:cs="Calibri" w:asciiTheme="minorAscii" w:hAnsiTheme="minorAscii" w:eastAsiaTheme="minorAscii" w:cstheme="minorAscii"/>
+          <w:b w:val="1"/>
+          <w:bCs w:val="1"/>
+          <w:strike w:val="0"/>
+          <w:dstrike w:val="0"/>
+          <w:noProof w:val="0"/>
+          <w:sz w:val="22"/>
+          <w:szCs w:val="22"/>
+          <w:u w:val="none"/>
+          <w:lang w:val="en-GB"/>
+        </w:rPr>
+        <w:t>$GLOBALS</w:t>
+      </w:r>
+      <w:r>
+        <w:rPr>
+          <w:rFonts w:ascii="Calibri" w:hAnsi="Calibri" w:eastAsia="Calibri" w:cs="Calibri" w:asciiTheme="minorAscii" w:hAnsiTheme="minorAscii" w:eastAsiaTheme="minorAscii" w:cstheme="minorAscii"/>
+          <w:b w:val="0"/>
+          <w:bCs w:val="0"/>
+          <w:strike w:val="0"/>
+          <w:dstrike w:val="0"/>
+          <w:noProof w:val="0"/>
+          <w:sz w:val="22"/>
+          <w:szCs w:val="22"/>
+          <w:u w:val="none"/>
+          <w:lang w:val="en-GB"/>
+        </w:rPr>
+        <w:t xml:space="preserve"> - Contains references to all variables currently defined in the global scope of the script.</w:t>
+      </w:r>
+    </w:p>
+    <w:p>
+      <w:pPr>
+        <w:pStyle w:val="ListParagraph"/>
+        <w:numPr>
+          <w:ilvl w:val="0"/>
+          <w:numId w:val="1"/>
+        </w:numPr>
+        <w:spacing w:before="0" w:beforeAutospacing="off" w:after="180" w:afterAutospacing="off"/>
+        <w:rPr>
+          <w:rFonts w:ascii="Calibri" w:hAnsi="Calibri" w:eastAsia="Calibri" w:cs="Calibri" w:asciiTheme="minorAscii" w:hAnsiTheme="minorAscii" w:eastAsiaTheme="minorAscii" w:cstheme="minorAscii"/>
+          <w:b w:val="0"/>
+          <w:bCs w:val="0"/>
+          <w:strike w:val="0"/>
+          <w:dstrike w:val="0"/>
+          <w:noProof w:val="0"/>
+          <w:sz w:val="22"/>
+          <w:szCs w:val="22"/>
+          <w:u w:val="none"/>
+          <w:lang w:val="en-GB"/>
+        </w:rPr>
+      </w:pPr>
+      <w:r>
+        <w:rPr>
+          <w:rFonts w:ascii="Calibri" w:hAnsi="Calibri" w:eastAsia="Calibri" w:cs="Calibri" w:asciiTheme="minorAscii" w:hAnsiTheme="minorAscii" w:eastAsiaTheme="minorAscii" w:cstheme="minorAscii"/>
+          <w:b w:val="1"/>
+          <w:bCs w:val="1"/>
+          <w:strike w:val="0"/>
+          <w:dstrike w:val="0"/>
+          <w:noProof w:val="0"/>
+          <w:sz w:val="22"/>
+          <w:szCs w:val="22"/>
+          <w:u w:val="none"/>
+          <w:lang w:val="en-GB"/>
+        </w:rPr>
+        <w:t>$_SERVER</w:t>
+      </w:r>
+      <w:r>
+        <w:rPr>
+          <w:rFonts w:ascii="Calibri" w:hAnsi="Calibri" w:eastAsia="Calibri" w:cs="Calibri" w:asciiTheme="minorAscii" w:hAnsiTheme="minorAscii" w:eastAsiaTheme="minorAscii" w:cstheme="minorAscii"/>
+          <w:b w:val="0"/>
+          <w:bCs w:val="0"/>
+          <w:strike w:val="0"/>
+          <w:dstrike w:val="0"/>
+          <w:noProof w:val="0"/>
+          <w:sz w:val="22"/>
+          <w:szCs w:val="22"/>
+          <w:u w:val="none"/>
+          <w:lang w:val="en-GB"/>
+        </w:rPr>
+        <w:t xml:space="preserve"> - Holds headers, paths, script locations, and server environment information.</w:t>
+      </w:r>
+    </w:p>
+    <w:p>
+      <w:pPr>
+        <w:pStyle w:val="ListParagraph"/>
+        <w:numPr>
+          <w:ilvl w:val="0"/>
+          <w:numId w:val="1"/>
+        </w:numPr>
+        <w:spacing w:before="0" w:beforeAutospacing="off" w:after="180" w:afterAutospacing="off"/>
+        <w:rPr>
+          <w:rFonts w:ascii="Calibri" w:hAnsi="Calibri" w:eastAsia="Calibri" w:cs="Calibri" w:asciiTheme="minorAscii" w:hAnsiTheme="minorAscii" w:eastAsiaTheme="minorAscii" w:cstheme="minorAscii"/>
+          <w:b w:val="0"/>
+          <w:bCs w:val="0"/>
+          <w:strike w:val="0"/>
+          <w:dstrike w:val="0"/>
+          <w:noProof w:val="0"/>
+          <w:sz w:val="22"/>
+          <w:szCs w:val="22"/>
+          <w:u w:val="none"/>
+          <w:lang w:val="en-GB"/>
+        </w:rPr>
+      </w:pPr>
+      <w:r>
+        <w:rPr>
+          <w:rFonts w:ascii="Calibri" w:hAnsi="Calibri" w:eastAsia="Calibri" w:cs="Calibri" w:asciiTheme="minorAscii" w:hAnsiTheme="minorAscii" w:eastAsiaTheme="minorAscii" w:cstheme="minorAscii"/>
+          <w:b w:val="1"/>
+          <w:bCs w:val="1"/>
+          <w:strike w:val="0"/>
+          <w:dstrike w:val="0"/>
+          <w:noProof w:val="0"/>
+          <w:sz w:val="22"/>
+          <w:szCs w:val="22"/>
+          <w:u w:val="none"/>
+          <w:lang w:val="en-GB"/>
+        </w:rPr>
+        <w:t>$_GET</w:t>
+      </w:r>
+      <w:r>
+        <w:rPr>
+          <w:rFonts w:ascii="Calibri" w:hAnsi="Calibri" w:eastAsia="Calibri" w:cs="Calibri" w:asciiTheme="minorAscii" w:hAnsiTheme="minorAscii" w:eastAsiaTheme="minorAscii" w:cstheme="minorAscii"/>
+          <w:b w:val="0"/>
+          <w:bCs w:val="0"/>
+          <w:strike w:val="0"/>
+          <w:dstrike w:val="0"/>
+          <w:noProof w:val="0"/>
+          <w:sz w:val="22"/>
+          <w:szCs w:val="22"/>
+          <w:u w:val="none"/>
+          <w:lang w:val="en-GB"/>
+        </w:rPr>
+        <w:t xml:space="preserve"> - Collects data sent through an HTTP GET request via URL parameters.</w:t>
+      </w:r>
+    </w:p>
+    <w:p>
+      <w:pPr>
+        <w:pStyle w:val="ListParagraph"/>
+        <w:numPr>
+          <w:ilvl w:val="0"/>
+          <w:numId w:val="1"/>
+        </w:numPr>
+        <w:spacing w:before="0" w:beforeAutospacing="off" w:after="180" w:afterAutospacing="off"/>
+        <w:rPr>
+          <w:rFonts w:ascii="Calibri" w:hAnsi="Calibri" w:eastAsia="Calibri" w:cs="Calibri" w:asciiTheme="minorAscii" w:hAnsiTheme="minorAscii" w:eastAsiaTheme="minorAscii" w:cstheme="minorAscii"/>
+          <w:b w:val="0"/>
+          <w:bCs w:val="0"/>
+          <w:strike w:val="0"/>
+          <w:dstrike w:val="0"/>
+          <w:noProof w:val="0"/>
+          <w:sz w:val="22"/>
+          <w:szCs w:val="22"/>
+          <w:u w:val="none"/>
+          <w:lang w:val="en-GB"/>
+        </w:rPr>
+      </w:pPr>
+      <w:r>
+        <w:rPr>
+          <w:rFonts w:ascii="Calibri" w:hAnsi="Calibri" w:eastAsia="Calibri" w:cs="Calibri" w:asciiTheme="minorAscii" w:hAnsiTheme="minorAscii" w:eastAsiaTheme="minorAscii" w:cstheme="minorAscii"/>
+          <w:b w:val="1"/>
+          <w:bCs w:val="1"/>
+          <w:strike w:val="0"/>
+          <w:dstrike w:val="0"/>
+          <w:noProof w:val="0"/>
+          <w:sz w:val="22"/>
+          <w:szCs w:val="22"/>
+          <w:u w:val="none"/>
+          <w:lang w:val="en-GB"/>
+        </w:rPr>
+        <w:t>$_POST</w:t>
+      </w:r>
+      <w:r>
+        <w:rPr>
+          <w:rFonts w:ascii="Calibri" w:hAnsi="Calibri" w:eastAsia="Calibri" w:cs="Calibri" w:asciiTheme="minorAscii" w:hAnsiTheme="minorAscii" w:eastAsiaTheme="minorAscii" w:cstheme="minorAscii"/>
+          <w:b w:val="0"/>
+          <w:bCs w:val="0"/>
+          <w:strike w:val="0"/>
+          <w:dstrike w:val="0"/>
+          <w:noProof w:val="0"/>
+          <w:sz w:val="22"/>
+          <w:szCs w:val="22"/>
+          <w:u w:val="none"/>
+          <w:lang w:val="en-GB"/>
+        </w:rPr>
+        <w:t xml:space="preserve"> - Collects data </w:t>
+      </w:r>
+      <w:r>
+        <w:rPr>
+          <w:rFonts w:ascii="Calibri" w:hAnsi="Calibri" w:eastAsia="Calibri" w:cs="Calibri" w:asciiTheme="minorAscii" w:hAnsiTheme="minorAscii" w:eastAsiaTheme="minorAscii" w:cstheme="minorAscii"/>
+          <w:b w:val="0"/>
+          <w:bCs w:val="0"/>
+          <w:strike w:val="0"/>
+          <w:dstrike w:val="0"/>
+          <w:noProof w:val="0"/>
+          <w:sz w:val="22"/>
+          <w:szCs w:val="22"/>
+          <w:u w:val="none"/>
+          <w:lang w:val="en-GB"/>
+        </w:rPr>
+        <w:t>submitted</w:t>
+      </w:r>
+      <w:r>
+        <w:rPr>
+          <w:rFonts w:ascii="Calibri" w:hAnsi="Calibri" w:eastAsia="Calibri" w:cs="Calibri" w:asciiTheme="minorAscii" w:hAnsiTheme="minorAscii" w:eastAsiaTheme="minorAscii" w:cstheme="minorAscii"/>
+          <w:b w:val="0"/>
+          <w:bCs w:val="0"/>
+          <w:strike w:val="0"/>
+          <w:dstrike w:val="0"/>
+          <w:noProof w:val="0"/>
+          <w:sz w:val="22"/>
+          <w:szCs w:val="22"/>
+          <w:u w:val="none"/>
+          <w:lang w:val="en-GB"/>
+        </w:rPr>
+        <w:t xml:space="preserve"> from an HTTP POST form.</w:t>
+      </w:r>
+    </w:p>
+    <w:p>
+      <w:pPr>
+        <w:pStyle w:val="ListParagraph"/>
+        <w:numPr>
+          <w:ilvl w:val="0"/>
+          <w:numId w:val="1"/>
+        </w:numPr>
+        <w:spacing w:before="0" w:beforeAutospacing="off" w:after="180" w:afterAutospacing="off"/>
+        <w:rPr>
+          <w:rFonts w:ascii="Calibri" w:hAnsi="Calibri" w:eastAsia="Calibri" w:cs="Calibri" w:asciiTheme="minorAscii" w:hAnsiTheme="minorAscii" w:eastAsiaTheme="minorAscii" w:cstheme="minorAscii"/>
+          <w:b w:val="0"/>
+          <w:bCs w:val="0"/>
+          <w:strike w:val="0"/>
+          <w:dstrike w:val="0"/>
+          <w:noProof w:val="0"/>
+          <w:sz w:val="22"/>
+          <w:szCs w:val="22"/>
+          <w:u w:val="none"/>
+          <w:lang w:val="en-GB"/>
+        </w:rPr>
+      </w:pPr>
+      <w:r>
+        <w:rPr>
+          <w:rFonts w:ascii="Calibri" w:hAnsi="Calibri" w:eastAsia="Calibri" w:cs="Calibri" w:asciiTheme="minorAscii" w:hAnsiTheme="minorAscii" w:eastAsiaTheme="minorAscii" w:cstheme="minorAscii"/>
+          <w:b w:val="1"/>
+          <w:bCs w:val="1"/>
+          <w:strike w:val="0"/>
+          <w:dstrike w:val="0"/>
+          <w:noProof w:val="0"/>
+          <w:sz w:val="22"/>
+          <w:szCs w:val="22"/>
+          <w:u w:val="none"/>
+          <w:lang w:val="en-GB"/>
+        </w:rPr>
+        <w:t>$_FILES</w:t>
+      </w:r>
+      <w:r>
+        <w:rPr>
+          <w:rFonts w:ascii="Calibri" w:hAnsi="Calibri" w:eastAsia="Calibri" w:cs="Calibri" w:asciiTheme="minorAscii" w:hAnsiTheme="minorAscii" w:eastAsiaTheme="minorAscii" w:cstheme="minorAscii"/>
+          <w:b w:val="0"/>
+          <w:bCs w:val="0"/>
+          <w:strike w:val="0"/>
+          <w:dstrike w:val="0"/>
+          <w:noProof w:val="0"/>
+          <w:sz w:val="22"/>
+          <w:szCs w:val="22"/>
+          <w:u w:val="none"/>
+          <w:lang w:val="en-GB"/>
+        </w:rPr>
+        <w:t xml:space="preserve"> - Contains information about items uploaded via HTTP POST file uploads.</w:t>
+      </w:r>
+    </w:p>
+    <w:p>
+      <w:pPr>
+        <w:pStyle w:val="ListParagraph"/>
+        <w:numPr>
+          <w:ilvl w:val="0"/>
+          <w:numId w:val="1"/>
+        </w:numPr>
+        <w:spacing w:before="0" w:beforeAutospacing="off" w:after="180" w:afterAutospacing="off"/>
+        <w:rPr>
+          <w:rFonts w:ascii="Calibri" w:hAnsi="Calibri" w:eastAsia="Calibri" w:cs="Calibri" w:asciiTheme="minorAscii" w:hAnsiTheme="minorAscii" w:eastAsiaTheme="minorAscii" w:cstheme="minorAscii"/>
+          <w:b w:val="0"/>
+          <w:bCs w:val="0"/>
+          <w:strike w:val="0"/>
+          <w:dstrike w:val="0"/>
+          <w:noProof w:val="0"/>
+          <w:sz w:val="22"/>
+          <w:szCs w:val="22"/>
+          <w:u w:val="none"/>
+          <w:lang w:val="en-GB"/>
+        </w:rPr>
+      </w:pPr>
+      <w:r>
+        <w:rPr>
+          <w:rFonts w:ascii="Calibri" w:hAnsi="Calibri" w:eastAsia="Calibri" w:cs="Calibri" w:asciiTheme="minorAscii" w:hAnsiTheme="minorAscii" w:eastAsiaTheme="minorAscii" w:cstheme="minorAscii"/>
+          <w:b w:val="1"/>
+          <w:bCs w:val="1"/>
+          <w:strike w:val="0"/>
+          <w:dstrike w:val="0"/>
+          <w:noProof w:val="0"/>
+          <w:sz w:val="22"/>
+          <w:szCs w:val="22"/>
+          <w:u w:val="none"/>
+          <w:lang w:val="en-GB"/>
+        </w:rPr>
+        <w:t>$_COOKIE</w:t>
+      </w:r>
+      <w:r>
+        <w:rPr>
+          <w:rFonts w:ascii="Calibri" w:hAnsi="Calibri" w:eastAsia="Calibri" w:cs="Calibri" w:asciiTheme="minorAscii" w:hAnsiTheme="minorAscii" w:eastAsiaTheme="minorAscii" w:cstheme="minorAscii"/>
+          <w:b w:val="0"/>
+          <w:bCs w:val="0"/>
+          <w:strike w:val="0"/>
+          <w:dstrike w:val="0"/>
+          <w:noProof w:val="0"/>
+          <w:sz w:val="22"/>
+          <w:szCs w:val="22"/>
+          <w:u w:val="none"/>
+          <w:lang w:val="en-GB"/>
+        </w:rPr>
+        <w:t xml:space="preserve"> - Retrieves HTTP Cookie variables passed to the script.</w:t>
+      </w:r>
+    </w:p>
+    <w:p>
+      <w:pPr>
+        <w:pStyle w:val="ListParagraph"/>
+        <w:numPr>
+          <w:ilvl w:val="0"/>
+          <w:numId w:val="1"/>
+        </w:numPr>
+        <w:spacing w:before="0" w:beforeAutospacing="off" w:after="180" w:afterAutospacing="off"/>
+        <w:rPr>
+          <w:rFonts w:ascii="Calibri" w:hAnsi="Calibri" w:eastAsia="Calibri" w:cs="Calibri" w:asciiTheme="minorAscii" w:hAnsiTheme="minorAscii" w:eastAsiaTheme="minorAscii" w:cstheme="minorAscii"/>
+          <w:b w:val="0"/>
+          <w:bCs w:val="0"/>
+          <w:strike w:val="0"/>
+          <w:dstrike w:val="0"/>
+          <w:noProof w:val="0"/>
+          <w:sz w:val="22"/>
+          <w:szCs w:val="22"/>
+          <w:u w:val="none"/>
+          <w:lang w:val="en-GB"/>
+        </w:rPr>
+      </w:pPr>
+      <w:r>
+        <w:rPr>
+          <w:rFonts w:ascii="Calibri" w:hAnsi="Calibri" w:eastAsia="Calibri" w:cs="Calibri" w:asciiTheme="minorAscii" w:hAnsiTheme="minorAscii" w:eastAsiaTheme="minorAscii" w:cstheme="minorAscii"/>
+          <w:b w:val="1"/>
+          <w:bCs w:val="1"/>
+          <w:strike w:val="0"/>
+          <w:dstrike w:val="0"/>
+          <w:noProof w:val="0"/>
+          <w:sz w:val="22"/>
+          <w:szCs w:val="22"/>
+          <w:u w:val="none"/>
+          <w:lang w:val="en-GB"/>
+        </w:rPr>
+        <w:t>$_SESSION</w:t>
+      </w:r>
+      <w:r>
+        <w:rPr>
+          <w:rFonts w:ascii="Calibri" w:hAnsi="Calibri" w:eastAsia="Calibri" w:cs="Calibri" w:asciiTheme="minorAscii" w:hAnsiTheme="minorAscii" w:eastAsiaTheme="minorAscii" w:cstheme="minorAscii"/>
+          <w:b w:val="0"/>
+          <w:bCs w:val="0"/>
+          <w:strike w:val="0"/>
+          <w:dstrike w:val="0"/>
+          <w:noProof w:val="0"/>
+          <w:sz w:val="22"/>
+          <w:szCs w:val="22"/>
+          <w:u w:val="none"/>
+          <w:lang w:val="en-GB"/>
+        </w:rPr>
+        <w:t xml:space="preserve"> </w:t>
+      </w:r>
+      <w:r>
+        <w:rPr>
+          <w:rFonts w:ascii="Calibri" w:hAnsi="Calibri" w:eastAsia="Calibri" w:cs="Calibri" w:asciiTheme="minorAscii" w:hAnsiTheme="minorAscii" w:eastAsiaTheme="minorAscii" w:cstheme="minorAscii"/>
+          <w:b w:val="0"/>
+          <w:bCs w:val="0"/>
+          <w:strike w:val="0"/>
+          <w:dstrike w:val="0"/>
+          <w:noProof w:val="0"/>
+          <w:sz w:val="22"/>
+          <w:szCs w:val="22"/>
+          <w:u w:val="none"/>
+          <w:lang w:val="en-GB"/>
+        </w:rPr>
+        <w:t>-</w:t>
+      </w:r>
+      <w:r>
+        <w:rPr>
+          <w:rFonts w:ascii="Calibri" w:hAnsi="Calibri" w:eastAsia="Calibri" w:cs="Calibri" w:asciiTheme="minorAscii" w:hAnsiTheme="minorAscii" w:eastAsiaTheme="minorAscii" w:cstheme="minorAscii"/>
+          <w:b w:val="0"/>
+          <w:bCs w:val="0"/>
+          <w:strike w:val="0"/>
+          <w:dstrike w:val="0"/>
+          <w:noProof w:val="0"/>
+          <w:sz w:val="22"/>
+          <w:szCs w:val="22"/>
+          <w:u w:val="none"/>
+          <w:lang w:val="en-GB"/>
+        </w:rPr>
+        <w:t xml:space="preserve"> Stores and manages session variables across multiple page requests.</w:t>
+      </w:r>
+    </w:p>
+    <w:p>
+      <w:pPr>
+        <w:pStyle w:val="ListParagraph"/>
+        <w:numPr>
+          <w:ilvl w:val="0"/>
+          <w:numId w:val="1"/>
+        </w:numPr>
+        <w:spacing w:before="0" w:beforeAutospacing="off" w:after="180" w:afterAutospacing="off"/>
+        <w:rPr>
+          <w:rFonts w:ascii="Calibri" w:hAnsi="Calibri" w:eastAsia="Calibri" w:cs="Calibri" w:asciiTheme="minorAscii" w:hAnsiTheme="minorAscii" w:eastAsiaTheme="minorAscii" w:cstheme="minorAscii"/>
+          <w:b w:val="0"/>
+          <w:bCs w:val="0"/>
+          <w:strike w:val="0"/>
+          <w:dstrike w:val="0"/>
+          <w:noProof w:val="0"/>
+          <w:sz w:val="22"/>
+          <w:szCs w:val="22"/>
+          <w:u w:val="none"/>
+          <w:lang w:val="en-GB"/>
+        </w:rPr>
+      </w:pPr>
+      <w:r>
+        <w:rPr>
+          <w:rFonts w:ascii="Calibri" w:hAnsi="Calibri" w:eastAsia="Calibri" w:cs="Calibri" w:asciiTheme="minorAscii" w:hAnsiTheme="minorAscii" w:eastAsiaTheme="minorAscii" w:cstheme="minorAscii"/>
+          <w:b w:val="1"/>
+          <w:bCs w:val="1"/>
+          <w:strike w:val="0"/>
+          <w:dstrike w:val="0"/>
+          <w:noProof w:val="0"/>
+          <w:sz w:val="22"/>
+          <w:szCs w:val="22"/>
+          <w:u w:val="none"/>
+          <w:lang w:val="en-GB"/>
+        </w:rPr>
+        <w:t>$_REQUEST</w:t>
+      </w:r>
+      <w:r>
+        <w:rPr>
+          <w:rFonts w:ascii="Calibri" w:hAnsi="Calibri" w:eastAsia="Calibri" w:cs="Calibri" w:asciiTheme="minorAscii" w:hAnsiTheme="minorAscii" w:eastAsiaTheme="minorAscii" w:cstheme="minorAscii"/>
+          <w:b w:val="0"/>
+          <w:bCs w:val="0"/>
+          <w:strike w:val="0"/>
+          <w:dstrike w:val="0"/>
+          <w:noProof w:val="0"/>
+          <w:sz w:val="22"/>
+          <w:szCs w:val="22"/>
+          <w:u w:val="none"/>
+          <w:lang w:val="en-GB"/>
+        </w:rPr>
+        <w:t xml:space="preserve"> </w:t>
+      </w:r>
+      <w:r>
+        <w:rPr>
+          <w:rFonts w:ascii="Calibri" w:hAnsi="Calibri" w:eastAsia="Calibri" w:cs="Calibri" w:asciiTheme="minorAscii" w:hAnsiTheme="minorAscii" w:eastAsiaTheme="minorAscii" w:cstheme="minorAscii"/>
+          <w:b w:val="0"/>
+          <w:bCs w:val="0"/>
+          <w:strike w:val="0"/>
+          <w:dstrike w:val="0"/>
+          <w:noProof w:val="0"/>
+          <w:sz w:val="22"/>
+          <w:szCs w:val="22"/>
+          <w:u w:val="none"/>
+          <w:lang w:val="en-GB"/>
+        </w:rPr>
+        <w:t>-</w:t>
+      </w:r>
+      <w:r>
+        <w:rPr>
+          <w:rFonts w:ascii="Calibri" w:hAnsi="Calibri" w:eastAsia="Calibri" w:cs="Calibri" w:asciiTheme="minorAscii" w:hAnsiTheme="minorAscii" w:eastAsiaTheme="minorAscii" w:cstheme="minorAscii"/>
+          <w:b w:val="0"/>
+          <w:bCs w:val="0"/>
+          <w:strike w:val="0"/>
+          <w:dstrike w:val="0"/>
+          <w:noProof w:val="0"/>
+          <w:sz w:val="22"/>
+          <w:szCs w:val="22"/>
+          <w:u w:val="none"/>
+          <w:lang w:val="en-GB"/>
+        </w:rPr>
+        <w:t xml:space="preserve"> A combined array </w:t>
+      </w:r>
+      <w:r>
+        <w:rPr>
+          <w:rFonts w:ascii="Calibri" w:hAnsi="Calibri" w:eastAsia="Calibri" w:cs="Calibri" w:asciiTheme="minorAscii" w:hAnsiTheme="minorAscii" w:eastAsiaTheme="minorAscii" w:cstheme="minorAscii"/>
+          <w:b w:val="0"/>
+          <w:bCs w:val="0"/>
+          <w:strike w:val="0"/>
+          <w:dstrike w:val="0"/>
+          <w:noProof w:val="0"/>
+          <w:sz w:val="22"/>
+          <w:szCs w:val="22"/>
+          <w:u w:val="none"/>
+          <w:lang w:val="en-GB"/>
+        </w:rPr>
+        <w:t>containing</w:t>
+      </w:r>
+      <w:r>
+        <w:rPr>
+          <w:rFonts w:ascii="Calibri" w:hAnsi="Calibri" w:eastAsia="Calibri" w:cs="Calibri" w:asciiTheme="minorAscii" w:hAnsiTheme="minorAscii" w:eastAsiaTheme="minorAscii" w:cstheme="minorAscii"/>
+          <w:b w:val="0"/>
+          <w:bCs w:val="0"/>
+          <w:strike w:val="0"/>
+          <w:dstrike w:val="0"/>
+          <w:noProof w:val="0"/>
+          <w:sz w:val="22"/>
+          <w:szCs w:val="22"/>
+          <w:u w:val="none"/>
+          <w:lang w:val="en-GB"/>
+        </w:rPr>
+        <w:t xml:space="preserve"> the contents of $_GET, $_POST, and $_COOKIE by default.</w:t>
+      </w:r>
+    </w:p>
+    <w:p>
+      <w:pPr>
+        <w:pStyle w:val="ListParagraph"/>
+        <w:numPr>
+          <w:ilvl w:val="0"/>
+          <w:numId w:val="1"/>
+        </w:numPr>
+        <w:spacing w:before="0" w:beforeAutospacing="off" w:after="180" w:afterAutospacing="off"/>
+        <w:rPr>
+          <w:rFonts w:ascii="Calibri" w:hAnsi="Calibri" w:eastAsia="Calibri" w:cs="Calibri" w:asciiTheme="minorAscii" w:hAnsiTheme="minorAscii" w:eastAsiaTheme="minorAscii" w:cstheme="minorAscii"/>
+          <w:noProof w:val="0"/>
+          <w:sz w:val="22"/>
+          <w:szCs w:val="22"/>
+          <w:lang w:val="en-GB"/>
+        </w:rPr>
+      </w:pPr>
+      <w:r>
+        <w:rPr>
+          <w:rFonts w:ascii="Calibri" w:hAnsi="Calibri" w:eastAsia="Calibri" w:cs="Calibri" w:asciiTheme="minorAscii" w:hAnsiTheme="minorAscii" w:eastAsiaTheme="minorAscii" w:cstheme="minorAscii"/>
+          <w:b w:val="1"/>
+          <w:bCs w:val="1"/>
+          <w:strike w:val="0"/>
+          <w:dstrike w:val="0"/>
+          <w:noProof w:val="0"/>
+          <w:sz w:val="22"/>
+          <w:szCs w:val="22"/>
+          <w:u w:val="none"/>
+          <w:lang w:val="en-GB"/>
+        </w:rPr>
+        <w:t>$_ENV</w:t>
+      </w:r>
+      <w:r>
+        <w:rPr>
+          <w:rFonts w:ascii="Calibri" w:hAnsi="Calibri" w:eastAsia="Calibri" w:cs="Calibri" w:asciiTheme="minorAscii" w:hAnsiTheme="minorAscii" w:eastAsiaTheme="minorAscii" w:cstheme="minorAscii"/>
+          <w:b w:val="0"/>
+          <w:bCs w:val="0"/>
+          <w:strike w:val="0"/>
+          <w:dstrike w:val="0"/>
+          <w:noProof w:val="0"/>
+          <w:sz w:val="22"/>
+          <w:szCs w:val="22"/>
+          <w:u w:val="none"/>
+          <w:lang w:val="en-GB"/>
+        </w:rPr>
+        <w:t xml:space="preserve"> </w:t>
+      </w:r>
+      <w:r>
+        <w:rPr>
+          <w:rFonts w:ascii="Calibri" w:hAnsi="Calibri" w:eastAsia="Calibri" w:cs="Calibri" w:asciiTheme="minorAscii" w:hAnsiTheme="minorAscii" w:eastAsiaTheme="minorAscii" w:cstheme="minorAscii"/>
+          <w:b w:val="0"/>
+          <w:bCs w:val="0"/>
+          <w:strike w:val="0"/>
+          <w:dstrike w:val="0"/>
+          <w:noProof w:val="0"/>
+          <w:sz w:val="22"/>
+          <w:szCs w:val="22"/>
+          <w:u w:val="none"/>
+          <w:lang w:val="en-GB"/>
+        </w:rPr>
+        <w:t>-</w:t>
+      </w:r>
+      <w:r>
+        <w:rPr>
+          <w:rFonts w:ascii="Calibri" w:hAnsi="Calibri" w:eastAsia="Calibri" w:cs="Calibri" w:asciiTheme="minorAscii" w:hAnsiTheme="minorAscii" w:eastAsiaTheme="minorAscii" w:cstheme="minorAscii"/>
+          <w:b w:val="0"/>
+          <w:bCs w:val="0"/>
+          <w:strike w:val="0"/>
+          <w:dstrike w:val="0"/>
+          <w:noProof w:val="0"/>
+          <w:sz w:val="22"/>
+          <w:szCs w:val="22"/>
+          <w:u w:val="none"/>
+          <w:lang w:val="en-GB"/>
+        </w:rPr>
+        <w:t xml:space="preserve"> Provides environment variables passed to the current PHP script from the </w:t>
+      </w:r>
+      <w:r>
+        <w:rPr>
+          <w:rFonts w:ascii="Calibri" w:hAnsi="Calibri" w:eastAsia="Calibri" w:cs="Calibri" w:asciiTheme="minorAscii" w:hAnsiTheme="minorAscii" w:eastAsiaTheme="minorAscii" w:cstheme="minorAscii"/>
+          <w:noProof w:val="0"/>
+          <w:sz w:val="22"/>
+          <w:szCs w:val="22"/>
+          <w:lang w:val="en-GB"/>
+        </w:rPr>
+        <w:t>environment.</w:t>
+      </w:r>
+    </w:p>
+    <w:p>
+      <w:pPr>
+        <w:pStyle w:val="Normal"/>
+        <w:spacing w:before="0" w:beforeAutospacing="off" w:after="180" w:afterAutospacing="off"/>
+        <w:rPr>
+          <w:rFonts w:ascii="Calibri" w:hAnsi="Calibri" w:eastAsia="Calibri" w:cs="Calibri" w:asciiTheme="minorAscii" w:hAnsiTheme="minorAscii" w:eastAsiaTheme="minorAscii" w:cstheme="minorAscii"/>
+          <w:b w:val="1"/>
+          <w:bCs w:val="1"/>
+          <w:noProof w:val="0"/>
+          <w:sz w:val="22"/>
+          <w:szCs w:val="22"/>
+          <w:lang w:val="en-GB"/>
+        </w:rPr>
+      </w:pPr>
+    </w:p>
+    <w:p>
+      <w:pPr>
+        <w:pStyle w:val="Normal"/>
+        <w:spacing w:before="0" w:beforeAutospacing="off" w:after="180" w:afterAutospacing="off"/>
+        <w:rPr>
+          <w:rFonts w:ascii="Calibri" w:hAnsi="Calibri" w:eastAsia="Calibri" w:cs="Calibri" w:asciiTheme="minorAscii" w:hAnsiTheme="minorAscii" w:eastAsiaTheme="minorAscii" w:cstheme="minorAscii"/>
+          <w:b w:val="1"/>
+          <w:bCs w:val="1"/>
+          <w:noProof w:val="0"/>
+          <w:sz w:val="22"/>
+          <w:szCs w:val="22"/>
+          <w:lang w:val="en-GB"/>
+        </w:rPr>
+      </w:pPr>
     </w:p>
     <w:p>
       <w:pPr>
@@ -5475,13 +6419,13 @@
         <w:spacing w:before="240" w:beforeAutospacing="off" w:after="240" w:afterAutospacing="off"/>
         <w:ind w:left="0"/>
         <w:rPr>
-          <w:rFonts w:ascii="Calibri" w:hAnsi="Calibri" w:eastAsia="Calibri" w:cs="Calibri"/>
-          <w:b w:val="1"/>
-          <w:bCs w:val="1"/>
-          <w:noProof w:val="0"/>
-          <w:color w:val="4C94D8" w:themeColor="text2" w:themeTint="80" w:themeShade="FF"/>
-          <w:sz w:val="32"/>
-          <w:szCs w:val="32"/>
+          <w:rFonts w:ascii="Calibri" w:hAnsi="Calibri" w:eastAsia="Calibri" w:cs="Calibri" w:asciiTheme="minorAscii" w:hAnsiTheme="minorAscii" w:eastAsiaTheme="minorAscii" w:cstheme="minorAscii"/>
+          <w:b w:val="1"/>
+          <w:bCs w:val="1"/>
+          <w:noProof w:val="0"/>
+          <w:color w:val="0E2740" w:themeColor="text2" w:themeTint="80" w:themeShade="FF"/>
+          <w:sz w:val="22"/>
+          <w:szCs w:val="22"/>
           <w:lang w:val="en-GB"/>
         </w:rPr>
       </w:pPr>
@@ -5672,6 +6616,118 @@
 
 <file path=word/numbering.xml><?xml version="1.0" encoding="utf-8"?>
 <w:numbering xmlns:w="http://schemas.openxmlformats.org/wordprocessingml/2006/main">
+  <w:abstractNum xmlns:w="http://schemas.openxmlformats.org/wordprocessingml/2006/main" w:abstractNumId="7">
+    <w:nsid w:val="1607ea74"/>
+    <w:multiLevelType xmlns:w="http://schemas.openxmlformats.org/wordprocessingml/2006/main" w:val="hybridMultilevel"/>
+    <w:lvl xmlns:w="http://schemas.openxmlformats.org/wordprocessingml/2006/main" w:ilvl="0">
+      <w:start w:val="1"/>
+      <w:numFmt w:val="bullet"/>
+      <w:lvlText w:val=""/>
+      <w:lvlJc w:val="left"/>
+      <w:pPr>
+        <w:ind w:left="720" w:hanging="360"/>
+      </w:pPr>
+      <w:rPr>
+        <w:rFonts w:hint="default" w:ascii="Symbol" w:hAnsi="Symbol"/>
+      </w:rPr>
+    </w:lvl>
+    <w:lvl xmlns:w="http://schemas.openxmlformats.org/wordprocessingml/2006/main" w:ilvl="1">
+      <w:start w:val="1"/>
+      <w:numFmt w:val="bullet"/>
+      <w:lvlText w:val="o"/>
+      <w:lvlJc w:val="left"/>
+      <w:pPr>
+        <w:ind w:left="1440" w:hanging="360"/>
+      </w:pPr>
+      <w:rPr>
+        <w:rFonts w:hint="default" w:ascii="Courier New" w:hAnsi="Courier New"/>
+      </w:rPr>
+    </w:lvl>
+    <w:lvl xmlns:w="http://schemas.openxmlformats.org/wordprocessingml/2006/main" w:ilvl="2">
+      <w:start w:val="1"/>
+      <w:numFmt w:val="bullet"/>
+      <w:lvlText w:val=""/>
+      <w:lvlJc w:val="left"/>
+      <w:pPr>
+        <w:ind w:left="2160" w:hanging="360"/>
+      </w:pPr>
+      <w:rPr>
+        <w:rFonts w:hint="default" w:ascii="Wingdings" w:hAnsi="Wingdings"/>
+      </w:rPr>
+    </w:lvl>
+    <w:lvl xmlns:w="http://schemas.openxmlformats.org/wordprocessingml/2006/main" w:ilvl="3">
+      <w:start w:val="1"/>
+      <w:numFmt w:val="bullet"/>
+      <w:lvlText w:val=""/>
+      <w:lvlJc w:val="left"/>
+      <w:pPr>
+        <w:ind w:left="2880" w:hanging="360"/>
+      </w:pPr>
+      <w:rPr>
+        <w:rFonts w:hint="default" w:ascii="Symbol" w:hAnsi="Symbol"/>
+      </w:rPr>
+    </w:lvl>
+    <w:lvl xmlns:w="http://schemas.openxmlformats.org/wordprocessingml/2006/main" w:ilvl="4">
+      <w:start w:val="1"/>
+      <w:numFmt w:val="bullet"/>
+      <w:lvlText w:val="o"/>
+      <w:lvlJc w:val="left"/>
+      <w:pPr>
+        <w:ind w:left="3600" w:hanging="360"/>
+      </w:pPr>
+      <w:rPr>
+        <w:rFonts w:hint="default" w:ascii="Courier New" w:hAnsi="Courier New"/>
+      </w:rPr>
+    </w:lvl>
+    <w:lvl xmlns:w="http://schemas.openxmlformats.org/wordprocessingml/2006/main" w:ilvl="5">
+      <w:start w:val="1"/>
+      <w:numFmt w:val="bullet"/>
+      <w:lvlText w:val=""/>
+      <w:lvlJc w:val="left"/>
+      <w:pPr>
+        <w:ind w:left="4320" w:hanging="360"/>
+      </w:pPr>
+      <w:rPr>
+        <w:rFonts w:hint="default" w:ascii="Wingdings" w:hAnsi="Wingdings"/>
+      </w:rPr>
+    </w:lvl>
+    <w:lvl xmlns:w="http://schemas.openxmlformats.org/wordprocessingml/2006/main" w:ilvl="6">
+      <w:start w:val="1"/>
+      <w:numFmt w:val="bullet"/>
+      <w:lvlText w:val=""/>
+      <w:lvlJc w:val="left"/>
+      <w:pPr>
+        <w:ind w:left="5040" w:hanging="360"/>
+      </w:pPr>
+      <w:rPr>
+        <w:rFonts w:hint="default" w:ascii="Symbol" w:hAnsi="Symbol"/>
+      </w:rPr>
+    </w:lvl>
+    <w:lvl xmlns:w="http://schemas.openxmlformats.org/wordprocessingml/2006/main" w:ilvl="7">
+      <w:start w:val="1"/>
+      <w:numFmt w:val="bullet"/>
+      <w:lvlText w:val="o"/>
+      <w:lvlJc w:val="left"/>
+      <w:pPr>
+        <w:ind w:left="5760" w:hanging="360"/>
+      </w:pPr>
+      <w:rPr>
+        <w:rFonts w:hint="default" w:ascii="Courier New" w:hAnsi="Courier New"/>
+      </w:rPr>
+    </w:lvl>
+    <w:lvl xmlns:w="http://schemas.openxmlformats.org/wordprocessingml/2006/main" w:ilvl="8">
+      <w:start w:val="1"/>
+      <w:numFmt w:val="bullet"/>
+      <w:lvlText w:val=""/>
+      <w:lvlJc w:val="left"/>
+      <w:pPr>
+        <w:ind w:left="6480" w:hanging="360"/>
+      </w:pPr>
+      <w:rPr>
+        <w:rFonts w:hint="default" w:ascii="Wingdings" w:hAnsi="Wingdings"/>
+      </w:rPr>
+    </w:lvl>
+  </w:abstractNum>
   <w:abstractNum xmlns:w="http://schemas.openxmlformats.org/wordprocessingml/2006/main" w:abstractNumId="6">
     <w:nsid w:val="2f91599"/>
     <w:multiLevelType xmlns:w="http://schemas.openxmlformats.org/wordprocessingml/2006/main" w:val="hybridMultilevel"/>
@@ -6344,6 +7400,9 @@
       </w:rPr>
     </w:lvl>
   </w:abstractNum>
+  <w:num w:numId="7">
+    <w:abstractNumId w:val="7"/>
+  </w:num>
   <w:num w:numId="6">
     <w:abstractNumId w:val="6"/>
   </w:num>

</xml_diff>

<commit_message>
Add php code examples for operator precedence, error handling, backticks, and constants
</commit_message>
<xml_diff>
--- a/PHP.docx
+++ b/PHP.docx
@@ -5937,66 +5937,6 @@
           <w:lang w:val="en-GB"/>
         </w:rPr>
       </w:pPr>
-      <w:r>
-        <w:rPr>
-          <w:rFonts w:ascii="Calibri" w:hAnsi="Calibri" w:eastAsia="Calibri" w:cs="Calibri" w:asciiTheme="minorAscii" w:hAnsiTheme="minorAscii" w:eastAsiaTheme="minorAscii" w:cstheme="minorAscii"/>
-          <w:b w:val="1"/>
-          <w:bCs w:val="1"/>
-          <w:strike w:val="0"/>
-          <w:dstrike w:val="0"/>
-          <w:noProof w:val="0"/>
-          <w:sz w:val="22"/>
-          <w:szCs w:val="22"/>
-          <w:u w:val="none"/>
-          <w:lang w:val="en-GB"/>
-        </w:rPr>
-        <w:t>$_POST</w:t>
-      </w:r>
-      <w:r>
-        <w:rPr>
-          <w:rFonts w:ascii="Calibri" w:hAnsi="Calibri" w:eastAsia="Calibri" w:cs="Calibri" w:asciiTheme="minorAscii" w:hAnsiTheme="minorAscii" w:eastAsiaTheme="minorAscii" w:cstheme="minorAscii"/>
-          <w:b w:val="0"/>
-          <w:bCs w:val="0"/>
-          <w:strike w:val="0"/>
-          <w:dstrike w:val="0"/>
-          <w:noProof w:val="0"/>
-          <w:sz w:val="22"/>
-          <w:szCs w:val="22"/>
-          <w:u w:val="none"/>
-          <w:lang w:val="en-GB"/>
-        </w:rPr>
-        <w:t xml:space="preserve"> - Collects data </w:t>
-      </w:r>
-      <w:r>
-        <w:rPr>
-          <w:rFonts w:ascii="Calibri" w:hAnsi="Calibri" w:eastAsia="Calibri" w:cs="Calibri" w:asciiTheme="minorAscii" w:hAnsiTheme="minorAscii" w:eastAsiaTheme="minorAscii" w:cstheme="minorAscii"/>
-          <w:b w:val="0"/>
-          <w:bCs w:val="0"/>
-          <w:strike w:val="0"/>
-          <w:dstrike w:val="0"/>
-          <w:noProof w:val="0"/>
-          <w:sz w:val="22"/>
-          <w:szCs w:val="22"/>
-          <w:u w:val="none"/>
-          <w:lang w:val="en-GB"/>
-        </w:rPr>
-        <w:t>submitted</w:t>
-      </w:r>
-      <w:r>
-        <w:rPr>
-          <w:rFonts w:ascii="Calibri" w:hAnsi="Calibri" w:eastAsia="Calibri" w:cs="Calibri" w:asciiTheme="minorAscii" w:hAnsiTheme="minorAscii" w:eastAsiaTheme="minorAscii" w:cstheme="minorAscii"/>
-          <w:b w:val="0"/>
-          <w:bCs w:val="0"/>
-          <w:strike w:val="0"/>
-          <w:dstrike w:val="0"/>
-          <w:noProof w:val="0"/>
-          <w:sz w:val="22"/>
-          <w:szCs w:val="22"/>
-          <w:u w:val="none"/>
-          <w:lang w:val="en-GB"/>
-        </w:rPr>
-        <w:t xml:space="preserve"> from an HTTP POST form.</w:t>
-      </w:r>
     </w:p>
     <w:p>
       <w:pPr>
@@ -6032,7 +5972,7 @@
           <w:u w:val="none"/>
           <w:lang w:val="en-GB"/>
         </w:rPr>
-        <w:t>$_FILES</w:t>
+        <w:t>$_POST</w:t>
       </w:r>
       <w:r>
         <w:rPr>
@@ -6047,7 +5987,37 @@
           <w:u w:val="none"/>
           <w:lang w:val="en-GB"/>
         </w:rPr>
-        <w:t xml:space="preserve"> - Contains information about items uploaded via HTTP POST file uploads.</w:t>
+        <w:t xml:space="preserve"> - Collects data </w:t>
+      </w:r>
+      <w:r>
+        <w:rPr>
+          <w:rFonts w:ascii="Calibri" w:hAnsi="Calibri" w:eastAsia="Calibri" w:cs="Calibri" w:asciiTheme="minorAscii" w:hAnsiTheme="minorAscii" w:eastAsiaTheme="minorAscii" w:cstheme="minorAscii"/>
+          <w:b w:val="0"/>
+          <w:bCs w:val="0"/>
+          <w:strike w:val="0"/>
+          <w:dstrike w:val="0"/>
+          <w:noProof w:val="0"/>
+          <w:sz w:val="22"/>
+          <w:szCs w:val="22"/>
+          <w:u w:val="none"/>
+          <w:lang w:val="en-GB"/>
+        </w:rPr>
+        <w:t>submitted</w:t>
+      </w:r>
+      <w:r>
+        <w:rPr>
+          <w:rFonts w:ascii="Calibri" w:hAnsi="Calibri" w:eastAsia="Calibri" w:cs="Calibri" w:asciiTheme="minorAscii" w:hAnsiTheme="minorAscii" w:eastAsiaTheme="minorAscii" w:cstheme="minorAscii"/>
+          <w:b w:val="0"/>
+          <w:bCs w:val="0"/>
+          <w:strike w:val="0"/>
+          <w:dstrike w:val="0"/>
+          <w:noProof w:val="0"/>
+          <w:sz w:val="22"/>
+          <w:szCs w:val="22"/>
+          <w:u w:val="none"/>
+          <w:lang w:val="en-GB"/>
+        </w:rPr>
+        <w:t xml:space="preserve"> from an HTTP POST form.</w:t>
       </w:r>
     </w:p>
     <w:p>
@@ -6084,7 +6054,7 @@
           <w:u w:val="none"/>
           <w:lang w:val="en-GB"/>
         </w:rPr>
-        <w:t>$_COOKIE</w:t>
+        <w:t>$_FILES</w:t>
       </w:r>
       <w:r>
         <w:rPr>
@@ -6099,7 +6069,7 @@
           <w:u w:val="none"/>
           <w:lang w:val="en-GB"/>
         </w:rPr>
-        <w:t xml:space="preserve"> - Retrieves HTTP Cookie variables passed to the script.</w:t>
+        <w:t xml:space="preserve"> - Contains information about items uploaded via HTTP POST file uploads.</w:t>
       </w:r>
     </w:p>
     <w:p>
@@ -6136,7 +6106,7 @@
           <w:u w:val="none"/>
           <w:lang w:val="en-GB"/>
         </w:rPr>
-        <w:t>$_SESSION</w:t>
+        <w:t>$_COOKIE</w:t>
       </w:r>
       <w:r>
         <w:rPr>
@@ -6151,37 +6121,7 @@
           <w:u w:val="none"/>
           <w:lang w:val="en-GB"/>
         </w:rPr>
-        <w:t xml:space="preserve"> </w:t>
-      </w:r>
-      <w:r>
-        <w:rPr>
-          <w:rFonts w:ascii="Calibri" w:hAnsi="Calibri" w:eastAsia="Calibri" w:cs="Calibri" w:asciiTheme="minorAscii" w:hAnsiTheme="minorAscii" w:eastAsiaTheme="minorAscii" w:cstheme="minorAscii"/>
-          <w:b w:val="0"/>
-          <w:bCs w:val="0"/>
-          <w:strike w:val="0"/>
-          <w:dstrike w:val="0"/>
-          <w:noProof w:val="0"/>
-          <w:sz w:val="22"/>
-          <w:szCs w:val="22"/>
-          <w:u w:val="none"/>
-          <w:lang w:val="en-GB"/>
-        </w:rPr>
-        <w:t>-</w:t>
-      </w:r>
-      <w:r>
-        <w:rPr>
-          <w:rFonts w:ascii="Calibri" w:hAnsi="Calibri" w:eastAsia="Calibri" w:cs="Calibri" w:asciiTheme="minorAscii" w:hAnsiTheme="minorAscii" w:eastAsiaTheme="minorAscii" w:cstheme="minorAscii"/>
-          <w:b w:val="0"/>
-          <w:bCs w:val="0"/>
-          <w:strike w:val="0"/>
-          <w:dstrike w:val="0"/>
-          <w:noProof w:val="0"/>
-          <w:sz w:val="22"/>
-          <w:szCs w:val="22"/>
-          <w:u w:val="none"/>
-          <w:lang w:val="en-GB"/>
-        </w:rPr>
-        <w:t xml:space="preserve"> Stores and manages session variables across multiple page requests.</w:t>
+        <w:t xml:space="preserve"> - Retrieves HTTP Cookie variables passed to the script.</w:t>
       </w:r>
     </w:p>
     <w:p>
@@ -6218,7 +6158,7 @@
           <w:u w:val="none"/>
           <w:lang w:val="en-GB"/>
         </w:rPr>
-        <w:t>$_REQUEST</w:t>
+        <w:t>$_SESSION</w:t>
       </w:r>
       <w:r>
         <w:rPr>
@@ -6263,37 +6203,7 @@
           <w:u w:val="none"/>
           <w:lang w:val="en-GB"/>
         </w:rPr>
-        <w:t xml:space="preserve"> A combined array </w:t>
-      </w:r>
-      <w:r>
-        <w:rPr>
-          <w:rFonts w:ascii="Calibri" w:hAnsi="Calibri" w:eastAsia="Calibri" w:cs="Calibri" w:asciiTheme="minorAscii" w:hAnsiTheme="minorAscii" w:eastAsiaTheme="minorAscii" w:cstheme="minorAscii"/>
-          <w:b w:val="0"/>
-          <w:bCs w:val="0"/>
-          <w:strike w:val="0"/>
-          <w:dstrike w:val="0"/>
-          <w:noProof w:val="0"/>
-          <w:sz w:val="22"/>
-          <w:szCs w:val="22"/>
-          <w:u w:val="none"/>
-          <w:lang w:val="en-GB"/>
-        </w:rPr>
-        <w:t>containing</w:t>
-      </w:r>
-      <w:r>
-        <w:rPr>
-          <w:rFonts w:ascii="Calibri" w:hAnsi="Calibri" w:eastAsia="Calibri" w:cs="Calibri" w:asciiTheme="minorAscii" w:hAnsiTheme="minorAscii" w:eastAsiaTheme="minorAscii" w:cstheme="minorAscii"/>
-          <w:b w:val="0"/>
-          <w:bCs w:val="0"/>
-          <w:strike w:val="0"/>
-          <w:dstrike w:val="0"/>
-          <w:noProof w:val="0"/>
-          <w:sz w:val="22"/>
-          <w:szCs w:val="22"/>
-          <w:u w:val="none"/>
-          <w:lang w:val="en-GB"/>
-        </w:rPr>
-        <w:t xml:space="preserve"> the contents of $_GET, $_POST, and $_COOKIE by default.</w:t>
+        <w:t xml:space="preserve"> Stores and manages session variables across multiple page requests.</w:t>
       </w:r>
     </w:p>
     <w:p>
@@ -6306,9 +6216,14 @@
         <w:spacing w:before="0" w:beforeAutospacing="off" w:after="180" w:afterAutospacing="off"/>
         <w:rPr>
           <w:rFonts w:ascii="Calibri" w:hAnsi="Calibri" w:eastAsia="Calibri" w:cs="Calibri" w:asciiTheme="minorAscii" w:hAnsiTheme="minorAscii" w:eastAsiaTheme="minorAscii" w:cstheme="minorAscii"/>
-          <w:noProof w:val="0"/>
-          <w:sz w:val="22"/>
-          <w:szCs w:val="22"/>
+          <w:b w:val="0"/>
+          <w:bCs w:val="0"/>
+          <w:strike w:val="0"/>
+          <w:dstrike w:val="0"/>
+          <w:noProof w:val="0"/>
+          <w:sz w:val="22"/>
+          <w:szCs w:val="22"/>
+          <w:u w:val="none"/>
           <w:lang w:val="en-GB"/>
         </w:rPr>
       </w:pPr>
@@ -6325,6 +6240,113 @@
           <w:u w:val="none"/>
           <w:lang w:val="en-GB"/>
         </w:rPr>
+        <w:t>$_REQUEST</w:t>
+      </w:r>
+      <w:r>
+        <w:rPr>
+          <w:rFonts w:ascii="Calibri" w:hAnsi="Calibri" w:eastAsia="Calibri" w:cs="Calibri" w:asciiTheme="minorAscii" w:hAnsiTheme="minorAscii" w:eastAsiaTheme="minorAscii" w:cstheme="minorAscii"/>
+          <w:b w:val="0"/>
+          <w:bCs w:val="0"/>
+          <w:strike w:val="0"/>
+          <w:dstrike w:val="0"/>
+          <w:noProof w:val="0"/>
+          <w:sz w:val="22"/>
+          <w:szCs w:val="22"/>
+          <w:u w:val="none"/>
+          <w:lang w:val="en-GB"/>
+        </w:rPr>
+        <w:t xml:space="preserve"> </w:t>
+      </w:r>
+      <w:r>
+        <w:rPr>
+          <w:rFonts w:ascii="Calibri" w:hAnsi="Calibri" w:eastAsia="Calibri" w:cs="Calibri" w:asciiTheme="minorAscii" w:hAnsiTheme="minorAscii" w:eastAsiaTheme="minorAscii" w:cstheme="minorAscii"/>
+          <w:b w:val="0"/>
+          <w:bCs w:val="0"/>
+          <w:strike w:val="0"/>
+          <w:dstrike w:val="0"/>
+          <w:noProof w:val="0"/>
+          <w:sz w:val="22"/>
+          <w:szCs w:val="22"/>
+          <w:u w:val="none"/>
+          <w:lang w:val="en-GB"/>
+        </w:rPr>
+        <w:t>-</w:t>
+      </w:r>
+      <w:r>
+        <w:rPr>
+          <w:rFonts w:ascii="Calibri" w:hAnsi="Calibri" w:eastAsia="Calibri" w:cs="Calibri" w:asciiTheme="minorAscii" w:hAnsiTheme="minorAscii" w:eastAsiaTheme="minorAscii" w:cstheme="minorAscii"/>
+          <w:b w:val="0"/>
+          <w:bCs w:val="0"/>
+          <w:strike w:val="0"/>
+          <w:dstrike w:val="0"/>
+          <w:noProof w:val="0"/>
+          <w:sz w:val="22"/>
+          <w:szCs w:val="22"/>
+          <w:u w:val="none"/>
+          <w:lang w:val="en-GB"/>
+        </w:rPr>
+        <w:t xml:space="preserve"> A combined array </w:t>
+      </w:r>
+      <w:r>
+        <w:rPr>
+          <w:rFonts w:ascii="Calibri" w:hAnsi="Calibri" w:eastAsia="Calibri" w:cs="Calibri" w:asciiTheme="minorAscii" w:hAnsiTheme="minorAscii" w:eastAsiaTheme="minorAscii" w:cstheme="minorAscii"/>
+          <w:b w:val="0"/>
+          <w:bCs w:val="0"/>
+          <w:strike w:val="0"/>
+          <w:dstrike w:val="0"/>
+          <w:noProof w:val="0"/>
+          <w:sz w:val="22"/>
+          <w:szCs w:val="22"/>
+          <w:u w:val="none"/>
+          <w:lang w:val="en-GB"/>
+        </w:rPr>
+        <w:t>containing</w:t>
+      </w:r>
+      <w:r>
+        <w:rPr>
+          <w:rFonts w:ascii="Calibri" w:hAnsi="Calibri" w:eastAsia="Calibri" w:cs="Calibri" w:asciiTheme="minorAscii" w:hAnsiTheme="minorAscii" w:eastAsiaTheme="minorAscii" w:cstheme="minorAscii"/>
+          <w:b w:val="0"/>
+          <w:bCs w:val="0"/>
+          <w:strike w:val="0"/>
+          <w:dstrike w:val="0"/>
+          <w:noProof w:val="0"/>
+          <w:sz w:val="22"/>
+          <w:szCs w:val="22"/>
+          <w:u w:val="none"/>
+          <w:lang w:val="en-GB"/>
+        </w:rPr>
+        <w:t xml:space="preserve"> the contents of $_GET, $_POST, and $_COOKIE by default.</w:t>
+      </w:r>
+    </w:p>
+    <w:p>
+      <w:pPr>
+        <w:pStyle w:val="ListParagraph"/>
+        <w:numPr>
+          <w:ilvl w:val="0"/>
+          <w:numId w:val="1"/>
+        </w:numPr>
+        <w:spacing w:before="0" w:beforeAutospacing="off" w:after="180" w:afterAutospacing="off"/>
+        <w:rPr>
+          <w:rFonts w:ascii="Calibri" w:hAnsi="Calibri" w:eastAsia="Calibri" w:cs="Calibri" w:asciiTheme="minorAscii" w:hAnsiTheme="minorAscii" w:eastAsiaTheme="minorAscii" w:cstheme="minorAscii"/>
+          <w:noProof w:val="0"/>
+          <w:sz w:val="22"/>
+          <w:szCs w:val="22"/>
+          <w:lang w:val="en-GB"/>
+        </w:rPr>
+      </w:pPr>
+      <w:r>
+        <w:rPr>
+          <w:rFonts w:ascii="Calibri" w:hAnsi="Calibri" w:eastAsia="Calibri" w:cs="Calibri" w:asciiTheme="minorAscii" w:hAnsiTheme="minorAscii" w:eastAsiaTheme="minorAscii" w:cstheme="minorAscii"/>
+          <w:b w:val="1"/>
+          <w:bCs w:val="1"/>
+          <w:strike w:val="0"/>
+          <w:dstrike w:val="0"/>
+          <w:noProof w:val="0"/>
+          <w:sz w:val="22"/>
+          <w:szCs w:val="22"/>
+          <w:u w:val="none"/>
+          <w:lang w:val="en-GB"/>
+        </w:rPr>
         <w:t>$_ENV</w:t>
       </w:r>
       <w:r>
@@ -6382,65 +6404,1031 @@
         </w:rPr>
         <w:t>environment.</w:t>
       </w:r>
+    </w:p>
+    <w:p>
+      <w:pPr>
+        <w:pStyle w:val="ListParagraph"/>
+        <w:spacing w:before="0" w:beforeAutospacing="off" w:after="180" w:afterAutospacing="off"/>
+        <w:ind w:left="720"/>
+        <w:rPr>
+          <w:rFonts w:ascii="Calibri" w:hAnsi="Calibri" w:eastAsia="Calibri" w:cs="Calibri" w:asciiTheme="minorAscii" w:hAnsiTheme="minorAscii" w:eastAsiaTheme="minorAscii" w:cstheme="minorAscii"/>
+          <w:noProof w:val="0"/>
+          <w:sz w:val="22"/>
+          <w:szCs w:val="22"/>
+          <w:lang w:val="en-GB"/>
+        </w:rPr>
+      </w:pPr>
     </w:p>
     <w:p>
       <w:pPr>
         <w:pStyle w:val="Normal"/>
         <w:spacing w:before="0" w:beforeAutospacing="off" w:after="180" w:afterAutospacing="off"/>
+        <w:ind w:left="0"/>
         <w:rPr>
           <w:rFonts w:ascii="Calibri" w:hAnsi="Calibri" w:eastAsia="Calibri" w:cs="Calibri" w:asciiTheme="minorAscii" w:hAnsiTheme="minorAscii" w:eastAsiaTheme="minorAscii" w:cstheme="minorAscii"/>
           <w:b w:val="1"/>
           <w:bCs w:val="1"/>
           <w:noProof w:val="0"/>
-          <w:sz w:val="22"/>
-          <w:szCs w:val="22"/>
-          <w:lang w:val="en-GB"/>
-        </w:rPr>
-      </w:pPr>
+          <w:color w:val="FF0000"/>
+          <w:sz w:val="32"/>
+          <w:szCs w:val="32"/>
+          <w:u w:val="single"/>
+          <w:lang w:val="en-GB"/>
+        </w:rPr>
+      </w:pPr>
+      <w:r>
+        <w:rPr>
+          <w:rFonts w:ascii="Calibri" w:hAnsi="Calibri" w:eastAsia="Calibri" w:cs="Calibri" w:asciiTheme="minorAscii" w:hAnsiTheme="minorAscii" w:eastAsiaTheme="minorAscii" w:cstheme="minorAscii"/>
+          <w:b w:val="1"/>
+          <w:bCs w:val="1"/>
+          <w:noProof w:val="0"/>
+          <w:color w:val="FF0000"/>
+          <w:sz w:val="32"/>
+          <w:szCs w:val="32"/>
+          <w:u w:val="single"/>
+          <w:lang w:val="en-GB"/>
+        </w:rPr>
+        <w:t>Constants:</w:t>
+      </w:r>
+    </w:p>
+    <w:p>
+      <w:pPr>
+        <w:spacing w:before="0" w:beforeAutospacing="off" w:after="240" w:afterAutospacing="off"/>
+        <w:ind/>
+        <w:rPr>
+          <w:rFonts w:ascii="Arial" w:hAnsi="Arial" w:eastAsia="Arial" w:cs="Arial"/>
+          <w:b w:val="0"/>
+          <w:bCs w:val="0"/>
+          <w:strike w:val="0"/>
+          <w:dstrike w:val="0"/>
+          <w:noProof w:val="0"/>
+          <w:sz w:val="22"/>
+          <w:szCs w:val="22"/>
+          <w:u w:val="none"/>
+          <w:lang w:val="en-GB"/>
+        </w:rPr>
+      </w:pPr>
+      <w:r>
+        <w:rPr>
+          <w:rFonts w:ascii="Arial" w:hAnsi="Arial" w:eastAsia="Arial" w:cs="Arial"/>
+          <w:b w:val="0"/>
+          <w:bCs w:val="0"/>
+          <w:strike w:val="0"/>
+          <w:dstrike w:val="0"/>
+          <w:noProof w:val="0"/>
+          <w:sz w:val="22"/>
+          <w:szCs w:val="22"/>
+          <w:u w:val="none"/>
+          <w:lang w:val="en-GB"/>
+        </w:rPr>
+        <w:t xml:space="preserve">A PHP constant is an </w:t>
+      </w:r>
+      <w:r>
+        <w:rPr>
+          <w:rFonts w:ascii="Arial" w:hAnsi="Arial" w:eastAsia="Arial" w:cs="Arial"/>
+          <w:b w:val="1"/>
+          <w:bCs w:val="1"/>
+          <w:strike w:val="0"/>
+          <w:dstrike w:val="0"/>
+          <w:noProof w:val="0"/>
+          <w:sz w:val="22"/>
+          <w:szCs w:val="22"/>
+          <w:u w:val="none"/>
+          <w:lang w:val="en-GB"/>
+        </w:rPr>
+        <w:t>identifier (name) for a simple, immutable value</w:t>
+      </w:r>
+      <w:r>
+        <w:rPr>
+          <w:rFonts w:ascii="Arial" w:hAnsi="Arial" w:eastAsia="Arial" w:cs="Arial"/>
+          <w:b w:val="0"/>
+          <w:bCs w:val="0"/>
+          <w:strike w:val="0"/>
+          <w:dstrike w:val="0"/>
+          <w:noProof w:val="0"/>
+          <w:sz w:val="22"/>
+          <w:szCs w:val="22"/>
+          <w:u w:val="none"/>
+          <w:lang w:val="en-GB"/>
+        </w:rPr>
+        <w:t xml:space="preserve"> that cannot be altered or undefined once it is set during the execution of a script. [</w:t>
+      </w:r>
+      <w:hyperlink r:id="R70c5fb4e7ce34636">
+        <w:r>
+          <w:rPr>
+            <w:rStyle w:val="Hyperlink"/>
+            <w:b w:val="0"/>
+            <w:bCs w:val="0"/>
+            <w:strike w:val="0"/>
+            <w:dstrike w:val="0"/>
+            <w:noProof w:val="0"/>
+            <w:sz w:val="22"/>
+            <w:szCs w:val="22"/>
+            <w:u w:val="none"/>
+            <w:lang w:val="en-GB"/>
+          </w:rPr>
+          <w:t>1</w:t>
+        </w:r>
+      </w:hyperlink>
+      <w:r>
+        <w:rPr>
+          <w:rFonts w:ascii="Arial" w:hAnsi="Arial" w:eastAsia="Arial" w:cs="Arial"/>
+          <w:b w:val="0"/>
+          <w:bCs w:val="0"/>
+          <w:strike w:val="0"/>
+          <w:dstrike w:val="0"/>
+          <w:noProof w:val="0"/>
+          <w:sz w:val="22"/>
+          <w:szCs w:val="22"/>
+          <w:u w:val="none"/>
+          <w:lang w:val="en-GB"/>
+        </w:rPr>
+        <w:t xml:space="preserve">, </w:t>
+      </w:r>
+      <w:hyperlink r:id="Rbc565453bd2941f0">
+        <w:r>
+          <w:rPr>
+            <w:rStyle w:val="Hyperlink"/>
+            <w:b w:val="0"/>
+            <w:bCs w:val="0"/>
+            <w:strike w:val="0"/>
+            <w:dstrike w:val="0"/>
+            <w:noProof w:val="0"/>
+            <w:sz w:val="22"/>
+            <w:szCs w:val="22"/>
+            <w:u w:val="none"/>
+            <w:lang w:val="en-GB"/>
+          </w:rPr>
+          <w:t>2</w:t>
+        </w:r>
+      </w:hyperlink>
+      <w:r>
+        <w:rPr>
+          <w:rFonts w:ascii="Arial" w:hAnsi="Arial" w:eastAsia="Arial" w:cs="Arial"/>
+          <w:b w:val="0"/>
+          <w:bCs w:val="0"/>
+          <w:strike w:val="0"/>
+          <w:dstrike w:val="0"/>
+          <w:noProof w:val="0"/>
+          <w:sz w:val="22"/>
+          <w:szCs w:val="22"/>
+          <w:u w:val="none"/>
+          <w:lang w:val="en-GB"/>
+        </w:rPr>
+        <w:t>]</w:t>
+      </w:r>
+    </w:p>
+    <w:p>
+      <w:pPr>
+        <w:spacing w:before="180" w:beforeAutospacing="off" w:after="240" w:afterAutospacing="off"/>
+        <w:ind/>
+      </w:pPr>
+      <w:r>
+        <w:rPr>
+          <w:rFonts w:ascii="Arial" w:hAnsi="Arial" w:eastAsia="Arial" w:cs="Arial"/>
+          <w:b w:val="0"/>
+          <w:bCs w:val="0"/>
+          <w:strike w:val="0"/>
+          <w:dstrike w:val="0"/>
+          <w:noProof w:val="0"/>
+          <w:sz w:val="22"/>
+          <w:szCs w:val="22"/>
+          <w:u w:val="none"/>
+          <w:lang w:val="en-GB"/>
+        </w:rPr>
+        <w:t xml:space="preserve">Unlike variables, constants </w:t>
+      </w:r>
+      <w:r>
+        <w:rPr>
+          <w:rFonts w:ascii="Arial" w:hAnsi="Arial" w:eastAsia="Arial" w:cs="Arial"/>
+          <w:b w:val="1"/>
+          <w:bCs w:val="1"/>
+          <w:strike w:val="0"/>
+          <w:dstrike w:val="0"/>
+          <w:noProof w:val="0"/>
+          <w:sz w:val="22"/>
+          <w:szCs w:val="22"/>
+          <w:u w:val="none"/>
+          <w:lang w:val="en-GB"/>
+        </w:rPr>
+        <w:t>do not use a leading dollar sign (</w:t>
+      </w:r>
+      <w:r>
+        <w:rPr>
+          <w:rFonts w:ascii="Consolas" w:hAnsi="Consolas" w:eastAsia="Consolas" w:cs="Consolas"/>
+          <w:b w:val="1"/>
+          <w:bCs w:val="1"/>
+          <w:strike w:val="0"/>
+          <w:dstrike w:val="0"/>
+          <w:noProof w:val="0"/>
+          <w:sz w:val="22"/>
+          <w:szCs w:val="22"/>
+          <w:u w:val="none"/>
+          <w:lang w:val="en-GB"/>
+        </w:rPr>
+        <w:t>$</w:t>
+      </w:r>
+      <w:r>
+        <w:rPr>
+          <w:rFonts w:ascii="Arial" w:hAnsi="Arial" w:eastAsia="Arial" w:cs="Arial"/>
+          <w:b w:val="1"/>
+          <w:bCs w:val="1"/>
+          <w:strike w:val="0"/>
+          <w:dstrike w:val="0"/>
+          <w:noProof w:val="0"/>
+          <w:sz w:val="22"/>
+          <w:szCs w:val="22"/>
+          <w:u w:val="none"/>
+          <w:lang w:val="en-GB"/>
+        </w:rPr>
+        <w:t>)</w:t>
+      </w:r>
+      <w:r>
+        <w:rPr>
+          <w:rFonts w:ascii="Arial" w:hAnsi="Arial" w:eastAsia="Arial" w:cs="Arial"/>
+          <w:b w:val="0"/>
+          <w:bCs w:val="0"/>
+          <w:strike w:val="0"/>
+          <w:dstrike w:val="0"/>
+          <w:noProof w:val="0"/>
+          <w:sz w:val="22"/>
+          <w:szCs w:val="22"/>
+          <w:u w:val="none"/>
+          <w:lang w:val="en-GB"/>
+        </w:rPr>
+        <w:t>, are globally accessible across the entire script by default, and are written in uppercase by convention.</w:t>
+      </w:r>
+    </w:p>
+    <w:p>
+      <w:pPr>
+        <w:spacing w:before="180" w:beforeAutospacing="off" w:after="240" w:afterAutospacing="off"/>
+        <w:ind/>
+      </w:pPr>
+      <w:r>
+        <w:rPr>
+          <w:rFonts w:ascii="Arial" w:hAnsi="Arial" w:eastAsia="Arial" w:cs="Arial"/>
+          <w:b w:val="1"/>
+          <w:bCs w:val="1"/>
+          <w:strike w:val="0"/>
+          <w:dstrike w:val="0"/>
+          <w:noProof w:val="0"/>
+          <w:color w:val="FF0000"/>
+          <w:sz w:val="32"/>
+          <w:szCs w:val="32"/>
+          <w:u w:val="single"/>
+          <w:lang w:val="en-GB"/>
+        </w:rPr>
+        <w:t>Operators order of precedence:</w:t>
+      </w:r>
     </w:p>
     <w:p>
       <w:pPr>
         <w:pStyle w:val="Normal"/>
-        <w:spacing w:before="0" w:beforeAutospacing="off" w:after="180" w:afterAutospacing="off"/>
-        <w:rPr>
-          <w:rFonts w:ascii="Calibri" w:hAnsi="Calibri" w:eastAsia="Calibri" w:cs="Calibri" w:asciiTheme="minorAscii" w:hAnsiTheme="minorAscii" w:eastAsiaTheme="minorAscii" w:cstheme="minorAscii"/>
-          <w:b w:val="1"/>
-          <w:bCs w:val="1"/>
-          <w:noProof w:val="0"/>
-          <w:sz w:val="22"/>
-          <w:szCs w:val="22"/>
-          <w:lang w:val="en-GB"/>
-        </w:rPr>
-      </w:pPr>
+        <w:spacing w:before="180" w:beforeAutospacing="off" w:after="240" w:afterAutospacing="off"/>
+        <w:ind/>
+        <w:rPr>
+          <w:rFonts w:ascii="Calibri" w:hAnsi="Calibri" w:eastAsia="Calibri" w:cs="Calibri"/>
+          <w:b w:val="1"/>
+          <w:bCs w:val="1"/>
+          <w:noProof w:val="0"/>
+          <w:color w:val="0E2740"/>
+          <w:sz w:val="24"/>
+          <w:szCs w:val="24"/>
+          <w:lang w:val="en-GB"/>
+        </w:rPr>
+      </w:pPr>
+      <w:r>
+        <w:rPr>
+          <w:rFonts w:ascii="Calibri" w:hAnsi="Calibri" w:eastAsia="Calibri" w:cs="Calibri"/>
+          <w:b w:val="1"/>
+          <w:bCs w:val="1"/>
+          <w:noProof w:val="0"/>
+          <w:color w:val="0E2740"/>
+          <w:sz w:val="24"/>
+          <w:szCs w:val="24"/>
+          <w:lang w:val="en-GB"/>
+        </w:rPr>
+        <w:t>Unary :</w:t>
+      </w:r>
+      <w:r>
+        <w:rPr>
+          <w:rFonts w:ascii="Calibri" w:hAnsi="Calibri" w:eastAsia="Calibri" w:cs="Calibri"/>
+          <w:b w:val="1"/>
+          <w:bCs w:val="1"/>
+          <w:noProof w:val="0"/>
+          <w:color w:val="0E2740"/>
+          <w:sz w:val="24"/>
+          <w:szCs w:val="24"/>
+          <w:lang w:val="en-GB"/>
+        </w:rPr>
+        <w:t xml:space="preserve">  </w:t>
+      </w:r>
+      <w:r>
+        <w:rPr>
+          <w:rFonts w:ascii="Calibri" w:hAnsi="Calibri" w:eastAsia="Calibri" w:cs="Calibri"/>
+          <w:b w:val="1"/>
+          <w:bCs w:val="1"/>
+          <w:noProof w:val="0"/>
+          <w:color w:val="0E2740"/>
+          <w:sz w:val="24"/>
+          <w:szCs w:val="24"/>
+          <w:lang w:val="en-GB"/>
+        </w:rPr>
+        <w:t xml:space="preserve">  </w:t>
+      </w:r>
+      <w:r>
+        <w:tab/>
+      </w:r>
+      <w:r>
+        <w:rPr>
+          <w:rFonts w:ascii="Calibri" w:hAnsi="Calibri" w:eastAsia="Calibri" w:cs="Calibri"/>
+          <w:b w:val="1"/>
+          <w:bCs w:val="1"/>
+          <w:noProof w:val="0"/>
+          <w:color w:val="0E2740"/>
+          <w:sz w:val="24"/>
+          <w:szCs w:val="24"/>
+          <w:lang w:val="en-GB"/>
+        </w:rPr>
+        <w:t>!, ++, --</w:t>
+      </w:r>
     </w:p>
     <w:p>
       <w:pPr>
         <w:pStyle w:val="Normal"/>
         <w:spacing w:before="240" w:beforeAutospacing="off" w:after="240" w:afterAutospacing="off"/>
         <w:ind w:left="0"/>
-        <w:rPr>
-          <w:rFonts w:ascii="Calibri" w:hAnsi="Calibri" w:eastAsia="Calibri" w:cs="Calibri" w:asciiTheme="minorAscii" w:hAnsiTheme="minorAscii" w:eastAsiaTheme="minorAscii" w:cstheme="minorAscii"/>
-          <w:b w:val="1"/>
-          <w:bCs w:val="1"/>
-          <w:noProof w:val="0"/>
-          <w:color w:val="0E2740" w:themeColor="text2" w:themeTint="80" w:themeShade="FF"/>
-          <w:sz w:val="22"/>
-          <w:szCs w:val="22"/>
-          <w:lang w:val="en-GB"/>
-        </w:rPr>
-      </w:pPr>
+      </w:pPr>
+      <w:r>
+        <w:rPr>
+          <w:rFonts w:ascii="Calibri" w:hAnsi="Calibri" w:eastAsia="Calibri" w:cs="Calibri"/>
+          <w:b w:val="1"/>
+          <w:bCs w:val="1"/>
+          <w:noProof w:val="0"/>
+          <w:color w:val="0E2740"/>
+          <w:sz w:val="24"/>
+          <w:szCs w:val="24"/>
+          <w:lang w:val="en-GB"/>
+        </w:rPr>
+        <w:t xml:space="preserve">Multiplication </w:t>
+      </w:r>
+      <w:r>
+        <w:rPr>
+          <w:rFonts w:ascii="Calibri" w:hAnsi="Calibri" w:eastAsia="Calibri" w:cs="Calibri"/>
+          <w:b w:val="1"/>
+          <w:bCs w:val="1"/>
+          <w:noProof w:val="0"/>
+          <w:color w:val="0E2740"/>
+          <w:sz w:val="24"/>
+          <w:szCs w:val="24"/>
+          <w:lang w:val="en-GB"/>
+        </w:rPr>
+        <w:t>:</w:t>
+      </w:r>
+      <w:r>
+        <w:tab/>
+      </w:r>
+      <w:r>
+        <w:rPr>
+          <w:rFonts w:ascii="Calibri" w:hAnsi="Calibri" w:eastAsia="Calibri" w:cs="Calibri"/>
+          <w:b w:val="1"/>
+          <w:bCs w:val="1"/>
+          <w:noProof w:val="0"/>
+          <w:color w:val="0E2740"/>
+          <w:sz w:val="24"/>
+          <w:szCs w:val="24"/>
+          <w:lang w:val="en-GB"/>
+        </w:rPr>
+        <w:t xml:space="preserve"> </w:t>
+      </w:r>
+      <w:r>
+        <w:rPr>
+          <w:rFonts w:ascii="Calibri" w:hAnsi="Calibri" w:eastAsia="Calibri" w:cs="Calibri"/>
+          <w:b w:val="1"/>
+          <w:bCs w:val="1"/>
+          <w:noProof w:val="0"/>
+          <w:color w:val="0E2740"/>
+          <w:sz w:val="24"/>
+          <w:szCs w:val="24"/>
+          <w:lang w:val="en-GB"/>
+        </w:rPr>
+        <w:t xml:space="preserve">* </w:t>
+      </w:r>
+      <w:r>
+        <w:rPr>
+          <w:rFonts w:ascii="Calibri" w:hAnsi="Calibri" w:eastAsia="Calibri" w:cs="Calibri"/>
+          <w:b w:val="1"/>
+          <w:bCs w:val="1"/>
+          <w:noProof w:val="0"/>
+          <w:color w:val="0E2740"/>
+          <w:sz w:val="24"/>
+          <w:szCs w:val="24"/>
+          <w:lang w:val="en-GB"/>
+        </w:rPr>
+        <w:t>,</w:t>
+      </w:r>
+      <w:r>
+        <w:rPr>
+          <w:rFonts w:ascii="Calibri" w:hAnsi="Calibri" w:eastAsia="Calibri" w:cs="Calibri"/>
+          <w:b w:val="1"/>
+          <w:bCs w:val="1"/>
+          <w:noProof w:val="0"/>
+          <w:color w:val="0E2740"/>
+          <w:sz w:val="24"/>
+          <w:szCs w:val="24"/>
+          <w:lang w:val="en-GB"/>
+        </w:rPr>
+        <w:t xml:space="preserve"> </w:t>
+      </w:r>
+      <w:r>
+        <w:rPr>
+          <w:rFonts w:ascii="Calibri" w:hAnsi="Calibri" w:eastAsia="Calibri" w:cs="Calibri"/>
+          <w:b w:val="1"/>
+          <w:bCs w:val="1"/>
+          <w:noProof w:val="0"/>
+          <w:color w:val="0E2740"/>
+          <w:sz w:val="24"/>
+          <w:szCs w:val="24"/>
+          <w:lang w:val="en-GB"/>
+        </w:rPr>
+        <w:t>/</w:t>
+      </w:r>
+      <w:r>
+        <w:rPr>
+          <w:rFonts w:ascii="Calibri" w:hAnsi="Calibri" w:eastAsia="Calibri" w:cs="Calibri"/>
+          <w:b w:val="1"/>
+          <w:bCs w:val="1"/>
+          <w:noProof w:val="0"/>
+          <w:color w:val="0E2740"/>
+          <w:sz w:val="24"/>
+          <w:szCs w:val="24"/>
+          <w:lang w:val="en-GB"/>
+        </w:rPr>
+        <w:t>,</w:t>
+      </w:r>
+      <w:r>
+        <w:rPr>
+          <w:rFonts w:ascii="Calibri" w:hAnsi="Calibri" w:eastAsia="Calibri" w:cs="Calibri"/>
+          <w:b w:val="1"/>
+          <w:bCs w:val="1"/>
+          <w:noProof w:val="0"/>
+          <w:color w:val="0E2740"/>
+          <w:sz w:val="24"/>
+          <w:szCs w:val="24"/>
+          <w:lang w:val="en-GB"/>
+        </w:rPr>
+        <w:t xml:space="preserve"> %</w:t>
+      </w:r>
     </w:p>
     <w:p>
       <w:pPr>
         <w:pStyle w:val="Normal"/>
         <w:spacing w:before="240" w:beforeAutospacing="off" w:after="240" w:afterAutospacing="off"/>
         <w:ind w:left="0"/>
-        <w:rPr>
-          <w:rFonts w:ascii="Calibri" w:hAnsi="Calibri" w:eastAsia="Calibri" w:cs="Calibri"/>
-          <w:b w:val="1"/>
-          <w:bCs w:val="1"/>
-          <w:noProof w:val="0"/>
-          <w:color w:val="4C94D8" w:themeColor="text2" w:themeTint="80" w:themeShade="FF"/>
+      </w:pPr>
+      <w:r>
+        <w:rPr>
+          <w:rFonts w:ascii="Calibri" w:hAnsi="Calibri" w:eastAsia="Calibri" w:cs="Calibri"/>
+          <w:b w:val="1"/>
+          <w:bCs w:val="1"/>
+          <w:noProof w:val="0"/>
+          <w:color w:val="0E2740"/>
+          <w:sz w:val="24"/>
+          <w:szCs w:val="24"/>
+          <w:lang w:val="en-GB"/>
+        </w:rPr>
+        <w:t>Add/</w:t>
+      </w:r>
+      <w:r>
+        <w:rPr>
+          <w:rFonts w:ascii="Calibri" w:hAnsi="Calibri" w:eastAsia="Calibri" w:cs="Calibri"/>
+          <w:b w:val="1"/>
+          <w:bCs w:val="1"/>
+          <w:noProof w:val="0"/>
+          <w:color w:val="0E2740"/>
+          <w:sz w:val="24"/>
+          <w:szCs w:val="24"/>
+          <w:lang w:val="en-GB"/>
+        </w:rPr>
+        <w:t xml:space="preserve">Subtract </w:t>
+      </w:r>
+      <w:r>
+        <w:rPr>
+          <w:rFonts w:ascii="Calibri" w:hAnsi="Calibri" w:eastAsia="Calibri" w:cs="Calibri"/>
+          <w:b w:val="1"/>
+          <w:bCs w:val="1"/>
+          <w:noProof w:val="0"/>
+          <w:color w:val="0E2740"/>
+          <w:sz w:val="24"/>
+          <w:szCs w:val="24"/>
+          <w:lang w:val="en-GB"/>
+        </w:rPr>
+        <w:t>:</w:t>
+      </w:r>
+      <w:r>
+        <w:tab/>
+      </w:r>
+      <w:r>
+        <w:rPr>
+          <w:rFonts w:ascii="Calibri" w:hAnsi="Calibri" w:eastAsia="Calibri" w:cs="Calibri"/>
+          <w:b w:val="1"/>
+          <w:bCs w:val="1"/>
+          <w:noProof w:val="0"/>
+          <w:color w:val="0E2740"/>
+          <w:sz w:val="24"/>
+          <w:szCs w:val="24"/>
+          <w:lang w:val="en-GB"/>
+        </w:rPr>
+        <w:t xml:space="preserve"> +, -</w:t>
+      </w:r>
+    </w:p>
+    <w:p>
+      <w:pPr>
+        <w:pStyle w:val="Normal"/>
+        <w:spacing w:before="240" w:beforeAutospacing="off" w:after="240" w:afterAutospacing="off"/>
+        <w:ind w:left="0"/>
+      </w:pPr>
+      <w:r>
+        <w:rPr>
+          <w:rFonts w:ascii="Calibri" w:hAnsi="Calibri" w:eastAsia="Calibri" w:cs="Calibri"/>
+          <w:b w:val="1"/>
+          <w:bCs w:val="1"/>
+          <w:noProof w:val="0"/>
+          <w:color w:val="0E2740"/>
+          <w:sz w:val="24"/>
+          <w:szCs w:val="24"/>
+          <w:lang w:val="en-GB"/>
+        </w:rPr>
+        <w:t xml:space="preserve">Relational </w:t>
+      </w:r>
+      <w:r>
+        <w:rPr>
+          <w:rFonts w:ascii="Calibri" w:hAnsi="Calibri" w:eastAsia="Calibri" w:cs="Calibri"/>
+          <w:b w:val="1"/>
+          <w:bCs w:val="1"/>
+          <w:noProof w:val="0"/>
+          <w:color w:val="0E2740"/>
+          <w:sz w:val="24"/>
+          <w:szCs w:val="24"/>
+          <w:lang w:val="en-GB"/>
+        </w:rPr>
+        <w:t>:</w:t>
+      </w:r>
+      <w:r>
+        <w:tab/>
+      </w:r>
+      <w:r>
+        <w:tab/>
+      </w:r>
+      <w:r>
+        <w:rPr>
+          <w:rFonts w:ascii="Calibri" w:hAnsi="Calibri" w:eastAsia="Calibri" w:cs="Calibri"/>
+          <w:b w:val="1"/>
+          <w:bCs w:val="1"/>
+          <w:noProof w:val="0"/>
+          <w:color w:val="0E2740"/>
+          <w:sz w:val="24"/>
+          <w:szCs w:val="24"/>
+          <w:lang w:val="en-GB"/>
+        </w:rPr>
+        <w:t xml:space="preserve"> &lt;, &gt;, &lt;=, &gt;=</w:t>
+      </w:r>
+    </w:p>
+    <w:p>
+      <w:pPr>
+        <w:pStyle w:val="Normal"/>
+        <w:spacing w:before="240" w:beforeAutospacing="off" w:after="240" w:afterAutospacing="off"/>
+        <w:ind w:left="0"/>
+      </w:pPr>
+      <w:r>
+        <w:rPr>
+          <w:rFonts w:ascii="Calibri" w:hAnsi="Calibri" w:eastAsia="Calibri" w:cs="Calibri"/>
+          <w:b w:val="1"/>
+          <w:bCs w:val="1"/>
+          <w:noProof w:val="0"/>
+          <w:color w:val="0E2740"/>
+          <w:sz w:val="24"/>
+          <w:szCs w:val="24"/>
+          <w:lang w:val="en-GB"/>
+        </w:rPr>
+        <w:t xml:space="preserve">Equality </w:t>
+      </w:r>
+      <w:r>
+        <w:rPr>
+          <w:rFonts w:ascii="Calibri" w:hAnsi="Calibri" w:eastAsia="Calibri" w:cs="Calibri"/>
+          <w:b w:val="1"/>
+          <w:bCs w:val="1"/>
+          <w:noProof w:val="0"/>
+          <w:color w:val="0E2740"/>
+          <w:sz w:val="24"/>
+          <w:szCs w:val="24"/>
+          <w:lang w:val="en-GB"/>
+        </w:rPr>
+        <w:t>:</w:t>
+      </w:r>
+      <w:r>
+        <w:tab/>
+      </w:r>
+      <w:r>
+        <w:tab/>
+      </w:r>
+      <w:r>
+        <w:rPr>
+          <w:rFonts w:ascii="Calibri" w:hAnsi="Calibri" w:eastAsia="Calibri" w:cs="Calibri"/>
+          <w:b w:val="1"/>
+          <w:bCs w:val="1"/>
+          <w:noProof w:val="0"/>
+          <w:color w:val="0E2740"/>
+          <w:sz w:val="24"/>
+          <w:szCs w:val="24"/>
+          <w:lang w:val="en-GB"/>
+        </w:rPr>
+        <w:t xml:space="preserve"> ==</w:t>
+      </w:r>
+      <w:r>
+        <w:rPr>
+          <w:rFonts w:ascii="Calibri" w:hAnsi="Calibri" w:eastAsia="Calibri" w:cs="Calibri"/>
+          <w:b w:val="1"/>
+          <w:bCs w:val="1"/>
+          <w:noProof w:val="0"/>
+          <w:color w:val="0E2740"/>
+          <w:sz w:val="24"/>
+          <w:szCs w:val="24"/>
+          <w:lang w:val="en-GB"/>
+        </w:rPr>
+        <w:t xml:space="preserve"> </w:t>
+      </w:r>
+      <w:r>
+        <w:rPr>
+          <w:rFonts w:ascii="Calibri" w:hAnsi="Calibri" w:eastAsia="Calibri" w:cs="Calibri"/>
+          <w:b w:val="1"/>
+          <w:bCs w:val="1"/>
+          <w:noProof w:val="0"/>
+          <w:color w:val="0E2740"/>
+          <w:sz w:val="24"/>
+          <w:szCs w:val="24"/>
+          <w:lang w:val="en-GB"/>
+        </w:rPr>
+        <w:t xml:space="preserve">, </w:t>
+      </w:r>
+      <w:r>
+        <w:rPr>
+          <w:rFonts w:ascii="Calibri" w:hAnsi="Calibri" w:eastAsia="Calibri" w:cs="Calibri"/>
+          <w:b w:val="1"/>
+          <w:bCs w:val="1"/>
+          <w:noProof w:val="0"/>
+          <w:color w:val="0E2740"/>
+          <w:sz w:val="24"/>
+          <w:szCs w:val="24"/>
+          <w:lang w:val="en-GB"/>
+        </w:rPr>
+        <w:t xml:space="preserve"> </w:t>
+      </w:r>
+      <w:r>
+        <w:rPr>
+          <w:rFonts w:ascii="Calibri" w:hAnsi="Calibri" w:eastAsia="Calibri" w:cs="Calibri"/>
+          <w:b w:val="1"/>
+          <w:bCs w:val="1"/>
+          <w:noProof w:val="0"/>
+          <w:color w:val="0E2740"/>
+          <w:sz w:val="24"/>
+          <w:szCs w:val="24"/>
+          <w:lang w:val="en-GB"/>
+        </w:rPr>
+        <w:t>!=</w:t>
+      </w:r>
+    </w:p>
+    <w:p>
+      <w:pPr>
+        <w:pStyle w:val="Normal"/>
+        <w:spacing w:before="240" w:beforeAutospacing="off" w:after="240" w:afterAutospacing="off"/>
+        <w:ind w:left="0"/>
+      </w:pPr>
+      <w:r>
+        <w:rPr>
+          <w:rFonts w:ascii="Calibri" w:hAnsi="Calibri" w:eastAsia="Calibri" w:cs="Calibri"/>
+          <w:b w:val="1"/>
+          <w:bCs w:val="1"/>
+          <w:noProof w:val="0"/>
+          <w:color w:val="0E2740"/>
+          <w:sz w:val="24"/>
+          <w:szCs w:val="24"/>
+          <w:lang w:val="en-GB"/>
+        </w:rPr>
+        <w:t xml:space="preserve">Logical AND </w:t>
+      </w:r>
+      <w:r>
+        <w:rPr>
+          <w:rFonts w:ascii="Calibri" w:hAnsi="Calibri" w:eastAsia="Calibri" w:cs="Calibri"/>
+          <w:b w:val="1"/>
+          <w:bCs w:val="1"/>
+          <w:noProof w:val="0"/>
+          <w:color w:val="0E2740"/>
+          <w:sz w:val="24"/>
+          <w:szCs w:val="24"/>
+          <w:lang w:val="en-GB"/>
+        </w:rPr>
+        <w:t>:</w:t>
+      </w:r>
+      <w:r>
+        <w:tab/>
+      </w:r>
+      <w:r>
+        <w:rPr>
+          <w:rFonts w:ascii="Calibri" w:hAnsi="Calibri" w:eastAsia="Calibri" w:cs="Calibri"/>
+          <w:b w:val="1"/>
+          <w:bCs w:val="1"/>
+          <w:noProof w:val="0"/>
+          <w:color w:val="0E2740"/>
+          <w:sz w:val="24"/>
+          <w:szCs w:val="24"/>
+          <w:lang w:val="en-GB"/>
+        </w:rPr>
+        <w:t xml:space="preserve"> </w:t>
+      </w:r>
+      <w:r>
+        <w:tab/>
+      </w:r>
+      <w:r>
+        <w:rPr>
+          <w:rFonts w:ascii="Calibri" w:hAnsi="Calibri" w:eastAsia="Calibri" w:cs="Calibri"/>
+          <w:b w:val="1"/>
+          <w:bCs w:val="1"/>
+          <w:noProof w:val="0"/>
+          <w:color w:val="0E2740"/>
+          <w:sz w:val="24"/>
+          <w:szCs w:val="24"/>
+          <w:lang w:val="en-GB"/>
+        </w:rPr>
+        <w:t>&amp;&amp;</w:t>
+      </w:r>
+    </w:p>
+    <w:p>
+      <w:pPr>
+        <w:pStyle w:val="Normal"/>
+        <w:spacing w:before="240" w:beforeAutospacing="off" w:after="240" w:afterAutospacing="off"/>
+        <w:ind w:left="0"/>
+      </w:pPr>
+      <w:r>
+        <w:rPr>
+          <w:rFonts w:ascii="Calibri" w:hAnsi="Calibri" w:eastAsia="Calibri" w:cs="Calibri"/>
+          <w:b w:val="1"/>
+          <w:bCs w:val="1"/>
+          <w:noProof w:val="0"/>
+          <w:color w:val="0E2740"/>
+          <w:sz w:val="24"/>
+          <w:szCs w:val="24"/>
+          <w:lang w:val="en-GB"/>
+        </w:rPr>
+        <w:t xml:space="preserve">Logical </w:t>
+      </w:r>
+      <w:r>
+        <w:rPr>
+          <w:rFonts w:ascii="Calibri" w:hAnsi="Calibri" w:eastAsia="Calibri" w:cs="Calibri"/>
+          <w:b w:val="1"/>
+          <w:bCs w:val="1"/>
+          <w:noProof w:val="0"/>
+          <w:color w:val="0E2740"/>
+          <w:sz w:val="24"/>
+          <w:szCs w:val="24"/>
+          <w:lang w:val="en-GB"/>
+        </w:rPr>
+        <w:t xml:space="preserve">OR </w:t>
+      </w:r>
+      <w:r>
+        <w:rPr>
+          <w:rFonts w:ascii="Calibri" w:hAnsi="Calibri" w:eastAsia="Calibri" w:cs="Calibri"/>
+          <w:b w:val="1"/>
+          <w:bCs w:val="1"/>
+          <w:noProof w:val="0"/>
+          <w:color w:val="0E2740"/>
+          <w:sz w:val="24"/>
+          <w:szCs w:val="24"/>
+          <w:lang w:val="en-GB"/>
+        </w:rPr>
+        <w:t>:</w:t>
+      </w:r>
+      <w:r>
+        <w:rPr>
+          <w:rFonts w:ascii="Calibri" w:hAnsi="Calibri" w:eastAsia="Calibri" w:cs="Calibri"/>
+          <w:b w:val="1"/>
+          <w:bCs w:val="1"/>
+          <w:noProof w:val="0"/>
+          <w:color w:val="0E2740"/>
+          <w:sz w:val="24"/>
+          <w:szCs w:val="24"/>
+          <w:lang w:val="en-GB"/>
+        </w:rPr>
+        <w:t xml:space="preserve"> </w:t>
+      </w:r>
+      <w:r>
+        <w:tab/>
+      </w:r>
+      <w:r>
+        <w:tab/>
+      </w:r>
+      <w:r>
+        <w:rPr>
+          <w:rFonts w:ascii="Calibri" w:hAnsi="Calibri" w:eastAsia="Calibri" w:cs="Calibri"/>
+          <w:b w:val="1"/>
+          <w:bCs w:val="1"/>
+          <w:noProof w:val="0"/>
+          <w:color w:val="0E2740"/>
+          <w:sz w:val="24"/>
+          <w:szCs w:val="24"/>
+          <w:lang w:val="en-GB"/>
+        </w:rPr>
+        <w:t>||</w:t>
+      </w:r>
+    </w:p>
+    <w:p>
+      <w:pPr>
+        <w:pStyle w:val="Normal"/>
+        <w:spacing w:before="240" w:beforeAutospacing="off" w:after="240" w:afterAutospacing="off"/>
+        <w:ind w:left="0"/>
+      </w:pPr>
+      <w:r>
+        <w:rPr>
+          <w:rFonts w:ascii="Calibri" w:hAnsi="Calibri" w:eastAsia="Calibri" w:cs="Calibri"/>
+          <w:b w:val="1"/>
+          <w:bCs w:val="1"/>
+          <w:noProof w:val="0"/>
+          <w:color w:val="0E2740"/>
+          <w:sz w:val="24"/>
+          <w:szCs w:val="24"/>
+          <w:lang w:val="en-GB"/>
+        </w:rPr>
+        <w:t xml:space="preserve">Conditional </w:t>
+      </w:r>
+      <w:r>
+        <w:rPr>
+          <w:rFonts w:ascii="Calibri" w:hAnsi="Calibri" w:eastAsia="Calibri" w:cs="Calibri"/>
+          <w:b w:val="1"/>
+          <w:bCs w:val="1"/>
+          <w:noProof w:val="0"/>
+          <w:color w:val="0E2740"/>
+          <w:sz w:val="24"/>
+          <w:szCs w:val="24"/>
+          <w:lang w:val="en-GB"/>
+        </w:rPr>
+        <w:t>:</w:t>
+      </w:r>
+      <w:r>
+        <w:rPr>
+          <w:rFonts w:ascii="Calibri" w:hAnsi="Calibri" w:eastAsia="Calibri" w:cs="Calibri"/>
+          <w:b w:val="1"/>
+          <w:bCs w:val="1"/>
+          <w:noProof w:val="0"/>
+          <w:color w:val="0E2740"/>
+          <w:sz w:val="24"/>
+          <w:szCs w:val="24"/>
+          <w:lang w:val="en-GB"/>
+        </w:rPr>
+        <w:t xml:space="preserve"> </w:t>
+      </w:r>
+      <w:r>
+        <w:tab/>
+      </w:r>
+      <w:r>
+        <w:tab/>
+      </w:r>
+      <w:r>
+        <w:rPr>
+          <w:rFonts w:ascii="Calibri" w:hAnsi="Calibri" w:eastAsia="Calibri" w:cs="Calibri"/>
+          <w:b w:val="1"/>
+          <w:bCs w:val="1"/>
+          <w:noProof w:val="0"/>
+          <w:color w:val="0E2740"/>
+          <w:sz w:val="24"/>
+          <w:szCs w:val="24"/>
+          <w:lang w:val="en-GB"/>
+        </w:rPr>
+        <w:t>?</w:t>
+      </w:r>
+      <w:r>
+        <w:rPr>
+          <w:rFonts w:ascii="Calibri" w:hAnsi="Calibri" w:eastAsia="Calibri" w:cs="Calibri"/>
+          <w:b w:val="1"/>
+          <w:bCs w:val="1"/>
+          <w:noProof w:val="0"/>
+          <w:color w:val="0E2740"/>
+          <w:sz w:val="24"/>
+          <w:szCs w:val="24"/>
+          <w:lang w:val="en-GB"/>
+        </w:rPr>
+        <w:t xml:space="preserve">, </w:t>
+      </w:r>
+      <w:r>
+        <w:rPr>
+          <w:rFonts w:ascii="Calibri" w:hAnsi="Calibri" w:eastAsia="Calibri" w:cs="Calibri"/>
+          <w:b w:val="1"/>
+          <w:bCs w:val="1"/>
+          <w:noProof w:val="0"/>
+          <w:color w:val="0E2740"/>
+          <w:sz w:val="24"/>
+          <w:szCs w:val="24"/>
+          <w:lang w:val="en-GB"/>
+        </w:rPr>
+        <w:t>:</w:t>
+      </w:r>
+    </w:p>
+    <w:p>
+      <w:pPr>
+        <w:pStyle w:val="Normal"/>
+        <w:spacing w:before="240" w:beforeAutospacing="off" w:after="240" w:afterAutospacing="off"/>
+        <w:ind w:left="0"/>
+      </w:pPr>
+      <w:r>
+        <w:rPr>
+          <w:rFonts w:ascii="Calibri" w:hAnsi="Calibri" w:eastAsia="Calibri" w:cs="Calibri"/>
+          <w:b w:val="1"/>
+          <w:bCs w:val="1"/>
+          <w:noProof w:val="0"/>
+          <w:color w:val="0E2740"/>
+          <w:sz w:val="24"/>
+          <w:szCs w:val="24"/>
+          <w:lang w:val="en-GB"/>
+        </w:rPr>
+        <w:t xml:space="preserve"> Assignment </w:t>
+      </w:r>
+      <w:r>
+        <w:rPr>
+          <w:rFonts w:ascii="Calibri" w:hAnsi="Calibri" w:eastAsia="Calibri" w:cs="Calibri"/>
+          <w:b w:val="1"/>
+          <w:bCs w:val="1"/>
+          <w:noProof w:val="0"/>
+          <w:color w:val="0E2740"/>
+          <w:sz w:val="24"/>
+          <w:szCs w:val="24"/>
+          <w:lang w:val="en-GB"/>
+        </w:rPr>
+        <w:t>:</w:t>
+      </w:r>
+      <w:r>
+        <w:tab/>
+      </w:r>
+      <w:r>
+        <w:tab/>
+      </w:r>
+      <w:r>
+        <w:rPr>
+          <w:rFonts w:ascii="Calibri" w:hAnsi="Calibri" w:eastAsia="Calibri" w:cs="Calibri"/>
+          <w:b w:val="1"/>
+          <w:bCs w:val="1"/>
+          <w:noProof w:val="0"/>
+          <w:color w:val="0E2740"/>
+          <w:sz w:val="24"/>
+          <w:szCs w:val="24"/>
+          <w:lang w:val="en-GB"/>
+        </w:rPr>
+        <w:t xml:space="preserve"> =, +=, -=, *=, /=, %=</w:t>
+      </w:r>
+    </w:p>
+    <w:p>
+      <w:pPr>
+        <w:pStyle w:val="Normal"/>
+        <w:spacing w:before="240" w:beforeAutospacing="off" w:after="240" w:afterAutospacing="off"/>
+        <w:ind w:left="0"/>
+        <w:rPr>
+          <w:rFonts w:ascii="Calibri" w:hAnsi="Calibri" w:eastAsia="Calibri" w:cs="Calibri"/>
+          <w:b w:val="1"/>
+          <w:bCs w:val="1"/>
+          <w:noProof w:val="0"/>
+          <w:color w:val="0E2740"/>
+          <w:sz w:val="24"/>
+          <w:szCs w:val="24"/>
+          <w:lang w:val="en-GB"/>
+        </w:rPr>
+      </w:pPr>
+    </w:p>
+    <w:p>
+      <w:pPr>
+        <w:pStyle w:val="Normal"/>
+        <w:spacing w:before="240" w:beforeAutospacing="off" w:after="240" w:afterAutospacing="off"/>
+        <w:ind w:left="0"/>
+        <w:rPr>
+          <w:rFonts w:ascii="Calibri" w:hAnsi="Calibri" w:eastAsia="Calibri" w:cs="Calibri"/>
+          <w:b w:val="1"/>
+          <w:bCs w:val="1"/>
+          <w:noProof w:val="0"/>
+          <w:color w:val="0E2740"/>
+          <w:sz w:val="24"/>
+          <w:szCs w:val="24"/>
+          <w:lang w:val="en-GB"/>
+        </w:rPr>
+      </w:pPr>
+    </w:p>
+    <w:p>
+      <w:pPr>
+        <w:pStyle w:val="Normal"/>
+        <w:spacing w:before="240" w:beforeAutospacing="off" w:after="240" w:afterAutospacing="off"/>
+        <w:ind w:left="0"/>
+        <w:rPr>
+          <w:rFonts w:ascii="Calibri" w:hAnsi="Calibri" w:eastAsia="Calibri" w:cs="Calibri"/>
+          <w:b w:val="1"/>
+          <w:bCs w:val="1"/>
+          <w:noProof w:val="0"/>
+          <w:color w:val="0E2740" w:themeColor="text2" w:themeTint="80" w:themeShade="FF"/>
           <w:sz w:val="24"/>
           <w:szCs w:val="24"/>
           <w:lang w:val="en-GB"/>

</xml_diff>

<commit_message>
Add php functions practice scripts
</commit_message>
<xml_diff>
--- a/PHP.docx
+++ b/PHP.docx
@@ -7516,23 +7516,6 @@
         <w:pStyle w:val="Normal"/>
         <w:spacing w:before="240" w:beforeAutospacing="off" w:after="240" w:afterAutospacing="off"/>
         <w:ind w:left="0"/>
-        <w:rPr>
-          <w:rFonts w:ascii="Calibri" w:hAnsi="Calibri" w:eastAsia="Calibri" w:cs="Calibri"/>
-          <w:b w:val="0"/>
-          <w:bCs w:val="0"/>
-          <w:noProof w:val="0"/>
-          <w:color w:val="0E2740"/>
-          <w:sz w:val="24"/>
-          <w:szCs w:val="24"/>
-          <w:lang w:val="en-GB"/>
-        </w:rPr>
-      </w:pPr>
-    </w:p>
-    <w:p>
-      <w:pPr>
-        <w:pStyle w:val="Normal"/>
-        <w:spacing w:before="240" w:beforeAutospacing="off" w:after="240" w:afterAutospacing="off"/>
-        <w:ind w:left="0"/>
       </w:pPr>
       <w:r>
         <w:rPr>
@@ -7636,26 +7619,780 @@
           <w:b w:val="1"/>
           <w:bCs w:val="1"/>
           <w:noProof w:val="0"/>
-          <w:color w:val="0E2740"/>
-          <w:sz w:val="24"/>
-          <w:szCs w:val="24"/>
-          <w:lang w:val="en-GB"/>
-        </w:rPr>
-      </w:pPr>
+          <w:sz w:val="32"/>
+          <w:szCs w:val="32"/>
+          <w:highlight w:val="yellow"/>
+          <w:lang w:val="en-GB"/>
+        </w:rPr>
+      </w:pPr>
+      <w:r>
+        <w:rPr>
+          <w:rFonts w:ascii="Calibri" w:hAnsi="Calibri" w:eastAsia="Calibri" w:cs="Calibri"/>
+          <w:b w:val="1"/>
+          <w:bCs w:val="1"/>
+          <w:noProof w:val="0"/>
+          <w:sz w:val="32"/>
+          <w:szCs w:val="32"/>
+          <w:highlight w:val="yellow"/>
+          <w:lang w:val="en-GB"/>
+        </w:rPr>
+        <w:t xml:space="preserve">Note in HEREDOC strings no </w:t>
+      </w:r>
+      <w:r>
+        <w:rPr>
+          <w:rFonts w:ascii="Calibri" w:hAnsi="Calibri" w:eastAsia="Calibri" w:cs="Calibri"/>
+          <w:b w:val="1"/>
+          <w:bCs w:val="1"/>
+          <w:noProof w:val="0"/>
+          <w:sz w:val="32"/>
+          <w:szCs w:val="32"/>
+          <w:highlight w:val="yellow"/>
+          <w:lang w:val="en-GB"/>
+        </w:rPr>
+        <w:t>hiiden</w:t>
+      </w:r>
+      <w:r>
+        <w:rPr>
+          <w:rFonts w:ascii="Calibri" w:hAnsi="Calibri" w:eastAsia="Calibri" w:cs="Calibri"/>
+          <w:b w:val="1"/>
+          <w:bCs w:val="1"/>
+          <w:noProof w:val="0"/>
+          <w:sz w:val="32"/>
+          <w:szCs w:val="32"/>
+          <w:highlight w:val="yellow"/>
+          <w:lang w:val="en-GB"/>
+        </w:rPr>
+        <w:t xml:space="preserve"> spaces should be there</w:t>
+      </w:r>
+    </w:p>
+    <w:p>
+      <w:pPr>
+        <w:shd w:val="clear" w:color="auto" w:fill="121314"/>
+        <w:spacing w:before="0" w:beforeAutospacing="off" w:after="0" w:afterAutospacing="off" w:line="285" w:lineRule="auto"/>
+      </w:pPr>
+      <w:r>
+        <w:rPr>
+          <w:rFonts w:ascii="Consolas" w:hAnsi="Consolas" w:eastAsia="Consolas" w:cs="Consolas"/>
+          <w:b w:val="0"/>
+          <w:bCs w:val="0"/>
+          <w:noProof w:val="0"/>
+          <w:color w:val="8B949E"/>
+          <w:sz w:val="21"/>
+          <w:szCs w:val="21"/>
+          <w:lang w:val="en-GB"/>
+        </w:rPr>
+        <w:t>//No hidden space after EOD, and closing tag is flush-left</w:t>
+      </w:r>
+    </w:p>
+    <w:p>
+      <w:pPr>
+        <w:shd w:val="clear" w:color="auto" w:fill="121314"/>
+        <w:spacing w:before="0" w:beforeAutospacing="off" w:after="0" w:afterAutospacing="off" w:line="285" w:lineRule="auto"/>
+      </w:pPr>
+      <w:r>
+        <w:rPr>
+          <w:rFonts w:ascii="Consolas" w:hAnsi="Consolas" w:eastAsia="Consolas" w:cs="Consolas"/>
+          <w:b w:val="0"/>
+          <w:bCs w:val="0"/>
+          <w:noProof w:val="0"/>
+          <w:color w:val="D4D4D4"/>
+          <w:sz w:val="21"/>
+          <w:szCs w:val="21"/>
+          <w:lang w:val="en-GB"/>
+        </w:rPr>
+        <w:t xml:space="preserve">        </w:t>
+      </w:r>
+      <w:r>
+        <w:rPr>
+          <w:rFonts w:ascii="Consolas" w:hAnsi="Consolas" w:eastAsia="Consolas" w:cs="Consolas"/>
+          <w:b w:val="0"/>
+          <w:bCs w:val="0"/>
+          <w:noProof w:val="0"/>
+          <w:color w:val="DCDCAA"/>
+          <w:sz w:val="21"/>
+          <w:szCs w:val="21"/>
+          <w:lang w:val="en-GB"/>
+        </w:rPr>
+        <w:t>echo</w:t>
+      </w:r>
+      <w:r>
+        <w:rPr>
+          <w:rFonts w:ascii="Consolas" w:hAnsi="Consolas" w:eastAsia="Consolas" w:cs="Consolas"/>
+          <w:b w:val="0"/>
+          <w:bCs w:val="0"/>
+          <w:noProof w:val="0"/>
+          <w:color w:val="D4D4D4"/>
+          <w:sz w:val="21"/>
+          <w:szCs w:val="21"/>
+          <w:lang w:val="en-GB"/>
+        </w:rPr>
+        <w:t xml:space="preserve"> </w:t>
+      </w:r>
+      <w:r>
+        <w:rPr>
+          <w:rFonts w:ascii="Consolas" w:hAnsi="Consolas" w:eastAsia="Consolas" w:cs="Consolas"/>
+          <w:b w:val="0"/>
+          <w:bCs w:val="0"/>
+          <w:noProof w:val="0"/>
+          <w:color w:val="A5D6FF"/>
+          <w:sz w:val="21"/>
+          <w:szCs w:val="21"/>
+          <w:lang w:val="en-GB"/>
+        </w:rPr>
+        <w:t>&lt;&lt;&lt;</w:t>
+      </w:r>
+      <w:r>
+        <w:rPr>
+          <w:rFonts w:ascii="Consolas" w:hAnsi="Consolas" w:eastAsia="Consolas" w:cs="Consolas"/>
+          <w:b w:val="0"/>
+          <w:bCs w:val="0"/>
+          <w:noProof w:val="0"/>
+          <w:color w:val="D4D4D4"/>
+          <w:sz w:val="21"/>
+          <w:szCs w:val="21"/>
+          <w:lang w:val="en-GB"/>
+        </w:rPr>
+        <w:t>EOD</w:t>
+      </w:r>
+    </w:p>
+    <w:p>
+      <w:pPr>
+        <w:shd w:val="clear" w:color="auto" w:fill="121314"/>
+        <w:spacing w:before="0" w:beforeAutospacing="off" w:after="0" w:afterAutospacing="off" w:line="285" w:lineRule="auto"/>
+      </w:pPr>
+      <w:r>
+        <w:rPr>
+          <w:rFonts w:ascii="Consolas" w:hAnsi="Consolas" w:eastAsia="Consolas" w:cs="Consolas"/>
+          <w:b w:val="0"/>
+          <w:bCs w:val="0"/>
+          <w:noProof w:val="0"/>
+          <w:color w:val="A5D6FF"/>
+          <w:sz w:val="21"/>
+          <w:szCs w:val="21"/>
+          <w:lang w:val="en-GB"/>
+        </w:rPr>
+        <w:t xml:space="preserve">        key is: "</w:t>
+      </w:r>
+      <w:r>
+        <w:rPr>
+          <w:rFonts w:ascii="Consolas" w:hAnsi="Consolas" w:eastAsia="Consolas" w:cs="Consolas"/>
+          <w:b w:val="0"/>
+          <w:bCs w:val="0"/>
+          <w:noProof w:val="0"/>
+          <w:color w:val="C9D1D9"/>
+          <w:sz w:val="21"/>
+          <w:szCs w:val="21"/>
+          <w:lang w:val="en-GB"/>
+        </w:rPr>
+        <w:t>$k</w:t>
+      </w:r>
+      <w:r>
+        <w:rPr>
+          <w:rFonts w:ascii="Consolas" w:hAnsi="Consolas" w:eastAsia="Consolas" w:cs="Consolas"/>
+          <w:b w:val="0"/>
+          <w:bCs w:val="0"/>
+          <w:noProof w:val="0"/>
+          <w:color w:val="A5D6FF"/>
+          <w:sz w:val="21"/>
+          <w:szCs w:val="21"/>
+          <w:lang w:val="en-GB"/>
+        </w:rPr>
+        <w:t>" and value is: "</w:t>
+      </w:r>
+      <w:r>
+        <w:rPr>
+          <w:rFonts w:ascii="Consolas" w:hAnsi="Consolas" w:eastAsia="Consolas" w:cs="Consolas"/>
+          <w:b w:val="0"/>
+          <w:bCs w:val="0"/>
+          <w:noProof w:val="0"/>
+          <w:color w:val="C9D1D9"/>
+          <w:sz w:val="21"/>
+          <w:szCs w:val="21"/>
+          <w:lang w:val="en-GB"/>
+        </w:rPr>
+        <w:t>$v</w:t>
+      </w:r>
+      <w:r>
+        <w:rPr>
+          <w:rFonts w:ascii="Consolas" w:hAnsi="Consolas" w:eastAsia="Consolas" w:cs="Consolas"/>
+          <w:b w:val="0"/>
+          <w:bCs w:val="0"/>
+          <w:noProof w:val="0"/>
+          <w:color w:val="A5D6FF"/>
+          <w:sz w:val="21"/>
+          <w:szCs w:val="21"/>
+          <w:lang w:val="en-GB"/>
+        </w:rPr>
+        <w:t xml:space="preserve">" </w:t>
+      </w:r>
+    </w:p>
+    <w:p>
+      <w:pPr>
+        <w:shd w:val="clear" w:color="auto" w:fill="121314"/>
+        <w:spacing w:before="0" w:beforeAutospacing="off" w:after="0" w:afterAutospacing="off" w:line="285" w:lineRule="auto"/>
+      </w:pPr>
+      <w:r>
+        <w:rPr>
+          <w:rFonts w:ascii="Consolas" w:hAnsi="Consolas" w:eastAsia="Consolas" w:cs="Consolas"/>
+          <w:b w:val="0"/>
+          <w:bCs w:val="0"/>
+          <w:noProof w:val="0"/>
+          <w:color w:val="A5D6FF"/>
+          <w:sz w:val="21"/>
+          <w:szCs w:val="21"/>
+          <w:lang w:val="en-GB"/>
+        </w:rPr>
+        <w:t xml:space="preserve">        </w:t>
+      </w:r>
+      <w:r>
+        <w:rPr>
+          <w:rFonts w:ascii="Consolas" w:hAnsi="Consolas" w:eastAsia="Consolas" w:cs="Consolas"/>
+          <w:b w:val="0"/>
+          <w:bCs w:val="0"/>
+          <w:noProof w:val="0"/>
+          <w:color w:val="D4D4D4"/>
+          <w:sz w:val="21"/>
+          <w:szCs w:val="21"/>
+          <w:lang w:val="en-GB"/>
+        </w:rPr>
+        <w:t>EOD;</w:t>
+      </w:r>
+    </w:p>
+    <w:p>
+      <w:pPr>
+        <w:shd w:val="clear" w:color="auto" w:fill="121314"/>
+        <w:spacing w:before="0" w:beforeAutospacing="off" w:after="0" w:afterAutospacing="off" w:line="285" w:lineRule="auto"/>
+        <w:rPr>
+          <w:rFonts w:ascii="Consolas" w:hAnsi="Consolas" w:eastAsia="Consolas" w:cs="Consolas"/>
+          <w:b w:val="0"/>
+          <w:bCs w:val="0"/>
+          <w:noProof w:val="0"/>
+          <w:color w:val="D4D4D4"/>
+          <w:sz w:val="21"/>
+          <w:szCs w:val="21"/>
+          <w:lang w:val="en-GB"/>
+        </w:rPr>
+      </w:pPr>
+    </w:p>
+    <w:p>
+      <w:pPr>
+        <w:pStyle w:val="ListParagraph"/>
+        <w:spacing w:before="0" w:beforeAutospacing="off" w:after="0" w:afterAutospacing="off"/>
+        <w:ind w:left="720"/>
+      </w:pPr>
+      <w:r>
+        <w:rPr>
+          <w:rFonts w:ascii="Arial" w:hAnsi="Arial" w:eastAsia="Arial" w:cs="Arial"/>
+          <w:b w:val="1"/>
+          <w:bCs w:val="1"/>
+          <w:strike w:val="0"/>
+          <w:dstrike w:val="0"/>
+          <w:noProof w:val="0"/>
+          <w:color w:val="FF0000"/>
+          <w:sz w:val="32"/>
+          <w:szCs w:val="32"/>
+          <w:u w:val="single"/>
+          <w:lang w:val="en-GB"/>
+        </w:rPr>
+        <w:t>Functions:</w:t>
+      </w:r>
+    </w:p>
+    <w:p>
+      <w:pPr>
+        <w:pStyle w:val="ListParagraph"/>
+        <w:spacing w:before="0" w:beforeAutospacing="off" w:after="0" w:afterAutospacing="off"/>
+        <w:ind w:left="720"/>
+        <w:rPr>
+          <w:rFonts w:ascii="Arial" w:hAnsi="Arial" w:eastAsia="Arial" w:cs="Arial"/>
+          <w:b w:val="1"/>
+          <w:bCs w:val="1"/>
+          <w:strike w:val="0"/>
+          <w:dstrike w:val="0"/>
+          <w:noProof w:val="0"/>
+          <w:color w:val="FF0000"/>
+          <w:sz w:val="32"/>
+          <w:szCs w:val="32"/>
+          <w:u w:val="single"/>
+          <w:lang w:val="en-GB"/>
+        </w:rPr>
+      </w:pPr>
+    </w:p>
+    <w:p>
+      <w:pPr>
+        <w:pStyle w:val="ListParagraph"/>
+        <w:spacing w:before="0" w:beforeAutospacing="off" w:after="0" w:afterAutospacing="off"/>
+        <w:ind w:left="720"/>
+        <w:rPr>
+          <w:rFonts w:ascii="Arial" w:hAnsi="Arial" w:eastAsia="Arial" w:cs="Arial"/>
+          <w:b w:val="1"/>
+          <w:bCs w:val="1"/>
+          <w:strike w:val="0"/>
+          <w:dstrike w:val="0"/>
+          <w:noProof w:val="0"/>
+          <w:color w:val="FF0000"/>
+          <w:sz w:val="24"/>
+          <w:szCs w:val="24"/>
+          <w:u w:val="none"/>
+          <w:lang w:val="en-GB"/>
+        </w:rPr>
+      </w:pPr>
+      <w:r>
+        <w:rPr>
+          <w:rFonts w:ascii="Arial" w:hAnsi="Arial" w:eastAsia="Arial" w:cs="Arial"/>
+          <w:b w:val="1"/>
+          <w:bCs w:val="1"/>
+          <w:strike w:val="0"/>
+          <w:dstrike w:val="0"/>
+          <w:noProof w:val="0"/>
+          <w:color w:val="FF0000"/>
+          <w:sz w:val="24"/>
+          <w:szCs w:val="24"/>
+          <w:u w:val="none"/>
+          <w:lang w:val="en-GB"/>
+        </w:rPr>
+        <w:t>Difference between call by value and call by reference function</w:t>
+      </w:r>
+    </w:p>
+    <w:p>
+      <w:pPr>
+        <w:pStyle w:val="ListParagraph"/>
+        <w:spacing w:before="0" w:beforeAutospacing="off" w:after="0" w:afterAutospacing="off"/>
+        <w:ind w:left="720"/>
+        <w:rPr>
+          <w:rFonts w:ascii="Arial" w:hAnsi="Arial" w:eastAsia="Arial" w:cs="Arial"/>
+          <w:b w:val="0"/>
+          <w:bCs w:val="0"/>
+          <w:strike w:val="0"/>
+          <w:dstrike w:val="0"/>
+          <w:noProof w:val="0"/>
+          <w:sz w:val="24"/>
+          <w:szCs w:val="24"/>
+          <w:u w:val="none"/>
+          <w:lang w:val="en-GB"/>
+        </w:rPr>
+      </w:pPr>
+    </w:p>
+    <w:p>
+      <w:pPr>
+        <w:pStyle w:val="ListParagraph"/>
+        <w:numPr>
+          <w:ilvl w:val="0"/>
+          <w:numId w:val="8"/>
+        </w:numPr>
+        <w:spacing w:before="0" w:beforeAutospacing="off" w:after="0" w:afterAutospacing="off"/>
+        <w:rPr>
+          <w:rFonts w:ascii="Arial" w:hAnsi="Arial" w:eastAsia="Arial" w:cs="Arial"/>
+          <w:b w:val="0"/>
+          <w:bCs w:val="0"/>
+          <w:strike w:val="0"/>
+          <w:dstrike w:val="0"/>
+          <w:noProof w:val="0"/>
+          <w:sz w:val="24"/>
+          <w:szCs w:val="24"/>
+          <w:u w:val="none"/>
+          <w:lang w:val="en-GB"/>
+        </w:rPr>
+      </w:pPr>
+      <w:r>
+        <w:rPr>
+          <w:rFonts w:ascii="Arial" w:hAnsi="Arial" w:eastAsia="Arial" w:cs="Arial"/>
+          <w:b w:val="1"/>
+          <w:bCs w:val="1"/>
+          <w:strike w:val="0"/>
+          <w:dstrike w:val="0"/>
+          <w:noProof w:val="0"/>
+          <w:sz w:val="24"/>
+          <w:szCs w:val="24"/>
+          <w:u w:val="none"/>
+          <w:lang w:val="en-GB"/>
+        </w:rPr>
+        <w:t>Call by Value:</w:t>
+      </w:r>
+      <w:r>
+        <w:rPr>
+          <w:rFonts w:ascii="Arial" w:hAnsi="Arial" w:eastAsia="Arial" w:cs="Arial"/>
+          <w:b w:val="0"/>
+          <w:bCs w:val="0"/>
+          <w:strike w:val="0"/>
+          <w:dstrike w:val="0"/>
+          <w:noProof w:val="0"/>
+          <w:sz w:val="24"/>
+          <w:szCs w:val="24"/>
+          <w:u w:val="none"/>
+          <w:lang w:val="en-GB"/>
+        </w:rPr>
+        <w:t xml:space="preserve"> The function gets a </w:t>
+      </w:r>
+      <w:r>
+        <w:rPr>
+          <w:rFonts w:ascii="Arial" w:hAnsi="Arial" w:eastAsia="Arial" w:cs="Arial"/>
+          <w:b w:val="1"/>
+          <w:bCs w:val="1"/>
+          <w:strike w:val="0"/>
+          <w:dstrike w:val="0"/>
+          <w:noProof w:val="0"/>
+          <w:sz w:val="24"/>
+          <w:szCs w:val="24"/>
+          <w:u w:val="none"/>
+          <w:lang w:val="en-GB"/>
+        </w:rPr>
+        <w:t>copy</w:t>
+      </w:r>
+      <w:r>
+        <w:rPr>
+          <w:rFonts w:ascii="Arial" w:hAnsi="Arial" w:eastAsia="Arial" w:cs="Arial"/>
+          <w:b w:val="0"/>
+          <w:bCs w:val="0"/>
+          <w:strike w:val="0"/>
+          <w:dstrike w:val="0"/>
+          <w:noProof w:val="0"/>
+          <w:sz w:val="24"/>
+          <w:szCs w:val="24"/>
+          <w:u w:val="none"/>
+          <w:lang w:val="en-GB"/>
+        </w:rPr>
+        <w:t xml:space="preserve"> of the file. If the function edits the copy, your original file stays exactly the same.</w:t>
+      </w:r>
+    </w:p>
+    <w:p>
+      <w:pPr>
+        <w:pStyle w:val="ListParagraph"/>
+        <w:numPr>
+          <w:ilvl w:val="0"/>
+          <w:numId w:val="8"/>
+        </w:numPr>
+        <w:spacing w:before="0" w:beforeAutospacing="off" w:after="0" w:afterAutospacing="off"/>
+        <w:rPr>
+          <w:rFonts w:ascii="Arial" w:hAnsi="Arial" w:eastAsia="Arial" w:cs="Arial"/>
+          <w:b w:val="0"/>
+          <w:bCs w:val="0"/>
+          <w:strike w:val="0"/>
+          <w:dstrike w:val="0"/>
+          <w:noProof w:val="0"/>
+          <w:sz w:val="24"/>
+          <w:szCs w:val="24"/>
+          <w:u w:val="none"/>
+          <w:lang w:val="en-GB"/>
+        </w:rPr>
+      </w:pPr>
+      <w:r>
+        <w:rPr>
+          <w:rFonts w:ascii="Arial" w:hAnsi="Arial" w:eastAsia="Arial" w:cs="Arial"/>
+          <w:b w:val="1"/>
+          <w:bCs w:val="1"/>
+          <w:strike w:val="0"/>
+          <w:dstrike w:val="0"/>
+          <w:noProof w:val="0"/>
+          <w:sz w:val="24"/>
+          <w:szCs w:val="24"/>
+          <w:u w:val="none"/>
+          <w:lang w:val="en-GB"/>
+        </w:rPr>
+        <w:t>Call by Reference:</w:t>
+      </w:r>
+      <w:r>
+        <w:rPr>
+          <w:rFonts w:ascii="Arial" w:hAnsi="Arial" w:eastAsia="Arial" w:cs="Arial"/>
+          <w:b w:val="0"/>
+          <w:bCs w:val="0"/>
+          <w:strike w:val="0"/>
+          <w:dstrike w:val="0"/>
+          <w:noProof w:val="0"/>
+          <w:sz w:val="24"/>
+          <w:szCs w:val="24"/>
+          <w:u w:val="none"/>
+          <w:lang w:val="en-GB"/>
+        </w:rPr>
+        <w:t xml:space="preserve"> The function gets a </w:t>
+      </w:r>
+      <w:r>
+        <w:rPr>
+          <w:rFonts w:ascii="Arial" w:hAnsi="Arial" w:eastAsia="Arial" w:cs="Arial"/>
+          <w:b w:val="1"/>
+          <w:bCs w:val="1"/>
+          <w:strike w:val="0"/>
+          <w:dstrike w:val="0"/>
+          <w:noProof w:val="0"/>
+          <w:sz w:val="24"/>
+          <w:szCs w:val="24"/>
+          <w:u w:val="none"/>
+          <w:lang w:val="en-GB"/>
+        </w:rPr>
+        <w:t>shortcut link</w:t>
+      </w:r>
+      <w:r>
+        <w:rPr>
+          <w:rFonts w:ascii="Arial" w:hAnsi="Arial" w:eastAsia="Arial" w:cs="Arial"/>
+          <w:b w:val="0"/>
+          <w:bCs w:val="0"/>
+          <w:strike w:val="0"/>
+          <w:dstrike w:val="0"/>
+          <w:noProof w:val="0"/>
+          <w:sz w:val="24"/>
+          <w:szCs w:val="24"/>
+          <w:u w:val="none"/>
+          <w:lang w:val="en-GB"/>
+        </w:rPr>
+        <w:t xml:space="preserve"> to the original file. If the function edits it, your original file is permanently changed.</w:t>
+      </w:r>
+    </w:p>
+    <w:p>
+      <w:pPr>
+        <w:spacing w:before="360" w:beforeAutospacing="off" w:after="180" w:afterAutospacing="off"/>
+      </w:pPr>
+      <w:r>
+        <w:rPr>
+          <w:rFonts w:ascii="Arial" w:hAnsi="Arial" w:eastAsia="Arial" w:cs="Arial"/>
+          <w:b w:val="1"/>
+          <w:bCs w:val="1"/>
+          <w:strike w:val="0"/>
+          <w:dstrike w:val="0"/>
+          <w:noProof w:val="0"/>
+          <w:sz w:val="30"/>
+          <w:szCs w:val="30"/>
+          <w:u w:val="none"/>
+          <w:lang w:val="en-GB"/>
+        </w:rPr>
+        <w:t>In PHP:</w:t>
+      </w:r>
+    </w:p>
+    <w:p>
+      <w:pPr>
+        <w:pStyle w:val="ListParagraph"/>
+        <w:numPr>
+          <w:ilvl w:val="0"/>
+          <w:numId w:val="9"/>
+        </w:numPr>
+        <w:spacing w:before="0" w:beforeAutospacing="off" w:after="0" w:afterAutospacing="off"/>
+        <w:rPr>
+          <w:rFonts w:ascii="Arial" w:hAnsi="Arial" w:eastAsia="Arial" w:cs="Arial"/>
+          <w:b w:val="0"/>
+          <w:bCs w:val="0"/>
+          <w:strike w:val="0"/>
+          <w:dstrike w:val="0"/>
+          <w:noProof w:val="0"/>
+          <w:sz w:val="24"/>
+          <w:szCs w:val="24"/>
+          <w:u w:val="none"/>
+          <w:lang w:val="en-GB"/>
+        </w:rPr>
+      </w:pPr>
+      <w:r>
+        <w:rPr>
+          <w:rFonts w:ascii="Arial" w:hAnsi="Arial" w:eastAsia="Arial" w:cs="Arial"/>
+          <w:b w:val="1"/>
+          <w:bCs w:val="1"/>
+          <w:strike w:val="0"/>
+          <w:dstrike w:val="0"/>
+          <w:noProof w:val="0"/>
+          <w:sz w:val="24"/>
+          <w:szCs w:val="24"/>
+          <w:u w:val="none"/>
+          <w:lang w:val="en-GB"/>
+        </w:rPr>
+        <w:t>Normal (Value):</w:t>
+      </w:r>
+      <w:r>
+        <w:rPr>
+          <w:rFonts w:ascii="Arial" w:hAnsi="Arial" w:eastAsia="Arial" w:cs="Arial"/>
+          <w:b w:val="0"/>
+          <w:bCs w:val="0"/>
+          <w:strike w:val="0"/>
+          <w:dstrike w:val="0"/>
+          <w:noProof w:val="0"/>
+          <w:sz w:val="24"/>
+          <w:szCs w:val="24"/>
+          <w:u w:val="none"/>
+          <w:lang w:val="en-GB"/>
+        </w:rPr>
+        <w:t xml:space="preserve"> </w:t>
+      </w:r>
+      <w:r>
+        <w:rPr>
+          <w:rFonts w:ascii="Consolas" w:hAnsi="Consolas" w:eastAsia="Consolas" w:cs="Consolas"/>
+          <w:b w:val="0"/>
+          <w:bCs w:val="0"/>
+          <w:strike w:val="0"/>
+          <w:dstrike w:val="0"/>
+          <w:noProof w:val="0"/>
+          <w:sz w:val="21"/>
+          <w:szCs w:val="21"/>
+          <w:u w:val="none"/>
+          <w:lang w:val="en-GB"/>
+        </w:rPr>
+        <w:t>function test($x)</w:t>
+      </w:r>
+      <w:r>
+        <w:rPr>
+          <w:rFonts w:ascii="Consolas" w:hAnsi="Consolas" w:eastAsia="Consolas" w:cs="Consolas"/>
+          <w:b w:val="0"/>
+          <w:bCs w:val="0"/>
+          <w:strike w:val="0"/>
+          <w:dstrike w:val="0"/>
+          <w:noProof w:val="0"/>
+          <w:sz w:val="21"/>
+          <w:szCs w:val="21"/>
+          <w:u w:val="none"/>
+          <w:lang w:val="en-GB"/>
+        </w:rPr>
+        <w:t>.</w:t>
+      </w:r>
+      <w:r>
+        <w:rPr>
+          <w:rFonts w:ascii="Arial" w:hAnsi="Arial" w:eastAsia="Arial" w:cs="Arial"/>
+          <w:b w:val="0"/>
+          <w:bCs w:val="0"/>
+          <w:strike w:val="0"/>
+          <w:dstrike w:val="0"/>
+          <w:noProof w:val="0"/>
+          <w:sz w:val="24"/>
+          <w:szCs w:val="24"/>
+          <w:u w:val="none"/>
+          <w:lang w:val="en-GB"/>
+        </w:rPr>
+        <w:t xml:space="preserve"> Original does not change.</w:t>
+      </w:r>
+    </w:p>
+    <w:p>
+      <w:pPr>
+        <w:pStyle w:val="ListParagraph"/>
+        <w:numPr>
+          <w:ilvl w:val="0"/>
+          <w:numId w:val="9"/>
+        </w:numPr>
+        <w:spacing w:before="0" w:beforeAutospacing="off" w:after="0" w:afterAutospacing="off"/>
+        <w:rPr>
+          <w:rFonts w:ascii="Arial" w:hAnsi="Arial" w:eastAsia="Arial" w:cs="Arial"/>
+          <w:b w:val="0"/>
+          <w:bCs w:val="0"/>
+          <w:strike w:val="0"/>
+          <w:dstrike w:val="0"/>
+          <w:noProof w:val="0"/>
+          <w:sz w:val="24"/>
+          <w:szCs w:val="24"/>
+          <w:u w:val="none"/>
+          <w:lang w:val="en-GB"/>
+        </w:rPr>
+      </w:pPr>
+      <w:r>
+        <w:rPr>
+          <w:rFonts w:ascii="Arial" w:hAnsi="Arial" w:eastAsia="Arial" w:cs="Arial"/>
+          <w:b w:val="1"/>
+          <w:bCs w:val="1"/>
+          <w:strike w:val="0"/>
+          <w:dstrike w:val="0"/>
+          <w:noProof w:val="0"/>
+          <w:sz w:val="24"/>
+          <w:szCs w:val="24"/>
+          <w:u w:val="none"/>
+          <w:lang w:val="en-GB"/>
+        </w:rPr>
+        <w:t xml:space="preserve">With </w:t>
+      </w:r>
+      <w:r>
+        <w:rPr>
+          <w:rFonts w:ascii="Consolas" w:hAnsi="Consolas" w:eastAsia="Consolas" w:cs="Consolas"/>
+          <w:b w:val="1"/>
+          <w:bCs w:val="1"/>
+          <w:strike w:val="0"/>
+          <w:dstrike w:val="0"/>
+          <w:noProof w:val="0"/>
+          <w:sz w:val="21"/>
+          <w:szCs w:val="21"/>
+          <w:u w:val="none"/>
+          <w:lang w:val="en-GB"/>
+        </w:rPr>
+        <w:t>&amp;</w:t>
+      </w:r>
+      <w:r>
+        <w:rPr>
+          <w:rFonts w:ascii="Arial" w:hAnsi="Arial" w:eastAsia="Arial" w:cs="Arial"/>
+          <w:b w:val="1"/>
+          <w:bCs w:val="1"/>
+          <w:strike w:val="0"/>
+          <w:dstrike w:val="0"/>
+          <w:noProof w:val="0"/>
+          <w:sz w:val="24"/>
+          <w:szCs w:val="24"/>
+          <w:u w:val="none"/>
+          <w:lang w:val="en-GB"/>
+        </w:rPr>
+        <w:t xml:space="preserve"> (Reference):</w:t>
+      </w:r>
+      <w:r>
+        <w:rPr>
+          <w:rFonts w:ascii="Arial" w:hAnsi="Arial" w:eastAsia="Arial" w:cs="Arial"/>
+          <w:b w:val="0"/>
+          <w:bCs w:val="0"/>
+          <w:strike w:val="0"/>
+          <w:dstrike w:val="0"/>
+          <w:noProof w:val="0"/>
+          <w:sz w:val="24"/>
+          <w:szCs w:val="24"/>
+          <w:u w:val="none"/>
+          <w:lang w:val="en-GB"/>
+        </w:rPr>
+        <w:t xml:space="preserve"> </w:t>
+      </w:r>
+      <w:r>
+        <w:rPr>
+          <w:rFonts w:ascii="Consolas" w:hAnsi="Consolas" w:eastAsia="Consolas" w:cs="Consolas"/>
+          <w:b w:val="0"/>
+          <w:bCs w:val="0"/>
+          <w:strike w:val="0"/>
+          <w:dstrike w:val="0"/>
+          <w:noProof w:val="0"/>
+          <w:sz w:val="21"/>
+          <w:szCs w:val="21"/>
+          <w:u w:val="none"/>
+          <w:lang w:val="en-GB"/>
+        </w:rPr>
+        <w:t>function test(&amp;$x)</w:t>
+      </w:r>
+      <w:r>
+        <w:rPr>
+          <w:rFonts w:ascii="Consolas" w:hAnsi="Consolas" w:eastAsia="Consolas" w:cs="Consolas"/>
+          <w:b w:val="0"/>
+          <w:bCs w:val="0"/>
+          <w:strike w:val="0"/>
+          <w:dstrike w:val="0"/>
+          <w:noProof w:val="0"/>
+          <w:sz w:val="21"/>
+          <w:szCs w:val="21"/>
+          <w:u w:val="none"/>
+          <w:lang w:val="en-GB"/>
+        </w:rPr>
+        <w:t>.</w:t>
+      </w:r>
+      <w:r>
+        <w:rPr>
+          <w:rFonts w:ascii="Arial" w:hAnsi="Arial" w:eastAsia="Arial" w:cs="Arial"/>
+          <w:b w:val="0"/>
+          <w:bCs w:val="0"/>
+          <w:strike w:val="0"/>
+          <w:dstrike w:val="0"/>
+          <w:noProof w:val="0"/>
+          <w:sz w:val="24"/>
+          <w:szCs w:val="24"/>
+          <w:u w:val="none"/>
+          <w:lang w:val="en-GB"/>
+        </w:rPr>
+        <w:t xml:space="preserve"> Original changes.</w:t>
+      </w:r>
     </w:p>
     <w:p>
       <w:pPr>
         <w:pStyle w:val="Normal"/>
-        <w:spacing w:before="240" w:beforeAutospacing="off" w:after="240" w:afterAutospacing="off"/>
-        <w:ind w:left="0"/>
-        <w:rPr>
-          <w:rFonts w:ascii="Calibri" w:hAnsi="Calibri" w:eastAsia="Calibri" w:cs="Calibri"/>
-          <w:b w:val="1"/>
-          <w:bCs w:val="1"/>
-          <w:noProof w:val="0"/>
-          <w:color w:val="0E2740"/>
-          <w:sz w:val="24"/>
-          <w:szCs w:val="24"/>
+        <w:shd w:val="clear" w:color="auto" w:fill="121314"/>
+        <w:spacing w:before="0" w:beforeAutospacing="off" w:after="0" w:afterAutospacing="off" w:line="285" w:lineRule="auto"/>
+        <w:rPr>
+          <w:rFonts w:ascii="Consolas" w:hAnsi="Consolas" w:eastAsia="Consolas" w:cs="Consolas"/>
+          <w:b w:val="0"/>
+          <w:bCs w:val="0"/>
+          <w:noProof w:val="0"/>
+          <w:color w:val="D4D4D4"/>
+          <w:sz w:val="21"/>
+          <w:szCs w:val="21"/>
           <w:lang w:val="en-GB"/>
         </w:rPr>
       </w:pPr>
@@ -7663,33 +8400,792 @@
     <w:p>
       <w:pPr>
         <w:pStyle w:val="Normal"/>
-        <w:spacing w:before="240" w:beforeAutospacing="off" w:after="240" w:afterAutospacing="off"/>
-        <w:ind w:left="0"/>
-        <w:rPr>
-          <w:rFonts w:ascii="Calibri" w:hAnsi="Calibri" w:eastAsia="Calibri" w:cs="Calibri"/>
-          <w:b w:val="1"/>
-          <w:bCs w:val="1"/>
-          <w:noProof w:val="0"/>
-          <w:color w:val="0E2740" w:themeColor="text2" w:themeTint="80" w:themeShade="FF"/>
-          <w:sz w:val="24"/>
-          <w:szCs w:val="24"/>
-          <w:lang w:val="en-GB"/>
-        </w:rPr>
-      </w:pPr>
+        <w:suppressLineNumbers w:val="0"/>
+        <w:shd w:val="clear" w:color="auto" w:fill="121314"/>
+        <w:bidi w:val="0"/>
+        <w:spacing w:before="0" w:beforeAutospacing="off" w:after="0" w:afterAutospacing="off" w:line="285" w:lineRule="auto"/>
+        <w:ind w:left="0" w:right="0"/>
+        <w:jc w:val="left"/>
+        <w:rPr>
+          <w:rFonts w:ascii="Consolas" w:hAnsi="Consolas" w:eastAsia="Consolas" w:cs="Consolas"/>
+          <w:b w:val="1"/>
+          <w:bCs w:val="1"/>
+          <w:noProof w:val="0"/>
+          <w:color w:val="FF0000"/>
+          <w:sz w:val="24"/>
+          <w:szCs w:val="24"/>
+          <w:u w:val="single"/>
+          <w:lang w:val="en-GB"/>
+        </w:rPr>
+      </w:pPr>
+      <w:r>
+        <w:rPr>
+          <w:rFonts w:ascii="Consolas" w:hAnsi="Consolas" w:eastAsia="Consolas" w:cs="Consolas"/>
+          <w:b w:val="1"/>
+          <w:bCs w:val="1"/>
+          <w:noProof w:val="0"/>
+          <w:color w:val="FF0000"/>
+          <w:sz w:val="24"/>
+          <w:szCs w:val="24"/>
+          <w:u w:val="single"/>
+          <w:lang w:val="en-GB"/>
+        </w:rPr>
+        <w:t>Call by value:</w:t>
+      </w:r>
     </w:p>
     <w:p>
       <w:pPr>
         <w:pStyle w:val="Normal"/>
-        <w:rPr>
-          <w:b w:val="1"/>
-          <w:bCs w:val="1"/>
-          <w:color w:val="4C94D8" w:themeColor="text2" w:themeTint="80" w:themeShade="FF"/>
+        <w:suppressLineNumbers w:val="0"/>
+        <w:shd w:val="clear" w:color="auto" w:fill="121314"/>
+        <w:bidi w:val="0"/>
+        <w:spacing w:before="0" w:beforeAutospacing="off" w:after="0" w:afterAutospacing="off" w:line="285" w:lineRule="auto"/>
+        <w:ind w:left="0" w:right="0"/>
+        <w:jc w:val="left"/>
+        <w:rPr>
+          <w:rFonts w:ascii="Consolas" w:hAnsi="Consolas" w:eastAsia="Consolas" w:cs="Consolas"/>
+          <w:b w:val="1"/>
+          <w:bCs w:val="1"/>
+          <w:noProof w:val="0"/>
+          <w:color w:val="FF0000"/>
+          <w:sz w:val="24"/>
+          <w:szCs w:val="24"/>
+          <w:u w:val="single"/>
+          <w:lang w:val="en-GB"/>
         </w:rPr>
       </w:pPr>
     </w:p>
     <w:p>
       <w:pPr>
         <w:pStyle w:val="Normal"/>
+        <w:suppressLineNumbers w:val="0"/>
+        <w:shd w:val="clear" w:color="auto" w:fill="121314"/>
+        <w:bidi w:val="0"/>
+        <w:spacing w:before="0" w:beforeAutospacing="off" w:after="0" w:afterAutospacing="off" w:line="285" w:lineRule="auto"/>
+        <w:ind w:left="0" w:right="0"/>
+        <w:jc w:val="left"/>
+        <w:rPr>
+          <w:rFonts w:ascii="Consolas" w:hAnsi="Consolas" w:eastAsia="Consolas" w:cs="Consolas"/>
+          <w:b w:val="0"/>
+          <w:bCs w:val="0"/>
+          <w:noProof w:val="0"/>
+          <w:color w:val="A5C9EB" w:themeColor="text2" w:themeTint="40" w:themeShade="FF"/>
+          <w:sz w:val="24"/>
+          <w:szCs w:val="24"/>
+          <w:u w:val="single"/>
+          <w:lang w:val="en-GB"/>
+        </w:rPr>
+      </w:pPr>
+      <w:r>
+        <w:rPr>
+          <w:rFonts w:ascii="Consolas" w:hAnsi="Consolas" w:eastAsia="Consolas" w:cs="Consolas"/>
+          <w:b w:val="0"/>
+          <w:bCs w:val="0"/>
+          <w:noProof w:val="0"/>
+          <w:color w:val="A5C9EB" w:themeColor="text2" w:themeTint="40" w:themeShade="FF"/>
+          <w:sz w:val="24"/>
+          <w:szCs w:val="24"/>
+          <w:u w:val="single"/>
+          <w:lang w:val="en-GB"/>
+        </w:rPr>
+        <w:t>&lt;?php</w:t>
+      </w:r>
+    </w:p>
+    <w:p>
+      <w:pPr>
+        <w:pStyle w:val="Normal"/>
+        <w:shd w:val="clear" w:color="auto" w:fill="121314"/>
+        <w:bidi w:val="0"/>
+        <w:spacing w:before="0" w:beforeAutospacing="off" w:after="0" w:afterAutospacing="off" w:line="285" w:lineRule="auto"/>
+        <w:ind w:left="0" w:right="0"/>
+        <w:jc w:val="left"/>
+        <w:rPr>
+          <w:rFonts w:ascii="Consolas" w:hAnsi="Consolas" w:eastAsia="Consolas" w:cs="Consolas"/>
+          <w:b w:val="0"/>
+          <w:bCs w:val="0"/>
+          <w:noProof w:val="0"/>
+          <w:color w:val="A5C9EB" w:themeColor="text2" w:themeTint="40" w:themeShade="FF"/>
+          <w:sz w:val="24"/>
+          <w:szCs w:val="24"/>
+          <w:u w:val="single"/>
+          <w:lang w:val="en-GB"/>
+        </w:rPr>
+      </w:pPr>
+      <w:r>
+        <w:rPr>
+          <w:rFonts w:ascii="Consolas" w:hAnsi="Consolas" w:eastAsia="Consolas" w:cs="Consolas"/>
+          <w:b w:val="0"/>
+          <w:bCs w:val="0"/>
+          <w:noProof w:val="0"/>
+          <w:color w:val="A5C9EB" w:themeColor="text2" w:themeTint="40" w:themeShade="FF"/>
+          <w:sz w:val="24"/>
+          <w:szCs w:val="24"/>
+          <w:u w:val="single"/>
+          <w:lang w:val="en-GB"/>
+        </w:rPr>
+        <w:t>function addBonus($salary) {</w:t>
+      </w:r>
+    </w:p>
+    <w:p>
+      <w:pPr>
+        <w:pStyle w:val="Normal"/>
+        <w:shd w:val="clear" w:color="auto" w:fill="121314"/>
+        <w:bidi w:val="0"/>
+        <w:spacing w:before="0" w:beforeAutospacing="off" w:after="0" w:afterAutospacing="off" w:line="285" w:lineRule="auto"/>
+        <w:ind w:left="0" w:right="0"/>
+        <w:jc w:val="left"/>
+        <w:rPr>
+          <w:rFonts w:ascii="Consolas" w:hAnsi="Consolas" w:eastAsia="Consolas" w:cs="Consolas"/>
+          <w:b w:val="0"/>
+          <w:bCs w:val="0"/>
+          <w:noProof w:val="0"/>
+          <w:color w:val="A5C9EB" w:themeColor="text2" w:themeTint="40" w:themeShade="FF"/>
+          <w:sz w:val="24"/>
+          <w:szCs w:val="24"/>
+          <w:u w:val="single"/>
+          <w:lang w:val="en-GB"/>
+        </w:rPr>
+      </w:pPr>
+      <w:r>
+        <w:rPr>
+          <w:rFonts w:ascii="Consolas" w:hAnsi="Consolas" w:eastAsia="Consolas" w:cs="Consolas"/>
+          <w:b w:val="0"/>
+          <w:bCs w:val="0"/>
+          <w:noProof w:val="0"/>
+          <w:color w:val="A5C9EB" w:themeColor="text2" w:themeTint="40" w:themeShade="FF"/>
+          <w:sz w:val="24"/>
+          <w:szCs w:val="24"/>
+          <w:u w:val="single"/>
+          <w:lang w:val="en-GB"/>
+        </w:rPr>
+        <w:t xml:space="preserve">    $salary = $salary + 500; // Modifies only the local copy</w:t>
+      </w:r>
+    </w:p>
+    <w:p>
+      <w:pPr>
+        <w:pStyle w:val="Normal"/>
+        <w:shd w:val="clear" w:color="auto" w:fill="121314"/>
+        <w:bidi w:val="0"/>
+        <w:spacing w:before="0" w:beforeAutospacing="off" w:after="0" w:afterAutospacing="off" w:line="285" w:lineRule="auto"/>
+        <w:ind w:left="0" w:right="0"/>
+        <w:jc w:val="left"/>
+        <w:rPr>
+          <w:rFonts w:ascii="Consolas" w:hAnsi="Consolas" w:eastAsia="Consolas" w:cs="Consolas"/>
+          <w:b w:val="0"/>
+          <w:bCs w:val="0"/>
+          <w:noProof w:val="0"/>
+          <w:color w:val="A5C9EB" w:themeColor="text2" w:themeTint="40" w:themeShade="FF"/>
+          <w:sz w:val="24"/>
+          <w:szCs w:val="24"/>
+          <w:u w:val="single"/>
+          <w:lang w:val="en-GB"/>
+        </w:rPr>
+      </w:pPr>
+      <w:r>
+        <w:rPr>
+          <w:rFonts w:ascii="Consolas" w:hAnsi="Consolas" w:eastAsia="Consolas" w:cs="Consolas"/>
+          <w:b w:val="0"/>
+          <w:bCs w:val="0"/>
+          <w:noProof w:val="0"/>
+          <w:color w:val="A5C9EB" w:themeColor="text2" w:themeTint="40" w:themeShade="FF"/>
+          <w:sz w:val="24"/>
+          <w:szCs w:val="24"/>
+          <w:u w:val="single"/>
+          <w:lang w:val="en-GB"/>
+        </w:rPr>
+        <w:t>}</w:t>
+      </w:r>
+    </w:p>
+    <w:p>
+      <w:pPr>
+        <w:pStyle w:val="Normal"/>
+        <w:shd w:val="clear" w:color="auto" w:fill="121314"/>
+        <w:bidi w:val="0"/>
+        <w:spacing w:before="0" w:beforeAutospacing="off" w:after="0" w:afterAutospacing="off" w:line="285" w:lineRule="auto"/>
+        <w:ind w:left="0" w:right="0"/>
+        <w:jc w:val="left"/>
+        <w:rPr>
+          <w:rFonts w:ascii="Consolas" w:hAnsi="Consolas" w:eastAsia="Consolas" w:cs="Consolas"/>
+          <w:b w:val="0"/>
+          <w:bCs w:val="0"/>
+          <w:noProof w:val="0"/>
+          <w:color w:val="A5C9EB" w:themeColor="text2" w:themeTint="40" w:themeShade="FF"/>
+          <w:sz w:val="24"/>
+          <w:szCs w:val="24"/>
+          <w:u w:val="single"/>
+          <w:lang w:val="en-GB"/>
+        </w:rPr>
+      </w:pPr>
+      <w:r>
+        <w:rPr>
+          <w:rFonts w:ascii="Consolas" w:hAnsi="Consolas" w:eastAsia="Consolas" w:cs="Consolas"/>
+          <w:b w:val="0"/>
+          <w:bCs w:val="0"/>
+          <w:noProof w:val="0"/>
+          <w:color w:val="A5C9EB" w:themeColor="text2" w:themeTint="40" w:themeShade="FF"/>
+          <w:sz w:val="24"/>
+          <w:szCs w:val="24"/>
+          <w:u w:val="single"/>
+          <w:lang w:val="en-GB"/>
+        </w:rPr>
+        <w:t xml:space="preserve"> </w:t>
+      </w:r>
+    </w:p>
+    <w:p>
+      <w:pPr>
+        <w:pStyle w:val="Normal"/>
+        <w:shd w:val="clear" w:color="auto" w:fill="121314"/>
+        <w:bidi w:val="0"/>
+        <w:spacing w:before="0" w:beforeAutospacing="off" w:after="0" w:afterAutospacing="off" w:line="285" w:lineRule="auto"/>
+        <w:ind w:left="0" w:right="0"/>
+        <w:jc w:val="left"/>
+        <w:rPr>
+          <w:rFonts w:ascii="Consolas" w:hAnsi="Consolas" w:eastAsia="Consolas" w:cs="Consolas"/>
+          <w:b w:val="0"/>
+          <w:bCs w:val="0"/>
+          <w:noProof w:val="0"/>
+          <w:color w:val="A5C9EB" w:themeColor="text2" w:themeTint="40" w:themeShade="FF"/>
+          <w:sz w:val="24"/>
+          <w:szCs w:val="24"/>
+          <w:u w:val="single"/>
+          <w:lang w:val="en-GB"/>
+        </w:rPr>
+      </w:pPr>
+      <w:r>
+        <w:rPr>
+          <w:rFonts w:ascii="Consolas" w:hAnsi="Consolas" w:eastAsia="Consolas" w:cs="Consolas"/>
+          <w:b w:val="0"/>
+          <w:bCs w:val="0"/>
+          <w:noProof w:val="0"/>
+          <w:color w:val="A5C9EB" w:themeColor="text2" w:themeTint="40" w:themeShade="FF"/>
+          <w:sz w:val="24"/>
+          <w:szCs w:val="24"/>
+          <w:u w:val="single"/>
+          <w:lang w:val="en-GB"/>
+        </w:rPr>
+        <w:t>$employeeSalary = 3000;</w:t>
+      </w:r>
+    </w:p>
+    <w:p>
+      <w:pPr>
+        <w:pStyle w:val="Normal"/>
+        <w:shd w:val="clear" w:color="auto" w:fill="121314"/>
+        <w:bidi w:val="0"/>
+        <w:spacing w:before="0" w:beforeAutospacing="off" w:after="0" w:afterAutospacing="off" w:line="285" w:lineRule="auto"/>
+        <w:ind w:left="0" w:right="0"/>
+        <w:jc w:val="left"/>
+        <w:rPr>
+          <w:rFonts w:ascii="Consolas" w:hAnsi="Consolas" w:eastAsia="Consolas" w:cs="Consolas"/>
+          <w:b w:val="0"/>
+          <w:bCs w:val="0"/>
+          <w:noProof w:val="0"/>
+          <w:color w:val="A5C9EB" w:themeColor="text2" w:themeTint="40" w:themeShade="FF"/>
+          <w:sz w:val="24"/>
+          <w:szCs w:val="24"/>
+          <w:u w:val="single"/>
+          <w:lang w:val="en-GB"/>
+        </w:rPr>
+      </w:pPr>
+      <w:r>
+        <w:rPr>
+          <w:rFonts w:ascii="Consolas" w:hAnsi="Consolas" w:eastAsia="Consolas" w:cs="Consolas"/>
+          <w:b w:val="0"/>
+          <w:bCs w:val="0"/>
+          <w:noProof w:val="0"/>
+          <w:color w:val="A5C9EB" w:themeColor="text2" w:themeTint="40" w:themeShade="FF"/>
+          <w:sz w:val="24"/>
+          <w:szCs w:val="24"/>
+          <w:u w:val="single"/>
+          <w:lang w:val="en-GB"/>
+        </w:rPr>
+        <w:t>addBonus($employeeSalary);</w:t>
+      </w:r>
+    </w:p>
+    <w:p>
+      <w:pPr>
+        <w:pStyle w:val="Normal"/>
+        <w:shd w:val="clear" w:color="auto" w:fill="121314"/>
+        <w:bidi w:val="0"/>
+        <w:spacing w:before="0" w:beforeAutospacing="off" w:after="0" w:afterAutospacing="off" w:line="285" w:lineRule="auto"/>
+        <w:ind w:left="0" w:right="0"/>
+        <w:jc w:val="left"/>
+        <w:rPr>
+          <w:rFonts w:ascii="Consolas" w:hAnsi="Consolas" w:eastAsia="Consolas" w:cs="Consolas"/>
+          <w:b w:val="0"/>
+          <w:bCs w:val="0"/>
+          <w:noProof w:val="0"/>
+          <w:color w:val="A5C9EB" w:themeColor="text2" w:themeTint="40" w:themeShade="FF"/>
+          <w:sz w:val="24"/>
+          <w:szCs w:val="24"/>
+          <w:u w:val="single"/>
+          <w:lang w:val="en-GB"/>
+        </w:rPr>
+      </w:pPr>
+      <w:r>
+        <w:rPr>
+          <w:rFonts w:ascii="Consolas" w:hAnsi="Consolas" w:eastAsia="Consolas" w:cs="Consolas"/>
+          <w:b w:val="0"/>
+          <w:bCs w:val="0"/>
+          <w:noProof w:val="0"/>
+          <w:color w:val="A5C9EB" w:themeColor="text2" w:themeTint="40" w:themeShade="FF"/>
+          <w:sz w:val="24"/>
+          <w:szCs w:val="24"/>
+          <w:u w:val="single"/>
+          <w:lang w:val="en-GB"/>
+        </w:rPr>
+        <w:t xml:space="preserve"> </w:t>
+      </w:r>
+    </w:p>
+    <w:p>
+      <w:pPr>
+        <w:pStyle w:val="Normal"/>
+        <w:shd w:val="clear" w:color="auto" w:fill="121314"/>
+        <w:bidi w:val="0"/>
+        <w:spacing w:before="0" w:beforeAutospacing="off" w:after="0" w:afterAutospacing="off" w:line="285" w:lineRule="auto"/>
+        <w:ind w:left="0" w:right="0"/>
+        <w:jc w:val="left"/>
+        <w:rPr>
+          <w:rFonts w:ascii="Consolas" w:hAnsi="Consolas" w:eastAsia="Consolas" w:cs="Consolas"/>
+          <w:b w:val="1"/>
+          <w:bCs w:val="1"/>
+          <w:noProof w:val="0"/>
+          <w:color w:val="FFFF00"/>
+          <w:sz w:val="24"/>
+          <w:szCs w:val="24"/>
+          <w:u w:val="single"/>
+          <w:lang w:val="en-GB"/>
+        </w:rPr>
+      </w:pPr>
+      <w:r>
+        <w:rPr>
+          <w:rFonts w:ascii="Consolas" w:hAnsi="Consolas" w:eastAsia="Consolas" w:cs="Consolas"/>
+          <w:b w:val="0"/>
+          <w:bCs w:val="0"/>
+          <w:noProof w:val="0"/>
+          <w:color w:val="A5C9EB" w:themeColor="text2" w:themeTint="40" w:themeShade="FF"/>
+          <w:sz w:val="24"/>
+          <w:szCs w:val="24"/>
+          <w:u w:val="single"/>
+          <w:lang w:val="en-GB"/>
+        </w:rPr>
+        <w:t xml:space="preserve">echo $employeeSalary; </w:t>
+      </w:r>
+      <w:r>
+        <w:rPr>
+          <w:rFonts w:ascii="Consolas" w:hAnsi="Consolas" w:eastAsia="Consolas" w:cs="Consolas"/>
+          <w:b w:val="1"/>
+          <w:bCs w:val="1"/>
+          <w:noProof w:val="0"/>
+          <w:color w:val="FFFF00"/>
+          <w:sz w:val="24"/>
+          <w:szCs w:val="24"/>
+          <w:u w:val="single"/>
+          <w:lang w:val="en-GB"/>
+        </w:rPr>
+        <w:t>// Outputs: 3000 (Unchanged)</w:t>
+      </w:r>
+    </w:p>
+    <w:p>
+      <w:pPr>
+        <w:pStyle w:val="Normal"/>
+        <w:shd w:val="clear" w:color="auto" w:fill="121314"/>
+        <w:bidi w:val="0"/>
+        <w:spacing w:before="0" w:beforeAutospacing="off" w:after="0" w:afterAutospacing="off" w:line="285" w:lineRule="auto"/>
+        <w:ind w:left="0" w:right="0"/>
+        <w:jc w:val="left"/>
+        <w:rPr>
+          <w:rFonts w:ascii="Consolas" w:hAnsi="Consolas" w:eastAsia="Consolas" w:cs="Consolas"/>
+          <w:b w:val="1"/>
+          <w:bCs w:val="1"/>
+          <w:noProof w:val="0"/>
+          <w:color w:val="A5C9EB" w:themeColor="text2" w:themeTint="40" w:themeShade="FF"/>
+          <w:sz w:val="24"/>
+          <w:szCs w:val="24"/>
+          <w:u w:val="single"/>
+          <w:lang w:val="en-GB"/>
+        </w:rPr>
+      </w:pPr>
+      <w:r>
+        <w:rPr>
+          <w:rFonts w:ascii="Consolas" w:hAnsi="Consolas" w:eastAsia="Consolas" w:cs="Consolas"/>
+          <w:b w:val="1"/>
+          <w:bCs w:val="1"/>
+          <w:noProof w:val="0"/>
+          <w:color w:val="A5C9EB" w:themeColor="text2" w:themeTint="40" w:themeShade="FF"/>
+          <w:sz w:val="24"/>
+          <w:szCs w:val="24"/>
+          <w:u w:val="single"/>
+          <w:lang w:val="en-GB"/>
+        </w:rPr>
+        <w:t>?&gt;</w:t>
+      </w:r>
+    </w:p>
+    <w:p>
+      <w:pPr>
+        <w:pStyle w:val="Normal"/>
+        <w:suppressLineNumbers w:val="0"/>
+        <w:shd w:val="clear" w:color="auto" w:fill="121314"/>
+        <w:bidi w:val="0"/>
+        <w:spacing w:before="0" w:beforeAutospacing="off" w:after="0" w:afterAutospacing="off" w:line="285" w:lineRule="auto"/>
+        <w:ind w:left="0" w:right="0"/>
+        <w:jc w:val="left"/>
+        <w:rPr>
+          <w:rFonts w:ascii="Consolas" w:hAnsi="Consolas" w:eastAsia="Consolas" w:cs="Consolas"/>
+          <w:b w:val="0"/>
+          <w:bCs w:val="0"/>
+          <w:noProof w:val="0"/>
+          <w:color w:val="A5C9EB" w:themeColor="text2" w:themeTint="40" w:themeShade="FF"/>
+          <w:sz w:val="24"/>
+          <w:szCs w:val="24"/>
+          <w:u w:val="single"/>
+          <w:lang w:val="en-GB"/>
+        </w:rPr>
+      </w:pPr>
+    </w:p>
+    <w:p>
+      <w:pPr>
+        <w:pStyle w:val="Normal"/>
+        <w:suppressLineNumbers w:val="0"/>
+        <w:shd w:val="clear" w:color="auto" w:fill="121314"/>
+        <w:bidi w:val="0"/>
+        <w:spacing w:before="0" w:beforeAutospacing="off" w:after="0" w:afterAutospacing="off" w:line="285" w:lineRule="auto"/>
+        <w:ind w:left="0" w:right="0"/>
+        <w:jc w:val="left"/>
+        <w:rPr>
+          <w:rFonts w:ascii="Consolas" w:hAnsi="Consolas" w:eastAsia="Consolas" w:cs="Consolas"/>
+          <w:b w:val="1"/>
+          <w:bCs w:val="1"/>
+          <w:noProof w:val="0"/>
+          <w:color w:val="FF0000"/>
+          <w:sz w:val="24"/>
+          <w:szCs w:val="24"/>
+          <w:u w:val="single"/>
+          <w:lang w:val="en-GB"/>
+        </w:rPr>
+      </w:pPr>
+      <w:r>
+        <w:rPr>
+          <w:rFonts w:ascii="Consolas" w:hAnsi="Consolas" w:eastAsia="Consolas" w:cs="Consolas"/>
+          <w:b w:val="1"/>
+          <w:bCs w:val="1"/>
+          <w:noProof w:val="0"/>
+          <w:color w:val="FF0000"/>
+          <w:sz w:val="24"/>
+          <w:szCs w:val="24"/>
+          <w:u w:val="single"/>
+          <w:lang w:val="en-GB"/>
+        </w:rPr>
+        <w:t>Call by reference:</w:t>
+      </w:r>
+    </w:p>
+    <w:p>
+      <w:pPr>
+        <w:pStyle w:val="Normal"/>
+        <w:suppressLineNumbers w:val="0"/>
+        <w:shd w:val="clear" w:color="auto" w:fill="121314"/>
+        <w:bidi w:val="0"/>
+        <w:spacing w:before="0" w:beforeAutospacing="off" w:after="0" w:afterAutospacing="off" w:line="285" w:lineRule="auto"/>
+        <w:ind w:left="0" w:right="0"/>
+        <w:jc w:val="left"/>
+        <w:rPr>
+          <w:rFonts w:ascii="Consolas" w:hAnsi="Consolas" w:eastAsia="Consolas" w:cs="Consolas"/>
+          <w:b w:val="1"/>
+          <w:bCs w:val="1"/>
+          <w:noProof w:val="0"/>
+          <w:color w:val="A5C9EB" w:themeColor="text2" w:themeTint="40" w:themeShade="FF"/>
+          <w:sz w:val="24"/>
+          <w:szCs w:val="24"/>
+          <w:u w:val="single"/>
+          <w:lang w:val="en-GB"/>
+        </w:rPr>
+      </w:pPr>
+    </w:p>
+    <w:p>
+      <w:pPr>
+        <w:pStyle w:val="Normal"/>
+        <w:suppressLineNumbers w:val="0"/>
+        <w:shd w:val="clear" w:color="auto" w:fill="121314"/>
+        <w:bidi w:val="0"/>
+        <w:spacing w:before="0" w:beforeAutospacing="off" w:after="0" w:afterAutospacing="off" w:line="285" w:lineRule="auto"/>
+        <w:ind w:left="0" w:right="0"/>
+        <w:jc w:val="left"/>
+      </w:pPr>
+      <w:r>
+        <w:rPr>
+          <w:rFonts w:ascii="Consolas" w:hAnsi="Consolas" w:eastAsia="Consolas" w:cs="Consolas"/>
+          <w:b w:val="1"/>
+          <w:bCs w:val="1"/>
+          <w:noProof w:val="0"/>
+          <w:color w:val="A5C9EB" w:themeColor="text2" w:themeTint="40" w:themeShade="FF"/>
+          <w:sz w:val="24"/>
+          <w:szCs w:val="24"/>
+          <w:u w:val="single"/>
+          <w:lang w:val="en-GB"/>
+        </w:rPr>
+        <w:t>&lt;?php</w:t>
+      </w:r>
+    </w:p>
+    <w:p>
+      <w:pPr>
+        <w:pStyle w:val="Normal"/>
+        <w:shd w:val="clear" w:color="auto" w:fill="121314"/>
+        <w:bidi w:val="0"/>
+        <w:spacing w:before="0" w:beforeAutospacing="off" w:after="0" w:afterAutospacing="off" w:line="285" w:lineRule="auto"/>
+        <w:ind w:left="0" w:right="0"/>
+        <w:jc w:val="left"/>
+      </w:pPr>
+      <w:r>
+        <w:rPr>
+          <w:rFonts w:ascii="Consolas" w:hAnsi="Consolas" w:eastAsia="Consolas" w:cs="Consolas"/>
+          <w:b w:val="1"/>
+          <w:bCs w:val="1"/>
+          <w:noProof w:val="0"/>
+          <w:color w:val="A5C9EB" w:themeColor="text2" w:themeTint="40" w:themeShade="FF"/>
+          <w:sz w:val="24"/>
+          <w:szCs w:val="24"/>
+          <w:u w:val="single"/>
+          <w:lang w:val="en-GB"/>
+        </w:rPr>
+        <w:t>function addBonusRef(&amp;$salary) { // '&amp;' means pass by reference</w:t>
+      </w:r>
+    </w:p>
+    <w:p>
+      <w:pPr>
+        <w:pStyle w:val="Normal"/>
+        <w:shd w:val="clear" w:color="auto" w:fill="121314"/>
+        <w:bidi w:val="0"/>
+        <w:spacing w:before="0" w:beforeAutospacing="off" w:after="0" w:afterAutospacing="off" w:line="285" w:lineRule="auto"/>
+        <w:ind w:left="0" w:right="0"/>
+        <w:jc w:val="left"/>
+      </w:pPr>
+      <w:r>
+        <w:rPr>
+          <w:rFonts w:ascii="Consolas" w:hAnsi="Consolas" w:eastAsia="Consolas" w:cs="Consolas"/>
+          <w:b w:val="1"/>
+          <w:bCs w:val="1"/>
+          <w:noProof w:val="0"/>
+          <w:color w:val="A5C9EB" w:themeColor="text2" w:themeTint="40" w:themeShade="FF"/>
+          <w:sz w:val="24"/>
+          <w:szCs w:val="24"/>
+          <w:u w:val="single"/>
+          <w:lang w:val="en-GB"/>
+        </w:rPr>
+        <w:t xml:space="preserve">    $salary = $salary + 500; // Modifies the original variable directly</w:t>
+      </w:r>
+    </w:p>
+    <w:p>
+      <w:pPr>
+        <w:pStyle w:val="Normal"/>
+        <w:shd w:val="clear" w:color="auto" w:fill="121314"/>
+        <w:bidi w:val="0"/>
+        <w:spacing w:before="0" w:beforeAutospacing="off" w:after="0" w:afterAutospacing="off" w:line="285" w:lineRule="auto"/>
+        <w:ind w:left="0" w:right="0"/>
+        <w:jc w:val="left"/>
+      </w:pPr>
+      <w:r>
+        <w:rPr>
+          <w:rFonts w:ascii="Consolas" w:hAnsi="Consolas" w:eastAsia="Consolas" w:cs="Consolas"/>
+          <w:b w:val="1"/>
+          <w:bCs w:val="1"/>
+          <w:noProof w:val="0"/>
+          <w:color w:val="A5C9EB" w:themeColor="text2" w:themeTint="40" w:themeShade="FF"/>
+          <w:sz w:val="24"/>
+          <w:szCs w:val="24"/>
+          <w:u w:val="single"/>
+          <w:lang w:val="en-GB"/>
+        </w:rPr>
+        <w:t>}</w:t>
+      </w:r>
+    </w:p>
+    <w:p>
+      <w:pPr>
+        <w:pStyle w:val="Normal"/>
+        <w:shd w:val="clear" w:color="auto" w:fill="121314"/>
+        <w:bidi w:val="0"/>
+        <w:spacing w:before="0" w:beforeAutospacing="off" w:after="0" w:afterAutospacing="off" w:line="285" w:lineRule="auto"/>
+        <w:ind w:left="0" w:right="0"/>
+        <w:jc w:val="left"/>
+      </w:pPr>
+      <w:r>
+        <w:rPr>
+          <w:rFonts w:ascii="Consolas" w:hAnsi="Consolas" w:eastAsia="Consolas" w:cs="Consolas"/>
+          <w:b w:val="1"/>
+          <w:bCs w:val="1"/>
+          <w:noProof w:val="0"/>
+          <w:color w:val="A5C9EB" w:themeColor="text2" w:themeTint="40" w:themeShade="FF"/>
+          <w:sz w:val="24"/>
+          <w:szCs w:val="24"/>
+          <w:u w:val="single"/>
+          <w:lang w:val="en-GB"/>
+        </w:rPr>
+        <w:t xml:space="preserve"> </w:t>
+      </w:r>
+    </w:p>
+    <w:p>
+      <w:pPr>
+        <w:pStyle w:val="Normal"/>
+        <w:shd w:val="clear" w:color="auto" w:fill="121314"/>
+        <w:bidi w:val="0"/>
+        <w:spacing w:before="0" w:beforeAutospacing="off" w:after="0" w:afterAutospacing="off" w:line="285" w:lineRule="auto"/>
+        <w:ind w:left="0" w:right="0"/>
+        <w:jc w:val="left"/>
+      </w:pPr>
+      <w:r>
+        <w:rPr>
+          <w:rFonts w:ascii="Consolas" w:hAnsi="Consolas" w:eastAsia="Consolas" w:cs="Consolas"/>
+          <w:b w:val="1"/>
+          <w:bCs w:val="1"/>
+          <w:noProof w:val="0"/>
+          <w:color w:val="A5C9EB" w:themeColor="text2" w:themeTint="40" w:themeShade="FF"/>
+          <w:sz w:val="24"/>
+          <w:szCs w:val="24"/>
+          <w:u w:val="single"/>
+          <w:lang w:val="en-GB"/>
+        </w:rPr>
+        <w:t>$employeeSalary = 3000;</w:t>
+      </w:r>
+    </w:p>
+    <w:p>
+      <w:pPr>
+        <w:pStyle w:val="Normal"/>
+        <w:shd w:val="clear" w:color="auto" w:fill="121314"/>
+        <w:bidi w:val="0"/>
+        <w:spacing w:before="0" w:beforeAutospacing="off" w:after="0" w:afterAutospacing="off" w:line="285" w:lineRule="auto"/>
+        <w:ind w:left="0" w:right="0"/>
+        <w:jc w:val="left"/>
+      </w:pPr>
+      <w:r>
+        <w:rPr>
+          <w:rFonts w:ascii="Consolas" w:hAnsi="Consolas" w:eastAsia="Consolas" w:cs="Consolas"/>
+          <w:b w:val="1"/>
+          <w:bCs w:val="1"/>
+          <w:noProof w:val="0"/>
+          <w:color w:val="A5C9EB" w:themeColor="text2" w:themeTint="40" w:themeShade="FF"/>
+          <w:sz w:val="24"/>
+          <w:szCs w:val="24"/>
+          <w:u w:val="single"/>
+          <w:lang w:val="en-GB"/>
+        </w:rPr>
+        <w:t>addBonusRef($employeeSalary);</w:t>
+      </w:r>
+    </w:p>
+    <w:p>
+      <w:pPr>
+        <w:pStyle w:val="Normal"/>
+        <w:shd w:val="clear" w:color="auto" w:fill="121314"/>
+        <w:bidi w:val="0"/>
+        <w:spacing w:before="0" w:beforeAutospacing="off" w:after="0" w:afterAutospacing="off" w:line="285" w:lineRule="auto"/>
+        <w:ind w:left="0" w:right="0"/>
+        <w:jc w:val="left"/>
+      </w:pPr>
+      <w:r>
+        <w:rPr>
+          <w:rFonts w:ascii="Consolas" w:hAnsi="Consolas" w:eastAsia="Consolas" w:cs="Consolas"/>
+          <w:b w:val="1"/>
+          <w:bCs w:val="1"/>
+          <w:noProof w:val="0"/>
+          <w:color w:val="A5C9EB" w:themeColor="text2" w:themeTint="40" w:themeShade="FF"/>
+          <w:sz w:val="24"/>
+          <w:szCs w:val="24"/>
+          <w:u w:val="single"/>
+          <w:lang w:val="en-GB"/>
+        </w:rPr>
+        <w:t xml:space="preserve"> </w:t>
+      </w:r>
+    </w:p>
+    <w:p>
+      <w:pPr>
+        <w:pStyle w:val="Normal"/>
+        <w:shd w:val="clear" w:color="auto" w:fill="121314"/>
+        <w:bidi w:val="0"/>
+        <w:spacing w:before="0" w:beforeAutospacing="off" w:after="0" w:afterAutospacing="off" w:line="285" w:lineRule="auto"/>
+        <w:ind w:left="0" w:right="0"/>
+        <w:jc w:val="left"/>
+        <w:rPr>
+          <w:rFonts w:ascii="Consolas" w:hAnsi="Consolas" w:eastAsia="Consolas" w:cs="Consolas"/>
+          <w:b w:val="1"/>
+          <w:bCs w:val="1"/>
+          <w:noProof w:val="0"/>
+          <w:color w:val="FFFF00"/>
+          <w:sz w:val="24"/>
+          <w:szCs w:val="24"/>
+          <w:u w:val="single"/>
+          <w:lang w:val="en-GB"/>
+        </w:rPr>
+      </w:pPr>
+      <w:r>
+        <w:rPr>
+          <w:rFonts w:ascii="Consolas" w:hAnsi="Consolas" w:eastAsia="Consolas" w:cs="Consolas"/>
+          <w:b w:val="1"/>
+          <w:bCs w:val="1"/>
+          <w:noProof w:val="0"/>
+          <w:color w:val="A5C9EB" w:themeColor="text2" w:themeTint="40" w:themeShade="FF"/>
+          <w:sz w:val="24"/>
+          <w:szCs w:val="24"/>
+          <w:u w:val="single"/>
+          <w:lang w:val="en-GB"/>
+        </w:rPr>
+        <w:t xml:space="preserve">echo $employeeSalary; </w:t>
+      </w:r>
+      <w:r>
+        <w:rPr>
+          <w:rFonts w:ascii="Consolas" w:hAnsi="Consolas" w:eastAsia="Consolas" w:cs="Consolas"/>
+          <w:b w:val="1"/>
+          <w:bCs w:val="1"/>
+          <w:noProof w:val="0"/>
+          <w:color w:val="FFFF00"/>
+          <w:sz w:val="24"/>
+          <w:szCs w:val="24"/>
+          <w:u w:val="single"/>
+          <w:lang w:val="en-GB"/>
+        </w:rPr>
+        <w:t>// Outputs: 3500 (Modified)</w:t>
+      </w:r>
+    </w:p>
+    <w:p>
+      <w:pPr>
+        <w:pStyle w:val="Normal"/>
+        <w:shd w:val="clear" w:color="auto" w:fill="121314"/>
+        <w:bidi w:val="0"/>
+        <w:spacing w:before="0" w:beforeAutospacing="off" w:after="0" w:afterAutospacing="off" w:line="285" w:lineRule="auto"/>
+        <w:ind w:left="0" w:right="0"/>
+        <w:jc w:val="left"/>
+      </w:pPr>
+      <w:r>
+        <w:rPr>
+          <w:rFonts w:ascii="Consolas" w:hAnsi="Consolas" w:eastAsia="Consolas" w:cs="Consolas"/>
+          <w:b w:val="1"/>
+          <w:bCs w:val="1"/>
+          <w:noProof w:val="0"/>
+          <w:color w:val="A5C9EB" w:themeColor="text2" w:themeTint="40" w:themeShade="FF"/>
+          <w:sz w:val="24"/>
+          <w:szCs w:val="24"/>
+          <w:u w:val="single"/>
+          <w:lang w:val="en-GB"/>
+        </w:rPr>
+        <w:t>?&gt;</w:t>
+      </w:r>
+    </w:p>
+    <w:p>
+      <w:pPr>
+        <w:pStyle w:val="Normal"/>
+        <w:suppressLineNumbers w:val="0"/>
+        <w:shd w:val="clear" w:color="auto" w:fill="121314"/>
+        <w:bidi w:val="0"/>
+        <w:spacing w:before="0" w:beforeAutospacing="off" w:after="0" w:afterAutospacing="off" w:line="285" w:lineRule="auto"/>
+        <w:ind w:left="0" w:right="0"/>
+        <w:jc w:val="left"/>
+        <w:rPr>
+          <w:rFonts w:ascii="Consolas" w:hAnsi="Consolas" w:eastAsia="Consolas" w:cs="Consolas"/>
+          <w:b w:val="1"/>
+          <w:bCs w:val="1"/>
+          <w:noProof w:val="0"/>
+          <w:color w:val="A5C9EB" w:themeColor="text2" w:themeTint="40" w:themeShade="FF"/>
+          <w:sz w:val="24"/>
+          <w:szCs w:val="24"/>
+          <w:u w:val="single"/>
+          <w:lang w:val="en-GB"/>
+        </w:rPr>
       </w:pPr>
     </w:p>
     <w:sectPr>
@@ -7846,6 +9342,230 @@
 
 <file path=word/numbering.xml><?xml version="1.0" encoding="utf-8"?>
 <w:numbering xmlns:w="http://schemas.openxmlformats.org/wordprocessingml/2006/main">
+  <w:abstractNum xmlns:w="http://schemas.openxmlformats.org/wordprocessingml/2006/main" w:abstractNumId="9">
+    <w:nsid w:val="58e9205b"/>
+    <w:multiLevelType xmlns:w="http://schemas.openxmlformats.org/wordprocessingml/2006/main" w:val="hybridMultilevel"/>
+    <w:lvl xmlns:w="http://schemas.openxmlformats.org/wordprocessingml/2006/main" w:ilvl="0">
+      <w:start w:val="1"/>
+      <w:numFmt w:val="bullet"/>
+      <w:lvlText w:val=""/>
+      <w:lvlJc w:val="left"/>
+      <w:pPr>
+        <w:ind w:left="720" w:hanging="360"/>
+      </w:pPr>
+      <w:rPr>
+        <w:rFonts w:hint="default" w:ascii="Symbol" w:hAnsi="Symbol"/>
+      </w:rPr>
+    </w:lvl>
+    <w:lvl xmlns:w="http://schemas.openxmlformats.org/wordprocessingml/2006/main" w:ilvl="1">
+      <w:start w:val="1"/>
+      <w:numFmt w:val="bullet"/>
+      <w:lvlText w:val="o"/>
+      <w:lvlJc w:val="left"/>
+      <w:pPr>
+        <w:ind w:left="1440" w:hanging="360"/>
+      </w:pPr>
+      <w:rPr>
+        <w:rFonts w:hint="default" w:ascii="Courier New" w:hAnsi="Courier New"/>
+      </w:rPr>
+    </w:lvl>
+    <w:lvl xmlns:w="http://schemas.openxmlformats.org/wordprocessingml/2006/main" w:ilvl="2">
+      <w:start w:val="1"/>
+      <w:numFmt w:val="bullet"/>
+      <w:lvlText w:val=""/>
+      <w:lvlJc w:val="left"/>
+      <w:pPr>
+        <w:ind w:left="2160" w:hanging="360"/>
+      </w:pPr>
+      <w:rPr>
+        <w:rFonts w:hint="default" w:ascii="Wingdings" w:hAnsi="Wingdings"/>
+      </w:rPr>
+    </w:lvl>
+    <w:lvl xmlns:w="http://schemas.openxmlformats.org/wordprocessingml/2006/main" w:ilvl="3">
+      <w:start w:val="1"/>
+      <w:numFmt w:val="bullet"/>
+      <w:lvlText w:val=""/>
+      <w:lvlJc w:val="left"/>
+      <w:pPr>
+        <w:ind w:left="2880" w:hanging="360"/>
+      </w:pPr>
+      <w:rPr>
+        <w:rFonts w:hint="default" w:ascii="Symbol" w:hAnsi="Symbol"/>
+      </w:rPr>
+    </w:lvl>
+    <w:lvl xmlns:w="http://schemas.openxmlformats.org/wordprocessingml/2006/main" w:ilvl="4">
+      <w:start w:val="1"/>
+      <w:numFmt w:val="bullet"/>
+      <w:lvlText w:val="o"/>
+      <w:lvlJc w:val="left"/>
+      <w:pPr>
+        <w:ind w:left="3600" w:hanging="360"/>
+      </w:pPr>
+      <w:rPr>
+        <w:rFonts w:hint="default" w:ascii="Courier New" w:hAnsi="Courier New"/>
+      </w:rPr>
+    </w:lvl>
+    <w:lvl xmlns:w="http://schemas.openxmlformats.org/wordprocessingml/2006/main" w:ilvl="5">
+      <w:start w:val="1"/>
+      <w:numFmt w:val="bullet"/>
+      <w:lvlText w:val=""/>
+      <w:lvlJc w:val="left"/>
+      <w:pPr>
+        <w:ind w:left="4320" w:hanging="360"/>
+      </w:pPr>
+      <w:rPr>
+        <w:rFonts w:hint="default" w:ascii="Wingdings" w:hAnsi="Wingdings"/>
+      </w:rPr>
+    </w:lvl>
+    <w:lvl xmlns:w="http://schemas.openxmlformats.org/wordprocessingml/2006/main" w:ilvl="6">
+      <w:start w:val="1"/>
+      <w:numFmt w:val="bullet"/>
+      <w:lvlText w:val=""/>
+      <w:lvlJc w:val="left"/>
+      <w:pPr>
+        <w:ind w:left="5040" w:hanging="360"/>
+      </w:pPr>
+      <w:rPr>
+        <w:rFonts w:hint="default" w:ascii="Symbol" w:hAnsi="Symbol"/>
+      </w:rPr>
+    </w:lvl>
+    <w:lvl xmlns:w="http://schemas.openxmlformats.org/wordprocessingml/2006/main" w:ilvl="7">
+      <w:start w:val="1"/>
+      <w:numFmt w:val="bullet"/>
+      <w:lvlText w:val="o"/>
+      <w:lvlJc w:val="left"/>
+      <w:pPr>
+        <w:ind w:left="5760" w:hanging="360"/>
+      </w:pPr>
+      <w:rPr>
+        <w:rFonts w:hint="default" w:ascii="Courier New" w:hAnsi="Courier New"/>
+      </w:rPr>
+    </w:lvl>
+    <w:lvl xmlns:w="http://schemas.openxmlformats.org/wordprocessingml/2006/main" w:ilvl="8">
+      <w:start w:val="1"/>
+      <w:numFmt w:val="bullet"/>
+      <w:lvlText w:val=""/>
+      <w:lvlJc w:val="left"/>
+      <w:pPr>
+        <w:ind w:left="6480" w:hanging="360"/>
+      </w:pPr>
+      <w:rPr>
+        <w:rFonts w:hint="default" w:ascii="Wingdings" w:hAnsi="Wingdings"/>
+      </w:rPr>
+    </w:lvl>
+  </w:abstractNum>
+  <w:abstractNum xmlns:w="http://schemas.openxmlformats.org/wordprocessingml/2006/main" w:abstractNumId="8">
+    <w:nsid w:val="6eea8383"/>
+    <w:multiLevelType xmlns:w="http://schemas.openxmlformats.org/wordprocessingml/2006/main" w:val="hybridMultilevel"/>
+    <w:lvl xmlns:w="http://schemas.openxmlformats.org/wordprocessingml/2006/main" w:ilvl="0">
+      <w:start w:val="1"/>
+      <w:numFmt w:val="bullet"/>
+      <w:lvlText w:val=""/>
+      <w:lvlJc w:val="left"/>
+      <w:pPr>
+        <w:ind w:left="720" w:hanging="360"/>
+      </w:pPr>
+      <w:rPr>
+        <w:rFonts w:hint="default" w:ascii="Symbol" w:hAnsi="Symbol"/>
+      </w:rPr>
+    </w:lvl>
+    <w:lvl xmlns:w="http://schemas.openxmlformats.org/wordprocessingml/2006/main" w:ilvl="1">
+      <w:start w:val="1"/>
+      <w:numFmt w:val="bullet"/>
+      <w:lvlText w:val="o"/>
+      <w:lvlJc w:val="left"/>
+      <w:pPr>
+        <w:ind w:left="1440" w:hanging="360"/>
+      </w:pPr>
+      <w:rPr>
+        <w:rFonts w:hint="default" w:ascii="Courier New" w:hAnsi="Courier New"/>
+      </w:rPr>
+    </w:lvl>
+    <w:lvl xmlns:w="http://schemas.openxmlformats.org/wordprocessingml/2006/main" w:ilvl="2">
+      <w:start w:val="1"/>
+      <w:numFmt w:val="bullet"/>
+      <w:lvlText w:val=""/>
+      <w:lvlJc w:val="left"/>
+      <w:pPr>
+        <w:ind w:left="2160" w:hanging="360"/>
+      </w:pPr>
+      <w:rPr>
+        <w:rFonts w:hint="default" w:ascii="Wingdings" w:hAnsi="Wingdings"/>
+      </w:rPr>
+    </w:lvl>
+    <w:lvl xmlns:w="http://schemas.openxmlformats.org/wordprocessingml/2006/main" w:ilvl="3">
+      <w:start w:val="1"/>
+      <w:numFmt w:val="bullet"/>
+      <w:lvlText w:val=""/>
+      <w:lvlJc w:val="left"/>
+      <w:pPr>
+        <w:ind w:left="2880" w:hanging="360"/>
+      </w:pPr>
+      <w:rPr>
+        <w:rFonts w:hint="default" w:ascii="Symbol" w:hAnsi="Symbol"/>
+      </w:rPr>
+    </w:lvl>
+    <w:lvl xmlns:w="http://schemas.openxmlformats.org/wordprocessingml/2006/main" w:ilvl="4">
+      <w:start w:val="1"/>
+      <w:numFmt w:val="bullet"/>
+      <w:lvlText w:val="o"/>
+      <w:lvlJc w:val="left"/>
+      <w:pPr>
+        <w:ind w:left="3600" w:hanging="360"/>
+      </w:pPr>
+      <w:rPr>
+        <w:rFonts w:hint="default" w:ascii="Courier New" w:hAnsi="Courier New"/>
+      </w:rPr>
+    </w:lvl>
+    <w:lvl xmlns:w="http://schemas.openxmlformats.org/wordprocessingml/2006/main" w:ilvl="5">
+      <w:start w:val="1"/>
+      <w:numFmt w:val="bullet"/>
+      <w:lvlText w:val=""/>
+      <w:lvlJc w:val="left"/>
+      <w:pPr>
+        <w:ind w:left="4320" w:hanging="360"/>
+      </w:pPr>
+      <w:rPr>
+        <w:rFonts w:hint="default" w:ascii="Wingdings" w:hAnsi="Wingdings"/>
+      </w:rPr>
+    </w:lvl>
+    <w:lvl xmlns:w="http://schemas.openxmlformats.org/wordprocessingml/2006/main" w:ilvl="6">
+      <w:start w:val="1"/>
+      <w:numFmt w:val="bullet"/>
+      <w:lvlText w:val=""/>
+      <w:lvlJc w:val="left"/>
+      <w:pPr>
+        <w:ind w:left="5040" w:hanging="360"/>
+      </w:pPr>
+      <w:rPr>
+        <w:rFonts w:hint="default" w:ascii="Symbol" w:hAnsi="Symbol"/>
+      </w:rPr>
+    </w:lvl>
+    <w:lvl xmlns:w="http://schemas.openxmlformats.org/wordprocessingml/2006/main" w:ilvl="7">
+      <w:start w:val="1"/>
+      <w:numFmt w:val="bullet"/>
+      <w:lvlText w:val="o"/>
+      <w:lvlJc w:val="left"/>
+      <w:pPr>
+        <w:ind w:left="5760" w:hanging="360"/>
+      </w:pPr>
+      <w:rPr>
+        <w:rFonts w:hint="default" w:ascii="Courier New" w:hAnsi="Courier New"/>
+      </w:rPr>
+    </w:lvl>
+    <w:lvl xmlns:w="http://schemas.openxmlformats.org/wordprocessingml/2006/main" w:ilvl="8">
+      <w:start w:val="1"/>
+      <w:numFmt w:val="bullet"/>
+      <w:lvlText w:val=""/>
+      <w:lvlJc w:val="left"/>
+      <w:pPr>
+        <w:ind w:left="6480" w:hanging="360"/>
+      </w:pPr>
+      <w:rPr>
+        <w:rFonts w:hint="default" w:ascii="Wingdings" w:hAnsi="Wingdings"/>
+      </w:rPr>
+    </w:lvl>
+  </w:abstractNum>
   <w:abstractNum xmlns:w="http://schemas.openxmlformats.org/wordprocessingml/2006/main" w:abstractNumId="7">
     <w:nsid w:val="1607ea74"/>
     <w:multiLevelType xmlns:w="http://schemas.openxmlformats.org/wordprocessingml/2006/main" w:val="hybridMultilevel"/>
@@ -8630,6 +10350,12 @@
       </w:rPr>
     </w:lvl>
   </w:abstractNum>
+  <w:num w:numId="9">
+    <w:abstractNumId w:val="9"/>
+  </w:num>
+  <w:num w:numId="8">
+    <w:abstractNumId w:val="8"/>
+  </w:num>
   <w:num w:numId="7">
     <w:abstractNumId w:val="7"/>
   </w:num>

</xml_diff>

<commit_message>
Update php notes: Handling Exceptions
</commit_message>
<xml_diff>
--- a/PHP.docx
+++ b/PHP.docx
@@ -9175,18 +9175,75 @@
         <w:spacing w:before="0" w:beforeAutospacing="off" w:after="0" w:afterAutospacing="off" w:line="285" w:lineRule="auto"/>
         <w:ind w:left="0" w:right="0"/>
         <w:jc w:val="left"/>
+      </w:pPr>
+      <w:r>
         <w:rPr>
           <w:rFonts w:ascii="Consolas" w:hAnsi="Consolas" w:eastAsia="Consolas" w:cs="Consolas"/>
-          <w:b w:val="1"/>
-          <w:bCs w:val="1"/>
-          <w:noProof w:val="0"/>
-          <w:color w:val="A5C9EB" w:themeColor="text2" w:themeTint="40" w:themeShade="FF"/>
-          <w:sz w:val="24"/>
-          <w:szCs w:val="24"/>
-          <w:u w:val="single"/>
-          <w:lang w:val="en-GB"/>
-        </w:rPr>
-      </w:pPr>
+          <w:b w:val="0"/>
+          <w:bCs w:val="0"/>
+          <w:noProof w:val="0"/>
+          <w:color w:val="FF0000"/>
+          <w:sz w:val="32"/>
+          <w:szCs w:val="32"/>
+          <w:u w:val="none"/>
+          <w:lang w:val="en-GB"/>
+        </w:rPr>
+        <w:t>Handling Exceptions:</w:t>
+      </w:r>
+    </w:p>
+    <w:p>
+      <w:pPr>
+        <w:pStyle w:val="Normal"/>
+        <w:suppressLineNumbers w:val="0"/>
+        <w:shd w:val="clear" w:color="auto" w:fill="121314"/>
+        <w:bidi w:val="0"/>
+        <w:spacing w:before="0" w:beforeAutospacing="off" w:after="0" w:afterAutospacing="off" w:line="285" w:lineRule="auto"/>
+        <w:ind w:left="0" w:right="0"/>
+        <w:jc w:val="left"/>
+        <w:rPr>
+          <w:rFonts w:ascii="Consolas" w:hAnsi="Consolas" w:eastAsia="Consolas" w:cs="Consolas"/>
+          <w:b w:val="0"/>
+          <w:bCs w:val="0"/>
+          <w:noProof w:val="0"/>
+          <w:color w:val="FF0000"/>
+          <w:sz w:val="32"/>
+          <w:szCs w:val="32"/>
+          <w:u w:val="none"/>
+          <w:lang w:val="en-GB"/>
+        </w:rPr>
+      </w:pPr>
+    </w:p>
+    <w:p>
+      <w:pPr>
+        <w:pStyle w:val="Normal"/>
+        <w:shd w:val="clear" w:color="auto" w:fill="121314"/>
+        <w:bidi w:val="0"/>
+        <w:spacing w:before="0" w:beforeAutospacing="off" w:after="0" w:afterAutospacing="off" w:line="285" w:lineRule="auto"/>
+        <w:ind w:left="0" w:right="0"/>
+        <w:jc w:val="left"/>
+        <w:rPr>
+          <w:rFonts w:ascii="Consolas" w:hAnsi="Consolas" w:eastAsia="Consolas" w:cs="Consolas"/>
+          <w:noProof w:val="0"/>
+          <w:sz w:val="32"/>
+          <w:szCs w:val="32"/>
+          <w:lang w:val="en-GB"/>
+        </w:rPr>
+      </w:pPr>
+      <w:r>
+        <w:rPr>
+          <w:rFonts w:ascii="Arial" w:hAnsi="Arial" w:eastAsia="Arial" w:cs="Arial"/>
+          <w:b w:val="1"/>
+          <w:bCs w:val="1"/>
+          <w:strike w:val="0"/>
+          <w:dstrike w:val="0"/>
+          <w:noProof w:val="0"/>
+          <w:sz w:val="24"/>
+          <w:szCs w:val="24"/>
+          <w:u w:val="none"/>
+          <w:lang w:val="en-GB"/>
+        </w:rPr>
+        <w:t>Exception handling in PHP is a structured, object-oriented way to intercept and manage runtime errors instead of letting the script crash.</w:t>
+      </w:r>
     </w:p>
     <w:sectPr>
       <w:pgSz w:w="11906" w:h="16838" w:orient="portrait"/>

</xml_diff>

<commit_message>
Add PHP scripts for file I/O operations and CSV data processing
</commit_message>
<xml_diff>
--- a/PHP.docx
+++ b/PHP.docx
@@ -9221,28 +9221,1017 @@
         <w:spacing w:before="0" w:beforeAutospacing="off" w:after="0" w:afterAutospacing="off" w:line="285" w:lineRule="auto"/>
         <w:ind w:left="0" w:right="0"/>
         <w:jc w:val="left"/>
-        <w:rPr>
-          <w:rFonts w:ascii="Consolas" w:hAnsi="Consolas" w:eastAsia="Consolas" w:cs="Consolas"/>
-          <w:noProof w:val="0"/>
+      </w:pPr>
+      <w:r>
+        <w:rPr>
+          <w:rFonts w:ascii="Arial" w:hAnsi="Arial" w:eastAsia="Arial" w:cs="Arial"/>
+          <w:b w:val="1"/>
+          <w:bCs w:val="1"/>
+          <w:strike w:val="0"/>
+          <w:dstrike w:val="0"/>
+          <w:noProof w:val="0"/>
+          <w:sz w:val="24"/>
+          <w:szCs w:val="24"/>
+          <w:u w:val="none"/>
+          <w:lang w:val="en-GB"/>
+        </w:rPr>
+        <w:t>Exception handling in PHP is a structured, object-oriented way to intercept and manage runtime errors instead of letting the script crash.</w:t>
+      </w:r>
+    </w:p>
+    <w:p>
+      <w:pPr>
+        <w:pStyle w:val="Normal"/>
+        <w:shd w:val="clear" w:color="auto" w:fill="121314"/>
+        <w:bidi w:val="0"/>
+        <w:spacing w:before="0" w:beforeAutospacing="off" w:after="0" w:afterAutospacing="off" w:line="285" w:lineRule="auto"/>
+        <w:ind w:left="0" w:right="0"/>
+        <w:jc w:val="left"/>
+        <w:rPr>
+          <w:rFonts w:ascii="Arial" w:hAnsi="Arial" w:eastAsia="Arial" w:cs="Arial"/>
+          <w:b w:val="1"/>
+          <w:bCs w:val="1"/>
+          <w:strike w:val="0"/>
+          <w:dstrike w:val="0"/>
+          <w:noProof w:val="0"/>
+          <w:sz w:val="24"/>
+          <w:szCs w:val="24"/>
+          <w:u w:val="none"/>
+          <w:lang w:val="en-GB"/>
+        </w:rPr>
+      </w:pPr>
+    </w:p>
+    <w:p>
+      <w:pPr>
+        <w:pStyle w:val="Normal"/>
+        <w:shd w:val="clear" w:color="auto" w:fill="121314"/>
+        <w:bidi w:val="0"/>
+        <w:spacing w:before="0" w:beforeAutospacing="off" w:after="0" w:afterAutospacing="off" w:line="285" w:lineRule="auto"/>
+        <w:ind w:left="0" w:right="0"/>
+        <w:jc w:val="left"/>
+        <w:rPr>
+          <w:rFonts w:ascii="Arial" w:hAnsi="Arial" w:eastAsia="Arial" w:cs="Arial"/>
+          <w:b w:val="1"/>
+          <w:bCs w:val="1"/>
+          <w:strike w:val="0"/>
+          <w:dstrike w:val="0"/>
+          <w:noProof w:val="0"/>
+          <w:color w:val="FF0000"/>
           <w:sz w:val="32"/>
           <w:szCs w:val="32"/>
-          <w:lang w:val="en-GB"/>
-        </w:rPr>
-      </w:pPr>
-      <w:r>
-        <w:rPr>
-          <w:rFonts w:ascii="Arial" w:hAnsi="Arial" w:eastAsia="Arial" w:cs="Arial"/>
-          <w:b w:val="1"/>
-          <w:bCs w:val="1"/>
-          <w:strike w:val="0"/>
-          <w:dstrike w:val="0"/>
-          <w:noProof w:val="0"/>
-          <w:sz w:val="24"/>
-          <w:szCs w:val="24"/>
-          <w:u w:val="none"/>
-          <w:lang w:val="en-GB"/>
-        </w:rPr>
-        <w:t>Exception handling in PHP is a structured, object-oriented way to intercept and manage runtime errors instead of letting the script crash.</w:t>
+          <w:u w:val="none"/>
+          <w:lang w:val="en-GB"/>
+        </w:rPr>
+      </w:pPr>
+      <w:r>
+        <w:rPr>
+          <w:rFonts w:ascii="Arial" w:hAnsi="Arial" w:eastAsia="Arial" w:cs="Arial"/>
+          <w:b w:val="1"/>
+          <w:bCs w:val="1"/>
+          <w:strike w:val="0"/>
+          <w:dstrike w:val="0"/>
+          <w:noProof w:val="0"/>
+          <w:color w:val="FF0000"/>
+          <w:sz w:val="32"/>
+          <w:szCs w:val="32"/>
+          <w:u w:val="none"/>
+          <w:lang w:val="en-GB"/>
+        </w:rPr>
+        <w:t>Parse_ini_file</w:t>
+      </w:r>
+      <w:r>
+        <w:rPr>
+          <w:rFonts w:ascii="Arial" w:hAnsi="Arial" w:eastAsia="Arial" w:cs="Arial"/>
+          <w:b w:val="1"/>
+          <w:bCs w:val="1"/>
+          <w:strike w:val="0"/>
+          <w:dstrike w:val="0"/>
+          <w:noProof w:val="0"/>
+          <w:color w:val="FF0000"/>
+          <w:sz w:val="32"/>
+          <w:szCs w:val="32"/>
+          <w:u w:val="none"/>
+          <w:lang w:val="en-GB"/>
+        </w:rPr>
+        <w:t>():</w:t>
+      </w:r>
+    </w:p>
+    <w:p>
+      <w:pPr>
+        <w:pStyle w:val="Normal"/>
+        <w:shd w:val="clear" w:color="auto" w:fill="121314"/>
+        <w:bidi w:val="0"/>
+        <w:spacing w:before="0" w:beforeAutospacing="off" w:after="0" w:afterAutospacing="off" w:line="285" w:lineRule="auto"/>
+        <w:ind w:left="0" w:right="0"/>
+        <w:jc w:val="left"/>
+        <w:rPr>
+          <w:rFonts w:ascii="Arial" w:hAnsi="Arial" w:eastAsia="Arial" w:cs="Arial"/>
+          <w:b w:val="1"/>
+          <w:bCs w:val="1"/>
+          <w:strike w:val="0"/>
+          <w:dstrike w:val="0"/>
+          <w:noProof w:val="0"/>
+          <w:color w:val="FF0000"/>
+          <w:sz w:val="24"/>
+          <w:szCs w:val="24"/>
+          <w:u w:val="none"/>
+          <w:lang w:val="en-GB"/>
+        </w:rPr>
+      </w:pPr>
+    </w:p>
+    <w:p>
+      <w:pPr>
+        <w:pStyle w:val="Normal"/>
+        <w:shd w:val="clear" w:color="auto" w:fill="121314"/>
+        <w:bidi w:val="0"/>
+        <w:spacing w:before="0" w:beforeAutospacing="off" w:after="0" w:afterAutospacing="off" w:line="285" w:lineRule="auto"/>
+        <w:ind w:left="0" w:right="0"/>
+        <w:jc w:val="left"/>
+      </w:pPr>
+      <w:r>
+        <w:rPr>
+          <w:rFonts w:ascii="Arial" w:hAnsi="Arial" w:eastAsia="Arial" w:cs="Arial"/>
+          <w:b w:val="1"/>
+          <w:bCs w:val="1"/>
+          <w:strike w:val="0"/>
+          <w:dstrike w:val="0"/>
+          <w:noProof w:val="0"/>
+          <w:color w:val="FFFFFF" w:themeColor="background1" w:themeTint="FF" w:themeShade="FF"/>
+          <w:sz w:val="24"/>
+          <w:szCs w:val="24"/>
+          <w:u w:val="none"/>
+          <w:lang w:val="en-GB"/>
+        </w:rPr>
+        <w:t>Used to open .</w:t>
+      </w:r>
+      <w:r>
+        <w:rPr>
+          <w:rFonts w:ascii="Arial" w:hAnsi="Arial" w:eastAsia="Arial" w:cs="Arial"/>
+          <w:b w:val="1"/>
+          <w:bCs w:val="1"/>
+          <w:strike w:val="0"/>
+          <w:dstrike w:val="0"/>
+          <w:noProof w:val="0"/>
+          <w:color w:val="FFFFFF" w:themeColor="background1" w:themeTint="FF" w:themeShade="FF"/>
+          <w:sz w:val="24"/>
+          <w:szCs w:val="24"/>
+          <w:u w:val="none"/>
+          <w:lang w:val="en-GB"/>
+        </w:rPr>
+        <w:t>ini</w:t>
+      </w:r>
+      <w:r>
+        <w:rPr>
+          <w:rFonts w:ascii="Arial" w:hAnsi="Arial" w:eastAsia="Arial" w:cs="Arial"/>
+          <w:b w:val="1"/>
+          <w:bCs w:val="1"/>
+          <w:strike w:val="0"/>
+          <w:dstrike w:val="0"/>
+          <w:noProof w:val="0"/>
+          <w:color w:val="FFFFFF" w:themeColor="background1" w:themeTint="FF" w:themeShade="FF"/>
+          <w:sz w:val="24"/>
+          <w:szCs w:val="24"/>
+          <w:u w:val="none"/>
+          <w:lang w:val="en-GB"/>
+        </w:rPr>
+        <w:t xml:space="preserve"> files, </w:t>
+      </w:r>
+      <w:r>
+        <w:rPr>
+          <w:rFonts w:ascii="Arial" w:hAnsi="Arial" w:eastAsia="Arial" w:cs="Arial"/>
+          <w:b w:val="1"/>
+          <w:bCs w:val="1"/>
+          <w:strike w:val="0"/>
+          <w:dstrike w:val="0"/>
+          <w:noProof w:val="0"/>
+          <w:color w:val="FFFFFF" w:themeColor="background1" w:themeTint="FF" w:themeShade="FF"/>
+          <w:sz w:val="24"/>
+          <w:szCs w:val="24"/>
+          <w:u w:val="none"/>
+          <w:lang w:val="en-GB"/>
+        </w:rPr>
+        <w:t>ini</w:t>
+      </w:r>
+      <w:r>
+        <w:rPr>
+          <w:rFonts w:ascii="Arial" w:hAnsi="Arial" w:eastAsia="Arial" w:cs="Arial"/>
+          <w:b w:val="1"/>
+          <w:bCs w:val="1"/>
+          <w:strike w:val="0"/>
+          <w:dstrike w:val="0"/>
+          <w:noProof w:val="0"/>
+          <w:color w:val="FFFFFF" w:themeColor="background1" w:themeTint="FF" w:themeShade="FF"/>
+          <w:sz w:val="24"/>
+          <w:szCs w:val="24"/>
+          <w:u w:val="none"/>
+          <w:lang w:val="en-GB"/>
+        </w:rPr>
+        <w:t xml:space="preserve"> files </w:t>
+      </w:r>
+      <w:r>
+        <w:rPr>
+          <w:rFonts w:ascii="Arial" w:hAnsi="Arial" w:eastAsia="Arial" w:cs="Arial"/>
+          <w:b w:val="1"/>
+          <w:bCs w:val="1"/>
+          <w:strike w:val="0"/>
+          <w:dstrike w:val="0"/>
+          <w:noProof w:val="0"/>
+          <w:color w:val="FFFFFF" w:themeColor="background1" w:themeTint="FF" w:themeShade="FF"/>
+          <w:sz w:val="24"/>
+          <w:szCs w:val="24"/>
+          <w:u w:val="none"/>
+          <w:lang w:val="en-GB"/>
+        </w:rPr>
+        <w:t>means</w:t>
+      </w:r>
+      <w:r>
+        <w:rPr>
+          <w:rFonts w:ascii="Arial" w:hAnsi="Arial" w:eastAsia="Arial" w:cs="Arial"/>
+          <w:b w:val="1"/>
+          <w:bCs w:val="1"/>
+          <w:strike w:val="0"/>
+          <w:dstrike w:val="0"/>
+          <w:noProof w:val="0"/>
+          <w:color w:val="FFFFFF" w:themeColor="background1" w:themeTint="FF" w:themeShade="FF"/>
+          <w:sz w:val="24"/>
+          <w:szCs w:val="24"/>
+          <w:u w:val="none"/>
+          <w:lang w:val="en-GB"/>
+        </w:rPr>
+        <w:t xml:space="preserve"> which hold configurations of your software</w:t>
+      </w:r>
+    </w:p>
+    <w:p>
+      <w:pPr>
+        <w:pStyle w:val="Normal"/>
+        <w:shd w:val="clear" w:color="auto" w:fill="121314"/>
+        <w:bidi w:val="0"/>
+        <w:spacing w:before="0" w:beforeAutospacing="off" w:after="0" w:afterAutospacing="off" w:line="285" w:lineRule="auto"/>
+        <w:ind w:left="0" w:right="0"/>
+        <w:jc w:val="left"/>
+        <w:rPr>
+          <w:rFonts w:ascii="Arial" w:hAnsi="Arial" w:eastAsia="Arial" w:cs="Arial"/>
+          <w:b w:val="1"/>
+          <w:bCs w:val="1"/>
+          <w:strike w:val="0"/>
+          <w:dstrike w:val="0"/>
+          <w:noProof w:val="0"/>
+          <w:color w:val="FFFFFF" w:themeColor="background1" w:themeTint="FF" w:themeShade="FF"/>
+          <w:sz w:val="24"/>
+          <w:szCs w:val="24"/>
+          <w:u w:val="none"/>
+          <w:lang w:val="en-GB"/>
+        </w:rPr>
+      </w:pPr>
+    </w:p>
+    <w:p>
+      <w:pPr>
+        <w:shd w:val="clear" w:color="auto" w:fill="121314"/>
+        <w:bidi w:val="0"/>
+        <w:spacing w:before="0" w:beforeAutospacing="off" w:after="0" w:afterAutospacing="off" w:line="285" w:lineRule="auto"/>
+        <w:jc w:val="left"/>
+      </w:pPr>
+      <w:r>
+        <w:rPr>
+          <w:rFonts w:ascii="Consolas" w:hAnsi="Consolas" w:eastAsia="Consolas" w:cs="Consolas"/>
+          <w:b w:val="0"/>
+          <w:bCs w:val="0"/>
+          <w:noProof w:val="0"/>
+          <w:color w:val="C9D1D9"/>
+          <w:sz w:val="21"/>
+          <w:szCs w:val="21"/>
+          <w:lang w:val="en-GB"/>
+        </w:rPr>
+        <w:t>$config</w:t>
+      </w:r>
+      <w:r>
+        <w:rPr>
+          <w:rFonts w:ascii="Consolas" w:hAnsi="Consolas" w:eastAsia="Consolas" w:cs="Consolas"/>
+          <w:b w:val="0"/>
+          <w:bCs w:val="0"/>
+          <w:noProof w:val="0"/>
+          <w:color w:val="D4D4D4"/>
+          <w:sz w:val="21"/>
+          <w:szCs w:val="21"/>
+          <w:lang w:val="en-GB"/>
+        </w:rPr>
+        <w:t xml:space="preserve"> = </w:t>
+      </w:r>
+      <w:r>
+        <w:rPr>
+          <w:rFonts w:ascii="Consolas" w:hAnsi="Consolas" w:eastAsia="Consolas" w:cs="Consolas"/>
+          <w:b w:val="0"/>
+          <w:bCs w:val="0"/>
+          <w:noProof w:val="0"/>
+          <w:color w:val="DCDCAA"/>
+          <w:sz w:val="21"/>
+          <w:szCs w:val="21"/>
+          <w:lang w:val="en-GB"/>
+        </w:rPr>
+        <w:t>parse_ini_file</w:t>
+      </w:r>
+      <w:r>
+        <w:rPr>
+          <w:rFonts w:ascii="Consolas" w:hAnsi="Consolas" w:eastAsia="Consolas" w:cs="Consolas"/>
+          <w:b w:val="0"/>
+          <w:bCs w:val="0"/>
+          <w:noProof w:val="0"/>
+          <w:color w:val="D4D4D4"/>
+          <w:sz w:val="21"/>
+          <w:szCs w:val="21"/>
+          <w:lang w:val="en-GB"/>
+        </w:rPr>
+        <w:t>(</w:t>
+      </w:r>
+      <w:r>
+        <w:rPr>
+          <w:rFonts w:ascii="Consolas" w:hAnsi="Consolas" w:eastAsia="Consolas" w:cs="Consolas"/>
+          <w:b w:val="0"/>
+          <w:bCs w:val="0"/>
+          <w:noProof w:val="0"/>
+          <w:color w:val="A5D6FF"/>
+          <w:sz w:val="21"/>
+          <w:szCs w:val="21"/>
+          <w:lang w:val="en-GB"/>
+        </w:rPr>
+        <w:t>"Test_Folder_3/test.ini"</w:t>
+      </w:r>
+      <w:r>
+        <w:rPr>
+          <w:rFonts w:ascii="Consolas" w:hAnsi="Consolas" w:eastAsia="Consolas" w:cs="Consolas"/>
+          <w:b w:val="0"/>
+          <w:bCs w:val="0"/>
+          <w:noProof w:val="0"/>
+          <w:color w:val="D4D4D4"/>
+          <w:sz w:val="21"/>
+          <w:szCs w:val="21"/>
+          <w:lang w:val="en-GB"/>
+        </w:rPr>
+        <w:t>);</w:t>
+      </w:r>
+    </w:p>
+    <w:p>
+      <w:pPr>
+        <w:shd w:val="clear" w:color="auto" w:fill="121314"/>
+        <w:bidi w:val="0"/>
+        <w:spacing w:before="0" w:beforeAutospacing="off" w:after="0" w:afterAutospacing="off" w:line="285" w:lineRule="auto"/>
+        <w:jc w:val="left"/>
+      </w:pPr>
+    </w:p>
+    <w:p>
+      <w:pPr>
+        <w:shd w:val="clear" w:color="auto" w:fill="121314"/>
+        <w:bidi w:val="0"/>
+        <w:spacing w:before="0" w:beforeAutospacing="off" w:after="0" w:afterAutospacing="off" w:line="285" w:lineRule="auto"/>
+        <w:jc w:val="left"/>
+      </w:pPr>
+      <w:r>
+        <w:rPr>
+          <w:rFonts w:ascii="Consolas" w:hAnsi="Consolas" w:eastAsia="Consolas" w:cs="Consolas"/>
+          <w:b w:val="0"/>
+          <w:bCs w:val="0"/>
+          <w:noProof w:val="0"/>
+          <w:color w:val="D4D4D4"/>
+          <w:sz w:val="21"/>
+          <w:szCs w:val="21"/>
+          <w:lang w:val="en-GB"/>
+        </w:rPr>
+        <w:t xml:space="preserve">        </w:t>
+      </w:r>
+      <w:r>
+        <w:rPr>
+          <w:rFonts w:ascii="Consolas" w:hAnsi="Consolas" w:eastAsia="Consolas" w:cs="Consolas"/>
+          <w:b w:val="0"/>
+          <w:bCs w:val="0"/>
+          <w:noProof w:val="0"/>
+          <w:color w:val="8B949E"/>
+          <w:sz w:val="21"/>
+          <w:szCs w:val="21"/>
+          <w:lang w:val="en-GB"/>
+        </w:rPr>
+        <w:t xml:space="preserve">// The parse_ini_file() function is a built-in PHP function used to load a configuration (.ini) file </w:t>
+      </w:r>
+    </w:p>
+    <w:p>
+      <w:pPr>
+        <w:shd w:val="clear" w:color="auto" w:fill="121314"/>
+        <w:bidi w:val="0"/>
+        <w:spacing w:before="0" w:beforeAutospacing="off" w:after="0" w:afterAutospacing="off" w:line="285" w:lineRule="auto"/>
+        <w:jc w:val="left"/>
+      </w:pPr>
+      <w:r>
+        <w:rPr>
+          <w:rFonts w:ascii="Consolas" w:hAnsi="Consolas" w:eastAsia="Consolas" w:cs="Consolas"/>
+          <w:b w:val="0"/>
+          <w:bCs w:val="0"/>
+          <w:noProof w:val="0"/>
+          <w:color w:val="D4D4D4"/>
+          <w:sz w:val="21"/>
+          <w:szCs w:val="21"/>
+          <w:lang w:val="en-GB"/>
+        </w:rPr>
+        <w:t xml:space="preserve">        </w:t>
+      </w:r>
+      <w:r>
+        <w:rPr>
+          <w:rFonts w:ascii="Consolas" w:hAnsi="Consolas" w:eastAsia="Consolas" w:cs="Consolas"/>
+          <w:b w:val="0"/>
+          <w:bCs w:val="0"/>
+          <w:noProof w:val="0"/>
+          <w:color w:val="8B949E"/>
+          <w:sz w:val="21"/>
+          <w:szCs w:val="21"/>
+          <w:lang w:val="en-GB"/>
+        </w:rPr>
+        <w:t>// and return its settings as an associative array.</w:t>
+      </w:r>
+    </w:p>
+    <w:p>
+      <w:pPr>
+        <w:shd w:val="clear" w:color="auto" w:fill="121314"/>
+        <w:bidi w:val="0"/>
+        <w:spacing w:before="0" w:beforeAutospacing="off" w:after="0" w:afterAutospacing="off" w:line="285" w:lineRule="auto"/>
+        <w:jc w:val="left"/>
+        <w:rPr>
+          <w:rFonts w:ascii="Consolas" w:hAnsi="Consolas" w:eastAsia="Consolas" w:cs="Consolas"/>
+          <w:b w:val="0"/>
+          <w:bCs w:val="0"/>
+          <w:noProof w:val="0"/>
+          <w:color w:val="8B949E"/>
+          <w:sz w:val="21"/>
+          <w:szCs w:val="21"/>
+          <w:lang w:val="en-GB"/>
+        </w:rPr>
+      </w:pPr>
+    </w:p>
+    <w:p>
+      <w:pPr>
+        <w:shd w:val="clear" w:color="auto" w:fill="121314"/>
+        <w:bidi w:val="0"/>
+        <w:spacing w:before="0" w:beforeAutospacing="off" w:after="0" w:afterAutospacing="off" w:line="285" w:lineRule="auto"/>
+        <w:jc w:val="left"/>
+        <w:rPr>
+          <w:rFonts w:ascii="Consolas" w:hAnsi="Consolas" w:eastAsia="Consolas" w:cs="Consolas"/>
+          <w:b w:val="0"/>
+          <w:bCs w:val="0"/>
+          <w:noProof w:val="0"/>
+          <w:color w:val="8B949E"/>
+          <w:sz w:val="21"/>
+          <w:szCs w:val="21"/>
+          <w:lang w:val="en-GB"/>
+        </w:rPr>
+      </w:pPr>
+    </w:p>
+    <w:p>
+      <w:pPr>
+        <w:pStyle w:val="Normal"/>
+        <w:shd w:val="clear" w:color="auto" w:fill="121314"/>
+        <w:bidi w:val="0"/>
+        <w:spacing w:before="0" w:beforeAutospacing="off" w:after="0" w:afterAutospacing="off" w:line="285" w:lineRule="auto"/>
+        <w:ind w:left="0" w:right="0"/>
+        <w:jc w:val="left"/>
+        <w:rPr>
+          <w:rFonts w:ascii="Arial" w:hAnsi="Arial" w:eastAsia="Arial" w:cs="Arial"/>
+          <w:b w:val="1"/>
+          <w:bCs w:val="1"/>
+          <w:strike w:val="0"/>
+          <w:dstrike w:val="0"/>
+          <w:noProof w:val="0"/>
+          <w:sz w:val="24"/>
+          <w:szCs w:val="24"/>
+          <w:u w:val="none"/>
+          <w:lang w:val="en-GB"/>
+        </w:rPr>
+      </w:pPr>
+    </w:p>
+    <w:p>
+      <w:pPr>
+        <w:pStyle w:val="Normal"/>
+        <w:shd w:val="clear" w:color="auto" w:fill="121314"/>
+        <w:bidi w:val="0"/>
+        <w:spacing w:before="0" w:beforeAutospacing="off" w:after="0" w:afterAutospacing="off" w:line="285" w:lineRule="auto"/>
+        <w:ind w:left="0" w:right="0"/>
+        <w:jc w:val="left"/>
+        <w:rPr>
+          <w:rFonts w:ascii="Arial" w:hAnsi="Arial" w:eastAsia="Arial" w:cs="Arial"/>
+          <w:b w:val="1"/>
+          <w:bCs w:val="1"/>
+          <w:strike w:val="0"/>
+          <w:dstrike w:val="0"/>
+          <w:noProof w:val="0"/>
+          <w:color w:val="FF0000"/>
+          <w:sz w:val="32"/>
+          <w:szCs w:val="32"/>
+          <w:highlight w:val="yellow"/>
+          <w:u w:val="none"/>
+          <w:lang w:val="en-GB"/>
+        </w:rPr>
+      </w:pPr>
+      <w:r>
+        <w:rPr>
+          <w:rFonts w:ascii="Arial" w:hAnsi="Arial" w:eastAsia="Arial" w:cs="Arial"/>
+          <w:b w:val="1"/>
+          <w:bCs w:val="1"/>
+          <w:strike w:val="0"/>
+          <w:dstrike w:val="0"/>
+          <w:noProof w:val="0"/>
+          <w:color w:val="FF0000"/>
+          <w:sz w:val="32"/>
+          <w:szCs w:val="32"/>
+          <w:highlight w:val="yellow"/>
+          <w:u w:val="none"/>
+          <w:lang w:val="en-GB"/>
+        </w:rPr>
+        <w:t>Note:</w:t>
+      </w:r>
+    </w:p>
+    <w:p>
+      <w:pPr>
+        <w:pStyle w:val="Normal"/>
+        <w:shd w:val="clear" w:color="auto" w:fill="121314"/>
+        <w:bidi w:val="0"/>
+        <w:spacing w:before="0" w:beforeAutospacing="off" w:after="0" w:afterAutospacing="off" w:line="285" w:lineRule="auto"/>
+        <w:ind w:left="0" w:right="0"/>
+        <w:jc w:val="left"/>
+      </w:pPr>
+      <w:r>
+        <w:rPr>
+          <w:rFonts w:ascii="Arial" w:hAnsi="Arial" w:eastAsia="Arial" w:cs="Arial"/>
+          <w:b w:val="0"/>
+          <w:bCs w:val="0"/>
+          <w:strike w:val="0"/>
+          <w:dstrike w:val="0"/>
+          <w:noProof w:val="0"/>
+          <w:sz w:val="24"/>
+          <w:szCs w:val="24"/>
+          <w:u w:val="none"/>
+          <w:lang w:val="en-GB"/>
+        </w:rPr>
+        <w:t xml:space="preserve">To create a file in PHP using the </w:t>
+      </w:r>
+      <w:r>
+        <w:rPr>
+          <w:rFonts w:ascii="Consolas" w:hAnsi="Consolas" w:eastAsia="Consolas" w:cs="Consolas"/>
+          <w:b w:val="0"/>
+          <w:bCs w:val="0"/>
+          <w:strike w:val="0"/>
+          <w:dstrike w:val="0"/>
+          <w:noProof w:val="0"/>
+          <w:sz w:val="21"/>
+          <w:szCs w:val="21"/>
+          <w:u w:val="none"/>
+          <w:lang w:val="en-GB"/>
+        </w:rPr>
+        <w:t>fopen</w:t>
+      </w:r>
+      <w:r>
+        <w:rPr>
+          <w:rFonts w:ascii="Consolas" w:hAnsi="Consolas" w:eastAsia="Consolas" w:cs="Consolas"/>
+          <w:b w:val="0"/>
+          <w:bCs w:val="0"/>
+          <w:strike w:val="0"/>
+          <w:dstrike w:val="0"/>
+          <w:noProof w:val="0"/>
+          <w:sz w:val="21"/>
+          <w:szCs w:val="21"/>
+          <w:u w:val="none"/>
+          <w:lang w:val="en-GB"/>
+        </w:rPr>
+        <w:t>()</w:t>
+      </w:r>
+      <w:r>
+        <w:rPr>
+          <w:rFonts w:ascii="Arial" w:hAnsi="Arial" w:eastAsia="Arial" w:cs="Arial"/>
+          <w:noProof w:val="0"/>
+          <w:sz w:val="24"/>
+          <w:szCs w:val="24"/>
+          <w:lang w:val="en-GB"/>
+        </w:rPr>
+        <w:t xml:space="preserve"> library</w:t>
+      </w:r>
+      <w:r>
+        <w:rPr>
+          <w:rFonts w:ascii="Arial" w:hAnsi="Arial" w:eastAsia="Arial" w:cs="Arial"/>
+          <w:noProof w:val="0"/>
+          <w:color w:val="FF0000"/>
+          <w:sz w:val="24"/>
+          <w:szCs w:val="24"/>
+          <w:lang w:val="en-GB"/>
+        </w:rPr>
+        <w:t xml:space="preserve">, </w:t>
+      </w:r>
+      <w:r>
+        <w:rPr>
+          <w:rFonts w:ascii="Arial" w:hAnsi="Arial" w:eastAsia="Arial" w:cs="Arial"/>
+          <w:noProof w:val="0"/>
+          <w:color w:val="FF0000"/>
+          <w:sz w:val="24"/>
+          <w:szCs w:val="24"/>
+          <w:highlight w:val="yellow"/>
+          <w:lang w:val="en-GB"/>
+        </w:rPr>
+        <w:t>y</w:t>
+      </w:r>
+      <w:r>
+        <w:rPr>
+          <w:rFonts w:ascii="Arial" w:hAnsi="Arial" w:eastAsia="Arial" w:cs="Arial"/>
+          <w:noProof w:val="0"/>
+          <w:color w:val="FF0000"/>
+          <w:sz w:val="24"/>
+          <w:szCs w:val="24"/>
+          <w:highlight w:val="yellow"/>
+          <w:lang w:val="en-GB"/>
+        </w:rPr>
+        <w:t xml:space="preserve">ou simply </w:t>
+      </w:r>
+      <w:r>
+        <w:rPr>
+          <w:rFonts w:ascii="Arial" w:hAnsi="Arial" w:eastAsia="Arial" w:cs="Arial"/>
+          <w:b w:val="0"/>
+          <w:bCs w:val="0"/>
+          <w:strike w:val="0"/>
+          <w:dstrike w:val="0"/>
+          <w:noProof w:val="0"/>
+          <w:color w:val="FF0000"/>
+          <w:sz w:val="24"/>
+          <w:szCs w:val="24"/>
+          <w:highlight w:val="yellow"/>
+          <w:u w:val="none"/>
+          <w:lang w:val="en-GB"/>
+        </w:rPr>
+        <w:t xml:space="preserve">use the </w:t>
+      </w:r>
+      <w:r>
+        <w:rPr>
+          <w:rFonts w:ascii="Consolas" w:hAnsi="Consolas" w:eastAsia="Consolas" w:cs="Consolas"/>
+          <w:b w:val="1"/>
+          <w:bCs w:val="1"/>
+          <w:strike w:val="0"/>
+          <w:dstrike w:val="0"/>
+          <w:noProof w:val="0"/>
+          <w:color w:val="FF0000"/>
+          <w:sz w:val="21"/>
+          <w:szCs w:val="21"/>
+          <w:highlight w:val="yellow"/>
+          <w:u w:val="none"/>
+          <w:lang w:val="en-GB"/>
+        </w:rPr>
+        <w:t>"w"</w:t>
+      </w:r>
+      <w:r>
+        <w:rPr>
+          <w:rFonts w:ascii="Arial" w:hAnsi="Arial" w:eastAsia="Arial" w:cs="Arial"/>
+          <w:b w:val="1"/>
+          <w:bCs w:val="1"/>
+          <w:strike w:val="0"/>
+          <w:dstrike w:val="0"/>
+          <w:noProof w:val="0"/>
+          <w:color w:val="FF0000"/>
+          <w:sz w:val="24"/>
+          <w:szCs w:val="24"/>
+          <w:highlight w:val="yellow"/>
+          <w:u w:val="none"/>
+          <w:lang w:val="en-GB"/>
+        </w:rPr>
+        <w:t xml:space="preserve"> (write)</w:t>
+      </w:r>
+      <w:r>
+        <w:rPr>
+          <w:rFonts w:ascii="Arial" w:hAnsi="Arial" w:eastAsia="Arial" w:cs="Arial"/>
+          <w:b w:val="0"/>
+          <w:bCs w:val="0"/>
+          <w:strike w:val="0"/>
+          <w:dstrike w:val="0"/>
+          <w:noProof w:val="0"/>
+          <w:color w:val="FF0000"/>
+          <w:sz w:val="24"/>
+          <w:szCs w:val="24"/>
+          <w:highlight w:val="yellow"/>
+          <w:u w:val="none"/>
+          <w:lang w:val="en-GB"/>
+        </w:rPr>
+        <w:t xml:space="preserve"> or </w:t>
+      </w:r>
+      <w:r>
+        <w:rPr>
+          <w:rFonts w:ascii="Consolas" w:hAnsi="Consolas" w:eastAsia="Consolas" w:cs="Consolas"/>
+          <w:b w:val="1"/>
+          <w:bCs w:val="1"/>
+          <w:strike w:val="0"/>
+          <w:dstrike w:val="0"/>
+          <w:noProof w:val="0"/>
+          <w:color w:val="FF0000"/>
+          <w:sz w:val="21"/>
+          <w:szCs w:val="21"/>
+          <w:highlight w:val="yellow"/>
+          <w:u w:val="none"/>
+          <w:lang w:val="en-GB"/>
+        </w:rPr>
+        <w:t>"x"</w:t>
+      </w:r>
+      <w:r>
+        <w:rPr>
+          <w:rFonts w:ascii="Arial" w:hAnsi="Arial" w:eastAsia="Arial" w:cs="Arial"/>
+          <w:b w:val="1"/>
+          <w:bCs w:val="1"/>
+          <w:strike w:val="0"/>
+          <w:dstrike w:val="0"/>
+          <w:noProof w:val="0"/>
+          <w:color w:val="FF0000"/>
+          <w:sz w:val="24"/>
+          <w:szCs w:val="24"/>
+          <w:highlight w:val="yellow"/>
+          <w:u w:val="none"/>
+          <w:lang w:val="en-GB"/>
+        </w:rPr>
+        <w:t xml:space="preserve"> (exclusive write)</w:t>
+      </w:r>
+      <w:r>
+        <w:rPr>
+          <w:rFonts w:ascii="Arial" w:hAnsi="Arial" w:eastAsia="Arial" w:cs="Arial"/>
+          <w:b w:val="0"/>
+          <w:bCs w:val="0"/>
+          <w:strike w:val="0"/>
+          <w:dstrike w:val="0"/>
+          <w:noProof w:val="0"/>
+          <w:color w:val="FF0000"/>
+          <w:sz w:val="24"/>
+          <w:szCs w:val="24"/>
+          <w:highlight w:val="yellow"/>
+          <w:u w:val="none"/>
+          <w:lang w:val="en-GB"/>
+        </w:rPr>
+        <w:t xml:space="preserve"> modes</w:t>
+      </w:r>
+      <w:r>
+        <w:rPr>
+          <w:rFonts w:ascii="Arial" w:hAnsi="Arial" w:eastAsia="Arial" w:cs="Arial"/>
+          <w:noProof w:val="0"/>
+          <w:color w:val="auto"/>
+          <w:sz w:val="24"/>
+          <w:szCs w:val="24"/>
+          <w:lang w:val="en-GB"/>
+        </w:rPr>
+        <w:t>.</w:t>
+      </w:r>
+      <w:r>
+        <w:rPr>
+          <w:rFonts w:ascii="Arial" w:hAnsi="Arial" w:eastAsia="Arial" w:cs="Arial"/>
+          <w:noProof w:val="0"/>
+          <w:sz w:val="24"/>
+          <w:szCs w:val="24"/>
+          <w:lang w:val="en-GB"/>
+        </w:rPr>
+        <w:t xml:space="preserve"> When you pass a file path that does not exist to </w:t>
+      </w:r>
+      <w:r>
+        <w:rPr>
+          <w:rFonts w:ascii="Consolas" w:hAnsi="Consolas" w:eastAsia="Consolas" w:cs="Consolas"/>
+          <w:b w:val="0"/>
+          <w:bCs w:val="0"/>
+          <w:strike w:val="0"/>
+          <w:dstrike w:val="0"/>
+          <w:noProof w:val="0"/>
+          <w:sz w:val="21"/>
+          <w:szCs w:val="21"/>
+          <w:u w:val="none"/>
+          <w:lang w:val="en-GB"/>
+        </w:rPr>
+        <w:t>fopen</w:t>
+      </w:r>
+      <w:r>
+        <w:rPr>
+          <w:rFonts w:ascii="Consolas" w:hAnsi="Consolas" w:eastAsia="Consolas" w:cs="Consolas"/>
+          <w:b w:val="0"/>
+          <w:bCs w:val="0"/>
+          <w:strike w:val="0"/>
+          <w:dstrike w:val="0"/>
+          <w:noProof w:val="0"/>
+          <w:sz w:val="21"/>
+          <w:szCs w:val="21"/>
+          <w:u w:val="none"/>
+          <w:lang w:val="en-GB"/>
+        </w:rPr>
+        <w:t>()</w:t>
+      </w:r>
+      <w:r>
+        <w:rPr>
+          <w:rFonts w:ascii="Arial" w:hAnsi="Arial" w:eastAsia="Arial" w:cs="Arial"/>
+          <w:noProof w:val="0"/>
+          <w:sz w:val="24"/>
+          <w:szCs w:val="24"/>
+          <w:lang w:val="en-GB"/>
+        </w:rPr>
+        <w:t xml:space="preserve">, </w:t>
+      </w:r>
+      <w:r>
+        <w:rPr>
+          <w:rFonts w:ascii="Arial" w:hAnsi="Arial" w:eastAsia="Arial" w:cs="Arial"/>
+          <w:noProof w:val="0"/>
+          <w:color w:val="FF0000"/>
+          <w:sz w:val="24"/>
+          <w:szCs w:val="24"/>
+          <w:highlight w:val="yellow"/>
+          <w:lang w:val="en-GB"/>
+        </w:rPr>
+        <w:t>PHP will automatically create the file for you.</w:t>
+      </w:r>
+    </w:p>
+    <w:p>
+      <w:pPr>
+        <w:pStyle w:val="Normal"/>
+        <w:shd w:val="clear" w:color="auto" w:fill="121314"/>
+        <w:bidi w:val="0"/>
+        <w:spacing w:before="0" w:beforeAutospacing="off" w:after="0" w:afterAutospacing="off" w:line="285" w:lineRule="auto"/>
+        <w:ind w:left="0" w:right="0"/>
+        <w:jc w:val="left"/>
+        <w:rPr>
+          <w:rFonts w:ascii="Arial" w:hAnsi="Arial" w:eastAsia="Arial" w:cs="Arial"/>
+          <w:noProof w:val="0"/>
+          <w:color w:val="FF0000"/>
+          <w:sz w:val="24"/>
+          <w:szCs w:val="24"/>
+          <w:highlight w:val="yellow"/>
+          <w:lang w:val="en-GB"/>
+        </w:rPr>
+      </w:pPr>
+    </w:p>
+    <w:p>
+      <w:pPr>
+        <w:pStyle w:val="Normal"/>
+        <w:shd w:val="clear" w:color="auto" w:fill="121314"/>
+        <w:bidi w:val="0"/>
+        <w:spacing w:before="0" w:beforeAutospacing="off" w:after="0" w:afterAutospacing="off" w:line="285" w:lineRule="auto"/>
+        <w:ind w:left="0" w:right="0"/>
+        <w:jc w:val="left"/>
+        <w:rPr>
+          <w:rFonts w:ascii="Arial" w:hAnsi="Arial" w:eastAsia="Arial" w:cs="Arial"/>
+          <w:noProof w:val="0"/>
+          <w:color w:val="FF0000"/>
+          <w:sz w:val="24"/>
+          <w:szCs w:val="24"/>
+          <w:highlight w:val="yellow"/>
+          <w:lang w:val="en-GB"/>
+        </w:rPr>
+      </w:pPr>
+    </w:p>
+    <w:p>
+      <w:pPr>
+        <w:pStyle w:val="Normal"/>
+        <w:shd w:val="clear" w:color="auto" w:fill="121314"/>
+        <w:bidi w:val="0"/>
+        <w:spacing w:before="0" w:beforeAutospacing="off" w:after="0" w:afterAutospacing="off" w:line="285" w:lineRule="auto"/>
+        <w:ind w:left="0" w:right="0"/>
+        <w:jc w:val="left"/>
+        <w:rPr>
+          <w:rFonts w:ascii="Arial" w:hAnsi="Arial" w:eastAsia="Arial" w:cs="Arial"/>
+          <w:noProof w:val="0"/>
+          <w:color w:val="FF0000"/>
+          <w:sz w:val="24"/>
+          <w:szCs w:val="24"/>
+          <w:highlight w:val="yellow"/>
+          <w:lang w:val="en-GB"/>
+        </w:rPr>
+      </w:pPr>
+    </w:p>
+    <w:p>
+      <w:pPr>
+        <w:pStyle w:val="Normal"/>
+        <w:shd w:val="clear" w:color="auto" w:fill="121314"/>
+        <w:bidi w:val="0"/>
+        <w:spacing w:before="0" w:beforeAutospacing="off" w:after="0" w:afterAutospacing="off" w:line="285" w:lineRule="auto"/>
+        <w:ind w:left="0" w:right="0"/>
+        <w:jc w:val="left"/>
+        <w:rPr>
+          <w:rFonts w:ascii="Arial" w:hAnsi="Arial" w:eastAsia="Arial" w:cs="Arial"/>
+          <w:noProof w:val="0"/>
+          <w:color w:val="FF0000"/>
+          <w:sz w:val="24"/>
+          <w:szCs w:val="24"/>
+          <w:highlight w:val="yellow"/>
+          <w:lang w:val="en-GB"/>
+        </w:rPr>
+      </w:pPr>
+    </w:p>
+    <w:p>
+      <w:pPr>
+        <w:pStyle w:val="Normal"/>
+        <w:suppressLineNumbers w:val="0"/>
+        <w:shd w:val="clear" w:color="auto" w:fill="121314"/>
+        <w:bidi w:val="0"/>
+        <w:spacing w:before="0" w:beforeAutospacing="off" w:after="0" w:afterAutospacing="off" w:line="285" w:lineRule="auto"/>
+        <w:ind w:left="0" w:right="0"/>
+        <w:jc w:val="left"/>
+        <w:rPr>
+          <w:rFonts w:ascii="Arial" w:hAnsi="Arial" w:eastAsia="Arial" w:cs="Arial"/>
+          <w:b w:val="1"/>
+          <w:bCs w:val="1"/>
+          <w:noProof w:val="0"/>
+          <w:color w:val="FF0000"/>
+          <w:sz w:val="32"/>
+          <w:szCs w:val="32"/>
+          <w:highlight w:val="yellow"/>
+          <w:lang w:val="en-GB"/>
+        </w:rPr>
+      </w:pPr>
+      <w:r>
+        <w:rPr>
+          <w:rFonts w:ascii="Arial" w:hAnsi="Arial" w:eastAsia="Arial" w:cs="Arial"/>
+          <w:b w:val="1"/>
+          <w:bCs w:val="1"/>
+          <w:noProof w:val="0"/>
+          <w:color w:val="FF0000"/>
+          <w:sz w:val="32"/>
+          <w:szCs w:val="32"/>
+          <w:highlight w:val="yellow"/>
+          <w:lang w:val="en-GB"/>
+        </w:rPr>
+        <w:t>array_map():</w:t>
+      </w:r>
+    </w:p>
+    <w:p>
+      <w:pPr>
+        <w:pStyle w:val="Normal"/>
+        <w:shd w:val="clear" w:color="auto" w:fill="121314"/>
+        <w:bidi w:val="0"/>
+        <w:spacing w:before="0" w:beforeAutospacing="off" w:after="0" w:afterAutospacing="off" w:line="285" w:lineRule="auto"/>
+        <w:ind w:left="0" w:right="0"/>
+        <w:jc w:val="left"/>
+      </w:pPr>
+      <w:r>
+        <w:rPr>
+          <w:rFonts w:ascii="Arial" w:hAnsi="Arial" w:eastAsia="Arial" w:cs="Arial"/>
+          <w:noProof w:val="0"/>
+          <w:sz w:val="24"/>
+          <w:szCs w:val="24"/>
+          <w:lang w:val="en-GB"/>
+        </w:rPr>
+        <w:t xml:space="preserve">You give it a </w:t>
+      </w:r>
+      <w:r>
+        <w:rPr>
+          <w:rFonts w:ascii="Arial" w:hAnsi="Arial" w:eastAsia="Arial" w:cs="Arial"/>
+          <w:b w:val="1"/>
+          <w:bCs w:val="1"/>
+          <w:noProof w:val="0"/>
+          <w:sz w:val="24"/>
+          <w:szCs w:val="24"/>
+          <w:lang w:val="en-GB"/>
+        </w:rPr>
+        <w:t>function</w:t>
+      </w:r>
+      <w:r>
+        <w:rPr>
+          <w:rFonts w:ascii="Arial" w:hAnsi="Arial" w:eastAsia="Arial" w:cs="Arial"/>
+          <w:noProof w:val="0"/>
+          <w:sz w:val="24"/>
+          <w:szCs w:val="24"/>
+          <w:lang w:val="en-GB"/>
+        </w:rPr>
+        <w:t xml:space="preserve"> (the task to perform) and an </w:t>
+      </w:r>
+      <w:r>
+        <w:rPr>
+          <w:rFonts w:ascii="Arial" w:hAnsi="Arial" w:eastAsia="Arial" w:cs="Arial"/>
+          <w:b w:val="1"/>
+          <w:bCs w:val="1"/>
+          <w:noProof w:val="0"/>
+          <w:sz w:val="24"/>
+          <w:szCs w:val="24"/>
+          <w:lang w:val="en-GB"/>
+        </w:rPr>
+        <w:t>array</w:t>
+      </w:r>
+      <w:r>
+        <w:rPr>
+          <w:rFonts w:ascii="Arial" w:hAnsi="Arial" w:eastAsia="Arial" w:cs="Arial"/>
+          <w:noProof w:val="0"/>
+          <w:sz w:val="24"/>
+          <w:szCs w:val="24"/>
+          <w:lang w:val="en-GB"/>
+        </w:rPr>
+        <w:t xml:space="preserve"> (the list of items). It applies that function to every single item in your array and hands you back a </w:t>
+      </w:r>
+      <w:r>
+        <w:rPr>
+          <w:rFonts w:ascii="Arial" w:hAnsi="Arial" w:eastAsia="Arial" w:cs="Arial"/>
+          <w:b w:val="1"/>
+          <w:bCs w:val="1"/>
+          <w:noProof w:val="0"/>
+          <w:sz w:val="24"/>
+          <w:szCs w:val="24"/>
+          <w:lang w:val="en-GB"/>
+        </w:rPr>
+        <w:t>brand-new array</w:t>
+      </w:r>
+      <w:r>
+        <w:rPr>
+          <w:rFonts w:ascii="Arial" w:hAnsi="Arial" w:eastAsia="Arial" w:cs="Arial"/>
+          <w:noProof w:val="0"/>
+          <w:sz w:val="24"/>
+          <w:szCs w:val="24"/>
+          <w:lang w:val="en-GB"/>
+        </w:rPr>
+        <w:t xml:space="preserve"> with the transformed items.</w:t>
       </w:r>
     </w:p>
     <w:sectPr>

</xml_diff>